<commit_message>
docs: polish oral defense wording
</commit_message>
<xml_diff>
--- a/doc/presentations/defensa-placa-permanent-dsi-ports-sortida-hexagonal/output/REMARKABLE_materials-orals-canonics-20-minuts.docx
+++ b/doc/presentations/defensa-placa-permanent-dsi-ports-sortida-hexagonal/output/REMARKABLE_materials-orals-canonics-20-minuts.docx
@@ -233,19 +233,19 @@
           <w:sz w:val="36"/>
           <w:szCs w:val="36"/>
         </w:rPr>
-        <w:t xml:space="preserve">La presentació té un fil narratiu acadèmicament defensable: situa la microlliçó dins Disseny de Sistemes d’Informació, formula un objectiu d’aprenentatge concret, parteix d’un cas real d’administració pública, diagnostica l’acoblament tecnològic, presenta el port de sortida i transfereix el patró a HexaStock. Aquesta estructura és adequada per a un tribunal perquè no presenta només tecnologia, sinó una decisió de disseny vinculada a docència, experiència professional i rigor arquitectònic.</w:t>
-      </w:r>
-    </w:p>
-    <w:p>
-      <w:pPr>
-        <w:pStyle w:val="Textoindependiente"/>
-      </w:pPr>
-      <w:r>
-        <w:rPr>
-          <w:sz w:val="36"/>
-          <w:szCs w:val="36"/>
-        </w:rPr>
-        <w:t xml:space="preserve">El punt més fort és la connexió entre el pla docent i l’informe AGAUR. El pla docent situa l’assignatura a tercer curs, 6 ECTS, amb continguts de clean o hexagonal architecture, ports i adaptadors, mapping entre capes, organització en mòduls, microserveis i DDD. L’informe AGAUR acredita una activitat real de 60 hores, entre maig i juliol de 2025, centrada en serveis REST i arquitectura hexagonal aplicada a sistemes d’informació, amb refactorització de serveis SOAP cap a REST, reducció d’acoblament, separació de responsabilitats, proves i mantenibilitat.</w:t>
+        <w:t xml:space="preserve">La presentació té un fil narratiu acadèmicament defensable: situa la classe dins Disseny de Sistemes d’Informació, formula un objectiu d’aprenentatge concret, parteix d’un cas real d’administració pública, diagnostica l’acoblament tecnològic, presenta el port de sortida i transfereix el patró a HexaStock. Aquesta estructura és adequada per a un tribunal perquè no presenta només tecnologia, sinó una decisió de disseny vinculada a docència, experiència professional i rigor arquitectònic.</w:t>
+      </w:r>
+    </w:p>
+    <w:p>
+      <w:pPr>
+        <w:pStyle w:val="Textoindependiente"/>
+      </w:pPr>
+      <w:r>
+        <w:rPr>
+          <w:sz w:val="36"/>
+          <w:szCs w:val="36"/>
+        </w:rPr>
+        <w:t xml:space="preserve">El punt més fort és la connexió entre el pla docent i l’informe AGAUR. El pla docent situa l’assignatura a tercer curs, 6 ECTS, amb continguts de clean o hexagonal architecture, ports i adaptadors, mapping entre capes, organització en mòduls, microserveis i DDD. L’informe AGAUR acredita una activitat professional especialitzada vinculada a arquitectura hexagonal i sistemes d’informació.</w:t>
       </w:r>
     </w:p>
     <w:p>
@@ -950,7 +950,7 @@
           <w:sz w:val="36"/>
           <w:szCs w:val="36"/>
         </w:rPr>
-        <w:t xml:space="preserve">La microlliçó que presento porta per títol</w:t>
+        <w:t xml:space="preserve">La classe que presento porta per títol</w:t>
       </w:r>
       <w:r>
         <w:rPr>
@@ -984,19 +984,19 @@
           <w:sz w:val="36"/>
           <w:szCs w:val="36"/>
         </w:rPr>
-        <w:t xml:space="preserve">Abans d’entrar en el contingut tècnic, voldria fer una precisió de context. A la documentació del tribunal he incorporat un informe acreditatiu de la meva activitat de formació i consultoria especialitzada per a l’AGAUR, l’Agència de Gestió d’Ajuts Universitaris i de Recerca. Aquest informe acredita una activitat de 60 hores, desenvolupada entre maig i juliol de 2025, centrada en serveis REST, arquitectura hexagonal i sistemes d’informació. [pausa breu]</w:t>
-      </w:r>
-    </w:p>
-    <w:p>
-      <w:pPr>
-        <w:pStyle w:val="Textoindependiente"/>
-      </w:pPr>
-      <w:r>
-        <w:rPr>
-          <w:sz w:val="36"/>
-          <w:szCs w:val="36"/>
-        </w:rPr>
-        <w:t xml:space="preserve">Ho explico al principi perquè aquesta sessió està plantejada deliberadament a partir d’una doble vinculació. D’una banda, és una microlliçó situada dins l’assignatura Disseny de Sistemes d’Informació, que imparteixo juntament amb el Dr. Josep Roure. De l’altra, parteix d’un cas professional real en l’àmbit de l’administració pública catalana. [mirada al tribunal]</w:t>
+        <w:t xml:space="preserve">Abans d’entrar en el contingut tècnic, voldria fer una precisió de context. A la documentació del tribunal he incorporat un informe acreditatiu de la meva activitat de formació i consultoria especialitzada per a l’AGAUR, l’Agència de Gestió d’Ajuts Universitaris i de Recerca. [pausa breu]</w:t>
+      </w:r>
+    </w:p>
+    <w:p>
+      <w:pPr>
+        <w:pStyle w:val="Textoindependiente"/>
+      </w:pPr>
+      <w:r>
+        <w:rPr>
+          <w:sz w:val="36"/>
+          <w:szCs w:val="36"/>
+        </w:rPr>
+        <w:t xml:space="preserve">Ho explico al principi perquè aquesta sessió està plantejada deliberadament a partir d’una doble vinculació. D’una banda, és una classe situada dins l’assignatura Disseny de Sistemes d’Informació, que imparteixo juntament amb el Dr. Josep Roure. De l’altra, parteix d’un cas professional real en l’àmbit de l’administració pública catalana. [mirada al tribunal]</w:t>
       </w:r>
     </w:p>
     <w:p>
@@ -1070,7 +1070,7 @@
           <w:sz w:val="36"/>
           <w:szCs w:val="36"/>
         </w:rPr>
-        <w:t xml:space="preserve">Per tant, aquesta no és una sessió afegida artificialment al temari. És una microlliçó versemblant dins l’assignatura. [pausa breu]</w:t>
+        <w:t xml:space="preserve">Per tant, aquesta no és una sessió afegida artificialment al temari. És una classe versemblant dins l’assignatura. [pausa breu]</w:t>
       </w:r>
     </w:p>
     <w:p>
@@ -1268,7 +1268,7 @@
           <w:sz w:val="36"/>
           <w:szCs w:val="36"/>
         </w:rPr>
-        <w:t xml:space="preserve">PICA és la Plataforma d’Integració i Col·laboració Administrativa de la Generalitat de Catalunya. Per a aquesta microlliçó, no cal entrar en tots els detalls tècnics de PICA. El que ens interessa és que actua com a mecanisme corporatiu d’interoperabilitat administrativa.</w:t>
+        <w:t xml:space="preserve">PICA és la Plataforma d’Integració i Col·laboració Administrativa de la Generalitat de Catalunya. Per a aquesta classe, no cal entrar en tots els detalls tècnics de PICA. El que ens interessa és que actua com a mecanisme corporatiu d’interoperabilitat administrativa.</w:t>
       </w:r>
     </w:p>
     <w:p>
@@ -2017,7 +2017,7 @@
           <w:sz w:val="36"/>
           <w:szCs w:val="36"/>
         </w:rPr>
-        <w:t xml:space="preserve">La demo, en aquesta microlliçó, no pretén impressionar per complexitat tècnica. Té una funció docent molt concreta: mostrar que podem mantenir el mateix cas d’ús, el mateix servei d’aplicació i el mateix domini, canviant només l’adaptador. [assenyalar les tres caixes]</w:t>
+        <w:t xml:space="preserve">La demo, en aquesta classe, no pretén impressionar per complexitat tècnica. Té una funció docent molt concreta: mostrar que podem mantenir el mateix cas d’ús, el mateix servei d’aplicació i el mateix domini, canviant només l’adaptador. [assenyalar les tres caixes]</w:t>
       </w:r>
     </w:p>
     <w:p>
@@ -2217,7 +2217,7 @@
           <w:sz w:val="36"/>
           <w:szCs w:val="36"/>
         </w:rPr>
-        <w:t xml:space="preserve">Microlliçó de DSI, no explicació completa d’arquitectura hexagonal.</w:t>
+        <w:t xml:space="preserve">Classe de DSI, no explicació completa d’arquitectura hexagonal.</w:t>
       </w:r>
     </w:p>
     <w:p>
@@ -2233,7 +2233,7 @@
           <w:sz w:val="36"/>
           <w:szCs w:val="36"/>
         </w:rPr>
-        <w:t xml:space="preserve">Informe AGAUR incorporat al tribunal: activitat real de 60 hores, maig-juliol 2025.</w:t>
+        <w:t xml:space="preserve">Informe AGAUR incorporat al tribunal: activitat de formació i consultoria especialitzada.</w:t>
       </w:r>
     </w:p>
     <w:p>
@@ -3575,7 +3575,7 @@
                 <w:sz w:val="36"/>
                 <w:szCs w:val="36"/>
               </w:rPr>
-              <w:t xml:space="preserve">La microlliçó encaixa en el pla docent</w:t>
+              <w:t xml:space="preserve">La classe encaixa en el pla docent</w:t>
             </w:r>
           </w:p>
         </w:tc>
@@ -4913,7 +4913,7 @@
           <w:sz w:val="36"/>
           <w:szCs w:val="36"/>
         </w:rPr>
-        <w:t xml:space="preserve">Risc documental: el pla docent oficial diu que la llengua de docència és l’anglès. Si surt la pregunta, la resposta prudent és que la defensa és en català i que la microlliçó és una adaptació per al context del tribunal; el contingut docent és el mateix.</w:t>
+        <w:t xml:space="preserve">Risc documental: el pla docent oficial diu que la llengua de docència és l’anglès. Si surt la pregunta, la resposta prudent és que la defensa és en català i que la classe és una adaptació per al context del tribunal; el contingut docent és el mateix.</w:t>
       </w:r>
     </w:p>
     <w:p>

</xml_diff>

<commit_message>
docs: refresh oral practice exports
</commit_message>
<xml_diff>
--- a/doc/presentations/defensa-placa-permanent-dsi-ports-sortida-hexagonal/output/REMARKABLE_materials-orals-canonics-20-minuts.docx
+++ b/doc/presentations/defensa-placa-permanent-dsi-ports-sortida-hexagonal/output/REMARKABLE_materials-orals-canonics-20-minuts.docx
@@ -2,18 +2,6 @@
 <file path=word/document.xml><?xml version="1.0" encoding="utf-8"?>
 <w:document xmlns:w="http://schemas.openxmlformats.org/wordprocessingml/2006/main">
   <w:body>
-    <w:p>
-      <w:pPr>
-        <w:pStyle w:val="Ttulo"/>
-      </w:pPr>
-      <w:r>
-        <w:t xml:space="preserve">Materials orals canònics</w:t>
-        <w:rPr>
-          <w:sz w:val="36"/>
-          <w:szCs w:val="36"/>
-        </w:rPr>
-      </w:r>
-    </w:p>
     <w:bookmarkStart w:id="38" w:name="X79cee1dd7752e91aad864bc270c2d5ac95f00d7"/>
     <w:p>
       <w:pPr>
@@ -21,10 +9,6 @@
       </w:pPr>
       <w:r>
         <w:t xml:space="preserve">Materials orals canònics per a la classe magistral de 20 minuts</w:t>
-        <w:rPr>
-          <w:sz w:val="36"/>
-          <w:szCs w:val="36"/>
-        </w:rPr>
       </w:r>
     </w:p>
     <w:p>
@@ -33,10 +17,6 @@
       </w:pPr>
       <w:r>
         <w:t xml:space="preserve">Fonts canòniques utilitzades:</w:t>
-        <w:rPr>
-          <w:sz w:val="36"/>
-          <w:szCs w:val="36"/>
-        </w:rPr>
       </w:r>
     </w:p>
     <w:p>
@@ -50,8 +30,6 @@
       <w:r>
         <w:rPr>
           <w:rStyle w:val="VerbatimChar"/>
-          <w:sz w:val="32"/>
-          <w:szCs w:val="32"/>
         </w:rPr>
         <w:t xml:space="preserve">IMPORTANTE_MANUAL_defensa-dsi-ports-sortida-hexagonal.pptx</w:t>
       </w:r>
@@ -67,8 +45,6 @@
       <w:r>
         <w:rPr>
           <w:rStyle w:val="VerbatimChar"/>
-          <w:sz w:val="32"/>
-          <w:szCs w:val="32"/>
         </w:rPr>
         <w:t xml:space="preserve">informe-acreditatiu-agaur-arquitectura-hexagonal.pdf</w:t>
       </w:r>
@@ -84,8 +60,6 @@
       <w:r>
         <w:rPr>
           <w:rStyle w:val="VerbatimChar"/>
-          <w:sz w:val="32"/>
-          <w:szCs w:val="32"/>
         </w:rPr>
         <w:t xml:space="preserve">pla-docent-dsi-103322-2025-26.pdf</w:t>
       </w:r>
@@ -101,24 +75,14 @@
       <w:r>
         <w:rPr>
           <w:rStyle w:val="VerbatimChar"/>
-          <w:sz w:val="32"/>
-          <w:szCs w:val="32"/>
         </w:rPr>
         <w:t xml:space="preserve">HexaStock_SellStocks.vpd</w:t>
       </w:r>
       <w:r>
         <w:t xml:space="preserve"> </w:t>
-        <w:rPr>
-          <w:sz w:val="32"/>
-          <w:szCs w:val="32"/>
-        </w:rPr>
       </w:r>
       <w:r>
         <w:t xml:space="preserve">i el seu render PNG equivalent</w:t>
-        <w:rPr>
-          <w:sz w:val="32"/>
-          <w:szCs w:val="32"/>
-        </w:rPr>
       </w:r>
     </w:p>
     <w:p>
@@ -132,8 +96,6 @@
       <w:r>
         <w:rPr>
           <w:rStyle w:val="VerbatimChar"/>
-          <w:sz w:val="32"/>
-          <w:szCs w:val="32"/>
         </w:rPr>
         <w:t xml:space="preserve">Get Your Hands Dirty on Clean Architecture.pdf</w:t>
       </w:r>
@@ -144,83 +106,45 @@
       </w:pPr>
       <w:r>
         <w:t xml:space="preserve">Documents antics ignorats com a font:</w:t>
-        <w:rPr>
-          <w:sz w:val="36"/>
-          <w:szCs w:val="36"/>
-        </w:rPr>
       </w:r>
       <w:r>
         <w:t xml:space="preserve"> </w:t>
-        <w:rPr>
-          <w:sz w:val="36"/>
-          <w:szCs w:val="36"/>
-        </w:rPr>
       </w:r>
       <w:r>
         <w:rPr>
           <w:rStyle w:val="VerbatimChar"/>
-          <w:sz w:val="36"/>
-          <w:szCs w:val="36"/>
         </w:rPr>
         <w:t xml:space="preserve">outline.md</w:t>
       </w:r>
       <w:r>
         <w:t xml:space="preserve">,</w:t>
-        <w:rPr>
-          <w:sz w:val="36"/>
-          <w:szCs w:val="36"/>
-        </w:rPr>
       </w:r>
       <w:r>
         <w:t xml:space="preserve"> </w:t>
-        <w:rPr>
-          <w:sz w:val="36"/>
-          <w:szCs w:val="36"/>
-        </w:rPr>
       </w:r>
       <w:r>
         <w:rPr>
           <w:rStyle w:val="VerbatimChar"/>
-          <w:sz w:val="36"/>
-          <w:szCs w:val="36"/>
         </w:rPr>
         <w:t xml:space="preserve">slide-by-slide.md</w:t>
       </w:r>
       <w:r>
         <w:t xml:space="preserve">,</w:t>
-        <w:rPr>
-          <w:sz w:val="36"/>
-          <w:szCs w:val="36"/>
-        </w:rPr>
       </w:r>
       <w:r>
         <w:t xml:space="preserve"> </w:t>
-        <w:rPr>
-          <w:sz w:val="36"/>
-          <w:szCs w:val="36"/>
-        </w:rPr>
       </w:r>
       <w:r>
         <w:rPr>
           <w:rStyle w:val="VerbatimChar"/>
-          <w:sz w:val="36"/>
-          <w:szCs w:val="36"/>
         </w:rPr>
         <w:t xml:space="preserve">guió-oral-20-minuts.md</w:t>
       </w:r>
       <w:r>
         <w:t xml:space="preserve"> </w:t>
-        <w:rPr>
-          <w:sz w:val="36"/>
-          <w:szCs w:val="36"/>
-        </w:rPr>
       </w:r>
       <w:r>
         <w:t xml:space="preserve">i altres esborranys previs.</w:t>
-        <w:rPr>
-          <w:sz w:val="36"/>
-          <w:szCs w:val="36"/>
-        </w:rPr>
       </w:r>
     </w:p>
     <w:bookmarkStart w:id="21" w:name="guió-oral-complet-imprimible"/>
@@ -230,10 +154,6 @@
       </w:pPr>
       <w:r>
         <w:t xml:space="preserve">1. Guió oral complet imprimible</w:t>
-        <w:rPr>
-          <w:sz w:val="36"/>
-          <w:szCs w:val="36"/>
-        </w:rPr>
       </w:r>
     </w:p>
     <w:p>
@@ -242,10 +162,6 @@
       </w:pPr>
       <w:r>
         <w:t xml:space="preserve">Temps total previst: 20:00.</w:t>
-        <w:rPr>
-          <w:sz w:val="36"/>
-          <w:szCs w:val="36"/>
-        </w:rPr>
       </w:r>
     </w:p>
     <w:bookmarkStart w:id="9" w:name="diapositiva-1.-portada---145"/>
@@ -255,10 +171,6 @@
       </w:pPr>
       <w:r>
         <w:t xml:space="preserve">Diapositiva 1. Portada - 1:45</w:t>
-        <w:rPr>
-          <w:sz w:val="36"/>
-          <w:szCs w:val="36"/>
-        </w:rPr>
       </w:r>
     </w:p>
     <w:p>
@@ -267,10 +179,6 @@
       </w:pPr>
       <w:r>
         <w:t xml:space="preserve">Bon dia, membres del tribunal. [pausa breu, mirada al tribunal]</w:t>
-        <w:rPr>
-          <w:sz w:val="36"/>
-          <w:szCs w:val="36"/>
-        </w:rPr>
       </w:r>
     </w:p>
     <w:p>
@@ -279,32 +187,18 @@
       </w:pPr>
       <w:r>
         <w:t xml:space="preserve">La classe que presento porta per títol</w:t>
-        <w:rPr>
-          <w:sz w:val="36"/>
-          <w:szCs w:val="36"/>
-        </w:rPr>
       </w:r>
       <w:r>
         <w:t xml:space="preserve"> </w:t>
-        <w:rPr>
-          <w:sz w:val="36"/>
-          <w:szCs w:val="36"/>
-        </w:rPr>
       </w:r>
       <w:r>
         <w:rPr>
           <w:rStyle w:val="VerbatimChar"/>
-          <w:sz w:val="36"/>
-          <w:szCs w:val="36"/>
         </w:rPr>
         <w:t xml:space="preserve">Disseny de ports de sortida en arquitectura hexagonal</w:t>
       </w:r>
       <w:r>
         <w:t xml:space="preserve">, i se centra en el desacoblament entre casos d’ús, domini i APIs externes. [assenyalar el títol]</w:t>
-        <w:rPr>
-          <w:sz w:val="36"/>
-          <w:szCs w:val="36"/>
-        </w:rPr>
       </w:r>
     </w:p>
     <w:p>
@@ -313,10 +207,6 @@
       </w:pPr>
       <w:r>
         <w:t xml:space="preserve">Abans d’entrar en el contingut tècnic, voldria fer una precisió de context. A la documentació de la convocatòria he incorporat un informe acreditatiu de la meva activitat de consultoria especialitzada per a la Generalitat de Catalunya, concretament l’Agència de Gestió d’Ajuts Universitaris i de Recerca. [pausa breu]</w:t>
-        <w:rPr>
-          <w:sz w:val="36"/>
-          <w:szCs w:val="36"/>
-        </w:rPr>
       </w:r>
     </w:p>
     <w:p>
@@ -325,10 +215,6 @@
       </w:pPr>
       <w:r>
         <w:t xml:space="preserve">Ho explico perquè em semblava molt enriquidor plantejar aquesta sessió com una trobada entre dues dimensions.</w:t>
-        <w:rPr>
-          <w:sz w:val="36"/>
-          <w:szCs w:val="36"/>
-        </w:rPr>
       </w:r>
     </w:p>
     <w:p>
@@ -337,10 +223,6 @@
       </w:pPr>
       <w:r>
         <w:t xml:space="preserve">D’una banda, la dimensió acadèmica: l’assignatura de Disseny de Sistemes d’Informació, on treballem conceptes com arquitectura hexagonal, ports, adaptadors i inversió de dependències.</w:t>
-        <w:rPr>
-          <w:sz w:val="36"/>
-          <w:szCs w:val="36"/>
-        </w:rPr>
       </w:r>
     </w:p>
     <w:p>
@@ -349,10 +231,6 @@
       </w:pPr>
       <w:r>
         <w:t xml:space="preserve">I de l’altra, la dimensió professional: un cas real que ens permet veure com aquests conceptes s’aterren en reptes concrets d’arquitectura de software. [mirada al tribunal]</w:t>
-        <w:rPr>
-          <w:sz w:val="36"/>
-          <w:szCs w:val="36"/>
-        </w:rPr>
       </w:r>
     </w:p>
     <w:p>
@@ -361,10 +239,6 @@
       </w:pPr>
       <w:r>
         <w:t xml:space="preserve">En vint minuts no seria rigorós intentar explicar tota l’arquitectura hexagonal. Per això em centraré en una decisió concreta: com dissenyar un port de sortida quan un cas d’ús necessita informació que es troba fora de l’aplicació.</w:t>
-        <w:rPr>
-          <w:sz w:val="36"/>
-          <w:szCs w:val="36"/>
-        </w:rPr>
       </w:r>
     </w:p>
     <w:bookmarkEnd w:id="9"/>
@@ -375,10 +249,6 @@
       </w:pPr>
       <w:r>
         <w:t xml:space="preserve">Diapositiva 2. On som dins l’assignatura - 1:10</w:t>
-        <w:rPr>
-          <w:sz w:val="36"/>
-          <w:szCs w:val="36"/>
-        </w:rPr>
       </w:r>
     </w:p>
     <w:p>
@@ -386,23 +256,15 @@
         <w:pStyle w:val="FirstParagraph"/>
       </w:pPr>
       <w:r>
-        <w:t xml:space="preserve">La sessió se situa dins Disseny de Sistemes d’Informació, una assignatura obligatòria de tercer curs, de 6 ECTS. [assenyalar la part esquerra]</w:t>
-        <w:rPr>
-          <w:sz w:val="36"/>
-          <w:szCs w:val="36"/>
-        </w:rPr>
-      </w:r>
-    </w:p>
-    <w:p>
-      <w:pPr>
-        <w:pStyle w:val="Textoindependiente"/>
-      </w:pPr>
-      <w:r>
-        <w:t xml:space="preserve">El pla docent de l’assignatura explica que s’hi treballa una visió global d’arquitectures de sistemes d’informació: arquitectures per capes, arquitectures clean o hexagonals, i arquitectures basades en microserveis. Dins el bloc d’arquitectures clean o hexagonals hi apareixen explícitament ports i adaptadors, mapping entre capes i organització en mòduls. [to calmat, explicatiu]</w:t>
-        <w:rPr>
-          <w:sz w:val="36"/>
-          <w:szCs w:val="36"/>
-        </w:rPr>
+        <w:t xml:space="preserve">La sessió se situa dins Disseny de Sistemes d’Informació, una assignatura de tercer curs, de 6 ECTS. [assenyalar la part esquerra]</w:t>
+      </w:r>
+    </w:p>
+    <w:p>
+      <w:pPr>
+        <w:pStyle w:val="Textoindependiente"/>
+      </w:pPr>
+      <w:r>
+        <w:t xml:space="preserve">El pla docent de l’assignatura explica que s’hi treballa una visió global d’arquitectures de sistemes d’informació: arquitectures per capes, arquitectures hexagonals, basades en microserveis. Dins el bloc d’arquitectures hexagonals hi apareixen explícitament ports i adaptadors. [to calmat, explicatiu]</w:t>
       </w:r>
     </w:p>
     <w:p>
@@ -411,22 +273,6 @@
       </w:pPr>
       <w:r>
         <w:t xml:space="preserve">Per tant, aquesta no és una sessió afegida artificialment al temari. És una classe versemblant dins l’assignatura. [pausa breu]</w:t>
-        <w:rPr>
-          <w:sz w:val="36"/>
-          <w:szCs w:val="36"/>
-        </w:rPr>
-      </w:r>
-    </w:p>
-    <w:p>
-      <w:pPr>
-        <w:pStyle w:val="Textoindependiente"/>
-      </w:pPr>
-      <w:r>
-        <w:t xml:space="preserve">El que farem avui és acotar molt el focus. No analitzarem tota l’arquitectura hexagonal. Ens centrarem en els ports de sortida: aquells ports que permeten que l’aplicació obtingui o persisteixi informació mitjançant sistemes externs, sense que el cas d’ús quedi lligat a una tecnologia concreta.</w:t>
-        <w:rPr>
-          <w:sz w:val="36"/>
-          <w:szCs w:val="36"/>
-        </w:rPr>
       </w:r>
     </w:p>
     <w:bookmarkEnd w:id="10"/>
@@ -437,10 +283,6 @@
       </w:pPr>
       <w:r>
         <w:t xml:space="preserve">Diapositiva 3. Objectiu de la sessió - 0:55</w:t>
-        <w:rPr>
-          <w:sz w:val="36"/>
-          <w:szCs w:val="36"/>
-        </w:rPr>
       </w:r>
     </w:p>
     <w:p>
@@ -449,10 +291,6 @@
       </w:pPr>
       <w:r>
         <w:t xml:space="preserve">Abans d’entrar en el cas, deixo formulat l’objectiu de la sessió. [pausa breu]</w:t>
-        <w:rPr>
-          <w:sz w:val="36"/>
-          <w:szCs w:val="36"/>
-        </w:rPr>
       </w:r>
     </w:p>
     <w:p>
@@ -461,10 +299,6 @@
       </w:pPr>
       <w:r>
         <w:t xml:space="preserve">El principi de treball és aquest: el cas d’ús necessita una capacitat, no una tecnologia. [mirar el tribunal]</w:t>
-        <w:rPr>
-          <w:sz w:val="36"/>
-          <w:szCs w:val="36"/>
-        </w:rPr>
       </w:r>
     </w:p>
     <w:p>
@@ -473,10 +307,6 @@
       </w:pPr>
       <w:r>
         <w:t xml:space="preserve">Per tant, el que aprendrem és a fer tres operacions: identificar una necessitat externa del cas d’ús, expressar-la com a port de sortida i implementar-la mitjançant adaptadors substituïbles. [assenyalar les tres caixes]</w:t>
-        <w:rPr>
-          <w:sz w:val="36"/>
-          <w:szCs w:val="36"/>
-        </w:rPr>
       </w:r>
     </w:p>
     <w:p>
@@ -485,10 +315,6 @@
       </w:pPr>
       <w:r>
         <w:t xml:space="preserve">No desenvoluparé encara tota l’abstracció. Primer veurem el problema en un cas real d’administració pública, i a partir d’aquí formularem la decisió arquitectònica. [pausa breu]</w:t>
-        <w:rPr>
-          <w:sz w:val="36"/>
-          <w:szCs w:val="36"/>
-        </w:rPr>
       </w:r>
     </w:p>
     <w:bookmarkEnd w:id="11"/>
@@ -499,10 +325,6 @@
       </w:pPr>
       <w:r>
         <w:t xml:space="preserve">Diapositiva 4. Avaluació econòmica d’una beca - 1:50</w:t>
-        <w:rPr>
-          <w:sz w:val="36"/>
-          <w:szCs w:val="36"/>
-        </w:rPr>
       </w:r>
     </w:p>
     <w:p>
@@ -511,10 +333,6 @@
       </w:pPr>
       <w:r>
         <w:t xml:space="preserve">Abans de parlar d’arquitectura de software, cal entendre mínimament el procediment administratiu. [to més lent]</w:t>
-        <w:rPr>
-          <w:sz w:val="36"/>
-          <w:szCs w:val="36"/>
-        </w:rPr>
       </w:r>
     </w:p>
     <w:p>
@@ -523,10 +341,6 @@
       </w:pPr>
       <w:r>
         <w:t xml:space="preserve">En un procediment de beca, una sol·licitud dona lloc a un expedient. Aquest expedient passa per diferents fases: requisits generals, requisits econòmics, revisió acadèmica i resolució. [assenyalar la seqüència de la dreta]</w:t>
-        <w:rPr>
-          <w:sz w:val="36"/>
-          <w:szCs w:val="36"/>
-        </w:rPr>
       </w:r>
     </w:p>
     <w:p>
@@ -535,10 +349,6 @@
       </w:pPr>
       <w:r>
         <w:t xml:space="preserve">La part que ens interessa és l’avaluació econòmica. En aquest punt es comproven aspectes com la renda familiar i el patrimoni. Quan no s’acredita el compliment dels requisits econòmics, l’expedient no obté una valoració favorable en aquesta fase. [pausa breu]</w:t>
-        <w:rPr>
-          <w:sz w:val="36"/>
-          <w:szCs w:val="36"/>
-        </w:rPr>
       </w:r>
     </w:p>
     <w:p>
@@ -547,10 +357,6 @@
       </w:pPr>
       <w:r>
         <w:t xml:space="preserve">La idea docent important és que aquí encara no hem parlat de SOAP, ni de REST, ni de PICA, ni de cap base de dades. Estem parlant de la necessitat funcional del procediment: per poder aplicar uns criteris econòmics, el sistema necessita dades fiables sobre renda i patrimoni.</w:t>
-        <w:rPr>
-          <w:sz w:val="36"/>
-          <w:szCs w:val="36"/>
-        </w:rPr>
       </w:r>
     </w:p>
     <w:p>
@@ -559,10 +365,6 @@
       </w:pPr>
       <w:r>
         <w:t xml:space="preserve">Aquest pas és essencial. Si comencem directament per la tecnologia, correm el risc de construir el cas d’ús al voltant de la integració. En canvi, si comencem pel procediment, podem distingir entre la decisió administrativa que volem modelar i el mecanisme tècnic que ens proporciona la informació.</w:t>
-        <w:rPr>
-          <w:sz w:val="36"/>
-          <w:szCs w:val="36"/>
-        </w:rPr>
       </w:r>
     </w:p>
     <w:bookmarkEnd w:id="12"/>
@@ -573,10 +375,6 @@
       </w:pPr>
       <w:r>
         <w:t xml:space="preserve">Diapositiva 5. Quina informació externa necessita el procediment? - 2:00</w:t>
-        <w:rPr>
-          <w:sz w:val="36"/>
-          <w:szCs w:val="36"/>
-        </w:rPr>
       </w:r>
     </w:p>
     <w:p>
@@ -585,10 +383,6 @@
       </w:pPr>
       <w:r>
         <w:t xml:space="preserve">Per avaluar renda i patrimoni, el procediment pot necessitar informació que no neix dins l’aplicació. [assenyalar la columna de necessitats]</w:t>
-        <w:rPr>
-          <w:sz w:val="36"/>
-          <w:szCs w:val="36"/>
-        </w:rPr>
       </w:r>
     </w:p>
     <w:p>
@@ -597,10 +391,6 @@
       </w:pPr>
       <w:r>
         <w:t xml:space="preserve">En termes funcionals, podem parlar de renda familiar, patrimoni i béns immobles. En termes de fonts administratives, apareixen organismes i plataformes com l’AEAT, el Cadastre i PICA. [assenyalar la columna de fonts]</w:t>
-        <w:rPr>
-          <w:sz w:val="36"/>
-          <w:szCs w:val="36"/>
-        </w:rPr>
       </w:r>
     </w:p>
     <w:p>
@@ -609,10 +399,6 @@
       </w:pPr>
       <w:r>
         <w:t xml:space="preserve">PICA és la Plataforma d’Integració i Col·laboració Administrativa de la Generalitat de Catalunya. Per a aquesta classe, no cal entrar en tots els detalls tècnics de PICA. El que ens interessa és que actua com a mecanisme corporatiu d’interoperabilitat administrativa.</w:t>
-        <w:rPr>
-          <w:sz w:val="36"/>
-          <w:szCs w:val="36"/>
-        </w:rPr>
       </w:r>
     </w:p>
     <w:p>
@@ -621,10 +407,6 @@
       </w:pPr>
       <w:r>
         <w:t xml:space="preserve">La distinció clau és aquesta: el procediment necessita informació administrativa; no necessita, en el seu llenguatge propi, una API concreta. [pausa llarga; mirar el tribunal]</w:t>
-        <w:rPr>
-          <w:sz w:val="36"/>
-          <w:szCs w:val="36"/>
-        </w:rPr>
       </w:r>
     </w:p>
     <w:p>
@@ -633,10 +415,6 @@
       </w:pPr>
       <w:r>
         <w:t xml:space="preserve">Això no vol dir que el mecanisme tècnic concret no sigui important. Ho és, i molt. Però encara no som en aquest nivell de decisió. En aquest moment, el que volem destacar és que el cas d’ús ha d’expressar una necessitat del procediment, no una dependència tecnològica concreta.</w:t>
-        <w:rPr>
-          <w:sz w:val="36"/>
-          <w:szCs w:val="36"/>
-        </w:rPr>
       </w:r>
     </w:p>
     <w:p>
@@ -645,32 +423,18 @@
       </w:pPr>
       <w:r>
         <w:t xml:space="preserve">El cas d’ús hauria de poder formular-se així:</w:t>
-        <w:rPr>
-          <w:sz w:val="36"/>
-          <w:szCs w:val="36"/>
-        </w:rPr>
       </w:r>
       <w:r>
         <w:t xml:space="preserve"> </w:t>
-        <w:rPr>
-          <w:sz w:val="36"/>
-          <w:szCs w:val="36"/>
-        </w:rPr>
       </w:r>
       <w:r>
         <w:rPr>
           <w:rStyle w:val="VerbatimChar"/>
-          <w:sz w:val="36"/>
-          <w:szCs w:val="36"/>
         </w:rPr>
         <w:t xml:space="preserve">necessito informació patrimonial avaluable</w:t>
       </w:r>
       <w:r>
         <w:t xml:space="preserve">. Encara no estem decidint si aquesta informació arribarà a través de PICA, d’un servei SOAP, d’una API REST, d’un certificat, d’una base de dades corporativa o d’un altre mecanisme futur.</w:t>
-        <w:rPr>
-          <w:sz w:val="36"/>
-          <w:szCs w:val="36"/>
-        </w:rPr>
       </w:r>
     </w:p>
     <w:p>
@@ -679,10 +443,6 @@
       </w:pPr>
       <w:r>
         <w:t xml:space="preserve">Quan aquesta separació no es respecta, apareix el problema arquitectònic que veurem ara.</w:t>
-        <w:rPr>
-          <w:sz w:val="36"/>
-          <w:szCs w:val="36"/>
-        </w:rPr>
       </w:r>
     </w:p>
     <w:bookmarkEnd w:id="13"/>
@@ -693,10 +453,6 @@
       </w:pPr>
       <w:r>
         <w:t xml:space="preserve">Diapositiva 6. Dependència directa entre procediment i integració - 2:10</w:t>
-        <w:rPr>
-          <w:sz w:val="36"/>
-          <w:szCs w:val="36"/>
-        </w:rPr>
       </w:r>
     </w:p>
     <w:p>
@@ -705,10 +461,6 @@
       </w:pPr>
       <w:r>
         <w:t xml:space="preserve">Imaginem una situació en què el cas d’ús queda vinculat directament a la cadena tècnica: SOAP/XML, PICA, AEAT o Cadastre. [assenyalar la cadena central]</w:t>
-        <w:rPr>
-          <w:sz w:val="36"/>
-          <w:szCs w:val="36"/>
-        </w:rPr>
       </w:r>
     </w:p>
     <w:p>
@@ -717,10 +469,6 @@
       </w:pPr>
       <w:r>
         <w:t xml:space="preserve">El problema no és consumir PICA. Ho remarco perquè és important. PICA, en aquest context, és una plataforma corporativa d’interoperabilitat. El problema arquitectònic apareix quan la lògica del procediment administratiu depèn directament dels detalls de la integració: DTOs externs, estructures XML, clients SOAP, codis d’error tècnics o convencions d’una API concreta. [pausa breu]</w:t>
-        <w:rPr>
-          <w:sz w:val="36"/>
-          <w:szCs w:val="36"/>
-        </w:rPr>
       </w:r>
     </w:p>
     <w:p>
@@ -729,10 +477,6 @@
       </w:pPr>
       <w:r>
         <w:t xml:space="preserve">Quan això passa, l’evolució tecnològica travessa la frontera del cas d’ús. Si un servei evoluciona, si canvia el contracte tècnic, si cal passar de SOAP a REST, o si apareix un altre mecanisme corporatiu, el canvi pot impactar codi que hauria d’estar expressant criteris del procediment.</w:t>
-        <w:rPr>
-          <w:sz w:val="36"/>
-          <w:szCs w:val="36"/>
-        </w:rPr>
       </w:r>
     </w:p>
     <w:p>
@@ -741,10 +485,6 @@
       </w:pPr>
       <w:r>
         <w:t xml:space="preserve">Des del punt de vista de l’enginyeria de software, això incrementa tres riscos. Primer, acoblament tecnològic: el cas d’ús coneix massa detalls externs. Segon, fragilitat del manteniment: canvis d’infraestructura obliguen a revisar lògica d’aplicació. I tercer, risc de continuïtat operativa: una evolució tècnica pot afectar un procediment que hauria de romandre estable. [assenyalar les tres caixes]</w:t>
-        <w:rPr>
-          <w:sz w:val="36"/>
-          <w:szCs w:val="36"/>
-        </w:rPr>
       </w:r>
     </w:p>
     <w:p>
@@ -753,10 +493,6 @@
       </w:pPr>
       <w:r>
         <w:t xml:space="preserve">La pregunta docent, per tant, és: com podem permetre que el cas d’ús necessiti dades externes, però sense dependre directament de la tecnologia que les proporciona?</w:t>
-        <w:rPr>
-          <w:sz w:val="36"/>
-          <w:szCs w:val="36"/>
-        </w:rPr>
       </w:r>
     </w:p>
     <w:p>
@@ -765,10 +501,6 @@
       </w:pPr>
       <w:r>
         <w:t xml:space="preserve">La resposta és introduir un port de sortida.</w:t>
-        <w:rPr>
-          <w:sz w:val="36"/>
-          <w:szCs w:val="36"/>
-        </w:rPr>
       </w:r>
     </w:p>
     <w:bookmarkEnd w:id="14"/>
@@ -779,10 +511,6 @@
       </w:pPr>
       <w:r>
         <w:t xml:space="preserve">Diapositiva 7. Port de sortida i adaptador - 0:55</w:t>
-        <w:rPr>
-          <w:sz w:val="36"/>
-          <w:szCs w:val="36"/>
-        </w:rPr>
       </w:r>
     </w:p>
     <w:p>
@@ -791,10 +519,6 @@
       </w:pPr>
       <w:r>
         <w:t xml:space="preserve">Abans d’aplicar-ho al cas patrimonial, fixem una distinció important.</w:t>
-        <w:rPr>
-          <w:sz w:val="36"/>
-          <w:szCs w:val="36"/>
-        </w:rPr>
       </w:r>
     </w:p>
     <w:p>
@@ -803,10 +527,6 @@
       </w:pPr>
       <w:r>
         <w:t xml:space="preserve">Una cosa és el flux d’execució: el cas d’ús demana una informació i aquesta informació pot acabar venint d’un sistema extern. [assenyalar la primera línia]</w:t>
-        <w:rPr>
-          <w:sz w:val="36"/>
-          <w:szCs w:val="36"/>
-        </w:rPr>
       </w:r>
     </w:p>
     <w:p>
@@ -815,10 +535,6 @@
       </w:pPr>
       <w:r>
         <w:t xml:space="preserve">Una altra cosa és la dependència de codi: el cas d’ús depèn del port, i l’adaptador implementa aquest port. [assenyalar la segona línia]</w:t>
-        <w:rPr>
-          <w:sz w:val="36"/>
-          <w:szCs w:val="36"/>
-        </w:rPr>
       </w:r>
     </w:p>
     <w:p>
@@ -827,10 +543,6 @@
       </w:pPr>
       <w:r>
         <w:t xml:space="preserve">Aquesta és la inversió de dependències: la infraestructura depèn del port definit per l’aplicació, no a l’inrevés. [mirada al tribunal]</w:t>
-        <w:rPr>
-          <w:sz w:val="36"/>
-          <w:szCs w:val="36"/>
-        </w:rPr>
       </w:r>
     </w:p>
     <w:p>
@@ -839,10 +551,6 @@
       </w:pPr>
       <w:r>
         <w:t xml:space="preserve">Amb aquesta idea clara, ara podem portar el patró al cas administratiu.</w:t>
-        <w:rPr>
-          <w:sz w:val="36"/>
-          <w:szCs w:val="36"/>
-        </w:rPr>
       </w:r>
     </w:p>
     <w:bookmarkEnd w:id="15"/>
@@ -853,10 +561,6 @@
       </w:pPr>
       <w:r>
         <w:t xml:space="preserve">Diapositiva 8. Port de sortida per a informació patrimonial - 2:05</w:t>
-        <w:rPr>
-          <w:sz w:val="36"/>
-          <w:szCs w:val="36"/>
-        </w:rPr>
       </w:r>
     </w:p>
     <w:p>
@@ -865,10 +569,6 @@
       </w:pPr>
       <w:r>
         <w:t xml:space="preserve">Portem aquesta idea al cas administratiu. [assenyalar el diagrama]</w:t>
-        <w:rPr>
-          <w:sz w:val="36"/>
-          <w:szCs w:val="36"/>
-        </w:rPr>
       </w:r>
     </w:p>
     <w:p>
@@ -877,10 +577,6 @@
       </w:pPr>
       <w:r>
         <w:t xml:space="preserve">El servei d’aplicació que avalua econòmicament una beca no hauria de conèixer directament els detalls de PICA, SOAP/XML, REST o JDBC. Hauria de dependre d’un contracte expressat en el llenguatge de l’aplicació. Per exemple: obtenir informació patrimonial, recuperar dades de renda o carregar l’expedient administratiu.</w:t>
-        <w:rPr>
-          <w:sz w:val="36"/>
-          <w:szCs w:val="36"/>
-        </w:rPr>
       </w:r>
     </w:p>
     <w:p>
@@ -889,10 +585,6 @@
       </w:pPr>
       <w:r>
         <w:t xml:space="preserve">En el diagrama, el nucli de l’aplicació conté el servei d’aplicació i el model de domini. Al voltant hi ha ports: un port d’entrada per invocar el cas d’ús i ports de sortida per obtenir o persistir informació. Fora del nucli hi ha els adaptadors: el controlador REST, l’adaptador JDBC, l’adaptador d’interoperabilitat amb PICA o qualsevol altre mecanisme concret.</w:t>
-        <w:rPr>
-          <w:sz w:val="36"/>
-          <w:szCs w:val="36"/>
-        </w:rPr>
       </w:r>
     </w:p>
     <w:p>
@@ -901,10 +593,6 @@
       </w:pPr>
       <w:r>
         <w:t xml:space="preserve">El punt tècnic més important és que l’adaptador de PICA o l’adaptador JDBC no són el centre de l’arquitectura. Són substituïbles. El que és estable és el contracte que el cas d’ús necessita. [pausa breu]</w:t>
-        <w:rPr>
-          <w:sz w:val="36"/>
-          <w:szCs w:val="36"/>
-        </w:rPr>
       </w:r>
     </w:p>
     <w:p>
@@ -913,32 +601,18 @@
       </w:pPr>
       <w:r>
         <w:t xml:space="preserve">Aquesta distinció queda reflectida en la direcció de les fletxes. Quan indiquen</w:t>
-        <w:rPr>
-          <w:sz w:val="36"/>
-          <w:szCs w:val="36"/>
-        </w:rPr>
       </w:r>
       <w:r>
         <w:t xml:space="preserve"> </w:t>
-        <w:rPr>
-          <w:sz w:val="36"/>
-          <w:szCs w:val="36"/>
-        </w:rPr>
       </w:r>
       <w:r>
         <w:rPr>
           <w:rStyle w:val="VerbatimChar"/>
-          <w:sz w:val="36"/>
-          <w:szCs w:val="36"/>
         </w:rPr>
         <w:t xml:space="preserve">implemented by</w:t>
       </w:r>
       <w:r>
         <w:t xml:space="preserve">, les fletxes van de l’adaptador cap al port. El servei usa el port. L’adaptador implementa el port. I el domini no coneix ni l’adaptador, ni PICA, ni SOAP, ni REST.</w:t>
-        <w:rPr>
-          <w:sz w:val="36"/>
-          <w:szCs w:val="36"/>
-        </w:rPr>
       </w:r>
     </w:p>
     <w:p>
@@ -947,10 +621,6 @@
       </w:pPr>
       <w:r>
         <w:t xml:space="preserve">Aquesta mateixa estructura la podem transferir ara a un domini diferent: una aplicació de gestió d’una cartera d’inversió personal.</w:t>
-        <w:rPr>
-          <w:sz w:val="36"/>
-          <w:szCs w:val="36"/>
-        </w:rPr>
       </w:r>
     </w:p>
     <w:bookmarkEnd w:id="16"/>
@@ -961,10 +631,6 @@
       </w:pPr>
       <w:r>
         <w:t xml:space="preserve">Diapositiva 9. Transferència a domini financer - 1:45</w:t>
-        <w:rPr>
-          <w:sz w:val="36"/>
-          <w:szCs w:val="36"/>
-        </w:rPr>
       </w:r>
     </w:p>
     <w:p>
@@ -973,10 +639,6 @@
       </w:pPr>
       <w:r>
         <w:t xml:space="preserve">Ara fem un canvi de domini. Ja no parlem d’una sol·licitud de beca, sinó d’una aplicació de gestió d’una cartera d’inversió personal. [assenyalar el títol]</w:t>
-        <w:rPr>
-          <w:sz w:val="36"/>
-          <w:szCs w:val="36"/>
-        </w:rPr>
       </w:r>
     </w:p>
     <w:p>
@@ -985,10 +647,6 @@
       </w:pPr>
       <w:r>
         <w:t xml:space="preserve">El diagrama que veiem ja correspon al projecte que utilitzaré després a la demo. Ara, però, no em centraré en els noms concrets; el que m’interessa és reconèixer el mateix patró: cas d’ús, port de sortida i adaptadors substituïbles.</w:t>
-        <w:rPr>
-          <w:sz w:val="36"/>
-          <w:szCs w:val="36"/>
-        </w:rPr>
       </w:r>
     </w:p>
     <w:p>
@@ -997,10 +655,6 @@
       </w:pPr>
       <w:r>
         <w:t xml:space="preserve">Imaginem un cas d’ús molt concret: vendre accions d’una cartera. Per executar aquesta operació correctament, l’aplicació pot necessitar consultar el preu actual de l’acció que l’usuari vol vendre.</w:t>
-        <w:rPr>
-          <w:sz w:val="36"/>
-          <w:szCs w:val="36"/>
-        </w:rPr>
       </w:r>
     </w:p>
     <w:p>
@@ -1009,32 +663,18 @@
       </w:pPr>
       <w:r>
         <w:t xml:space="preserve">Ara bé, el cas d’ús no hauria de dependre directament d’un proveïdor concret de dades financeres, ni d’una API específica, ni del format tècnic de la resposta. El cas d’ús només hauria d’expressar la seva necessitat:</w:t>
-        <w:rPr>
-          <w:sz w:val="36"/>
-          <w:szCs w:val="36"/>
-        </w:rPr>
       </w:r>
       <w:r>
         <w:t xml:space="preserve"> </w:t>
-        <w:rPr>
-          <w:sz w:val="36"/>
-          <w:szCs w:val="36"/>
-        </w:rPr>
       </w:r>
       <w:r>
         <w:rPr>
           <w:rStyle w:val="VerbatimChar"/>
-          <w:sz w:val="36"/>
-          <w:szCs w:val="36"/>
         </w:rPr>
         <w:t xml:space="preserve">necessito obtenir el preu actual d'una acció concreta</w:t>
       </w:r>
       <w:r>
         <w:t xml:space="preserve">.</w:t>
-        <w:rPr>
-          <w:sz w:val="36"/>
-          <w:szCs w:val="36"/>
-        </w:rPr>
       </w:r>
     </w:p>
     <w:p>
@@ -1043,10 +683,6 @@
       </w:pPr>
       <w:r>
         <w:t xml:space="preserve">Aquesta necessitat es pot representar amb un port de sortida. Aquest port no diu quin proveïdor s’ha de consultar, ni quin endpoint s’ha d’utilitzar, ni si la resposta vindrà en JSON, XML o qualsevol altre format. Només defineix una capacitat que l’aplicació necessita.</w:t>
-        <w:rPr>
-          <w:sz w:val="36"/>
-          <w:szCs w:val="36"/>
-        </w:rPr>
       </w:r>
     </w:p>
     <w:p>
@@ -1055,10 +691,6 @@
       </w:pPr>
       <w:r>
         <w:t xml:space="preserve">L’adaptador serà la peça que implementarà aquest port i coneixerà el detall tècnic concret: quin servei extern es consulta, com es fa la petició, quin format retorna la resposta i com es transforma aquesta informació perquè el cas d’ús la pugui utilitzar.</w:t>
-        <w:rPr>
-          <w:sz w:val="36"/>
-          <w:szCs w:val="36"/>
-        </w:rPr>
       </w:r>
     </w:p>
     <w:p>
@@ -1067,10 +699,6 @@
       </w:pPr>
       <w:r>
         <w:t xml:space="preserve">El patró és idèntic al cas AGAUR. En el cas administratiu, el procediment necessita informació patrimonial, no una tecnologia concreta. En el domini financer, el cas d’ús necessita un preu actual, no un proveïdor concret. [mirada al tribunal]</w:t>
-        <w:rPr>
-          <w:sz w:val="36"/>
-          <w:szCs w:val="36"/>
-        </w:rPr>
       </w:r>
     </w:p>
     <w:p>
@@ -1079,10 +707,6 @@
       </w:pPr>
       <w:r>
         <w:t xml:space="preserve">Per tant, el missatge docent és transferible: primer identifiquem la necessitat funcional; després definim el port; finalment implementem adaptadors.</w:t>
-        <w:rPr>
-          <w:sz w:val="36"/>
-          <w:szCs w:val="36"/>
-        </w:rPr>
       </w:r>
     </w:p>
     <w:bookmarkEnd w:id="17"/>
@@ -1093,10 +717,6 @@
       </w:pPr>
       <w:r>
         <w:t xml:space="preserve">Diapositiva 10. Flux i codi essencial - 1:45</w:t>
-        <w:rPr>
-          <w:sz w:val="36"/>
-          <w:szCs w:val="36"/>
-        </w:rPr>
       </w:r>
     </w:p>
     <w:p>
@@ -1105,10 +725,6 @@
       </w:pPr>
       <w:r>
         <w:t xml:space="preserve">A partir d’aquí ja podem baixar al projecte concret de la demo: HexaStock. Aquesta diapositiva mostra el flux temporal del cas d’ús de venda. [assenyalar el diagrama de seqüència]</w:t>
-        <w:rPr>
-          <w:sz w:val="36"/>
-          <w:szCs w:val="36"/>
-        </w:rPr>
       </w:r>
     </w:p>
     <w:p>
@@ -1117,10 +733,6 @@
       </w:pPr>
       <w:r>
         <w:t xml:space="preserve">Convé aclarir que, en un diagrama de seqüència, les fletxes representen ordre d’execució, no dependències de codi. Això és perfectament compatible amb la inversió de dependències que acabem d’explicar.</w:t>
-        <w:rPr>
-          <w:sz w:val="36"/>
-          <w:szCs w:val="36"/>
-        </w:rPr>
       </w:r>
     </w:p>
     <w:p>
@@ -1129,54 +741,30 @@
       </w:pPr>
       <w:r>
         <w:t xml:space="preserve">El client o controlador invoca el port d’entrada,</w:t>
-        <w:rPr>
-          <w:sz w:val="36"/>
-          <w:szCs w:val="36"/>
-        </w:rPr>
       </w:r>
       <w:r>
         <w:t xml:space="preserve"> </w:t>
-        <w:rPr>
-          <w:sz w:val="36"/>
-          <w:szCs w:val="36"/>
-        </w:rPr>
       </w:r>
       <w:r>
         <w:rPr>
           <w:rStyle w:val="VerbatimChar"/>
-          <w:sz w:val="36"/>
-          <w:szCs w:val="36"/>
         </w:rPr>
         <w:t xml:space="preserve">PortfolioStockOperationsUseCase</w:t>
       </w:r>
       <w:r>
         <w:t xml:space="preserve">. La implementació és el servei d’aplicació,</w:t>
-        <w:rPr>
-          <w:sz w:val="36"/>
-          <w:szCs w:val="36"/>
-        </w:rPr>
       </w:r>
       <w:r>
         <w:t xml:space="preserve"> </w:t>
-        <w:rPr>
-          <w:sz w:val="36"/>
-          <w:szCs w:val="36"/>
-        </w:rPr>
       </w:r>
       <w:r>
         <w:rPr>
           <w:rStyle w:val="VerbatimChar"/>
-          <w:sz w:val="36"/>
-          <w:szCs w:val="36"/>
         </w:rPr>
         <w:t xml:space="preserve">PortfolioStockOperationsService</w:t>
       </w:r>
       <w:r>
         <w:t xml:space="preserve">. Aquest servei recupera el portfolio mitjançant un port de persistència, consulta el preu mitjançant el port de preus, i després crida el domini amb l’acció, la quantitat i el preu. [pausa breu]</w:t>
-        <w:rPr>
-          <w:sz w:val="36"/>
-          <w:szCs w:val="36"/>
-        </w:rPr>
       </w:r>
     </w:p>
     <w:p>
@@ -1185,32 +773,18 @@
       </w:pPr>
       <w:r>
         <w:t xml:space="preserve">La separació de responsabilitats és molt important. El servei coordina. El port obté informació. L’adaptador integra amb la infraestructura. Però la decisió de domini, la venda i el càlcul del resultat, no es resolen ni al controlador ni a l’adaptador de preus. Es resolen al model de domini, dins l’agregat</w:t>
-        <w:rPr>
-          <w:sz w:val="36"/>
-          <w:szCs w:val="36"/>
-        </w:rPr>
       </w:r>
       <w:r>
         <w:t xml:space="preserve"> </w:t>
-        <w:rPr>
-          <w:sz w:val="36"/>
-          <w:szCs w:val="36"/>
-        </w:rPr>
       </w:r>
       <w:r>
         <w:rPr>
           <w:rStyle w:val="VerbatimChar"/>
-          <w:sz w:val="36"/>
-          <w:szCs w:val="36"/>
         </w:rPr>
         <w:t xml:space="preserve">Portfolio</w:t>
       </w:r>
       <w:r>
         <w:t xml:space="preserve">.</w:t>
-        <w:rPr>
-          <w:sz w:val="36"/>
-          <w:szCs w:val="36"/>
-        </w:rPr>
       </w:r>
     </w:p>
     <w:p>
@@ -1219,10 +793,6 @@
       </w:pPr>
       <w:r>
         <w:t xml:space="preserve">Dit de manera sintètica: l’adaptador pot saber com obtenir un preu; no hauria de decidir com es ven una acció dins la cartera. [pausa]</w:t>
-        <w:rPr>
-          <w:sz w:val="36"/>
-          <w:szCs w:val="36"/>
-        </w:rPr>
       </w:r>
     </w:p>
     <w:bookmarkEnd w:id="18"/>
@@ -1233,10 +803,6 @@
       </w:pPr>
       <w:r>
         <w:t xml:space="preserve">Diapositiva 11. Demo - 1:45</w:t>
-        <w:rPr>
-          <w:sz w:val="36"/>
-          <w:szCs w:val="36"/>
-        </w:rPr>
       </w:r>
     </w:p>
     <w:p>
@@ -1245,10 +811,6 @@
       </w:pPr>
       <w:r>
         <w:t xml:space="preserve">La demo, en aquesta classe, no pretén impressionar per complexitat tècnica. Té una funció docent molt concreta: mostrar que podem mantenir el mateix cas d’ús, el mateix servei d’aplicació i el mateix domini, canviant només l’adaptador. [assenyalar les tres caixes]</w:t>
-        <w:rPr>
-          <w:sz w:val="36"/>
-          <w:szCs w:val="36"/>
-        </w:rPr>
       </w:r>
     </w:p>
     <w:p>
@@ -1257,32 +819,18 @@
       </w:pPr>
       <w:r>
         <w:t xml:space="preserve">En HexaStock, això es pot veure amb perfils diferents: un adaptador Finnhub, un adaptador Alpha Vantage o un adaptador mock. El port que veu el servei és el mateix:</w:t>
-        <w:rPr>
-          <w:sz w:val="36"/>
-          <w:szCs w:val="36"/>
-        </w:rPr>
       </w:r>
       <w:r>
         <w:t xml:space="preserve"> </w:t>
-        <w:rPr>
-          <w:sz w:val="36"/>
-          <w:szCs w:val="36"/>
-        </w:rPr>
       </w:r>
       <w:r>
         <w:rPr>
           <w:rStyle w:val="VerbatimChar"/>
-          <w:sz w:val="36"/>
-          <w:szCs w:val="36"/>
         </w:rPr>
         <w:t xml:space="preserve">StockPriceProviderPort</w:t>
       </w:r>
       <w:r>
         <w:t xml:space="preserve">. La implementació concreta canvia segons la configuració.</w:t>
-        <w:rPr>
-          <w:sz w:val="36"/>
-          <w:szCs w:val="36"/>
-        </w:rPr>
       </w:r>
     </w:p>
     <w:p>
@@ -1291,10 +839,6 @@
       </w:pPr>
       <w:r>
         <w:t xml:space="preserve">Aquests noms són implementacions concretes. El que vull que observeu és que el contracte que veu el cas d’ús no canvia.</w:t>
-        <w:rPr>
-          <w:sz w:val="36"/>
-          <w:szCs w:val="36"/>
-        </w:rPr>
       </w:r>
     </w:p>
     <w:p>
@@ -1303,10 +847,6 @@
       </w:pPr>
       <w:r>
         <w:t xml:space="preserve">Aquest punt és especialment rellevant en docència. Permet fer proves amb un adaptador mock, sense claus reals, sense disponibilitat d’un proveïdor extern i sense contaminar el domini amb detalls tècnics. [mirada al tribunal]</w:t>
-        <w:rPr>
-          <w:sz w:val="36"/>
-          <w:szCs w:val="36"/>
-        </w:rPr>
       </w:r>
     </w:p>
     <w:p>
@@ -1315,10 +855,6 @@
       </w:pPr>
       <w:r>
         <w:t xml:space="preserve">El missatge de la demo és el mateix que hem treballat des del principi: canvia la infraestructura; el cas d’ús i el domini romanen estables.</w:t>
-        <w:rPr>
-          <w:sz w:val="36"/>
-          <w:szCs w:val="36"/>
-        </w:rPr>
       </w:r>
     </w:p>
     <w:p>
@@ -1327,10 +863,6 @@
       </w:pPr>
       <w:r>
         <w:t xml:space="preserve">Això no vol dir que l’arquitectura elimini el canvi. El canvi continua existint. El que fa una bona arquitectura és localitzar-lo.</w:t>
-        <w:rPr>
-          <w:sz w:val="36"/>
-          <w:szCs w:val="36"/>
-        </w:rPr>
       </w:r>
     </w:p>
     <w:bookmarkEnd w:id="19"/>
@@ -1341,10 +873,6 @@
       </w:pPr>
       <w:r>
         <w:t xml:space="preserve">Diapositiva 12. Agraïment - 1:20</w:t>
-        <w:rPr>
-          <w:sz w:val="36"/>
-          <w:szCs w:val="36"/>
-        </w:rPr>
       </w:r>
     </w:p>
     <w:p>
@@ -1353,10 +881,6 @@
       </w:pPr>
       <w:r>
         <w:t xml:space="preserve">Per tancar, voldria recuperar aquesta idea final. [pausa breu]</w:t>
-        <w:rPr>
-          <w:sz w:val="36"/>
-          <w:szCs w:val="36"/>
-        </w:rPr>
       </w:r>
     </w:p>
     <w:p>
@@ -1365,10 +889,6 @@
       </w:pPr>
       <w:r>
         <w:t xml:space="preserve">L’arquitectura no elimina la dependència del món exterior. Les aplicacions reals necessiten bases de dades, APIs, plataformes corporatives, proveïdors externs i mecanismes d’integració. El que fa l’arquitectura hexagonal és convertir aquesta dependència en una frontera explícita, substituïble i comprovable.</w:t>
-        <w:rPr>
-          <w:sz w:val="36"/>
-          <w:szCs w:val="36"/>
-        </w:rPr>
       </w:r>
     </w:p>
     <w:p>
@@ -1377,10 +897,6 @@
       </w:pPr>
       <w:r>
         <w:t xml:space="preserve">Quan canvia un proveïdor, una API o una tecnologia, volem canviar l’adaptador. No volem reescriure el cas d’ús ni deformar el model de domini. [pausa]</w:t>
-        <w:rPr>
-          <w:sz w:val="36"/>
-          <w:szCs w:val="36"/>
-        </w:rPr>
       </w:r>
     </w:p>
     <w:p>
@@ -1389,10 +905,6 @@
       </w:pPr>
       <w:r>
         <w:t xml:space="preserve">Vull expressar el meu agraïment al TecnoCampus per un entorn que m’encoratja a créixer, tant en la docència com en l’àmbit acadèmic, al costat d’un equip del qual aprenc i amb qui comparteixo coneixement, responsabilitat i compromís amb la formació universitària. [pausa breu; mirar el tribunal]</w:t>
-        <w:rPr>
-          <w:sz w:val="36"/>
-          <w:szCs w:val="36"/>
-        </w:rPr>
       </w:r>
     </w:p>
     <w:p>
@@ -1401,10 +913,6 @@
       </w:pPr>
       <w:r>
         <w:t xml:space="preserve">També vull fer un agraïment especial al Dr. Josep Roure, company professor del TecnoCampus, amb qui he tingut l’oportunitat d’aprendre sobre arquitectura de software, metodologies actives d’aprenentatge i treball en equip. [mirada al tribunal]</w:t>
-        <w:rPr>
-          <w:sz w:val="36"/>
-          <w:szCs w:val="36"/>
-        </w:rPr>
       </w:r>
     </w:p>
     <w:p>
@@ -1413,10 +921,6 @@
       </w:pPr>
       <w:r>
         <w:t xml:space="preserve">Moltes gràcies.</w:t>
-        <w:rPr>
-          <w:sz w:val="36"/>
-          <w:szCs w:val="36"/>
-        </w:rPr>
       </w:r>
     </w:p>
     <w:bookmarkEnd w:id="20"/>
@@ -1428,10 +932,6 @@
       </w:pPr>
       <w:r>
         <w:t xml:space="preserve">2. Notes del presentador per diapositiva</w:t>
-        <w:rPr>
-          <w:sz w:val="36"/>
-          <w:szCs w:val="36"/>
-        </w:rPr>
       </w:r>
     </w:p>
     <w:bookmarkStart w:id="22" w:name="portada---145"/>
@@ -1441,10 +941,6 @@
       </w:pPr>
       <w:r>
         <w:t xml:space="preserve">1. Portada - 1:45</w:t>
-        <w:rPr>
-          <w:sz w:val="36"/>
-          <w:szCs w:val="36"/>
-        </w:rPr>
       </w:r>
     </w:p>
     <w:p>
@@ -1457,10 +953,6 @@
       </w:pPr>
       <w:r>
         <w:t xml:space="preserve">Classe de DSI, no explicació completa d’arquitectura hexagonal.</w:t>
-        <w:rPr>
-          <w:sz w:val="32"/>
-          <w:szCs w:val="32"/>
-        </w:rPr>
       </w:r>
     </w:p>
     <w:p>
@@ -1473,10 +965,6 @@
       </w:pPr>
       <w:r>
         <w:t xml:space="preserve">Informe incorporat a la documentació de la convocatòria: consultoria especialitzada per a la Generalitat/AGAUR.</w:t>
-        <w:rPr>
-          <w:sz w:val="32"/>
-          <w:szCs w:val="32"/>
-        </w:rPr>
       </w:r>
     </w:p>
     <w:p>
@@ -1489,10 +977,6 @@
       </w:pPr>
       <w:r>
         <w:t xml:space="preserve">Trobada entre dimensió acadèmica i dimensió professional.</w:t>
-        <w:rPr>
-          <w:sz w:val="32"/>
-          <w:szCs w:val="32"/>
-        </w:rPr>
       </w:r>
     </w:p>
     <w:p>
@@ -1505,10 +989,6 @@
       </w:pPr>
       <w:r>
         <w:t xml:space="preserve">Cas real com a base docent, sense entrar en detalls interns.</w:t>
-        <w:rPr>
-          <w:sz w:val="32"/>
-          <w:szCs w:val="32"/>
-        </w:rPr>
       </w:r>
     </w:p>
     <w:p>
@@ -1521,10 +1001,6 @@
       </w:pPr>
       <w:r>
         <w:t xml:space="preserve">Transició: ens centrarem en una decisió concreta, el port de sortida.</w:t>
-        <w:rPr>
-          <w:sz w:val="32"/>
-          <w:szCs w:val="32"/>
-        </w:rPr>
       </w:r>
     </w:p>
     <w:bookmarkEnd w:id="22"/>
@@ -1535,10 +1011,6 @@
       </w:pPr>
       <w:r>
         <w:t xml:space="preserve">2. On som dins l’assignatura - 1:10</w:t>
-        <w:rPr>
-          <w:sz w:val="36"/>
-          <w:szCs w:val="36"/>
-        </w:rPr>
       </w:r>
     </w:p>
     <w:p>
@@ -1551,10 +1023,6 @@
       </w:pPr>
       <w:r>
         <w:t xml:space="preserve">Pla docent: 3r curs, 6 ECTS, assignatura obligatòria.</w:t>
-        <w:rPr>
-          <w:sz w:val="32"/>
-          <w:szCs w:val="32"/>
-        </w:rPr>
       </w:r>
     </w:p>
     <w:p>
@@ -1567,10 +1035,6 @@
       </w:pPr>
       <w:r>
         <w:t xml:space="preserve">Bloc: clean/hexagonal, ports i adaptadors, mapping, mòduls, DDD.</w:t>
-        <w:rPr>
-          <w:sz w:val="32"/>
-          <w:szCs w:val="32"/>
-        </w:rPr>
       </w:r>
     </w:p>
     <w:p>
@@ -1583,10 +1047,6 @@
       </w:pPr>
       <w:r>
         <w:t xml:space="preserve">Justificar que la sessió encaixa en el temari.</w:t>
-        <w:rPr>
-          <w:sz w:val="32"/>
-          <w:szCs w:val="32"/>
-        </w:rPr>
       </w:r>
     </w:p>
     <w:p>
@@ -1599,10 +1059,6 @@
       </w:pPr>
       <w:r>
         <w:t xml:space="preserve">No panoràmica completa; focus en ports de sortida.</w:t>
-        <w:rPr>
-          <w:sz w:val="32"/>
-          <w:szCs w:val="32"/>
-        </w:rPr>
       </w:r>
     </w:p>
     <w:p>
@@ -1615,10 +1071,6 @@
       </w:pPr>
       <w:r>
         <w:t xml:space="preserve">Transició: objectiu mínim i entrada ràpida al cas real.</w:t>
-        <w:rPr>
-          <w:sz w:val="32"/>
-          <w:szCs w:val="32"/>
-        </w:rPr>
       </w:r>
     </w:p>
     <w:bookmarkEnd w:id="23"/>
@@ -1629,10 +1081,6 @@
       </w:pPr>
       <w:r>
         <w:t xml:space="preserve">3. Objectiu de la sessió - 0:55</w:t>
-        <w:rPr>
-          <w:sz w:val="36"/>
-          <w:szCs w:val="36"/>
-        </w:rPr>
       </w:r>
     </w:p>
     <w:p>
@@ -1645,10 +1093,6 @@
       </w:pPr>
       <w:r>
         <w:t xml:space="preserve">Passar-hi ràpid: és una diapositiva pont, no una explicació teòrica llarga.</w:t>
-        <w:rPr>
-          <w:sz w:val="32"/>
-          <w:szCs w:val="32"/>
-        </w:rPr>
       </w:r>
     </w:p>
     <w:p>
@@ -1661,10 +1105,6 @@
       </w:pPr>
       <w:r>
         <w:t xml:space="preserve">Frase clau: el cas d’ús necessita una capacitat, no una tecnologia.</w:t>
-        <w:rPr>
-          <w:sz w:val="32"/>
-          <w:szCs w:val="32"/>
-        </w:rPr>
       </w:r>
     </w:p>
     <w:p>
@@ -1677,10 +1117,6 @@
       </w:pPr>
       <w:r>
         <w:t xml:space="preserve">Tres accions: identificar necessitat, definir port, implementar adaptadors.</w:t>
-        <w:rPr>
-          <w:sz w:val="32"/>
-          <w:szCs w:val="32"/>
-        </w:rPr>
       </w:r>
     </w:p>
     <w:p>
@@ -1693,10 +1129,6 @@
       </w:pPr>
       <w:r>
         <w:t xml:space="preserve">Anunciar metodologia: primer cas real, després abstracció arquitectònica.</w:t>
-        <w:rPr>
-          <w:sz w:val="32"/>
-          <w:szCs w:val="32"/>
-        </w:rPr>
       </w:r>
     </w:p>
     <w:p>
@@ -1709,10 +1141,6 @@
       </w:pPr>
       <w:r>
         <w:t xml:space="preserve">Transició: començar pel procediment de beca.</w:t>
-        <w:rPr>
-          <w:sz w:val="32"/>
-          <w:szCs w:val="32"/>
-        </w:rPr>
       </w:r>
     </w:p>
     <w:bookmarkEnd w:id="24"/>
@@ -1723,10 +1151,6 @@
       </w:pPr>
       <w:r>
         <w:t xml:space="preserve">4. Avaluació econòmica - 1:50</w:t>
-        <w:rPr>
-          <w:sz w:val="36"/>
-          <w:szCs w:val="36"/>
-        </w:rPr>
       </w:r>
     </w:p>
     <w:p>
@@ -1739,10 +1163,6 @@
       </w:pPr>
       <w:r>
         <w:t xml:space="preserve">Primer entendre procediment, després tecnologia.</w:t>
-        <w:rPr>
-          <w:sz w:val="32"/>
-          <w:szCs w:val="32"/>
-        </w:rPr>
       </w:r>
     </w:p>
     <w:p>
@@ -1755,10 +1175,6 @@
       </w:pPr>
       <w:r>
         <w:t xml:space="preserve">Sol·licitud, expedient, requisits generals, econòmics, revisió, resolució.</w:t>
-        <w:rPr>
-          <w:sz w:val="32"/>
-          <w:szCs w:val="32"/>
-        </w:rPr>
       </w:r>
     </w:p>
     <w:p>
@@ -1771,10 +1187,6 @@
       </w:pPr>
       <w:r>
         <w:t xml:space="preserve">Renda i patrimoni com a decisió funcional.</w:t>
-        <w:rPr>
-          <w:sz w:val="32"/>
-          <w:szCs w:val="32"/>
-        </w:rPr>
       </w:r>
     </w:p>
     <w:p>
@@ -1787,10 +1199,6 @@
       </w:pPr>
       <w:r>
         <w:t xml:space="preserve">Evitar començar per SOAP/REST/PICA.</w:t>
-        <w:rPr>
-          <w:sz w:val="32"/>
-          <w:szCs w:val="32"/>
-        </w:rPr>
       </w:r>
     </w:p>
     <w:p>
@@ -1803,10 +1211,6 @@
       </w:pPr>
       <w:r>
         <w:t xml:space="preserve">Transició: quines dades externes fan falta?</w:t>
-        <w:rPr>
-          <w:sz w:val="32"/>
-          <w:szCs w:val="32"/>
-        </w:rPr>
       </w:r>
     </w:p>
     <w:bookmarkEnd w:id="25"/>
@@ -1817,10 +1221,6 @@
       </w:pPr>
       <w:r>
         <w:t xml:space="preserve">5. Informació externa - 2:00</w:t>
-        <w:rPr>
-          <w:sz w:val="36"/>
-          <w:szCs w:val="36"/>
-        </w:rPr>
       </w:r>
     </w:p>
     <w:p>
@@ -1833,10 +1233,6 @@
       </w:pPr>
       <w:r>
         <w:t xml:space="preserve">Necessitats: renda, patrimoni, béns immobles.</w:t>
-        <w:rPr>
-          <w:sz w:val="32"/>
-          <w:szCs w:val="32"/>
-        </w:rPr>
       </w:r>
     </w:p>
     <w:p>
@@ -1849,10 +1245,6 @@
       </w:pPr>
       <w:r>
         <w:t xml:space="preserve">Fonts: AEAT, Cadastre, PICA.</w:t>
-        <w:rPr>
-          <w:sz w:val="32"/>
-          <w:szCs w:val="32"/>
-        </w:rPr>
       </w:r>
     </w:p>
     <w:p>
@@ -1865,10 +1257,6 @@
       </w:pPr>
       <w:r>
         <w:t xml:space="preserve">PICA com a interoperabilitat administrativa.</w:t>
-        <w:rPr>
-          <w:sz w:val="32"/>
-          <w:szCs w:val="32"/>
-        </w:rPr>
       </w:r>
     </w:p>
     <w:p>
@@ -1881,10 +1269,6 @@
       </w:pPr>
       <w:r>
         <w:t xml:space="preserve">Frase clau: informació administrativa, no API concreta.</w:t>
-        <w:rPr>
-          <w:sz w:val="32"/>
-          <w:szCs w:val="32"/>
-        </w:rPr>
       </w:r>
     </w:p>
     <w:p>
@@ -1897,10 +1281,6 @@
       </w:pPr>
       <w:r>
         <w:t xml:space="preserve">Transició: si no separem, apareix dependència directa.</w:t>
-        <w:rPr>
-          <w:sz w:val="32"/>
-          <w:szCs w:val="32"/>
-        </w:rPr>
       </w:r>
     </w:p>
     <w:bookmarkEnd w:id="26"/>
@@ -1911,10 +1291,6 @@
       </w:pPr>
       <w:r>
         <w:t xml:space="preserve">6. Dependència directa - 2:10</w:t>
-        <w:rPr>
-          <w:sz w:val="36"/>
-          <w:szCs w:val="36"/>
-        </w:rPr>
       </w:r>
     </w:p>
     <w:p>
@@ -1927,10 +1303,6 @@
       </w:pPr>
       <w:r>
         <w:t xml:space="preserve">El problema no és PICA; és l’acoblament directe.</w:t>
-        <w:rPr>
-          <w:sz w:val="32"/>
-          <w:szCs w:val="32"/>
-        </w:rPr>
       </w:r>
     </w:p>
     <w:p>
@@ -1943,10 +1315,6 @@
       </w:pPr>
       <w:r>
         <w:t xml:space="preserve">Cas d’ús coneix SOAP/XML, DTOs, clients, errors tècnics.</w:t>
-        <w:rPr>
-          <w:sz w:val="32"/>
-          <w:szCs w:val="32"/>
-        </w:rPr>
       </w:r>
     </w:p>
     <w:p>
@@ -1959,10 +1327,6 @@
       </w:pPr>
       <w:r>
         <w:t xml:space="preserve">Evolució tecnològica travessa frontera.</w:t>
-        <w:rPr>
-          <w:sz w:val="32"/>
-          <w:szCs w:val="32"/>
-        </w:rPr>
       </w:r>
     </w:p>
     <w:p>
@@ -1975,10 +1339,6 @@
       </w:pPr>
       <w:r>
         <w:t xml:space="preserve">Tres riscos: acoblament, manteniment fràgil, continuïtat operativa.</w:t>
-        <w:rPr>
-          <w:sz w:val="32"/>
-          <w:szCs w:val="32"/>
-        </w:rPr>
       </w:r>
     </w:p>
     <w:p>
@@ -1991,10 +1351,6 @@
       </w:pPr>
       <w:r>
         <w:t xml:space="preserve">Transició: resposta arquitectònica, port de sortida.</w:t>
-        <w:rPr>
-          <w:sz w:val="32"/>
-          <w:szCs w:val="32"/>
-        </w:rPr>
       </w:r>
     </w:p>
     <w:bookmarkEnd w:id="27"/>
@@ -2005,10 +1361,6 @@
       </w:pPr>
       <w:r>
         <w:t xml:space="preserve">7. Port i adaptador - 0:55</w:t>
-        <w:rPr>
-          <w:sz w:val="36"/>
-          <w:szCs w:val="36"/>
-        </w:rPr>
       </w:r>
     </w:p>
     <w:p>
@@ -2021,10 +1373,6 @@
       </w:pPr>
       <w:r>
         <w:t xml:space="preserve">Fer-la servir com a frontissa conceptual, no com a explicació llarga.</w:t>
-        <w:rPr>
-          <w:sz w:val="32"/>
-          <w:szCs w:val="32"/>
-        </w:rPr>
       </w:r>
     </w:p>
     <w:p>
@@ -2037,10 +1385,6 @@
       </w:pPr>
       <w:r>
         <w:t xml:space="preserve">Flux d’execució: el cas d’ús demana informació cap enfora.</w:t>
-        <w:rPr>
-          <w:sz w:val="32"/>
-          <w:szCs w:val="32"/>
-        </w:rPr>
       </w:r>
     </w:p>
     <w:p>
@@ -2053,10 +1397,6 @@
       </w:pPr>
       <w:r>
         <w:t xml:space="preserve">Dependència de codi: el cas d’ús depèn del port; l’adaptador implementa el port.</w:t>
-        <w:rPr>
-          <w:sz w:val="32"/>
-          <w:szCs w:val="32"/>
-        </w:rPr>
       </w:r>
     </w:p>
     <w:p>
@@ -2069,10 +1409,6 @@
       </w:pPr>
       <w:r>
         <w:t xml:space="preserve">Inversió: la infraestructura depèn del port definit per l’aplicació.</w:t>
-        <w:rPr>
-          <w:sz w:val="32"/>
-          <w:szCs w:val="32"/>
-        </w:rPr>
       </w:r>
     </w:p>
     <w:p>
@@ -2085,10 +1421,6 @@
       </w:pPr>
       <w:r>
         <w:t xml:space="preserve">Transició: aplicar-ho al cas patrimonial.</w:t>
-        <w:rPr>
-          <w:sz w:val="32"/>
-          <w:szCs w:val="32"/>
-        </w:rPr>
       </w:r>
     </w:p>
     <w:bookmarkEnd w:id="28"/>
@@ -2099,10 +1431,6 @@
       </w:pPr>
       <w:r>
         <w:t xml:space="preserve">8. Port patrimonial - 2:05</w:t>
-        <w:rPr>
-          <w:sz w:val="36"/>
-          <w:szCs w:val="36"/>
-        </w:rPr>
       </w:r>
     </w:p>
     <w:p>
@@ -2115,10 +1443,6 @@
       </w:pPr>
       <w:r>
         <w:t xml:space="preserve">Servei d’aplicació depèn de contractes propis.</w:t>
-        <w:rPr>
-          <w:sz w:val="32"/>
-          <w:szCs w:val="32"/>
-        </w:rPr>
       </w:r>
     </w:p>
     <w:p>
@@ -2131,10 +1455,6 @@
       </w:pPr>
       <w:r>
         <w:t xml:space="preserve">Adaptadors fora del nucli.</w:t>
-        <w:rPr>
-          <w:sz w:val="32"/>
-          <w:szCs w:val="32"/>
-        </w:rPr>
       </w:r>
     </w:p>
     <w:p>
@@ -2147,10 +1467,6 @@
       </w:pPr>
       <w:r>
         <w:t xml:space="preserve">PICA/JDBC/SOAP/REST són detalls substituïbles.</w:t>
-        <w:rPr>
-          <w:sz w:val="32"/>
-          <w:szCs w:val="32"/>
-        </w:rPr>
       </w:r>
     </w:p>
     <w:p>
@@ -2163,10 +1479,6 @@
       </w:pPr>
       <w:r>
         <w:t xml:space="preserve">Fletxa correcta d’implementació: adaptador -&gt; port.</w:t>
-        <w:rPr>
-          <w:sz w:val="32"/>
-          <w:szCs w:val="32"/>
-        </w:rPr>
       </w:r>
     </w:p>
     <w:p>
@@ -2179,10 +1491,6 @@
       </w:pPr>
       <w:r>
         <w:t xml:space="preserve">Transició: mateix patró en un domini financer.</w:t>
-        <w:rPr>
-          <w:sz w:val="32"/>
-          <w:szCs w:val="32"/>
-        </w:rPr>
       </w:r>
     </w:p>
     <w:bookmarkEnd w:id="29"/>
@@ -2193,10 +1501,6 @@
       </w:pPr>
       <w:r>
         <w:t xml:space="preserve">9. Domini financer - 1:45</w:t>
-        <w:rPr>
-          <w:sz w:val="36"/>
-          <w:szCs w:val="36"/>
-        </w:rPr>
       </w:r>
     </w:p>
     <w:p>
@@ -2209,10 +1513,6 @@
       </w:pPr>
       <w:r>
         <w:t xml:space="preserve">Canvi explícit de domini: beca -&gt; cartera d’inversió personal.</w:t>
-        <w:rPr>
-          <w:sz w:val="32"/>
-          <w:szCs w:val="32"/>
-        </w:rPr>
       </w:r>
     </w:p>
     <w:p>
@@ -2225,10 +1525,6 @@
       </w:pPr>
       <w:r>
         <w:t xml:space="preserve">El diagrama ja correspon a HexaStock, però s’ha de llegir com a patró.</w:t>
-        <w:rPr>
-          <w:sz w:val="32"/>
-          <w:szCs w:val="32"/>
-        </w:rPr>
       </w:r>
     </w:p>
     <w:p>
@@ -2241,10 +1537,6 @@
       </w:pPr>
       <w:r>
         <w:t xml:space="preserve">Cas d’ús: vendre accions.</w:t>
-        <w:rPr>
-          <w:sz w:val="32"/>
-          <w:szCs w:val="32"/>
-        </w:rPr>
       </w:r>
     </w:p>
     <w:p>
@@ -2257,10 +1549,6 @@
       </w:pPr>
       <w:r>
         <w:t xml:space="preserve">Necessitat: preu actual de l’acció que l’usuari vol vendre.</w:t>
-        <w:rPr>
-          <w:sz w:val="32"/>
-          <w:szCs w:val="32"/>
-        </w:rPr>
       </w:r>
     </w:p>
     <w:p>
@@ -2273,10 +1561,6 @@
       </w:pPr>
       <w:r>
         <w:t xml:space="preserve">Port de sortida: defineix aquesta capacitat.</w:t>
-        <w:rPr>
-          <w:sz w:val="32"/>
-          <w:szCs w:val="32"/>
-        </w:rPr>
       </w:r>
     </w:p>
     <w:p>
@@ -2289,10 +1573,6 @@
       </w:pPr>
       <w:r>
         <w:t xml:space="preserve">Transició: ara sí, concretar-ho en HexaStock.</w:t>
-        <w:rPr>
-          <w:sz w:val="32"/>
-          <w:szCs w:val="32"/>
-        </w:rPr>
       </w:r>
     </w:p>
     <w:bookmarkEnd w:id="30"/>
@@ -2303,10 +1583,6 @@
       </w:pPr>
       <w:r>
         <w:t xml:space="preserve">10. Flux i codi - 1:45</w:t>
-        <w:rPr>
-          <w:sz w:val="36"/>
-          <w:szCs w:val="36"/>
-        </w:rPr>
       </w:r>
     </w:p>
     <w:p>
@@ -2319,10 +1595,6 @@
       </w:pPr>
       <w:r>
         <w:t xml:space="preserve">Diagrama de seqüència = flux temporal, no dependència de codi.</w:t>
-        <w:rPr>
-          <w:sz w:val="32"/>
-          <w:szCs w:val="32"/>
-        </w:rPr>
       </w:r>
     </w:p>
     <w:p>
@@ -2335,10 +1607,6 @@
       </w:pPr>
       <w:r>
         <w:t xml:space="preserve">Controller -&gt; port d’entrada -&gt; servei.</w:t>
-        <w:rPr>
-          <w:sz w:val="32"/>
-          <w:szCs w:val="32"/>
-        </w:rPr>
       </w:r>
     </w:p>
     <w:p>
@@ -2351,10 +1619,6 @@
       </w:pPr>
       <w:r>
         <w:t xml:space="preserve">Servei consulta ports i delega venda al domini.</w:t>
-        <w:rPr>
-          <w:sz w:val="32"/>
-          <w:szCs w:val="32"/>
-        </w:rPr>
       </w:r>
     </w:p>
     <w:p>
@@ -2367,10 +1631,6 @@
       </w:pPr>
       <w:r>
         <w:t xml:space="preserve">Domini decideix; adaptador integra.</w:t>
-        <w:rPr>
-          <w:sz w:val="32"/>
-          <w:szCs w:val="32"/>
-        </w:rPr>
       </w:r>
     </w:p>
     <w:p>
@@ -2383,10 +1643,6 @@
       </w:pPr>
       <w:r>
         <w:t xml:space="preserve">Transició: demo controlada amb adaptador substituïble.</w:t>
-        <w:rPr>
-          <w:sz w:val="32"/>
-          <w:szCs w:val="32"/>
-        </w:rPr>
       </w:r>
     </w:p>
     <w:bookmarkEnd w:id="31"/>
@@ -2397,10 +1653,6 @@
       </w:pPr>
       <w:r>
         <w:t xml:space="preserve">11. Demo - 1:45</w:t>
-        <w:rPr>
-          <w:sz w:val="36"/>
-          <w:szCs w:val="36"/>
-        </w:rPr>
       </w:r>
     </w:p>
     <w:p>
@@ -2413,10 +1665,6 @@
       </w:pPr>
       <w:r>
         <w:t xml:space="preserve">Mateix cas d’ús, servei i domini.</w:t>
-        <w:rPr>
-          <w:sz w:val="32"/>
-          <w:szCs w:val="32"/>
-        </w:rPr>
       </w:r>
     </w:p>
     <w:p>
@@ -2429,10 +1677,6 @@
       </w:pPr>
       <w:r>
         <w:t xml:space="preserve">Canvia l’adaptador.</w:t>
-        <w:rPr>
-          <w:sz w:val="32"/>
-          <w:szCs w:val="32"/>
-        </w:rPr>
       </w:r>
     </w:p>
     <w:p>
@@ -2445,10 +1689,6 @@
       </w:pPr>
       <w:r>
         <w:t xml:space="preserve">Perfils: Finnhub, Alpha Vantage, mock.</w:t>
-        <w:rPr>
-          <w:sz w:val="32"/>
-          <w:szCs w:val="32"/>
-        </w:rPr>
       </w:r>
     </w:p>
     <w:p>
@@ -2461,10 +1701,6 @@
       </w:pPr>
       <w:r>
         <w:t xml:space="preserve">Finnhub i Alpha Vantage són implementacions concretes; el contracte no canvia.</w:t>
-        <w:rPr>
-          <w:sz w:val="32"/>
-          <w:szCs w:val="32"/>
-        </w:rPr>
       </w:r>
     </w:p>
     <w:p>
@@ -2477,10 +1713,6 @@
       </w:pPr>
       <w:r>
         <w:t xml:space="preserve">Utilitat docent: proves amb adaptador mock i sense claus reals.</w:t>
-        <w:rPr>
-          <w:sz w:val="32"/>
-          <w:szCs w:val="32"/>
-        </w:rPr>
       </w:r>
     </w:p>
     <w:p>
@@ -2493,10 +1725,6 @@
       </w:pPr>
       <w:r>
         <w:t xml:space="preserve">Transició: conclusió final.</w:t>
-        <w:rPr>
-          <w:sz w:val="32"/>
-          <w:szCs w:val="32"/>
-        </w:rPr>
       </w:r>
     </w:p>
     <w:bookmarkEnd w:id="32"/>
@@ -2507,10 +1735,6 @@
       </w:pPr>
       <w:r>
         <w:t xml:space="preserve">12. Agraïment - 1:20</w:t>
-        <w:rPr>
-          <w:sz w:val="36"/>
-          <w:szCs w:val="36"/>
-        </w:rPr>
       </w:r>
     </w:p>
     <w:p>
@@ -2523,10 +1747,6 @@
       </w:pPr>
       <w:r>
         <w:t xml:space="preserve">Arquitectura no elimina canvi; el localitza.</w:t>
-        <w:rPr>
-          <w:sz w:val="32"/>
-          <w:szCs w:val="32"/>
-        </w:rPr>
       </w:r>
     </w:p>
     <w:p>
@@ -2539,10 +1759,6 @@
       </w:pPr>
       <w:r>
         <w:t xml:space="preserve">Canviar adaptador, no cas d’ús ni domini.</w:t>
-        <w:rPr>
-          <w:sz w:val="32"/>
-          <w:szCs w:val="32"/>
-        </w:rPr>
       </w:r>
     </w:p>
     <w:p>
@@ -2555,10 +1771,6 @@
       </w:pPr>
       <w:r>
         <w:t xml:space="preserve">Agraïment TecnoCampus.</w:t>
-        <w:rPr>
-          <w:sz w:val="32"/>
-          <w:szCs w:val="32"/>
-        </w:rPr>
       </w:r>
     </w:p>
     <w:p>
@@ -2571,10 +1783,6 @@
       </w:pPr>
       <w:r>
         <w:t xml:space="preserve">Agraïment Dr. Josep Roure.</w:t>
-        <w:rPr>
-          <w:sz w:val="32"/>
-          <w:szCs w:val="32"/>
-        </w:rPr>
       </w:r>
     </w:p>
     <w:p>
@@ -2587,32 +1795,18 @@
       </w:pPr>
       <w:r>
         <w:t xml:space="preserve">Tancar mirant el tribunal:</w:t>
-        <w:rPr>
-          <w:sz w:val="32"/>
-          <w:szCs w:val="32"/>
-        </w:rPr>
       </w:r>
       <w:r>
         <w:t xml:space="preserve"> </w:t>
-        <w:rPr>
-          <w:sz w:val="32"/>
-          <w:szCs w:val="32"/>
-        </w:rPr>
       </w:r>
       <w:r>
         <w:rPr>
           <w:rStyle w:val="VerbatimChar"/>
-          <w:sz w:val="32"/>
-          <w:szCs w:val="32"/>
         </w:rPr>
         <w:t xml:space="preserve">Moltes gràcies</w:t>
       </w:r>
       <w:r>
         <w:t xml:space="preserve">.</w:t>
-        <w:rPr>
-          <w:sz w:val="32"/>
-          <w:szCs w:val="32"/>
-        </w:rPr>
       </w:r>
     </w:p>
     <w:bookmarkEnd w:id="33"/>
@@ -2624,10 +1818,6 @@
       </w:pPr>
       <w:r>
         <w:t xml:space="preserve">3. Esquema de memorització</w:t>
-        <w:rPr>
-          <w:sz w:val="36"/>
-          <w:szCs w:val="36"/>
-        </w:rPr>
       </w:r>
     </w:p>
     <w:tbl>
@@ -2656,10 +1846,6 @@
             </w:pPr>
             <w:r>
               <w:t xml:space="preserve">Diapositiva</w:t>
-              <w:rPr>
-                <w:sz w:val="36"/>
-                <w:szCs w:val="36"/>
-              </w:rPr>
             </w:r>
           </w:p>
         </w:tc>
@@ -2671,10 +1857,6 @@
             </w:pPr>
             <w:r>
               <w:t xml:space="preserve">Missatge central</w:t>
-              <w:rPr>
-                <w:sz w:val="36"/>
-                <w:szCs w:val="36"/>
-              </w:rPr>
             </w:r>
           </w:p>
         </w:tc>
@@ -2686,10 +1868,6 @@
             </w:pPr>
             <w:r>
               <w:t xml:space="preserve">Concepte tècnic imprescindible</w:t>
-              <w:rPr>
-                <w:sz w:val="36"/>
-                <w:szCs w:val="36"/>
-              </w:rPr>
             </w:r>
           </w:p>
         </w:tc>
@@ -2701,10 +1879,6 @@
             </w:pPr>
             <w:r>
               <w:t xml:space="preserve">Connexió anterior</w:t>
-              <w:rPr>
-                <w:sz w:val="36"/>
-                <w:szCs w:val="36"/>
-              </w:rPr>
             </w:r>
           </w:p>
         </w:tc>
@@ -2716,10 +1890,6 @@
             </w:pPr>
             <w:r>
               <w:t xml:space="preserve">Connexió següent</w:t>
-              <w:rPr>
-                <w:sz w:val="36"/>
-                <w:szCs w:val="36"/>
-              </w:rPr>
             </w:r>
           </w:p>
         </w:tc>
@@ -2733,10 +1903,6 @@
             </w:pPr>
             <w:r>
               <w:t xml:space="preserve">1</w:t>
-              <w:rPr>
-                <w:sz w:val="36"/>
-                <w:szCs w:val="36"/>
-              </w:rPr>
             </w:r>
           </w:p>
         </w:tc>
@@ -2748,10 +1914,6 @@
             </w:pPr>
             <w:r>
               <w:t xml:space="preserve">Classe des d’un cas real acreditat</w:t>
-              <w:rPr>
-                <w:sz w:val="36"/>
-                <w:szCs w:val="36"/>
-              </w:rPr>
             </w:r>
           </w:p>
         </w:tc>
@@ -2763,10 +1925,6 @@
             </w:pPr>
             <w:r>
               <w:t xml:space="preserve">Ports de sortida com a focus</w:t>
-              <w:rPr>
-                <w:sz w:val="36"/>
-                <w:szCs w:val="36"/>
-              </w:rPr>
             </w:r>
           </w:p>
         </w:tc>
@@ -2778,10 +1936,6 @@
             </w:pPr>
             <w:r>
               <w:t xml:space="preserve">Inici</w:t>
-              <w:rPr>
-                <w:sz w:val="36"/>
-                <w:szCs w:val="36"/>
-              </w:rPr>
             </w:r>
           </w:p>
         </w:tc>
@@ -2793,10 +1947,6 @@
             </w:pPr>
             <w:r>
               <w:t xml:space="preserve">Situar dins DSI</w:t>
-              <w:rPr>
-                <w:sz w:val="36"/>
-                <w:szCs w:val="36"/>
-              </w:rPr>
             </w:r>
           </w:p>
         </w:tc>
@@ -2810,10 +1960,6 @@
             </w:pPr>
             <w:r>
               <w:t xml:space="preserve">2</w:t>
-              <w:rPr>
-                <w:sz w:val="36"/>
-                <w:szCs w:val="36"/>
-              </w:rPr>
             </w:r>
           </w:p>
         </w:tc>
@@ -2825,10 +1971,6 @@
             </w:pPr>
             <w:r>
               <w:t xml:space="preserve">La classe encaixa en el pla docent</w:t>
-              <w:rPr>
-                <w:sz w:val="36"/>
-                <w:szCs w:val="36"/>
-              </w:rPr>
             </w:r>
           </w:p>
         </w:tc>
@@ -2840,10 +1982,6 @@
             </w:pPr>
             <w:r>
               <w:t xml:space="preserve">Clean/hexagonal, ports, adaptadors</w:t>
-              <w:rPr>
-                <w:sz w:val="36"/>
-                <w:szCs w:val="36"/>
-              </w:rPr>
             </w:r>
           </w:p>
         </w:tc>
@@ -2855,10 +1993,6 @@
             </w:pPr>
             <w:r>
               <w:t xml:space="preserve">Cas real + docència</w:t>
-              <w:rPr>
-                <w:sz w:val="36"/>
-                <w:szCs w:val="36"/>
-              </w:rPr>
             </w:r>
           </w:p>
         </w:tc>
@@ -2870,10 +2004,6 @@
             </w:pPr>
             <w:r>
               <w:t xml:space="preserve">Objectiu breu</w:t>
-              <w:rPr>
-                <w:sz w:val="36"/>
-                <w:szCs w:val="36"/>
-              </w:rPr>
             </w:r>
           </w:p>
         </w:tc>
@@ -2887,10 +2017,6 @@
             </w:pPr>
             <w:r>
               <w:t xml:space="preserve">3</w:t>
-              <w:rPr>
-                <w:sz w:val="36"/>
-                <w:szCs w:val="36"/>
-              </w:rPr>
             </w:r>
           </w:p>
         </w:tc>
@@ -2902,10 +2028,6 @@
             </w:pPr>
             <w:r>
               <w:t xml:space="preserve">Objectiu: necessitat, port, adaptador</w:t>
-              <w:rPr>
-                <w:sz w:val="36"/>
-                <w:szCs w:val="36"/>
-              </w:rPr>
             </w:r>
           </w:p>
         </w:tc>
@@ -2917,10 +2039,6 @@
             </w:pPr>
             <w:r>
               <w:t xml:space="preserve">Capacitat, no tecnologia</w:t>
-              <w:rPr>
-                <w:sz w:val="36"/>
-                <w:szCs w:val="36"/>
-              </w:rPr>
             </w:r>
           </w:p>
         </w:tc>
@@ -2932,10 +2050,6 @@
             </w:pPr>
             <w:r>
               <w:t xml:space="preserve">Assignatura</w:t>
-              <w:rPr>
-                <w:sz w:val="36"/>
-                <w:szCs w:val="36"/>
-              </w:rPr>
             </w:r>
           </w:p>
         </w:tc>
@@ -2947,10 +2061,6 @@
             </w:pPr>
             <w:r>
               <w:t xml:space="preserve">Cas funcional</w:t>
-              <w:rPr>
-                <w:sz w:val="36"/>
-                <w:szCs w:val="36"/>
-              </w:rPr>
             </w:r>
           </w:p>
         </w:tc>
@@ -2964,10 +2074,6 @@
             </w:pPr>
             <w:r>
               <w:t xml:space="preserve">4</w:t>
-              <w:rPr>
-                <w:sz w:val="36"/>
-                <w:szCs w:val="36"/>
-              </w:rPr>
             </w:r>
           </w:p>
         </w:tc>
@@ -2979,10 +2085,6 @@
             </w:pPr>
             <w:r>
               <w:t xml:space="preserve">Primer procediment, després tecnologia</w:t>
-              <w:rPr>
-                <w:sz w:val="36"/>
-                <w:szCs w:val="36"/>
-              </w:rPr>
             </w:r>
           </w:p>
         </w:tc>
@@ -2994,10 +2096,6 @@
             </w:pPr>
             <w:r>
               <w:t xml:space="preserve">Necessitat funcional</w:t>
-              <w:rPr>
-                <w:sz w:val="36"/>
-                <w:szCs w:val="36"/>
-              </w:rPr>
             </w:r>
           </w:p>
         </w:tc>
@@ -3009,10 +2107,6 @@
             </w:pPr>
             <w:r>
               <w:t xml:space="preserve">Objectiu</w:t>
-              <w:rPr>
-                <w:sz w:val="36"/>
-                <w:szCs w:val="36"/>
-              </w:rPr>
             </w:r>
           </w:p>
         </w:tc>
@@ -3024,10 +2118,6 @@
             </w:pPr>
             <w:r>
               <w:t xml:space="preserve">Fonts externes</w:t>
-              <w:rPr>
-                <w:sz w:val="36"/>
-                <w:szCs w:val="36"/>
-              </w:rPr>
             </w:r>
           </w:p>
         </w:tc>
@@ -3041,10 +2131,6 @@
             </w:pPr>
             <w:r>
               <w:t xml:space="preserve">5</w:t>
-              <w:rPr>
-                <w:sz w:val="36"/>
-                <w:szCs w:val="36"/>
-              </w:rPr>
             </w:r>
           </w:p>
         </w:tc>
@@ -3056,10 +2142,6 @@
             </w:pPr>
             <w:r>
               <w:t xml:space="preserve">El procediment necessita dades, no API</w:t>
-              <w:rPr>
-                <w:sz w:val="36"/>
-                <w:szCs w:val="36"/>
-              </w:rPr>
             </w:r>
           </w:p>
         </w:tc>
@@ -3071,10 +2153,6 @@
             </w:pPr>
             <w:r>
               <w:t xml:space="preserve">Interoperabilitat administrativa</w:t>
-              <w:rPr>
-                <w:sz w:val="36"/>
-                <w:szCs w:val="36"/>
-              </w:rPr>
             </w:r>
           </w:p>
         </w:tc>
@@ -3086,10 +2164,6 @@
             </w:pPr>
             <w:r>
               <w:t xml:space="preserve">Procediment</w:t>
-              <w:rPr>
-                <w:sz w:val="36"/>
-                <w:szCs w:val="36"/>
-              </w:rPr>
             </w:r>
           </w:p>
         </w:tc>
@@ -3101,10 +2175,6 @@
             </w:pPr>
             <w:r>
               <w:t xml:space="preserve">Risc d’acoblament</w:t>
-              <w:rPr>
-                <w:sz w:val="36"/>
-                <w:szCs w:val="36"/>
-              </w:rPr>
             </w:r>
           </w:p>
         </w:tc>
@@ -3118,10 +2188,6 @@
             </w:pPr>
             <w:r>
               <w:t xml:space="preserve">6</w:t>
-              <w:rPr>
-                <w:sz w:val="36"/>
-                <w:szCs w:val="36"/>
-              </w:rPr>
             </w:r>
           </w:p>
         </w:tc>
@@ -3133,10 +2199,6 @@
             </w:pPr>
             <w:r>
               <w:t xml:space="preserve">La dependència directa fa fràgil el cas d’ús</w:t>
-              <w:rPr>
-                <w:sz w:val="36"/>
-                <w:szCs w:val="36"/>
-              </w:rPr>
             </w:r>
           </w:p>
         </w:tc>
@@ -3148,10 +2210,6 @@
             </w:pPr>
             <w:r>
               <w:t xml:space="preserve">Acoblament tecnològic</w:t>
-              <w:rPr>
-                <w:sz w:val="36"/>
-                <w:szCs w:val="36"/>
-              </w:rPr>
             </w:r>
           </w:p>
         </w:tc>
@@ -3163,10 +2221,6 @@
             </w:pPr>
             <w:r>
               <w:t xml:space="preserve">Dades externes</w:t>
-              <w:rPr>
-                <w:sz w:val="36"/>
-                <w:szCs w:val="36"/>
-              </w:rPr>
             </w:r>
           </w:p>
         </w:tc>
@@ -3178,10 +2232,6 @@
             </w:pPr>
             <w:r>
               <w:t xml:space="preserve">Port de sortida</w:t>
-              <w:rPr>
-                <w:sz w:val="36"/>
-                <w:szCs w:val="36"/>
-              </w:rPr>
             </w:r>
           </w:p>
         </w:tc>
@@ -3195,10 +2245,6 @@
             </w:pPr>
             <w:r>
               <w:t xml:space="preserve">7</w:t>
-              <w:rPr>
-                <w:sz w:val="36"/>
-                <w:szCs w:val="36"/>
-              </w:rPr>
             </w:r>
           </w:p>
         </w:tc>
@@ -3210,10 +2256,6 @@
             </w:pPr>
             <w:r>
               <w:t xml:space="preserve">Port diu què; adaptador diu com</w:t>
-              <w:rPr>
-                <w:sz w:val="36"/>
-                <w:szCs w:val="36"/>
-              </w:rPr>
             </w:r>
           </w:p>
         </w:tc>
@@ -3225,10 +2267,6 @@
             </w:pPr>
             <w:r>
               <w:t xml:space="preserve">Inversió de dependències</w:t>
-              <w:rPr>
-                <w:sz w:val="36"/>
-                <w:szCs w:val="36"/>
-              </w:rPr>
             </w:r>
           </w:p>
         </w:tc>
@@ -3240,10 +2278,6 @@
             </w:pPr>
             <w:r>
               <w:t xml:space="preserve">Problema</w:t>
-              <w:rPr>
-                <w:sz w:val="36"/>
-                <w:szCs w:val="36"/>
-              </w:rPr>
             </w:r>
           </w:p>
         </w:tc>
@@ -3255,10 +2289,6 @@
             </w:pPr>
             <w:r>
               <w:t xml:space="preserve">Aplicació al cas patrimonial</w:t>
-              <w:rPr>
-                <w:sz w:val="36"/>
-                <w:szCs w:val="36"/>
-              </w:rPr>
             </w:r>
           </w:p>
         </w:tc>
@@ -3272,10 +2302,6 @@
             </w:pPr>
             <w:r>
               <w:t xml:space="preserve">8</w:t>
-              <w:rPr>
-                <w:sz w:val="36"/>
-                <w:szCs w:val="36"/>
-              </w:rPr>
             </w:r>
           </w:p>
         </w:tc>
@@ -3287,10 +2313,6 @@
             </w:pPr>
             <w:r>
               <w:t xml:space="preserve">AGAUR: contracte d’aplicació, no detall tècnic</w:t>
-              <w:rPr>
-                <w:sz w:val="36"/>
-                <w:szCs w:val="36"/>
-              </w:rPr>
             </w:r>
           </w:p>
         </w:tc>
@@ -3302,10 +2324,6 @@
             </w:pPr>
             <w:r>
               <w:t xml:space="preserve">Adaptador implementa port</w:t>
-              <w:rPr>
-                <w:sz w:val="36"/>
-                <w:szCs w:val="36"/>
-              </w:rPr>
             </w:r>
           </w:p>
         </w:tc>
@@ -3317,10 +2335,6 @@
             </w:pPr>
             <w:r>
               <w:t xml:space="preserve">Port genèric</w:t>
-              <w:rPr>
-                <w:sz w:val="36"/>
-                <w:szCs w:val="36"/>
-              </w:rPr>
             </w:r>
           </w:p>
         </w:tc>
@@ -3332,10 +2346,6 @@
             </w:pPr>
             <w:r>
               <w:t xml:space="preserve">Transferència al domini financer</w:t>
-              <w:rPr>
-                <w:sz w:val="36"/>
-                <w:szCs w:val="36"/>
-              </w:rPr>
             </w:r>
           </w:p>
         </w:tc>
@@ -3349,10 +2359,6 @@
             </w:pPr>
             <w:r>
               <w:t xml:space="preserve">9</w:t>
-              <w:rPr>
-                <w:sz w:val="36"/>
-                <w:szCs w:val="36"/>
-              </w:rPr>
             </w:r>
           </w:p>
         </w:tc>
@@ -3364,10 +2370,6 @@
             </w:pPr>
             <w:r>
               <w:t xml:space="preserve">Mateix patró en domini financer</w:t>
-              <w:rPr>
-                <w:sz w:val="36"/>
-                <w:szCs w:val="36"/>
-              </w:rPr>
             </w:r>
           </w:p>
         </w:tc>
@@ -3379,10 +2381,6 @@
             </w:pPr>
             <w:r>
               <w:t xml:space="preserve">Necessitat, port i adaptador</w:t>
-              <w:rPr>
-                <w:sz w:val="36"/>
-                <w:szCs w:val="36"/>
-              </w:rPr>
             </w:r>
           </w:p>
         </w:tc>
@@ -3394,10 +2392,6 @@
             </w:pPr>
             <w:r>
               <w:t xml:space="preserve">Cas AGAUR</w:t>
-              <w:rPr>
-                <w:sz w:val="36"/>
-                <w:szCs w:val="36"/>
-              </w:rPr>
             </w:r>
           </w:p>
         </w:tc>
@@ -3409,10 +2403,6 @@
             </w:pPr>
             <w:r>
               <w:t xml:space="preserve">Projecte concret</w:t>
-              <w:rPr>
-                <w:sz w:val="36"/>
-                <w:szCs w:val="36"/>
-              </w:rPr>
             </w:r>
           </w:p>
         </w:tc>
@@ -3426,10 +2416,6 @@
             </w:pPr>
             <w:r>
               <w:t xml:space="preserve">10</w:t>
-              <w:rPr>
-                <w:sz w:val="36"/>
-                <w:szCs w:val="36"/>
-              </w:rPr>
             </w:r>
           </w:p>
         </w:tc>
@@ -3441,10 +2427,6 @@
             </w:pPr>
             <w:r>
               <w:t xml:space="preserve">Servei coordina, domini decideix</w:t>
-              <w:rPr>
-                <w:sz w:val="36"/>
-                <w:szCs w:val="36"/>
-              </w:rPr>
             </w:r>
           </w:p>
         </w:tc>
@@ -3456,10 +2438,6 @@
             </w:pPr>
             <w:r>
               <w:t xml:space="preserve">Seqüència vs dependència</w:t>
-              <w:rPr>
-                <w:sz w:val="36"/>
-                <w:szCs w:val="36"/>
-              </w:rPr>
             </w:r>
           </w:p>
         </w:tc>
@@ -3471,10 +2449,6 @@
             </w:pPr>
             <w:r>
               <w:t xml:space="preserve">Transferència genèrica</w:t>
-              <w:rPr>
-                <w:sz w:val="36"/>
-                <w:szCs w:val="36"/>
-              </w:rPr>
             </w:r>
           </w:p>
         </w:tc>
@@ -3486,10 +2460,6 @@
             </w:pPr>
             <w:r>
               <w:t xml:space="preserve">Demo</w:t>
-              <w:rPr>
-                <w:sz w:val="36"/>
-                <w:szCs w:val="36"/>
-              </w:rPr>
             </w:r>
           </w:p>
         </w:tc>
@@ -3503,10 +2473,6 @@
             </w:pPr>
             <w:r>
               <w:t xml:space="preserve">11</w:t>
-              <w:rPr>
-                <w:sz w:val="36"/>
-                <w:szCs w:val="36"/>
-              </w:rPr>
             </w:r>
           </w:p>
         </w:tc>
@@ -3518,10 +2484,6 @@
             </w:pPr>
             <w:r>
               <w:t xml:space="preserve">Canvia infraestructura, no cas d’ús</w:t>
-              <w:rPr>
-                <w:sz w:val="36"/>
-                <w:szCs w:val="36"/>
-              </w:rPr>
             </w:r>
           </w:p>
         </w:tc>
@@ -3533,10 +2495,6 @@
             </w:pPr>
             <w:r>
               <w:t xml:space="preserve">Adaptador substituïble</w:t>
-              <w:rPr>
-                <w:sz w:val="36"/>
-                <w:szCs w:val="36"/>
-              </w:rPr>
             </w:r>
           </w:p>
         </w:tc>
@@ -3548,10 +2506,6 @@
             </w:pPr>
             <w:r>
               <w:t xml:space="preserve">Flux</w:t>
-              <w:rPr>
-                <w:sz w:val="36"/>
-                <w:szCs w:val="36"/>
-              </w:rPr>
             </w:r>
           </w:p>
         </w:tc>
@@ -3563,10 +2517,6 @@
             </w:pPr>
             <w:r>
               <w:t xml:space="preserve">Conclusió</w:t>
-              <w:rPr>
-                <w:sz w:val="36"/>
-                <w:szCs w:val="36"/>
-              </w:rPr>
             </w:r>
           </w:p>
         </w:tc>
@@ -3580,10 +2530,6 @@
             </w:pPr>
             <w:r>
               <w:t xml:space="preserve">12</w:t>
-              <w:rPr>
-                <w:sz w:val="36"/>
-                <w:szCs w:val="36"/>
-              </w:rPr>
             </w:r>
           </w:p>
         </w:tc>
@@ -3595,10 +2541,6 @@
             </w:pPr>
             <w:r>
               <w:t xml:space="preserve">L’arquitectura localitza el canvi</w:t>
-              <w:rPr>
-                <w:sz w:val="36"/>
-                <w:szCs w:val="36"/>
-              </w:rPr>
             </w:r>
           </w:p>
         </w:tc>
@@ -3610,10 +2552,6 @@
             </w:pPr>
             <w:r>
               <w:t xml:space="preserve">Frontera explícita</w:t>
-              <w:rPr>
-                <w:sz w:val="36"/>
-                <w:szCs w:val="36"/>
-              </w:rPr>
             </w:r>
           </w:p>
         </w:tc>
@@ -3625,10 +2563,6 @@
             </w:pPr>
             <w:r>
               <w:t xml:space="preserve">Demo</w:t>
-              <w:rPr>
-                <w:sz w:val="36"/>
-                <w:szCs w:val="36"/>
-              </w:rPr>
             </w:r>
           </w:p>
         </w:tc>
@@ -3640,10 +2574,6 @@
             </w:pPr>
             <w:r>
               <w:t xml:space="preserve">Tancament</w:t>
-              <w:rPr>
-                <w:sz w:val="36"/>
-                <w:szCs w:val="36"/>
-              </w:rPr>
             </w:r>
           </w:p>
         </w:tc>
@@ -3655,32 +2585,18 @@
       </w:pPr>
       <w:r>
         <w:t xml:space="preserve">Mantra de memòria:</w:t>
-        <w:rPr>
-          <w:sz w:val="36"/>
-          <w:szCs w:val="36"/>
-        </w:rPr>
       </w:r>
       <w:r>
         <w:t xml:space="preserve"> </w:t>
-        <w:rPr>
-          <w:sz w:val="36"/>
-          <w:szCs w:val="36"/>
-        </w:rPr>
       </w:r>
       <w:r>
         <w:rPr>
           <w:rStyle w:val="VerbatimChar"/>
-          <w:sz w:val="36"/>
-          <w:szCs w:val="36"/>
         </w:rPr>
         <w:t xml:space="preserve">context -&gt; assignatura -&gt; objectiu breu -&gt; procediment -&gt; dada externa -&gt; acoblament -&gt; port -&gt; AGAUR -&gt; domini financer -&gt; HexaStock -&gt; demo -&gt; conclusió</w:t>
       </w:r>
       <w:r>
         <w:t xml:space="preserve">.</w:t>
-        <w:rPr>
-          <w:sz w:val="36"/>
-          <w:szCs w:val="36"/>
-        </w:rPr>
       </w:r>
     </w:p>
     <w:bookmarkEnd w:id="35"/>
@@ -3691,10 +2607,6 @@
       </w:pPr>
       <w:r>
         <w:t xml:space="preserve">4. Pla d’entrenament comunicatiu</w:t>
-        <w:rPr>
-          <w:sz w:val="36"/>
-          <w:szCs w:val="36"/>
-        </w:rPr>
       </w:r>
     </w:p>
     <w:p>
@@ -3705,8 +2617,6 @@
         <w:rPr>
           <w:b/>
           <w:bCs/>
-          <w:sz w:val="36"/>
-          <w:szCs w:val="36"/>
         </w:rPr>
         <w:t xml:space="preserve">Entrenament inicial</w:t>
       </w:r>
@@ -3717,10 +2627,6 @@
       </w:pPr>
       <w:r>
         <w:t xml:space="preserve">Llegeix el guió complet en veu alta dues vegades sense cronòmetre. L’objectiu no és memoritzar, sinó detectar frases que no sonen naturals. Marca amb llapis les frases que vols dir exactament igual: la definició inicial, la distinció entre flux i dependència, i la conclusió final. La resta pot ser més flexible.</w:t>
-        <w:rPr>
-          <w:sz w:val="36"/>
-          <w:szCs w:val="36"/>
-        </w:rPr>
       </w:r>
     </w:p>
     <w:p>
@@ -3729,10 +2635,6 @@
       </w:pPr>
       <w:r>
         <w:t xml:space="preserve">Després fes una lectura cronometrada. Ritme orientatiu: 125-135 paraules per minut, amb pauses reals. Si surt per sobre de 22 minuts, retalla exemples; si surt per sota de 18:30, no afegeixis contingut tècnic, amplia pauses i transicions.</w:t>
-        <w:rPr>
-          <w:sz w:val="36"/>
-          <w:szCs w:val="36"/>
-        </w:rPr>
       </w:r>
     </w:p>
     <w:p>
@@ -3743,8 +2645,6 @@
         <w:rPr>
           <w:b/>
           <w:bCs/>
-          <w:sz w:val="36"/>
-          <w:szCs w:val="36"/>
         </w:rPr>
         <w:t xml:space="preserve">Entrenament intermedi</w:t>
       </w:r>
@@ -3755,10 +2655,6 @@
       </w:pPr>
       <w:r>
         <w:t xml:space="preserve">Practica per blocs, no tota la presentació sempre sencera:</w:t>
-        <w:rPr>
-          <w:sz w:val="36"/>
-          <w:szCs w:val="36"/>
-        </w:rPr>
       </w:r>
     </w:p>
     <w:p>
@@ -3771,10 +2667,6 @@
       </w:pPr>
       <w:r>
         <w:t xml:space="preserve">Bloc 1: diapositives 1-3, context, assignatura i objectiu breu.</w:t>
-        <w:rPr>
-          <w:sz w:val="32"/>
-          <w:szCs w:val="32"/>
-        </w:rPr>
       </w:r>
     </w:p>
     <w:p>
@@ -3787,10 +2679,6 @@
       </w:pPr>
       <w:r>
         <w:t xml:space="preserve">Bloc 2: diapositives 4-8, cas AGAUR, problema i port de sortida.</w:t>
-        <w:rPr>
-          <w:sz w:val="32"/>
-          <w:szCs w:val="32"/>
-        </w:rPr>
       </w:r>
     </w:p>
     <w:p>
@@ -3803,10 +2691,6 @@
       </w:pPr>
       <w:r>
         <w:t xml:space="preserve">Bloc 3: diapositives 9-12, domini financer, HexaStock, demo i tancament.</w:t>
-        <w:rPr>
-          <w:sz w:val="32"/>
-          <w:szCs w:val="32"/>
-        </w:rPr>
       </w:r>
     </w:p>
     <w:p>
@@ -3815,54 +2699,30 @@
       </w:pPr>
       <w:r>
         <w:t xml:space="preserve">En cada bloc, treballa tres coses: mirada, pausa i gest. La mirada ha d’anar al tribunal en les frases conceptuals; a la pantalla només quan assenyales una part concreta. Les mans han d’ajudar a separar conceptes: una mà per</w:t>
-        <w:rPr>
-          <w:sz w:val="36"/>
-          <w:szCs w:val="36"/>
-        </w:rPr>
       </w:r>
       <w:r>
         <w:t xml:space="preserve"> </w:t>
-        <w:rPr>
-          <w:sz w:val="36"/>
-          <w:szCs w:val="36"/>
-        </w:rPr>
       </w:r>
       <w:r>
         <w:rPr>
           <w:rStyle w:val="VerbatimChar"/>
-          <w:sz w:val="36"/>
-          <w:szCs w:val="36"/>
         </w:rPr>
         <w:t xml:space="preserve">necessitat funcional</w:t>
       </w:r>
       <w:r>
         <w:t xml:space="preserve">, l’altra per</w:t>
-        <w:rPr>
-          <w:sz w:val="36"/>
-          <w:szCs w:val="36"/>
-        </w:rPr>
       </w:r>
       <w:r>
         <w:t xml:space="preserve"> </w:t>
-        <w:rPr>
-          <w:sz w:val="36"/>
-          <w:szCs w:val="36"/>
-        </w:rPr>
       </w:r>
       <w:r>
         <w:rPr>
           <w:rStyle w:val="VerbatimChar"/>
-          <w:sz w:val="36"/>
-          <w:szCs w:val="36"/>
         </w:rPr>
         <w:t xml:space="preserve">tecnologia concreta</w:t>
       </w:r>
       <w:r>
         <w:t xml:space="preserve">. Evita caminar mentre expliques una distinció fina; atura’t, formula-la i continua.</w:t>
-        <w:rPr>
-          <w:sz w:val="36"/>
-          <w:szCs w:val="36"/>
-        </w:rPr>
       </w:r>
     </w:p>
     <w:p>
@@ -3873,8 +2733,6 @@
         <w:rPr>
           <w:b/>
           <w:bCs/>
-          <w:sz w:val="36"/>
-          <w:szCs w:val="36"/>
         </w:rPr>
         <w:t xml:space="preserve">Assaig final</w:t>
       </w:r>
@@ -3885,10 +2743,6 @@
       </w:pPr>
       <w:r>
         <w:t xml:space="preserve">Fes com a mínim tres passades completes:</w:t>
-        <w:rPr>
-          <w:sz w:val="36"/>
-          <w:szCs w:val="36"/>
-        </w:rPr>
       </w:r>
     </w:p>
     <w:p>
@@ -3901,10 +2755,6 @@
       </w:pPr>
       <w:r>
         <w:t xml:space="preserve">Primera passada: amb guió complet a la mà.</w:t>
-        <w:rPr>
-          <w:sz w:val="32"/>
-          <w:szCs w:val="32"/>
-        </w:rPr>
       </w:r>
     </w:p>
     <w:p>
@@ -3917,10 +2767,6 @@
       </w:pPr>
       <w:r>
         <w:t xml:space="preserve">Segona passada: només amb notes del presentador.</w:t>
-        <w:rPr>
-          <w:sz w:val="32"/>
-          <w:szCs w:val="32"/>
-        </w:rPr>
       </w:r>
     </w:p>
     <w:p>
@@ -3933,10 +2779,6 @@
       </w:pPr>
       <w:r>
         <w:t xml:space="preserve">Tercera passada: només amb l’esquema de memorització.</w:t>
-        <w:rPr>
-          <w:sz w:val="32"/>
-          <w:szCs w:val="32"/>
-        </w:rPr>
       </w:r>
     </w:p>
     <w:p>
@@ -3945,39 +2787,21 @@
       </w:pPr>
       <w:r>
         <w:t xml:space="preserve">Grava una passada en vídeo. Revisa només quatre indicadors: si mires massa la pantalla, si acceleres a les diapositives 6-10, si les pauses existeixen de veritat, i si la frase</w:t>
-        <w:rPr>
-          <w:sz w:val="36"/>
-          <w:szCs w:val="36"/>
-        </w:rPr>
       </w:r>
       <w:r>
         <w:t xml:space="preserve"> </w:t>
-        <w:rPr>
-          <w:sz w:val="36"/>
-          <w:szCs w:val="36"/>
-        </w:rPr>
       </w:r>
       <w:r>
         <w:rPr>
           <w:rStyle w:val="VerbatimChar"/>
-          <w:sz w:val="36"/>
-          <w:szCs w:val="36"/>
         </w:rPr>
         <w:t xml:space="preserve">flux d'execució no és dependència de codi</w:t>
       </w:r>
       <w:r>
         <w:t xml:space="preserve"> </w:t>
-        <w:rPr>
-          <w:sz w:val="36"/>
-          <w:szCs w:val="36"/>
-        </w:rPr>
       </w:r>
       <w:r>
         <w:t xml:space="preserve">queda clara.</w:t>
-        <w:rPr>
-          <w:sz w:val="36"/>
-          <w:szCs w:val="36"/>
-        </w:rPr>
       </w:r>
     </w:p>
     <w:p>
@@ -3988,8 +2812,6 @@
         <w:rPr>
           <w:b/>
           <w:bCs/>
-          <w:sz w:val="36"/>
-          <w:szCs w:val="36"/>
         </w:rPr>
         <w:t xml:space="preserve">Ritme, veu i cos</w:t>
       </w:r>
@@ -4000,98 +2822,54 @@
       </w:pPr>
       <w:r>
         <w:t xml:space="preserve">Mantingues un to més lent a les diapositives 3, 6, 7 i 8, perquè són les conceptualment més importants. Fes pauses llargues després de:</w:t>
-        <w:rPr>
-          <w:sz w:val="36"/>
-          <w:szCs w:val="36"/>
-        </w:rPr>
       </w:r>
       <w:r>
         <w:t xml:space="preserve"> </w:t>
-        <w:rPr>
-          <w:sz w:val="36"/>
-          <w:szCs w:val="36"/>
-        </w:rPr>
       </w:r>
       <w:r>
         <w:rPr>
           <w:rStyle w:val="VerbatimChar"/>
-          <w:sz w:val="36"/>
-          <w:szCs w:val="36"/>
         </w:rPr>
         <w:t xml:space="preserve">capacitat, no tecnologia</w:t>
       </w:r>
       <w:r>
         <w:t xml:space="preserve">;</w:t>
-        <w:rPr>
-          <w:sz w:val="36"/>
-          <w:szCs w:val="36"/>
-        </w:rPr>
       </w:r>
       <w:r>
         <w:t xml:space="preserve"> </w:t>
-        <w:rPr>
-          <w:sz w:val="36"/>
-          <w:szCs w:val="36"/>
-        </w:rPr>
       </w:r>
       <w:r>
         <w:rPr>
           <w:rStyle w:val="VerbatimChar"/>
-          <w:sz w:val="36"/>
-          <w:szCs w:val="36"/>
         </w:rPr>
         <w:t xml:space="preserve">el problema no és consumir PICA</w:t>
       </w:r>
       <w:r>
         <w:t xml:space="preserve">;</w:t>
-        <w:rPr>
-          <w:sz w:val="36"/>
-          <w:szCs w:val="36"/>
-        </w:rPr>
       </w:r>
       <w:r>
         <w:t xml:space="preserve"> </w:t>
-        <w:rPr>
-          <w:sz w:val="36"/>
-          <w:szCs w:val="36"/>
-        </w:rPr>
       </w:r>
       <w:r>
         <w:rPr>
           <w:rStyle w:val="VerbatimChar"/>
-          <w:sz w:val="36"/>
-          <w:szCs w:val="36"/>
         </w:rPr>
         <w:t xml:space="preserve">l'adaptador implementa el port</w:t>
       </w:r>
       <w:r>
         <w:t xml:space="preserve">;</w:t>
-        <w:rPr>
-          <w:sz w:val="36"/>
-          <w:szCs w:val="36"/>
-        </w:rPr>
       </w:r>
       <w:r>
         <w:t xml:space="preserve"> </w:t>
-        <w:rPr>
-          <w:sz w:val="36"/>
-          <w:szCs w:val="36"/>
-        </w:rPr>
       </w:r>
       <w:r>
         <w:rPr>
           <w:rStyle w:val="VerbatimChar"/>
-          <w:sz w:val="36"/>
-          <w:szCs w:val="36"/>
         </w:rPr>
         <w:t xml:space="preserve">l'arquitectura no elimina el canvi, el localitza</w:t>
       </w:r>
       <w:r>
         <w:t xml:space="preserve">.</w:t>
-        <w:rPr>
-          <w:sz w:val="36"/>
-          <w:szCs w:val="36"/>
-        </w:rPr>
       </w:r>
     </w:p>
     <w:p>
@@ -4100,10 +2878,6 @@
       </w:pPr>
       <w:r>
         <w:t xml:space="preserve">La postura ha de ser estable, amb els peus oberts a amplada d’espatlles. Usa les mans per marcar fronteres: dins/fora, port/adaptador, flux/dependència. Si et perds, torna al mantra: necessitat, port, adaptador. Aquesta triada recupera tota la presentació.</w:t>
-        <w:rPr>
-          <w:sz w:val="36"/>
-          <w:szCs w:val="36"/>
-        </w:rPr>
       </w:r>
     </w:p>
     <w:bookmarkEnd w:id="36"/>
@@ -4114,10 +2888,6 @@
       </w:pPr>
       <w:r>
         <w:t xml:space="preserve">5. Advertiments finals</w:t>
-        <w:rPr>
-          <w:sz w:val="36"/>
-          <w:szCs w:val="36"/>
-        </w:rPr>
       </w:r>
     </w:p>
     <w:p>
@@ -4126,10 +2896,6 @@
       </w:pPr>
       <w:r>
         <w:t xml:space="preserve">Risc de temps: les diapositives 4-10 poden allargar-se fàcilment. Si vas tard, no retallis la conclusió; retalla detall del cas AGAUR i de la demo.</w:t>
-        <w:rPr>
-          <w:sz w:val="36"/>
-          <w:szCs w:val="36"/>
-        </w:rPr>
       </w:r>
     </w:p>
     <w:p>
@@ -4138,10 +2904,6 @@
       </w:pPr>
       <w:r>
         <w:t xml:space="preserve">Risc conceptual: no diguis que PICA és el problema. Formula-ho sempre així: el problema és que el cas d’ús depengui directament dels detalls tècnics de la integració.</w:t>
-        <w:rPr>
-          <w:sz w:val="36"/>
-          <w:szCs w:val="36"/>
-        </w:rPr>
       </w:r>
     </w:p>
     <w:p>
@@ -4150,10 +2912,6 @@
       </w:pPr>
       <w:r>
         <w:t xml:space="preserve">Risc de lectura de fletxes: no presentar totes les fletxes com si signifiquessin el mateix. Quan representen ús o flux d’execució, poden sortir del servei cap als ports. Quan representen implementació o dependència de codi, la lectura correcta és de l’adaptador cap al port.</w:t>
-        <w:rPr>
-          <w:sz w:val="36"/>
-          <w:szCs w:val="36"/>
-        </w:rPr>
       </w:r>
     </w:p>
     <w:p>
@@ -4162,10 +2920,6 @@
       </w:pPr>
       <w:r>
         <w:t xml:space="preserve">Risc documental: el pla docent oficial diu que la llengua de docència és l’anglès. Si surt la pregunta, la resposta prudent és que la defensa és en català i que la classe és una adaptació per al context del tribunal; el contingut docent és el mateix.</w:t>
-        <w:rPr>
-          <w:sz w:val="36"/>
-          <w:szCs w:val="36"/>
-        </w:rPr>
       </w:r>
     </w:p>
     <w:p>
@@ -4174,54 +2928,30 @@
       </w:pPr>
       <w:r>
         <w:t xml:space="preserve">Risc de nom: el pla docent identifica</w:t>
-        <w:rPr>
-          <w:sz w:val="36"/>
-          <w:szCs w:val="36"/>
-        </w:rPr>
       </w:r>
       <w:r>
         <w:t xml:space="preserve"> </w:t>
-        <w:rPr>
-          <w:sz w:val="36"/>
-          <w:szCs w:val="36"/>
-        </w:rPr>
       </w:r>
       <w:r>
         <w:rPr>
           <w:rStyle w:val="VerbatimChar"/>
-          <w:sz w:val="36"/>
-          <w:szCs w:val="36"/>
         </w:rPr>
         <w:t xml:space="preserve">Josep Roure Alcobé</w:t>
       </w:r>
       <w:r>
         <w:t xml:space="preserve">. Si a altres documents apareix</w:t>
-        <w:rPr>
-          <w:sz w:val="36"/>
-          <w:szCs w:val="36"/>
-        </w:rPr>
       </w:r>
       <w:r>
         <w:t xml:space="preserve"> </w:t>
-        <w:rPr>
-          <w:sz w:val="36"/>
-          <w:szCs w:val="36"/>
-        </w:rPr>
       </w:r>
       <w:r>
         <w:rPr>
           <w:rStyle w:val="VerbatimChar"/>
-          <w:sz w:val="36"/>
-          <w:szCs w:val="36"/>
         </w:rPr>
         <w:t xml:space="preserve">Roura</w:t>
       </w:r>
       <w:r>
         <w:t xml:space="preserve">, cal unificar abans de tancar la PPTX.</w:t>
-        <w:rPr>
-          <w:sz w:val="36"/>
-          <w:szCs w:val="36"/>
-        </w:rPr>
       </w:r>
     </w:p>
     <w:p>
@@ -4230,10 +2960,6 @@
       </w:pPr>
       <w:r>
         <w:t xml:space="preserve">Risc de confidencialitat: no mencionar endpoints, credencials, captures internes ni detalls operatius d’AGAUR. L’informe acredita l’activitat; la classe només usa el cas com a abstracció docent.</w:t>
-        <w:rPr>
-          <w:sz w:val="36"/>
-          <w:szCs w:val="36"/>
-        </w:rPr>
       </w:r>
     </w:p>
     <w:bookmarkEnd w:id="37"/>
@@ -4274,8 +3000,8 @@
 </file>
 
 <file path=word/numbering.xml><?xml version="1.0" encoding="utf-8"?>
-<w:numbering xmlns:aink="http://schemas.microsoft.com/office/drawing/2016/ink" xmlns:am3d="http://schemas.microsoft.com/office/drawing/2017/model3d" xmlns:cx="http://schemas.microsoft.com/office/drawing/2014/chartex" xmlns:cx1="http://schemas.microsoft.com/office/drawing/2015/9/8/chartex" xmlns:cx2="http://schemas.microsoft.com/office/drawing/2015/10/21/chartex" xmlns:cx3="http://schemas.microsoft.com/office/drawing/2016/5/9/chartex" xmlns:cx4="http://schemas.microsoft.com/office/drawing/2016/5/10/chartex" xmlns:cx5="http://schemas.microsoft.com/office/drawing/2016/5/11/chartex" xmlns:cx6="http://schemas.microsoft.com/office/drawing/2016/5/12/chartex" xmlns:cx7="http://schemas.microsoft.com/office/drawing/2016/5/13/chartex" xmlns:cx8="http://schemas.microsoft.com/office/drawing/2016/5/14/chartex" xmlns:m="http://schemas.openxmlformats.org/officeDocument/2006/math" xmlns:mc="http://schemas.openxmlformats.org/markup-compatibility/2006" xmlns:o="urn:schemas-microsoft-com:office:office" xmlns:oel="http://schemas.microsoft.com/office/2019/extlst" xmlns:r="http://schemas.openxmlformats.org/officeDocument/2006/relationships" xmlns:v="urn:schemas-microsoft-com:vml" xmlns:w="http://schemas.openxmlformats.org/wordprocessingml/2006/main" xmlns:w10="urn:schemas-microsoft-com:office:word" xmlns:w14="http://schemas.microsoft.com/office/word/2010/wordml" xmlns:w15="http://schemas.microsoft.com/office/word/2012/wordml" xmlns:w16="http://schemas.microsoft.com/office/word/2018/wordml" xmlns:w16cex="http://schemas.microsoft.com/office/word/2018/wordml/cex" xmlns:w16cid="http://schemas.microsoft.com/office/word/2016/wordml/cid" xmlns:w16du="http://schemas.microsoft.com/office/word/2023/wordml/word16du" xmlns:w16sdtdh="http://schemas.microsoft.com/office/word/2020/wordml/sdtdatahash" xmlns:w16sdtfl="http://schemas.microsoft.com/office/word/2024/wordml/sdtformatlock" xmlns:w16se="http://schemas.microsoft.com/office/word/2015/wordml/symex" xmlns:wne="http://schemas.microsoft.com/office/word/2006/wordml" xmlns:wp="http://schemas.openxmlformats.org/drawingml/2006/wordprocessingDrawing" xmlns:wp14="http://schemas.microsoft.com/office/word/2010/wordprocessingDrawing" xmlns:wpc="http://schemas.microsoft.com/office/word/2010/wordprocessingCanvas" xmlns:wpg="http://schemas.microsoft.com/office/word/2010/wordprocessingGroup" xmlns:wpi="http://schemas.microsoft.com/office/word/2010/wordprocessingInk" xmlns:wps="http://schemas.microsoft.com/office/word/2010/wordprocessingShape" mc:Ignorable="w14 w15 w16se w16cid w16 w16cex w16sdtdh w16sdtfl w16du wp14">
-  <w:abstractNum w15:restartNumberingAfterBreak="0" w:abstractNumId="0">
+<w:numbering xmlns:ns1="http://schemas.openxmlformats.org/markup-compatibility/2006" xmlns:ns2="http://schemas.microsoft.com/office/word/2012/wordml" xmlns:ns3="http://schemas.microsoft.com/office/word/2016/wordml/cid" xmlns:w="http://schemas.openxmlformats.org/wordprocessingml/2006/main" ns1:Ignorable="w14 w15 w16se w16cid w16 w16cex w16sdtdh w16sdtfl w16du wp14">
+  <w:abstractNum ns2:restartNumberingAfterBreak="0" w:abstractNumId="0">
     <w:nsid w:val="0000A990"/>
     <w:multiLevelType w:val="multilevel"/>
     <w:tmpl w:val="CA3615EA"/>
@@ -4352,7 +3078,7 @@
       </w:pPr>
     </w:lvl>
   </w:abstractNum>
-  <w:abstractNum w15:restartNumberingAfterBreak="0" w:abstractNumId="1">
+  <w:abstractNum ns2:restartNumberingAfterBreak="0" w:abstractNumId="1">
     <w:nsid w:val="0000A991"/>
     <w:multiLevelType w:val="multilevel"/>
     <w:tmpl w:val="F12E014E"/>
@@ -4635,58 +3361,106 @@
       </w:rPr>
     </w:lvl>
   </w:abstractNum>
-  <w:num w16cid:durableId="144666998" w:numId="1">
+  <w:num ns3:durableId="144666998" w:numId="1">
     <w:abstractNumId w:val="0"/>
   </w:num>
-  <w:num w16cid:durableId="1410419399" w:numId="2">
+  <w:num ns3:durableId="1410419399" w:numId="2">
     <w:abstractNumId w:val="1"/>
   </w:num>
-  <w:num w16cid:durableId="466897372" w:numId="3">
+  <w:num ns3:durableId="466897372" w:numId="3">
     <w:abstractNumId w:val="1"/>
   </w:num>
-  <w:num w16cid:durableId="1619142029" w:numId="4">
+  <w:num ns3:durableId="1619142029" w:numId="4">
     <w:abstractNumId w:val="1"/>
   </w:num>
-  <w:num w16cid:durableId="988754143" w:numId="5">
+  <w:num ns3:durableId="988754143" w:numId="5">
     <w:abstractNumId w:val="1"/>
   </w:num>
-  <w:num w16cid:durableId="1848209600" w:numId="6">
+  <w:num ns3:durableId="1848209600" w:numId="6">
     <w:abstractNumId w:val="1"/>
   </w:num>
-  <w:num w16cid:durableId="1766072532" w:numId="7">
+  <w:num ns3:durableId="1766072532" w:numId="7">
     <w:abstractNumId w:val="1"/>
   </w:num>
-  <w:num w16cid:durableId="1921862898" w:numId="8">
+  <w:num ns3:durableId="1921862898" w:numId="8">
     <w:abstractNumId w:val="1"/>
   </w:num>
-  <w:num w16cid:durableId="1438065664" w:numId="9">
+  <w:num ns3:durableId="1438065664" w:numId="9">
     <w:abstractNumId w:val="1"/>
   </w:num>
-  <w:num w16cid:durableId="323168462" w:numId="10">
+  <w:num ns3:durableId="323168462" w:numId="10">
     <w:abstractNumId w:val="1"/>
   </w:num>
-  <w:num w16cid:durableId="1204441828" w:numId="11">
+  <w:num ns3:durableId="1204441828" w:numId="11">
     <w:abstractNumId w:val="1"/>
   </w:num>
-  <w:num w16cid:durableId="941954038" w:numId="12">
+  <w:num ns3:durableId="941954038" w:numId="12">
     <w:abstractNumId w:val="1"/>
   </w:num>
-  <w:num w16cid:durableId="1411657343" w:numId="13">
+  <w:num ns3:durableId="1411657343" w:numId="13">
     <w:abstractNumId w:val="1"/>
   </w:num>
-  <w:num w16cid:durableId="1168640367" w:numId="14">
+  <w:num ns3:durableId="1168640367" w:numId="14">
     <w:abstractNumId w:val="1"/>
   </w:num>
-  <w:num w16cid:durableId="2045523877" w:numId="15">
+  <w:num ns3:durableId="2045523877" w:numId="15">
     <w:abstractNumId w:val="1"/>
   </w:num>
-  <w:num w16cid:durableId="672026053" w:numId="16">
+  <w:num ns3:durableId="672026053" w:numId="16">
     <w:abstractNumId w:val="1"/>
   </w:num>
-  <w:num w16cid:durableId="1328555788" w:numId="17">
+  <w:num ns3:durableId="1328555788" w:numId="17">
     <w:abstractNumId w:val="1"/>
   </w:num>
-  <w:num w16cid:durableId="1339043308" w:numId="18">
+  <w:num ns3:durableId="1339043308" w:numId="18">
+    <w:abstractNumId w:val="1"/>
+  </w:num>
+  <w:num ns3:durableId="940065575" w:numId="19">
+    <w:abstractNumId w:val="0"/>
+  </w:num>
+  <w:num ns3:durableId="179127088" w:numId="20">
+    <w:abstractNumId w:val="1"/>
+  </w:num>
+  <w:num ns3:durableId="765348858" w:numId="21">
+    <w:abstractNumId w:val="1"/>
+  </w:num>
+  <w:num ns3:durableId="522784037" w:numId="22">
+    <w:abstractNumId w:val="1"/>
+  </w:num>
+  <w:num ns3:durableId="420951279" w:numId="23">
+    <w:abstractNumId w:val="1"/>
+  </w:num>
+  <w:num ns3:durableId="1111169217" w:numId="24">
+    <w:abstractNumId w:val="1"/>
+  </w:num>
+  <w:num ns3:durableId="250706255" w:numId="25">
+    <w:abstractNumId w:val="1"/>
+  </w:num>
+  <w:num ns3:durableId="1093821049" w:numId="26">
+    <w:abstractNumId w:val="1"/>
+  </w:num>
+  <w:num ns3:durableId="1723601968" w:numId="27">
+    <w:abstractNumId w:val="1"/>
+  </w:num>
+  <w:num ns3:durableId="211425153" w:numId="28">
+    <w:abstractNumId w:val="1"/>
+  </w:num>
+  <w:num ns3:durableId="510796475" w:numId="29">
+    <w:abstractNumId w:val="1"/>
+  </w:num>
+  <w:num ns3:durableId="269972921" w:numId="30">
+    <w:abstractNumId w:val="1"/>
+  </w:num>
+  <w:num ns3:durableId="2025936008" w:numId="31">
+    <w:abstractNumId w:val="1"/>
+  </w:num>
+  <w:num ns3:durableId="493498129" w:numId="32">
+    <w:abstractNumId w:val="1"/>
+  </w:num>
+  <w:num ns3:durableId="1781146685" w:numId="33">
+    <w:abstractNumId w:val="1"/>
+  </w:num>
+  <w:num ns3:durableId="1685129439" w:numId="34">
     <w:abstractNumId w:val="1"/>
   </w:num>
   <w:num w:numId="1000">
@@ -4741,13 +3515,13 @@
 </file>
 
 <file path=word/styles.xml><?xml version="1.0" encoding="utf-8"?>
-<w:styles xmlns:mc="http://schemas.openxmlformats.org/markup-compatibility/2006" xmlns:r="http://schemas.openxmlformats.org/officeDocument/2006/relationships" xmlns:w="http://schemas.openxmlformats.org/wordprocessingml/2006/main" xmlns:w14="http://schemas.microsoft.com/office/word/2010/wordml" xmlns:w15="http://schemas.microsoft.com/office/word/2012/wordml" xmlns:w16="http://schemas.microsoft.com/office/word/2018/wordml" xmlns:w16cex="http://schemas.microsoft.com/office/word/2018/wordml/cex" xmlns:w16cid="http://schemas.microsoft.com/office/word/2016/wordml/cid" xmlns:w16du="http://schemas.microsoft.com/office/word/2023/wordml/word16du" xmlns:w16sdtdh="http://schemas.microsoft.com/office/word/2020/wordml/sdtdatahash" xmlns:w16sdtfl="http://schemas.microsoft.com/office/word/2024/wordml/sdtformatlock" xmlns:w16se="http://schemas.microsoft.com/office/word/2015/wordml/symex" mc:Ignorable="w14 w15 w16se w16cid w16 w16cex w16sdtdh w16sdtfl w16du">
+<w:styles xmlns:ns1="http://schemas.openxmlformats.org/markup-compatibility/2006" xmlns:w="http://schemas.openxmlformats.org/wordprocessingml/2006/main" ns1:Ignorable="w14 w15 w16se w16cid w16 w16cex w16sdtdh w16sdtfl w16du">
   <w:docDefaults>
     <w:rPrDefault>
       <w:rPr>
         <w:rFonts w:asciiTheme="minorHAnsi" w:cstheme="minorBidi" w:eastAsiaTheme="minorEastAsia" w:hAnsiTheme="minorHAnsi"/>
-        <w:sz w:val="24"/>
-        <w:szCs w:val="24"/>
+        <w:sz w:val="36"/>
+        <w:szCs w:val="36"/>
         <w:lang w:bidi="ar-SA" w:eastAsia="zh-CN" w:val="en-US"/>
       </w:rPr>
     </w:rPrDefault>
@@ -5045,8 +3819,8 @@
     <w:rPr>
       <w:rFonts w:asciiTheme="majorHAnsi" w:cstheme="majorBidi" w:eastAsiaTheme="majorEastAsia" w:hAnsiTheme="majorHAnsi"/>
       <w:color w:themeColor="accent1" w:themeShade="BF" w:val="0F4761"/>
-      <w:sz w:val="32"/>
-      <w:szCs w:val="32"/>
+      <w:sz w:val="36"/>
+      <w:szCs w:val="36"/>
     </w:rPr>
   </w:style>
   <w:style w:styleId="Ttulo3" w:type="paragraph">
@@ -5068,8 +3842,8 @@
     <w:rPr>
       <w:rFonts w:cstheme="majorBidi" w:eastAsiaTheme="majorEastAsia"/>
       <w:color w:themeColor="accent1" w:themeShade="BF" w:val="0F4761"/>
-      <w:sz w:val="28"/>
-      <w:szCs w:val="28"/>
+      <w:sz w:val="36"/>
+      <w:szCs w:val="36"/>
     </w:rPr>
   </w:style>
   <w:style w:styleId="Ttulo4" w:type="paragraph">
@@ -5299,8 +4073,8 @@
     </w:pPr>
     <w:rPr>
       <w:spacing w:val="15"/>
-      <w:sz w:val="28"/>
-      <w:szCs w:val="28"/>
+      <w:sz w:val="36"/>
+      <w:szCs w:val="36"/>
     </w:rPr>
   </w:style>
   <w:style w:customStyle="1" w:styleId="SubttuloCar" w:type="character">
@@ -5313,8 +4087,8 @@
       <w:rFonts w:cstheme="majorBidi" w:eastAsiaTheme="majorEastAsia"/>
       <w:color w:themeColor="text1" w:themeTint="A6" w:val="595959"/>
       <w:spacing w:val="15"/>
-      <w:sz w:val="28"/>
-      <w:szCs w:val="28"/>
+      <w:sz w:val="36"/>
+      <w:szCs w:val="36"/>
     </w:rPr>
   </w:style>
   <w:style w:customStyle="1" w:styleId="Author" w:type="paragraph">
@@ -5327,8 +4101,8 @@
       <w:keepLines/>
     </w:pPr>
     <w:rPr>
-      <w:sz w:val="24"/>
-      <w:szCs w:val="24"/>
+      <w:sz w:val="36"/>
+      <w:szCs w:val="36"/>
     </w:rPr>
   </w:style>
   <w:style w:styleId="Fecha" w:type="paragraph">
@@ -5341,8 +4115,8 @@
       <w:keepLines/>
     </w:pPr>
     <w:rPr>
-      <w:sz w:val="24"/>
-      <w:szCs w:val="24"/>
+      <w:sz w:val="36"/>
+      <w:szCs w:val="36"/>
     </w:rPr>
   </w:style>
   <w:style w:customStyle="1" w:styleId="AbstractTitle" w:type="paragraph">
@@ -5358,8 +4132,8 @@
     </w:pPr>
     <w:rPr>
       <w:b/>
-      <w:sz w:val="20"/>
-      <w:szCs w:val="20"/>
+      <w:sz w:val="36"/>
+      <w:szCs w:val="36"/>
     </w:rPr>
   </w:style>
   <w:style w:customStyle="1" w:styleId="Abstract" w:type="paragraph">
@@ -5373,8 +4147,8 @@
       <w:spacing w:after="300" w:before="100"/>
     </w:pPr>
     <w:rPr>
-      <w:sz w:val="20"/>
-      <w:szCs w:val="20"/>
+      <w:sz w:val="36"/>
+      <w:szCs w:val="36"/>
     </w:rPr>
   </w:style>
   <w:style w:styleId="Bibliografa" w:type="paragraph">
@@ -5405,8 +4179,8 @@
     <w:rPr>
       <w:rFonts w:asciiTheme="majorHAnsi" w:cstheme="majorBidi" w:eastAsiaTheme="majorEastAsia" w:hAnsiTheme="majorHAnsi"/>
       <w:color w:themeColor="accent1" w:themeShade="BF" w:val="0F4761"/>
-      <w:sz w:val="32"/>
-      <w:szCs w:val="32"/>
+      <w:sz w:val="36"/>
+      <w:szCs w:val="36"/>
     </w:rPr>
   </w:style>
   <w:style w:customStyle="1" w:styleId="Ttulo3Car" w:type="character">
@@ -5419,8 +4193,8 @@
     <w:rPr>
       <w:rFonts w:cstheme="majorBidi" w:eastAsiaTheme="majorEastAsia"/>
       <w:color w:themeColor="accent1" w:themeShade="BF" w:val="0F4761"/>
-      <w:sz w:val="28"/>
-      <w:szCs w:val="28"/>
+      <w:sz w:val="36"/>
+      <w:szCs w:val="36"/>
     </w:rPr>
   </w:style>
   <w:style w:customStyle="1" w:styleId="Ttulo4Car" w:type="character">
@@ -5617,7 +4391,7 @@
     <w:link w:val="SourceCode"/>
     <w:rPr>
       <w:rFonts w:ascii="Consolas" w:hAnsi="Consolas"/>
-      <w:sz w:val="22"/>
+      <w:sz w:val="36"/>
     </w:rPr>
   </w:style>
   <w:style w:customStyle="1" w:styleId="SectionNumber" w:type="character">
@@ -5665,7 +4439,7 @@
       <w:rFonts w:ascii="Consolas" w:hAnsi="Consolas"/>
       <w:b/>
       <w:color w:val="007020"/>
-      <w:sz w:val="22"/>
+      <w:sz w:val="36"/>
     </w:rPr>
   </w:style>
   <w:style w:customStyle="1" w:styleId="DataTypeTok" w:type="character">
@@ -5674,7 +4448,7 @@
     <w:rPr>
       <w:rFonts w:ascii="Consolas" w:hAnsi="Consolas"/>
       <w:color w:val="902000"/>
-      <w:sz w:val="22"/>
+      <w:sz w:val="36"/>
     </w:rPr>
   </w:style>
   <w:style w:customStyle="1" w:styleId="DecValTok" w:type="character">
@@ -5683,7 +4457,7 @@
     <w:rPr>
       <w:rFonts w:ascii="Consolas" w:hAnsi="Consolas"/>
       <w:color w:val="40A070"/>
-      <w:sz w:val="22"/>
+      <w:sz w:val="36"/>
     </w:rPr>
   </w:style>
   <w:style w:customStyle="1" w:styleId="BaseNTok" w:type="character">
@@ -5692,7 +4466,7 @@
     <w:rPr>
       <w:rFonts w:ascii="Consolas" w:hAnsi="Consolas"/>
       <w:color w:val="40A070"/>
-      <w:sz w:val="22"/>
+      <w:sz w:val="36"/>
     </w:rPr>
   </w:style>
   <w:style w:customStyle="1" w:styleId="FloatTok" w:type="character">
@@ -5701,7 +4475,7 @@
     <w:rPr>
       <w:rFonts w:ascii="Consolas" w:hAnsi="Consolas"/>
       <w:color w:val="40A070"/>
-      <w:sz w:val="22"/>
+      <w:sz w:val="36"/>
     </w:rPr>
   </w:style>
   <w:style w:customStyle="1" w:styleId="ConstantTok" w:type="character">
@@ -5710,7 +4484,7 @@
     <w:rPr>
       <w:rFonts w:ascii="Consolas" w:hAnsi="Consolas"/>
       <w:color w:val="880000"/>
-      <w:sz w:val="22"/>
+      <w:sz w:val="36"/>
     </w:rPr>
   </w:style>
   <w:style w:customStyle="1" w:styleId="CharTok" w:type="character">
@@ -5719,7 +4493,7 @@
     <w:rPr>
       <w:rFonts w:ascii="Consolas" w:hAnsi="Consolas"/>
       <w:color w:val="4070A0"/>
-      <w:sz w:val="22"/>
+      <w:sz w:val="36"/>
     </w:rPr>
   </w:style>
   <w:style w:customStyle="1" w:styleId="SpecialCharTok" w:type="character">
@@ -5728,7 +4502,7 @@
     <w:rPr>
       <w:rFonts w:ascii="Consolas" w:hAnsi="Consolas"/>
       <w:color w:val="4070A0"/>
-      <w:sz w:val="22"/>
+      <w:sz w:val="36"/>
     </w:rPr>
   </w:style>
   <w:style w:customStyle="1" w:styleId="StringTok" w:type="character">
@@ -5737,7 +4511,7 @@
     <w:rPr>
       <w:rFonts w:ascii="Consolas" w:hAnsi="Consolas"/>
       <w:color w:val="4070A0"/>
-      <w:sz w:val="22"/>
+      <w:sz w:val="36"/>
     </w:rPr>
   </w:style>
   <w:style w:customStyle="1" w:styleId="VerbatimStringTok" w:type="character">
@@ -5746,7 +4520,7 @@
     <w:rPr>
       <w:rFonts w:ascii="Consolas" w:hAnsi="Consolas"/>
       <w:color w:val="4070A0"/>
-      <w:sz w:val="22"/>
+      <w:sz w:val="36"/>
     </w:rPr>
   </w:style>
   <w:style w:customStyle="1" w:styleId="SpecialStringTok" w:type="character">
@@ -5755,7 +4529,7 @@
     <w:rPr>
       <w:rFonts w:ascii="Consolas" w:hAnsi="Consolas"/>
       <w:color w:val="BB6688"/>
-      <w:sz w:val="22"/>
+      <w:sz w:val="36"/>
     </w:rPr>
   </w:style>
   <w:style w:customStyle="1" w:styleId="ImportTok" w:type="character">
@@ -5765,7 +4539,7 @@
       <w:rFonts w:ascii="Consolas" w:hAnsi="Consolas"/>
       <w:b/>
       <w:color w:val="008000"/>
-      <w:sz w:val="22"/>
+      <w:sz w:val="36"/>
     </w:rPr>
   </w:style>
   <w:style w:customStyle="1" w:styleId="CommentTok" w:type="character">
@@ -5775,7 +4549,7 @@
       <w:rFonts w:ascii="Consolas" w:hAnsi="Consolas"/>
       <w:i/>
       <w:color w:val="60A0B0"/>
-      <w:sz w:val="22"/>
+      <w:sz w:val="36"/>
     </w:rPr>
   </w:style>
   <w:style w:customStyle="1" w:styleId="DocumentationTok" w:type="character">
@@ -5785,7 +4559,7 @@
       <w:rFonts w:ascii="Consolas" w:hAnsi="Consolas"/>
       <w:i/>
       <w:color w:val="BA2121"/>
-      <w:sz w:val="22"/>
+      <w:sz w:val="36"/>
     </w:rPr>
   </w:style>
   <w:style w:customStyle="1" w:styleId="AnnotationTok" w:type="character">
@@ -5796,7 +4570,7 @@
       <w:b/>
       <w:i/>
       <w:color w:val="60A0B0"/>
-      <w:sz w:val="22"/>
+      <w:sz w:val="36"/>
     </w:rPr>
   </w:style>
   <w:style w:customStyle="1" w:styleId="CommentVarTok" w:type="character">
@@ -5807,7 +4581,7 @@
       <w:b/>
       <w:i/>
       <w:color w:val="60A0B0"/>
-      <w:sz w:val="22"/>
+      <w:sz w:val="36"/>
     </w:rPr>
   </w:style>
   <w:style w:customStyle="1" w:styleId="OtherTok" w:type="character">
@@ -5816,7 +4590,7 @@
     <w:rPr>
       <w:rFonts w:ascii="Consolas" w:hAnsi="Consolas"/>
       <w:color w:val="007020"/>
-      <w:sz w:val="22"/>
+      <w:sz w:val="36"/>
     </w:rPr>
   </w:style>
   <w:style w:customStyle="1" w:styleId="FunctionTok" w:type="character">
@@ -5825,7 +4599,7 @@
     <w:rPr>
       <w:rFonts w:ascii="Consolas" w:hAnsi="Consolas"/>
       <w:color w:val="06287E"/>
-      <w:sz w:val="22"/>
+      <w:sz w:val="36"/>
     </w:rPr>
   </w:style>
   <w:style w:customStyle="1" w:styleId="VariableTok" w:type="character">
@@ -5834,7 +4608,7 @@
     <w:rPr>
       <w:rFonts w:ascii="Consolas" w:hAnsi="Consolas"/>
       <w:color w:val="19177C"/>
-      <w:sz w:val="22"/>
+      <w:sz w:val="36"/>
     </w:rPr>
   </w:style>
   <w:style w:customStyle="1" w:styleId="ControlFlowTok" w:type="character">
@@ -5844,7 +4618,7 @@
       <w:rFonts w:ascii="Consolas" w:hAnsi="Consolas"/>
       <w:b/>
       <w:color w:val="007020"/>
-      <w:sz w:val="22"/>
+      <w:sz w:val="36"/>
     </w:rPr>
   </w:style>
   <w:style w:customStyle="1" w:styleId="OperatorTok" w:type="character">
@@ -5853,7 +4627,7 @@
     <w:rPr>
       <w:rFonts w:ascii="Consolas" w:hAnsi="Consolas"/>
       <w:color w:val="666666"/>
-      <w:sz w:val="22"/>
+      <w:sz w:val="36"/>
     </w:rPr>
   </w:style>
   <w:style w:customStyle="1" w:styleId="BuiltInTok" w:type="character">
@@ -5862,7 +4636,7 @@
     <w:rPr>
       <w:rFonts w:ascii="Consolas" w:hAnsi="Consolas"/>
       <w:color w:val="008000"/>
-      <w:sz w:val="22"/>
+      <w:sz w:val="36"/>
     </w:rPr>
   </w:style>
   <w:style w:customStyle="1" w:styleId="ExtensionTok" w:type="character">
@@ -5870,7 +4644,7 @@
     <w:basedOn w:val="VerbatimChar"/>
     <w:rPr>
       <w:rFonts w:ascii="Consolas" w:hAnsi="Consolas"/>
-      <w:sz w:val="22"/>
+      <w:sz w:val="36"/>
     </w:rPr>
   </w:style>
   <w:style w:customStyle="1" w:styleId="PreprocessorTok" w:type="character">
@@ -5879,7 +4653,7 @@
     <w:rPr>
       <w:rFonts w:ascii="Consolas" w:hAnsi="Consolas"/>
       <w:color w:val="BC7A00"/>
-      <w:sz w:val="22"/>
+      <w:sz w:val="36"/>
     </w:rPr>
   </w:style>
   <w:style w:customStyle="1" w:styleId="AttributeTok" w:type="character">
@@ -5888,7 +4662,7 @@
     <w:rPr>
       <w:rFonts w:ascii="Consolas" w:hAnsi="Consolas"/>
       <w:color w:val="7D9029"/>
-      <w:sz w:val="22"/>
+      <w:sz w:val="36"/>
     </w:rPr>
   </w:style>
   <w:style w:customStyle="1" w:styleId="RegionMarkerTok" w:type="character">
@@ -5896,7 +4670,7 @@
     <w:basedOn w:val="VerbatimChar"/>
     <w:rPr>
       <w:rFonts w:ascii="Consolas" w:hAnsi="Consolas"/>
-      <w:sz w:val="22"/>
+      <w:sz w:val="36"/>
     </w:rPr>
   </w:style>
   <w:style w:customStyle="1" w:styleId="InformationTok" w:type="character">
@@ -5907,7 +4681,7 @@
       <w:b/>
       <w:i/>
       <w:color w:val="60A0B0"/>
-      <w:sz w:val="22"/>
+      <w:sz w:val="36"/>
     </w:rPr>
   </w:style>
   <w:style w:customStyle="1" w:styleId="WarningTok" w:type="character">
@@ -5918,7 +4692,7 @@
       <w:b/>
       <w:i/>
       <w:color w:val="60A0B0"/>
-      <w:sz w:val="22"/>
+      <w:sz w:val="36"/>
     </w:rPr>
   </w:style>
   <w:style w:customStyle="1" w:styleId="AlertTok" w:type="character">
@@ -5928,7 +4702,7 @@
       <w:rFonts w:ascii="Consolas" w:hAnsi="Consolas"/>
       <w:b/>
       <w:color w:val="FF0000"/>
-      <w:sz w:val="22"/>
+      <w:sz w:val="36"/>
     </w:rPr>
   </w:style>
   <w:style w:customStyle="1" w:styleId="ErrorTok" w:type="character">
@@ -5938,7 +4712,7 @@
       <w:rFonts w:ascii="Consolas" w:hAnsi="Consolas"/>
       <w:b/>
       <w:color w:val="FF0000"/>
-      <w:sz w:val="22"/>
+      <w:sz w:val="36"/>
     </w:rPr>
   </w:style>
   <w:style w:customStyle="1" w:styleId="NormalTok" w:type="character">
@@ -5946,7 +4720,7 @@
     <w:basedOn w:val="VerbatimChar"/>
     <w:rPr>
       <w:rFonts w:ascii="Consolas" w:hAnsi="Consolas"/>
-      <w:sz w:val="22"/>
+      <w:sz w:val="36"/>
     </w:rPr>
   </w:style>
 </w:styles>

</xml_diff>

<commit_message>
docs: add derived materials generation script
</commit_message>
<xml_diff>
--- a/doc/presentations/defensa-placa-permanent-dsi-ports-sortida-hexagonal/output/REMARKABLE_materials-orals-canonics-20-minuts.docx
+++ b/doc/presentations/defensa-placa-permanent-dsi-ports-sortida-hexagonal/output/REMARKABLE_materials-orals-canonics-20-minuts.docx
@@ -1,8 +1,8 @@
 
 <file path=word/document.xml><?xml version="1.0" encoding="utf-8"?>
-<w:document xmlns:w="http://schemas.openxmlformats.org/wordprocessingml/2006/main">
+<w:document xmlns:w="http://schemas.openxmlformats.org/wordprocessingml/2006/main" xmlns:m="http://schemas.openxmlformats.org/officeDocument/2006/math" xmlns:r="http://schemas.openxmlformats.org/officeDocument/2006/relationships" xmlns:o="urn:schemas-microsoft-com:office:office" xmlns:v="urn:schemas-microsoft-com:vml" xmlns:w10="urn:schemas-microsoft-com:office:word" xmlns:a="http://schemas.openxmlformats.org/drawingml/2006/main" xmlns:pic="http://schemas.openxmlformats.org/drawingml/2006/picture" xmlns:wp="http://schemas.openxmlformats.org/drawingml/2006/wordprocessingDrawing">
   <w:body>
-    <w:bookmarkStart w:id="38" w:name="X79cee1dd7752e91aad864bc270c2d5ac95f00d7"/>
+    <w:bookmarkStart w:id="43" w:name="X79cee1dd7752e91aad864bc270c2d5ac95f00d7"/>
     <w:p>
       <w:pPr>
         <w:pStyle w:val="Ttulo1"/>
@@ -147,7 +147,22 @@
         <w:t xml:space="preserve">i altres esborranys previs.</w:t>
       </w:r>
     </w:p>
-    <w:bookmarkStart w:id="21" w:name="guió-oral-complet-imprimible"/>
+    <w:p>
+      <w:pPr>
+        <w:pStyle w:val="Textoindependiente"/>
+      </w:pPr>
+      <w:r>
+        <w:t xml:space="preserve">Nota de versió: la demo queda fora del cos principal de la classe. El tancament formal és la diapositiva d’agraïment. La demo es conserva com a annex opcional, només per activar-la si el tribunal la demana o si hi ha temps explícitament disponible després del tancament.</w:t>
+      </w:r>
+    </w:p>
+    <w:p>
+      <w:r>
+        <w:pict>
+          <v:rect style="width:0;height:1.5pt" o:hralign="center" o:hrstd="t" o:hr="t"/>
+        </w:pict>
+      </w:r>
+    </w:p>
+    <w:bookmarkStart w:id="20" w:name="guió-oral-complet-imprimible"/>
     <w:p>
       <w:pPr>
         <w:pStyle w:val="Ttulo2"/>
@@ -161,16 +176,24 @@
         <w:pStyle w:val="FirstParagraph"/>
       </w:pPr>
       <w:r>
-        <w:t xml:space="preserve">Temps total previst: 20:00.</w:t>
-      </w:r>
-    </w:p>
-    <w:bookmarkStart w:id="9" w:name="diapositiva-1.-portada---145"/>
+        <w:t xml:space="preserve">Temps total previst del cos principal: 20:00 aproximadament, sense demo en viu.</w:t>
+      </w:r>
+    </w:p>
+    <w:p>
+      <w:pPr>
+        <w:pStyle w:val="Textoindependiente"/>
+      </w:pPr>
+      <w:r>
+        <w:t xml:space="preserve">La demo no forma part del temps canònic de la classe. S’ha de considerar un annex opcional posterior al tancament.</w:t>
+      </w:r>
+    </w:p>
+    <w:bookmarkStart w:id="9" w:name="diapositiva-1.-portada---135"/>
     <w:p>
       <w:pPr>
         <w:pStyle w:val="Ttulo3"/>
       </w:pPr>
       <w:r>
-        <w:t xml:space="preserve">Diapositiva 1. Portada - 1:45</w:t>
+        <w:t xml:space="preserve">Diapositiva 1. Portada - 1:35</w:t>
       </w:r>
     </w:p>
     <w:p>
@@ -242,13 +265,13 @@
       </w:r>
     </w:p>
     <w:bookmarkEnd w:id="9"/>
-    <w:bookmarkStart w:id="10" w:name="Xbd8d813bdf1f660b3e63d6e4e001ea5920e5fb0"/>
+    <w:bookmarkStart w:id="10" w:name="Xb5679af0ea6231d1f2267dfe9100fc7751af926"/>
     <w:p>
       <w:pPr>
         <w:pStyle w:val="Ttulo3"/>
       </w:pPr>
       <w:r>
-        <w:t xml:space="preserve">Diapositiva 2. On som dins l’assignatura - 1:10</w:t>
+        <w:t xml:space="preserve">Diapositiva 2. On som dins l’assignatura - 1:05</w:t>
       </w:r>
     </w:p>
     <w:p>
@@ -264,7 +287,7 @@
         <w:pStyle w:val="Textoindependiente"/>
       </w:pPr>
       <w:r>
-        <w:t xml:space="preserve">El pla docent de l’assignatura explica que s’hi treballa una visió global d’arquitectures de sistemes d’informació: arquitectures per capes, arquitectures hexagonals, basades en microserveis. Dins el bloc d’arquitectures hexagonals hi apareixen explícitament ports i adaptadors. [to calmat, explicatiu]</w:t>
+        <w:t xml:space="preserve">El pla docent de l’assignatura explica que s’hi treballa una visió global d’arquitectures de sistemes d’informació: arquitectures per capes, arquitectures hexagonals i arquitectures basades en microserveis. Dins el bloc d’arquitectures hexagonals hi apareixen explícitament ports i adaptadors. [to calmat, explicatiu]</w:t>
       </w:r>
     </w:p>
     <w:p>
@@ -318,13 +341,13 @@
       </w:r>
     </w:p>
     <w:bookmarkEnd w:id="11"/>
-    <w:bookmarkStart w:id="12" w:name="Xe44e148b7ebe898f3299718f45351b6467fee24"/>
+    <w:bookmarkStart w:id="12" w:name="X5e939adc6516d171120054c2dd2ce9d366e8390"/>
     <w:p>
       <w:pPr>
         <w:pStyle w:val="Ttulo3"/>
       </w:pPr>
       <w:r>
-        <w:t xml:space="preserve">Diapositiva 4. Avaluació econòmica d’una beca - 1:50</w:t>
+        <w:t xml:space="preserve">Diapositiva 4. Avaluació econòmica d’una beca - 1:45</w:t>
       </w:r>
     </w:p>
     <w:p>
@@ -368,13 +391,13 @@
       </w:r>
     </w:p>
     <w:bookmarkEnd w:id="12"/>
-    <w:bookmarkStart w:id="13" w:name="X49d8499aef8096cf0d8707c0a2b10b4e00df2f8"/>
+    <w:bookmarkStart w:id="13" w:name="Xaefc5253d1fb734b44ed8eafed0859cae3b4679"/>
     <w:p>
       <w:pPr>
         <w:pStyle w:val="Ttulo3"/>
       </w:pPr>
       <w:r>
-        <w:t xml:space="preserve">Diapositiva 5. Quina informació externa necessita el procediment? - 2:00</w:t>
+        <w:t xml:space="preserve">Diapositiva 5. Quina informació externa necessita el procediment? - 1:55</w:t>
       </w:r>
     </w:p>
     <w:p>
@@ -434,7 +457,7 @@
         <w:t xml:space="preserve">necessito informació patrimonial avaluable</w:t>
       </w:r>
       <w:r>
-        <w:t xml:space="preserve">. Encara no estem decidint si aquesta informació arribarà a través de PICA, d’un servei SOAP, d’una API REST, d’un certificat, d’una base de dades corporativa o d’un altre mecanisme futur.</w:t>
+        <w:t xml:space="preserve">. Encara no estem decidint si aquesta informació arribarà a través de PICA, d’un servei SOAP, d’una API REST, d’una base de dades corporativa o d’un altre mecanisme futur.</w:t>
       </w:r>
     </w:p>
     <w:p>
@@ -446,13 +469,13 @@
       </w:r>
     </w:p>
     <w:bookmarkEnd w:id="13"/>
-    <w:bookmarkStart w:id="14" w:name="X84147f10029592ec3bd146ffb3a5109a19eca0d"/>
+    <w:bookmarkStart w:id="14" w:name="Xe7b448d2a3a0863eade31fe1550722061691316"/>
     <w:p>
       <w:pPr>
         <w:pStyle w:val="Ttulo3"/>
       </w:pPr>
       <w:r>
-        <w:t xml:space="preserve">Diapositiva 6. Dependència directa entre procediment i integració - 2:10</w:t>
+        <w:t xml:space="preserve">Diapositiva 6. Dependència directa entre procediment i integració - 2:05</w:t>
       </w:r>
     </w:p>
     <w:p>
@@ -468,7 +491,7 @@
         <w:pStyle w:val="Textoindependiente"/>
       </w:pPr>
       <w:r>
-        <w:t xml:space="preserve">El problema no és consumir PICA. Ho remarco perquè és important. PICA, en aquest context, és una plataforma corporativa d’interoperabilitat. El problema arquitectònic apareix quan la lògica del procediment administratiu depèn directament dels detalls de la integració: DTOs externs, estructures XML, clients SOAP, codis d’error tècnics o convencions d’una API concreta. [pausa breu]</w:t>
+        <w:t xml:space="preserve">El problema no és consumir PICA. Ho remarco perquè és important. PICA, en aquest context, és una plataforma corporativa d’interoperabilitat. El problema arquitectònic apareix quan la lògica del procediment administratiu depèn directament dels detalls de la integració: estructures XML, clients SOAP, codis d’error tècnics o convencions d’una API concreta. [pausa breu]</w:t>
       </w:r>
     </w:p>
     <w:p>
@@ -504,13 +527,13 @@
       </w:r>
     </w:p>
     <w:bookmarkEnd w:id="14"/>
-    <w:bookmarkStart w:id="15" w:name="X1b46c11a0007e42ff86c8d65e9cc641b28b5559"/>
+    <w:bookmarkStart w:id="15" w:name="Xa64d3085c9800517858e9bbb9c52cb4bb4814e5"/>
     <w:p>
       <w:pPr>
         <w:pStyle w:val="Ttulo3"/>
       </w:pPr>
       <w:r>
-        <w:t xml:space="preserve">Diapositiva 7. Port de sortida i adaptador - 0:55</w:t>
+        <w:t xml:space="preserve">Diapositiva 7. Port de sortida i adaptador - 2:20</w:t>
       </w:r>
     </w:p>
     <w:p>
@@ -526,23 +549,81 @@
         <w:pStyle w:val="Textoindependiente"/>
       </w:pPr>
       <w:r>
-        <w:t xml:space="preserve">Una cosa és el flux d’execució: el cas d’ús demana una informació i aquesta informació pot acabar venint d’un sistema extern. [assenyalar la primera línia]</w:t>
-      </w:r>
-    </w:p>
-    <w:p>
-      <w:pPr>
-        <w:pStyle w:val="Textoindependiente"/>
-      </w:pPr>
-      <w:r>
-        <w:t xml:space="preserve">Una altra cosa és la dependència de codi: el cas d’ús depèn del port, i l’adaptador implementa aquest port. [assenyalar la segona línia]</w:t>
-      </w:r>
-    </w:p>
-    <w:p>
-      <w:pPr>
-        <w:pStyle w:val="Textoindependiente"/>
-      </w:pPr>
-      <w:r>
-        <w:t xml:space="preserve">Aquesta és la inversió de dependències: la infraestructura depèn del port definit per l’aplicació, no a l’inrevés. [mirada al tribunal]</w:t>
+        <w:t xml:space="preserve">Una cosa és el flux d’execució: el cas d’ús demana una informació i aquesta informació pot acabar venint d’un sistema extern.</w:t>
+      </w:r>
+      <w:r>
+        <w:t xml:space="preserve"> </w:t>
+      </w:r>
+      <w:r>
+        <w:t xml:space="preserve">[assenyalar la primera línia]</w:t>
+      </w:r>
+    </w:p>
+    <w:p>
+      <w:pPr>
+        <w:pStyle w:val="Textoindependiente"/>
+      </w:pPr>
+      <w:r>
+        <w:t xml:space="preserve">Una altra cosa és la dependència de codi: el cas d’ús depèn del port, i l’adaptador implementa aquest port.</w:t>
+      </w:r>
+      <w:r>
+        <w:t xml:space="preserve"> </w:t>
+      </w:r>
+      <w:r>
+        <w:t xml:space="preserve">[assenyalar la segona línia]</w:t>
+      </w:r>
+    </w:p>
+    <w:p>
+      <w:pPr>
+        <w:pStyle w:val="Textoindependiente"/>
+      </w:pPr>
+      <w:r>
+        <w:t xml:space="preserve">Per situar bé el concepte, quan aquí parlem d’un port no estem parlant d’un element físic ni d’un detall d’infraestructura. En termes de Java, aquest port s’expressa com una interfície.</w:t>
+      </w:r>
+    </w:p>
+    <w:p>
+      <w:pPr>
+        <w:pStyle w:val="Textoindependiente"/>
+      </w:pPr>
+      <w:r>
+        <w:t xml:space="preserve">És a dir, el cas d’ús no depèn directament d’una base de dades, d’una API externa o d’un client concret. El cas d’ús depèn d’una interfície que defineix què necessita: per exemple, obtenir una determinada informació, consultar un expedient o recuperar unes dades administratives.</w:t>
+      </w:r>
+    </w:p>
+    <w:p>
+      <w:pPr>
+        <w:pStyle w:val="Textoindependiente"/>
+      </w:pPr>
+      <w:r>
+        <w:t xml:space="preserve">Després, l’adaptador és la peça que implementa aquesta interfície i sap com anar realment a buscar aquella informació al sistema extern corresponent.</w:t>
+      </w:r>
+    </w:p>
+    <w:p>
+      <w:pPr>
+        <w:pStyle w:val="Textoindependiente"/>
+      </w:pPr>
+      <w:r>
+        <w:t xml:space="preserve">Això ens ajuda a entendre el valor arquitectònic de la interfície. Una interfície és una eina d’enginyeria que permet comunicar components sense acoblar-los directament entre ells. Defineix un contracte estable: què es necessita i què es retorna, però sense obligar el cas d’ús a conèixer com es resol tècnicament aquesta necessitat.</w:t>
+      </w:r>
+    </w:p>
+    <w:p>
+      <w:pPr>
+        <w:pStyle w:val="Textoindependiente"/>
+      </w:pPr>
+      <w:r>
+        <w:t xml:space="preserve">I això no és només una idea pròpia de la programació. És un principi molt general d’enginyeria: separar el contracte d’ús de la implementació concreta. Quan fem això, els components poden evolucionar, substituir-se o adaptar-se amb molt menys impacte sobre la resta del sistema.</w:t>
+      </w:r>
+    </w:p>
+    <w:p>
+      <w:pPr>
+        <w:pStyle w:val="Textoindependiente"/>
+      </w:pPr>
+      <w:r>
+        <w:t xml:space="preserve">Aquesta és la inversió de dependències: la infraestructura depèn del port definit per l’aplicació, no a l’inrevés.</w:t>
+      </w:r>
+      <w:r>
+        <w:t xml:space="preserve"> </w:t>
+      </w:r>
+      <w:r>
+        <w:t xml:space="preserve">[mirada al tribunal]</w:t>
       </w:r>
     </w:p>
     <w:p>
@@ -554,13 +635,13 @@
       </w:r>
     </w:p>
     <w:bookmarkEnd w:id="15"/>
-    <w:bookmarkStart w:id="16" w:name="X25282647dc1f1bc8d2bf508fc797cb7f01a992d"/>
+    <w:bookmarkStart w:id="16" w:name="X02f5972dd1f8fa5236a8ff5f76fd6d012a2d0ed"/>
     <w:p>
       <w:pPr>
         <w:pStyle w:val="Ttulo3"/>
       </w:pPr>
       <w:r>
-        <w:t xml:space="preserve">Diapositiva 8. Port de sortida per a informació patrimonial - 2:05</w:t>
+        <w:t xml:space="preserve">Diapositiva 8. Port de sortida per a informació patrimonial - 1:55</w:t>
       </w:r>
     </w:p>
     <w:p>
@@ -624,13 +705,13 @@
       </w:r>
     </w:p>
     <w:bookmarkEnd w:id="16"/>
-    <w:bookmarkStart w:id="17" w:name="X619a10340c1a251e91abc9532d1ef3ec34eca8e"/>
+    <w:bookmarkStart w:id="17" w:name="X78fc559941333af28916ea4cd4e8a03bf048adf"/>
     <w:p>
       <w:pPr>
         <w:pStyle w:val="Ttulo3"/>
       </w:pPr>
       <w:r>
-        <w:t xml:space="preserve">Diapositiva 9. Transferència a domini financer - 1:45</w:t>
+        <w:t xml:space="preserve">Diapositiva 9. Transferència a domini financer - 1:35</w:t>
       </w:r>
     </w:p>
     <w:p>
@@ -646,7 +727,7 @@
         <w:pStyle w:val="Textoindependiente"/>
       </w:pPr>
       <w:r>
-        <w:t xml:space="preserve">El diagrama que veiem ja correspon al projecte que utilitzaré després a la demo. Ara, però, no em centraré en els noms concrets; el que m’interessa és reconèixer el mateix patró: cas d’ús, port de sortida i adaptadors substituïbles.</w:t>
+        <w:t xml:space="preserve">El diagrama que veiem correspon a HexaStock. Ara, però, no em centraré en els noms concrets; el que m’interessa és reconèixer el mateix patró: cas d’ús, port de sortida i adaptadors substituïbles.</w:t>
       </w:r>
     </w:p>
     <w:p>
@@ -710,13 +791,13 @@
       </w:r>
     </w:p>
     <w:bookmarkEnd w:id="17"/>
-    <w:bookmarkStart w:id="18" w:name="Xf23ce5279610c607185e420fa6986d11a2001c6"/>
+    <w:bookmarkStart w:id="18" w:name="Xbfe6b0fd34b3c609a21e8adce1ae4f130898e4d"/>
     <w:p>
       <w:pPr>
         <w:pStyle w:val="Ttulo3"/>
       </w:pPr>
       <w:r>
-        <w:t xml:space="preserve">Diapositiva 10. Flux i codi essencial - 1:45</w:t>
+        <w:t xml:space="preserve">Diapositiva 10. Flux i codi essencial - 1:35</w:t>
       </w:r>
     </w:p>
     <w:p>
@@ -724,15 +805,7 @@
         <w:pStyle w:val="FirstParagraph"/>
       </w:pPr>
       <w:r>
-        <w:t xml:space="preserve">A partir d’aquí ja podem baixar al projecte concret de la demo: HexaStock. Aquesta diapositiva mostra el flux temporal del cas d’ús de venda. [assenyalar el diagrama de seqüència]</w:t>
-      </w:r>
-    </w:p>
-    <w:p>
-      <w:pPr>
-        <w:pStyle w:val="Textoindependiente"/>
-      </w:pPr>
-      <w:r>
-        <w:t xml:space="preserve">Convé aclarir que, en un diagrama de seqüència, les fletxes representen ordre d’execució, no dependències de codi. Això és perfectament compatible amb la inversió de dependències que acabem d’explicar.</w:t>
+        <w:t xml:space="preserve">A partir d’aquí ja podem baixar al projecte concret HexaStock. Aquesta diapositiva mostra el flux temporal del cas d’ús de venda. [assenyalar el diagrama de seqüència]</w:t>
       </w:r>
     </w:p>
     <w:p>
@@ -795,14 +868,22 @@
         <w:t xml:space="preserve">Dit de manera sintètica: l’adaptador pot saber com obtenir un preu; no hauria de decidir com es ven una acció dins la cartera. [pausa]</w:t>
       </w:r>
     </w:p>
+    <w:p>
+      <w:pPr>
+        <w:pStyle w:val="Textoindependiente"/>
+      </w:pPr>
+      <w:r>
+        <w:t xml:space="preserve">Aquesta idea ens porta al tancament: l’arquitectura no elimina la dependència respecte del món exterior, però sí que ens ajuda a ubicar-la en una frontera explícita.</w:t>
+      </w:r>
+    </w:p>
     <w:bookmarkEnd w:id="18"/>
-    <w:bookmarkStart w:id="19" w:name="diapositiva-11.-demo---145"/>
+    <w:bookmarkStart w:id="19" w:name="diapositiva-11.-agraïment---140"/>
     <w:p>
       <w:pPr>
         <w:pStyle w:val="Ttulo3"/>
       </w:pPr>
       <w:r>
-        <w:t xml:space="preserve">Diapositiva 11. Demo - 1:45</w:t>
+        <w:t xml:space="preserve">Diapositiva 11. Agraïment - 1:40</w:t>
       </w:r>
     </w:p>
     <w:p>
@@ -810,7 +891,98 @@
         <w:pStyle w:val="FirstParagraph"/>
       </w:pPr>
       <w:r>
-        <w:t xml:space="preserve">La demo, en aquesta classe, no pretén impressionar per complexitat tècnica. Té una funció docent molt concreta: mostrar que podem mantenir el mateix cas d’ús, el mateix servei d’aplicació i el mateix domini, canviant només l’adaptador. [assenyalar les tres caixes]</w:t>
+        <w:t xml:space="preserve">Per tancar, voldria recuperar aquesta idea final. [pausa breu]</w:t>
+      </w:r>
+    </w:p>
+    <w:p>
+      <w:pPr>
+        <w:pStyle w:val="Textoindependiente"/>
+      </w:pPr>
+      <w:r>
+        <w:t xml:space="preserve">L’arquitectura no elimina la dependència del món exterior. Les aplicacions reals necessiten bases de dades, APIs, plataformes corporatives, proveïdors externs i mecanismes d’integració. El que fa l’arquitectura hexagonal és convertir aquesta dependència en una frontera explícita, substituïble i comprovable.</w:t>
+      </w:r>
+    </w:p>
+    <w:p>
+      <w:pPr>
+        <w:pStyle w:val="Textoindependiente"/>
+      </w:pPr>
+      <w:r>
+        <w:t xml:space="preserve">Quan canvia un proveïdor, una API o una tecnologia, volem canviar l’adaptador. No volem reescriure el cas d’ús ni deformar el model de domini. [pausa]</w:t>
+      </w:r>
+    </w:p>
+    <w:p>
+      <w:pPr>
+        <w:pStyle w:val="Textoindependiente"/>
+      </w:pPr>
+      <w:r>
+        <w:t xml:space="preserve">Vull expressar el meu agraïment al TecnoCampus per un entorn que m’encoratja a créixer, tant en la docència com en l’àmbit acadèmic, al costat d’un equip del qual aprenc i amb qui comparteixo coneixement, responsabilitat i compromís amb la formació universitària. [pausa breu; mirar el tribunal]</w:t>
+      </w:r>
+    </w:p>
+    <w:p>
+      <w:pPr>
+        <w:pStyle w:val="Textoindependiente"/>
+      </w:pPr>
+      <w:r>
+        <w:t xml:space="preserve">També vull fer un agraïment especial al Dr. Josep Roure, company professor del TecnoCampus, amb qui he tingut l’oportunitat d’aprendre sobre arquitectura de software, metodologies actives d’aprenentatge i treball en equip. [mirada al tribunal]</w:t>
+      </w:r>
+    </w:p>
+    <w:p>
+      <w:pPr>
+        <w:pStyle w:val="Textoindependiente"/>
+      </w:pPr>
+      <w:r>
+        <w:t xml:space="preserve">Moltes gràcies.</w:t>
+      </w:r>
+    </w:p>
+    <w:p>
+      <w:r>
+        <w:pict>
+          <v:rect style="width:0;height:1.5pt" o:hralign="center" o:hrstd="t" o:hr="t"/>
+        </w:pict>
+      </w:r>
+    </w:p>
+    <w:bookmarkEnd w:id="19"/>
+    <w:bookmarkEnd w:id="20"/>
+    <w:bookmarkStart w:id="22" w:name="annex-a.-demo-opcional"/>
+    <w:p>
+      <w:pPr>
+        <w:pStyle w:val="Ttulo2"/>
+      </w:pPr>
+      <w:r>
+        <w:t xml:space="preserve">Annex A. Demo opcional</w:t>
+      </w:r>
+    </w:p>
+    <w:p>
+      <w:pPr>
+        <w:pStyle w:val="FirstParagraph"/>
+      </w:pPr>
+      <w:r>
+        <w:t xml:space="preserve">Aquest annex no forma part del cos principal de la classe magistral de 20 minuts. Només s’ha d’utilitzar si el tribunal ho demana o si, després del tancament formal, es considera oportú mostrar breument la demostració.</w:t>
+      </w:r>
+    </w:p>
+    <w:bookmarkStart w:id="21" w:name="annex-a.-demo-opcional---130-a-230"/>
+    <w:p>
+      <w:pPr>
+        <w:pStyle w:val="Ttulo3"/>
+      </w:pPr>
+      <w:r>
+        <w:t xml:space="preserve">Annex A. Demo opcional - 1:30 a 2:30</w:t>
+      </w:r>
+    </w:p>
+    <w:p>
+      <w:pPr>
+        <w:pStyle w:val="FirstParagraph"/>
+      </w:pPr>
+      <w:r>
+        <w:t xml:space="preserve">Si es vol veure la translació pràctica d’aquesta idea, tinc preparada una demo molt breu amb HexaStock.</w:t>
+      </w:r>
+    </w:p>
+    <w:p>
+      <w:pPr>
+        <w:pStyle w:val="Textoindependiente"/>
+      </w:pPr>
+      <w:r>
+        <w:t xml:space="preserve">La demo no pretén impressionar per complexitat tècnica. Té una funció docent molt concreta: mostrar que podem mantenir el mateix cas d’ús, el mateix servei d’aplicació i el mateix domini, canviant només l’adaptador. [assenyalar les three caixes]</w:t>
       </w:r>
     </w:p>
     <w:p>
@@ -865,794 +1037,791 @@
         <w:t xml:space="preserve">Això no vol dir que l’arquitectura elimini el canvi. El canvi continua existint. El que fa una bona arquitectura és localitzar-lo.</w:t>
       </w:r>
     </w:p>
-    <w:bookmarkEnd w:id="19"/>
-    <w:bookmarkStart w:id="20" w:name="diapositiva-12.-agraïment---120"/>
+    <w:p>
+      <w:r>
+        <w:pict>
+          <v:rect style="width:0;height:1.5pt" o:hralign="center" o:hrstd="t" o:hr="t"/>
+        </w:pict>
+      </w:r>
+    </w:p>
+    <w:bookmarkEnd w:id="21"/>
+    <w:bookmarkEnd w:id="22"/>
+    <w:bookmarkStart w:id="35" w:name="notes-del-presentador-per-diapositiva"/>
+    <w:p>
+      <w:pPr>
+        <w:pStyle w:val="Ttulo2"/>
+      </w:pPr>
+      <w:r>
+        <w:t xml:space="preserve">2. Notes del presentador per diapositiva</w:t>
+      </w:r>
+    </w:p>
+    <w:bookmarkStart w:id="23" w:name="portada---135"/>
     <w:p>
       <w:pPr>
         <w:pStyle w:val="Ttulo3"/>
       </w:pPr>
       <w:r>
-        <w:t xml:space="preserve">Diapositiva 12. Agraïment - 1:20</w:t>
-      </w:r>
-    </w:p>
-    <w:p>
-      <w:pPr>
-        <w:pStyle w:val="FirstParagraph"/>
-      </w:pPr>
-      <w:r>
-        <w:t xml:space="preserve">Per tancar, voldria recuperar aquesta idea final. [pausa breu]</w:t>
-      </w:r>
-    </w:p>
-    <w:p>
-      <w:pPr>
-        <w:pStyle w:val="Textoindependiente"/>
-      </w:pPr>
-      <w:r>
-        <w:t xml:space="preserve">L’arquitectura no elimina la dependència del món exterior. Les aplicacions reals necessiten bases de dades, APIs, plataformes corporatives, proveïdors externs i mecanismes d’integració. El que fa l’arquitectura hexagonal és convertir aquesta dependència en una frontera explícita, substituïble i comprovable.</w:t>
-      </w:r>
-    </w:p>
-    <w:p>
-      <w:pPr>
-        <w:pStyle w:val="Textoindependiente"/>
-      </w:pPr>
-      <w:r>
-        <w:t xml:space="preserve">Quan canvia un proveïdor, una API o una tecnologia, volem canviar l’adaptador. No volem reescriure el cas d’ús ni deformar el model de domini. [pausa]</w:t>
-      </w:r>
-    </w:p>
-    <w:p>
-      <w:pPr>
-        <w:pStyle w:val="Textoindependiente"/>
-      </w:pPr>
-      <w:r>
-        <w:t xml:space="preserve">Vull expressar el meu agraïment al TecnoCampus per un entorn que m’encoratja a créixer, tant en la docència com en l’àmbit acadèmic, al costat d’un equip del qual aprenc i amb qui comparteixo coneixement, responsabilitat i compromís amb la formació universitària. [pausa breu; mirar el tribunal]</w:t>
-      </w:r>
-    </w:p>
-    <w:p>
-      <w:pPr>
-        <w:pStyle w:val="Textoindependiente"/>
-      </w:pPr>
-      <w:r>
-        <w:t xml:space="preserve">També vull fer un agraïment especial al Dr. Josep Roure, company professor del TecnoCampus, amb qui he tingut l’oportunitat d’aprendre sobre arquitectura de software, metodologies actives d’aprenentatge i treball en equip. [mirada al tribunal]</w:t>
-      </w:r>
-    </w:p>
-    <w:p>
-      <w:pPr>
-        <w:pStyle w:val="Textoindependiente"/>
-      </w:pPr>
-      <w:r>
-        <w:t xml:space="preserve">Moltes gràcies.</w:t>
-      </w:r>
-    </w:p>
-    <w:bookmarkEnd w:id="20"/>
-    <w:bookmarkEnd w:id="21"/>
-    <w:bookmarkStart w:id="34" w:name="notes-del-presentador-per-diapositiva"/>
-    <w:p>
-      <w:pPr>
-        <w:pStyle w:val="Ttulo2"/>
-      </w:pPr>
-      <w:r>
-        <w:t xml:space="preserve">2. Notes del presentador per diapositiva</w:t>
-      </w:r>
-    </w:p>
-    <w:bookmarkStart w:id="22" w:name="portada---145"/>
+        <w:t xml:space="preserve">1. Portada - 1:35</w:t>
+      </w:r>
+    </w:p>
+    <w:p>
+      <w:pPr>
+        <w:pStyle w:val="Compact"/>
+        <w:numPr>
+          <w:ilvl w:val="0"/>
+          <w:numId w:val="1002"/>
+        </w:numPr>
+      </w:pPr>
+      <w:r>
+        <w:t xml:space="preserve">Classe de DSI, no explicació completa d’arquitectura hexagonal.</w:t>
+      </w:r>
+    </w:p>
+    <w:p>
+      <w:pPr>
+        <w:pStyle w:val="Compact"/>
+        <w:numPr>
+          <w:ilvl w:val="0"/>
+          <w:numId w:val="1002"/>
+        </w:numPr>
+      </w:pPr>
+      <w:r>
+        <w:t xml:space="preserve">Informe incorporat a la documentació de la convocatòria: consultoria especialitzada per a la Generalitat/AGAUR.</w:t>
+      </w:r>
+    </w:p>
+    <w:p>
+      <w:pPr>
+        <w:pStyle w:val="Compact"/>
+        <w:numPr>
+          <w:ilvl w:val="0"/>
+          <w:numId w:val="1002"/>
+        </w:numPr>
+      </w:pPr>
+      <w:r>
+        <w:t xml:space="preserve">Trobada entre dimensió acadèmica i dimensió professional.</w:t>
+      </w:r>
+    </w:p>
+    <w:p>
+      <w:pPr>
+        <w:pStyle w:val="Compact"/>
+        <w:numPr>
+          <w:ilvl w:val="0"/>
+          <w:numId w:val="1002"/>
+        </w:numPr>
+      </w:pPr>
+      <w:r>
+        <w:t xml:space="preserve">Cas real com a base docent, sense entrar en detalls interns.</w:t>
+      </w:r>
+    </w:p>
+    <w:p>
+      <w:pPr>
+        <w:pStyle w:val="Compact"/>
+        <w:numPr>
+          <w:ilvl w:val="0"/>
+          <w:numId w:val="1002"/>
+        </w:numPr>
+      </w:pPr>
+      <w:r>
+        <w:t xml:space="preserve">Transició: ens centrarem en una decisió concreta, el port de sortida.</w:t>
+      </w:r>
+    </w:p>
+    <w:bookmarkEnd w:id="23"/>
+    <w:bookmarkStart w:id="24" w:name="on-som-dins-lassignatura---105"/>
     <w:p>
       <w:pPr>
         <w:pStyle w:val="Ttulo3"/>
       </w:pPr>
       <w:r>
-        <w:t xml:space="preserve">1. Portada - 1:45</w:t>
-      </w:r>
-    </w:p>
-    <w:p>
-      <w:pPr>
-        <w:pStyle w:val="Compact"/>
-        <w:numPr>
-          <w:ilvl w:val="0"/>
-          <w:numId w:val="1002"/>
-        </w:numPr>
-      </w:pPr>
-      <w:r>
-        <w:t xml:space="preserve">Classe de DSI, no explicació completa d’arquitectura hexagonal.</w:t>
-      </w:r>
-    </w:p>
-    <w:p>
-      <w:pPr>
-        <w:pStyle w:val="Compact"/>
-        <w:numPr>
-          <w:ilvl w:val="0"/>
-          <w:numId w:val="1002"/>
-        </w:numPr>
-      </w:pPr>
-      <w:r>
-        <w:t xml:space="preserve">Informe incorporat a la documentació de la convocatòria: consultoria especialitzada per a la Generalitat/AGAUR.</w:t>
-      </w:r>
-    </w:p>
-    <w:p>
-      <w:pPr>
-        <w:pStyle w:val="Compact"/>
-        <w:numPr>
-          <w:ilvl w:val="0"/>
-          <w:numId w:val="1002"/>
-        </w:numPr>
-      </w:pPr>
-      <w:r>
-        <w:t xml:space="preserve">Trobada entre dimensió acadèmica i dimensió professional.</w:t>
-      </w:r>
-    </w:p>
-    <w:p>
-      <w:pPr>
-        <w:pStyle w:val="Compact"/>
-        <w:numPr>
-          <w:ilvl w:val="0"/>
-          <w:numId w:val="1002"/>
-        </w:numPr>
-      </w:pPr>
-      <w:r>
-        <w:t xml:space="preserve">Cas real com a base docent, sense entrar en detalls interns.</w:t>
-      </w:r>
-    </w:p>
-    <w:p>
-      <w:pPr>
-        <w:pStyle w:val="Compact"/>
-        <w:numPr>
-          <w:ilvl w:val="0"/>
-          <w:numId w:val="1002"/>
-        </w:numPr>
-      </w:pPr>
-      <w:r>
-        <w:t xml:space="preserve">Transició: ens centrarem en una decisió concreta, el port de sortida.</w:t>
-      </w:r>
-    </w:p>
-    <w:bookmarkEnd w:id="22"/>
-    <w:bookmarkStart w:id="23" w:name="on-som-dins-lassignatura---110"/>
+        <w:t xml:space="preserve">2. On som dins l’assignatura - 1:05</w:t>
+      </w:r>
+    </w:p>
+    <w:p>
+      <w:pPr>
+        <w:pStyle w:val="Compact"/>
+        <w:numPr>
+          <w:ilvl w:val="0"/>
+          <w:numId w:val="1003"/>
+        </w:numPr>
+      </w:pPr>
+      <w:r>
+        <w:t xml:space="preserve">Pla docent: 3r curs, 6 ECTS, assignatura obligatòria.</w:t>
+      </w:r>
+    </w:p>
+    <w:p>
+      <w:pPr>
+        <w:pStyle w:val="Compact"/>
+        <w:numPr>
+          <w:ilvl w:val="0"/>
+          <w:numId w:val="1003"/>
+        </w:numPr>
+      </w:pPr>
+      <w:r>
+        <w:t xml:space="preserve">Bloc: clean/hexagonal, ports i adaptadors, mapping, mòduls, DDD.</w:t>
+      </w:r>
+    </w:p>
+    <w:p>
+      <w:pPr>
+        <w:pStyle w:val="Compact"/>
+        <w:numPr>
+          <w:ilvl w:val="0"/>
+          <w:numId w:val="1003"/>
+        </w:numPr>
+      </w:pPr>
+      <w:r>
+        <w:t xml:space="preserve">Justificar que la sessió encaixa en el temari.</w:t>
+      </w:r>
+    </w:p>
+    <w:p>
+      <w:pPr>
+        <w:pStyle w:val="Compact"/>
+        <w:numPr>
+          <w:ilvl w:val="0"/>
+          <w:numId w:val="1003"/>
+        </w:numPr>
+      </w:pPr>
+      <w:r>
+        <w:t xml:space="preserve">No panoràmica completa; focus en ports de sortida.</w:t>
+      </w:r>
+    </w:p>
+    <w:p>
+      <w:pPr>
+        <w:pStyle w:val="Compact"/>
+        <w:numPr>
+          <w:ilvl w:val="0"/>
+          <w:numId w:val="1003"/>
+        </w:numPr>
+      </w:pPr>
+      <w:r>
+        <w:t xml:space="preserve">Transició: objectiu mínim i entrada ràpida al cas real.</w:t>
+      </w:r>
+    </w:p>
+    <w:bookmarkEnd w:id="24"/>
+    <w:bookmarkStart w:id="25" w:name="objectiu-de-la-sessió---055"/>
     <w:p>
       <w:pPr>
         <w:pStyle w:val="Ttulo3"/>
       </w:pPr>
       <w:r>
-        <w:t xml:space="preserve">2. On som dins l’assignatura - 1:10</w:t>
-      </w:r>
-    </w:p>
-    <w:p>
-      <w:pPr>
-        <w:pStyle w:val="Compact"/>
-        <w:numPr>
-          <w:ilvl w:val="0"/>
-          <w:numId w:val="1003"/>
-        </w:numPr>
-      </w:pPr>
-      <w:r>
-        <w:t xml:space="preserve">Pla docent: 3r curs, 6 ECTS, assignatura obligatòria.</w:t>
-      </w:r>
-    </w:p>
-    <w:p>
-      <w:pPr>
-        <w:pStyle w:val="Compact"/>
-        <w:numPr>
-          <w:ilvl w:val="0"/>
-          <w:numId w:val="1003"/>
-        </w:numPr>
-      </w:pPr>
-      <w:r>
-        <w:t xml:space="preserve">Bloc: clean/hexagonal, ports i adaptadors, mapping, mòduls, DDD.</w:t>
-      </w:r>
-    </w:p>
-    <w:p>
-      <w:pPr>
-        <w:pStyle w:val="Compact"/>
-        <w:numPr>
-          <w:ilvl w:val="0"/>
-          <w:numId w:val="1003"/>
-        </w:numPr>
-      </w:pPr>
-      <w:r>
-        <w:t xml:space="preserve">Justificar que la sessió encaixa en el temari.</w:t>
-      </w:r>
-    </w:p>
-    <w:p>
-      <w:pPr>
-        <w:pStyle w:val="Compact"/>
-        <w:numPr>
-          <w:ilvl w:val="0"/>
-          <w:numId w:val="1003"/>
-        </w:numPr>
-      </w:pPr>
-      <w:r>
-        <w:t xml:space="preserve">No panoràmica completa; focus en ports de sortida.</w:t>
-      </w:r>
-    </w:p>
-    <w:p>
-      <w:pPr>
-        <w:pStyle w:val="Compact"/>
-        <w:numPr>
-          <w:ilvl w:val="0"/>
-          <w:numId w:val="1003"/>
-        </w:numPr>
-      </w:pPr>
-      <w:r>
-        <w:t xml:space="preserve">Transició: objectiu mínim i entrada ràpida al cas real.</w:t>
-      </w:r>
-    </w:p>
-    <w:bookmarkEnd w:id="23"/>
-    <w:bookmarkStart w:id="24" w:name="objectiu-de-la-sessió---055"/>
+        <w:t xml:space="preserve">3. Objectiu de la sessió - 0:55</w:t>
+      </w:r>
+    </w:p>
+    <w:p>
+      <w:pPr>
+        <w:pStyle w:val="Compact"/>
+        <w:numPr>
+          <w:ilvl w:val="0"/>
+          <w:numId w:val="1004"/>
+        </w:numPr>
+      </w:pPr>
+      <w:r>
+        <w:t xml:space="preserve">Passar-hi ràpid: és una diapositiva pont, no una explicació teòrica llarga.</w:t>
+      </w:r>
+    </w:p>
+    <w:p>
+      <w:pPr>
+        <w:pStyle w:val="Compact"/>
+        <w:numPr>
+          <w:ilvl w:val="0"/>
+          <w:numId w:val="1004"/>
+        </w:numPr>
+      </w:pPr>
+      <w:r>
+        <w:t xml:space="preserve">Frase clau: el cas d’ús necessita una capacitat, no una tecnologia.</w:t>
+      </w:r>
+    </w:p>
+    <w:p>
+      <w:pPr>
+        <w:pStyle w:val="Compact"/>
+        <w:numPr>
+          <w:ilvl w:val="0"/>
+          <w:numId w:val="1004"/>
+        </w:numPr>
+      </w:pPr>
+      <w:r>
+        <w:t xml:space="preserve">Tres accions: identificar necessitat, definir port, implementar adaptadors.</w:t>
+      </w:r>
+    </w:p>
+    <w:p>
+      <w:pPr>
+        <w:pStyle w:val="Compact"/>
+        <w:numPr>
+          <w:ilvl w:val="0"/>
+          <w:numId w:val="1004"/>
+        </w:numPr>
+      </w:pPr>
+      <w:r>
+        <w:t xml:space="preserve">Anunciar metodologia: primer cas real, després abstracció arquitectònica.</w:t>
+      </w:r>
+    </w:p>
+    <w:p>
+      <w:pPr>
+        <w:pStyle w:val="Compact"/>
+        <w:numPr>
+          <w:ilvl w:val="0"/>
+          <w:numId w:val="1004"/>
+        </w:numPr>
+      </w:pPr>
+      <w:r>
+        <w:t xml:space="preserve">Transició: començar pel procediment de beca.</w:t>
+      </w:r>
+    </w:p>
+    <w:bookmarkEnd w:id="25"/>
+    <w:bookmarkStart w:id="26" w:name="avaluació-econòmica---145"/>
     <w:p>
       <w:pPr>
         <w:pStyle w:val="Ttulo3"/>
       </w:pPr>
       <w:r>
-        <w:t xml:space="preserve">3. Objectiu de la sessió - 0:55</w:t>
-      </w:r>
-    </w:p>
-    <w:p>
-      <w:pPr>
-        <w:pStyle w:val="Compact"/>
-        <w:numPr>
-          <w:ilvl w:val="0"/>
-          <w:numId w:val="1004"/>
-        </w:numPr>
-      </w:pPr>
-      <w:r>
-        <w:t xml:space="preserve">Passar-hi ràpid: és una diapositiva pont, no una explicació teòrica llarga.</w:t>
-      </w:r>
-    </w:p>
-    <w:p>
-      <w:pPr>
-        <w:pStyle w:val="Compact"/>
-        <w:numPr>
-          <w:ilvl w:val="0"/>
-          <w:numId w:val="1004"/>
-        </w:numPr>
-      </w:pPr>
-      <w:r>
-        <w:t xml:space="preserve">Frase clau: el cas d’ús necessita una capacitat, no una tecnologia.</w:t>
-      </w:r>
-    </w:p>
-    <w:p>
-      <w:pPr>
-        <w:pStyle w:val="Compact"/>
-        <w:numPr>
-          <w:ilvl w:val="0"/>
-          <w:numId w:val="1004"/>
-        </w:numPr>
-      </w:pPr>
-      <w:r>
-        <w:t xml:space="preserve">Tres accions: identificar necessitat, definir port, implementar adaptadors.</w:t>
-      </w:r>
-    </w:p>
-    <w:p>
-      <w:pPr>
-        <w:pStyle w:val="Compact"/>
-        <w:numPr>
-          <w:ilvl w:val="0"/>
-          <w:numId w:val="1004"/>
-        </w:numPr>
-      </w:pPr>
-      <w:r>
-        <w:t xml:space="preserve">Anunciar metodologia: primer cas real, després abstracció arquitectònica.</w:t>
-      </w:r>
-    </w:p>
-    <w:p>
-      <w:pPr>
-        <w:pStyle w:val="Compact"/>
-        <w:numPr>
-          <w:ilvl w:val="0"/>
-          <w:numId w:val="1004"/>
-        </w:numPr>
-      </w:pPr>
-      <w:r>
-        <w:t xml:space="preserve">Transició: començar pel procediment de beca.</w:t>
-      </w:r>
-    </w:p>
-    <w:bookmarkEnd w:id="24"/>
-    <w:bookmarkStart w:id="25" w:name="avaluació-econòmica---150"/>
+        <w:t xml:space="preserve">4. Avaluació econòmica - 1:45</w:t>
+      </w:r>
+    </w:p>
+    <w:p>
+      <w:pPr>
+        <w:pStyle w:val="Compact"/>
+        <w:numPr>
+          <w:ilvl w:val="0"/>
+          <w:numId w:val="1005"/>
+        </w:numPr>
+      </w:pPr>
+      <w:r>
+        <w:t xml:space="preserve">Primer entendre procediment, després tecnologia.</w:t>
+      </w:r>
+    </w:p>
+    <w:p>
+      <w:pPr>
+        <w:pStyle w:val="Compact"/>
+        <w:numPr>
+          <w:ilvl w:val="0"/>
+          <w:numId w:val="1005"/>
+        </w:numPr>
+      </w:pPr>
+      <w:r>
+        <w:t xml:space="preserve">Sol·licitud, expedient, requisits generals, econòmics, revisió, resolució.</w:t>
+      </w:r>
+    </w:p>
+    <w:p>
+      <w:pPr>
+        <w:pStyle w:val="Compact"/>
+        <w:numPr>
+          <w:ilvl w:val="0"/>
+          <w:numId w:val="1005"/>
+        </w:numPr>
+      </w:pPr>
+      <w:r>
+        <w:t xml:space="preserve">Renda i patrimoni com a decisió funcional.</w:t>
+      </w:r>
+    </w:p>
+    <w:p>
+      <w:pPr>
+        <w:pStyle w:val="Compact"/>
+        <w:numPr>
+          <w:ilvl w:val="0"/>
+          <w:numId w:val="1005"/>
+        </w:numPr>
+      </w:pPr>
+      <w:r>
+        <w:t xml:space="preserve">Evitar començar per SOAP/REST/PICA.</w:t>
+      </w:r>
+    </w:p>
+    <w:p>
+      <w:pPr>
+        <w:pStyle w:val="Compact"/>
+        <w:numPr>
+          <w:ilvl w:val="0"/>
+          <w:numId w:val="1005"/>
+        </w:numPr>
+      </w:pPr>
+      <w:r>
+        <w:t xml:space="preserve">Transició: quines dades externes fan falta?</w:t>
+      </w:r>
+    </w:p>
+    <w:bookmarkEnd w:id="26"/>
+    <w:bookmarkStart w:id="27" w:name="informació-externa---155"/>
     <w:p>
       <w:pPr>
         <w:pStyle w:val="Ttulo3"/>
       </w:pPr>
       <w:r>
-        <w:t xml:space="preserve">4. Avaluació econòmica - 1:50</w:t>
-      </w:r>
-    </w:p>
-    <w:p>
-      <w:pPr>
-        <w:pStyle w:val="Compact"/>
-        <w:numPr>
-          <w:ilvl w:val="0"/>
-          <w:numId w:val="1005"/>
-        </w:numPr>
-      </w:pPr>
-      <w:r>
-        <w:t xml:space="preserve">Primer entendre procediment, després tecnologia.</w:t>
-      </w:r>
-    </w:p>
-    <w:p>
-      <w:pPr>
-        <w:pStyle w:val="Compact"/>
-        <w:numPr>
-          <w:ilvl w:val="0"/>
-          <w:numId w:val="1005"/>
-        </w:numPr>
-      </w:pPr>
-      <w:r>
-        <w:t xml:space="preserve">Sol·licitud, expedient, requisits generals, econòmics, revisió, resolució.</w:t>
-      </w:r>
-    </w:p>
-    <w:p>
-      <w:pPr>
-        <w:pStyle w:val="Compact"/>
-        <w:numPr>
-          <w:ilvl w:val="0"/>
-          <w:numId w:val="1005"/>
-        </w:numPr>
-      </w:pPr>
-      <w:r>
-        <w:t xml:space="preserve">Renda i patrimoni com a decisió funcional.</w:t>
-      </w:r>
-    </w:p>
-    <w:p>
-      <w:pPr>
-        <w:pStyle w:val="Compact"/>
-        <w:numPr>
-          <w:ilvl w:val="0"/>
-          <w:numId w:val="1005"/>
-        </w:numPr>
-      </w:pPr>
-      <w:r>
-        <w:t xml:space="preserve">Evitar començar per SOAP/REST/PICA.</w:t>
-      </w:r>
-    </w:p>
-    <w:p>
-      <w:pPr>
-        <w:pStyle w:val="Compact"/>
-        <w:numPr>
-          <w:ilvl w:val="0"/>
-          <w:numId w:val="1005"/>
-        </w:numPr>
-      </w:pPr>
-      <w:r>
-        <w:t xml:space="preserve">Transició: quines dades externes fan falta?</w:t>
-      </w:r>
-    </w:p>
-    <w:bookmarkEnd w:id="25"/>
-    <w:bookmarkStart w:id="26" w:name="informació-externa---200"/>
+        <w:t xml:space="preserve">5. Informació externa - 1:55</w:t>
+      </w:r>
+    </w:p>
+    <w:p>
+      <w:pPr>
+        <w:pStyle w:val="Compact"/>
+        <w:numPr>
+          <w:ilvl w:val="0"/>
+          <w:numId w:val="1006"/>
+        </w:numPr>
+      </w:pPr>
+      <w:r>
+        <w:t xml:space="preserve">Necessitats: renda, patrimoni, béns immobles.</w:t>
+      </w:r>
+    </w:p>
+    <w:p>
+      <w:pPr>
+        <w:pStyle w:val="Compact"/>
+        <w:numPr>
+          <w:ilvl w:val="0"/>
+          <w:numId w:val="1006"/>
+        </w:numPr>
+      </w:pPr>
+      <w:r>
+        <w:t xml:space="preserve">Fonts: AEAT, Cadastre, PICA.</w:t>
+      </w:r>
+    </w:p>
+    <w:p>
+      <w:pPr>
+        <w:pStyle w:val="Compact"/>
+        <w:numPr>
+          <w:ilvl w:val="0"/>
+          <w:numId w:val="1006"/>
+        </w:numPr>
+      </w:pPr>
+      <w:r>
+        <w:t xml:space="preserve">PICA com a interoperabilitat administrativa.</w:t>
+      </w:r>
+    </w:p>
+    <w:p>
+      <w:pPr>
+        <w:pStyle w:val="Compact"/>
+        <w:numPr>
+          <w:ilvl w:val="0"/>
+          <w:numId w:val="1006"/>
+        </w:numPr>
+      </w:pPr>
+      <w:r>
+        <w:t xml:space="preserve">Frase clau: informació administrativa, no API concreta.</w:t>
+      </w:r>
+    </w:p>
+    <w:p>
+      <w:pPr>
+        <w:pStyle w:val="Compact"/>
+        <w:numPr>
+          <w:ilvl w:val="0"/>
+          <w:numId w:val="1006"/>
+        </w:numPr>
+      </w:pPr>
+      <w:r>
+        <w:t xml:space="preserve">Transició: si no separem, apareix dependència directa.</w:t>
+      </w:r>
+    </w:p>
+    <w:bookmarkEnd w:id="27"/>
+    <w:bookmarkStart w:id="28" w:name="dependència-directa---205"/>
     <w:p>
       <w:pPr>
         <w:pStyle w:val="Ttulo3"/>
       </w:pPr>
       <w:r>
-        <w:t xml:space="preserve">5. Informació externa - 2:00</w:t>
-      </w:r>
-    </w:p>
-    <w:p>
-      <w:pPr>
-        <w:pStyle w:val="Compact"/>
-        <w:numPr>
-          <w:ilvl w:val="0"/>
-          <w:numId w:val="1006"/>
-        </w:numPr>
-      </w:pPr>
-      <w:r>
-        <w:t xml:space="preserve">Necessitats: renda, patrimoni, béns immobles.</w:t>
-      </w:r>
-    </w:p>
-    <w:p>
-      <w:pPr>
-        <w:pStyle w:val="Compact"/>
-        <w:numPr>
-          <w:ilvl w:val="0"/>
-          <w:numId w:val="1006"/>
-        </w:numPr>
-      </w:pPr>
-      <w:r>
-        <w:t xml:space="preserve">Fonts: AEAT, Cadastre, PICA.</w:t>
-      </w:r>
-    </w:p>
-    <w:p>
-      <w:pPr>
-        <w:pStyle w:val="Compact"/>
-        <w:numPr>
-          <w:ilvl w:val="0"/>
-          <w:numId w:val="1006"/>
-        </w:numPr>
-      </w:pPr>
-      <w:r>
-        <w:t xml:space="preserve">PICA com a interoperabilitat administrativa.</w:t>
-      </w:r>
-    </w:p>
-    <w:p>
-      <w:pPr>
-        <w:pStyle w:val="Compact"/>
-        <w:numPr>
-          <w:ilvl w:val="0"/>
-          <w:numId w:val="1006"/>
-        </w:numPr>
-      </w:pPr>
-      <w:r>
-        <w:t xml:space="preserve">Frase clau: informació administrativa, no API concreta.</w:t>
-      </w:r>
-    </w:p>
-    <w:p>
-      <w:pPr>
-        <w:pStyle w:val="Compact"/>
-        <w:numPr>
-          <w:ilvl w:val="0"/>
-          <w:numId w:val="1006"/>
-        </w:numPr>
-      </w:pPr>
-      <w:r>
-        <w:t xml:space="preserve">Transició: si no separem, apareix dependència directa.</w:t>
-      </w:r>
-    </w:p>
-    <w:bookmarkEnd w:id="26"/>
-    <w:bookmarkStart w:id="27" w:name="dependència-directa---210"/>
+        <w:t xml:space="preserve">6. Dependència directa - 2:05</w:t>
+      </w:r>
+    </w:p>
+    <w:p>
+      <w:pPr>
+        <w:pStyle w:val="Compact"/>
+        <w:numPr>
+          <w:ilvl w:val="0"/>
+          <w:numId w:val="1007"/>
+        </w:numPr>
+      </w:pPr>
+      <w:r>
+        <w:t xml:space="preserve">El problema no és PICA; és l’acoblament directe.</w:t>
+      </w:r>
+    </w:p>
+    <w:p>
+      <w:pPr>
+        <w:pStyle w:val="Compact"/>
+        <w:numPr>
+          <w:ilvl w:val="0"/>
+          <w:numId w:val="1007"/>
+        </w:numPr>
+      </w:pPr>
+      <w:r>
+        <w:t xml:space="preserve">Cas d’ús coneix SOAP/XML, DTOs, clients, errors tècnics.</w:t>
+      </w:r>
+    </w:p>
+    <w:p>
+      <w:pPr>
+        <w:pStyle w:val="Compact"/>
+        <w:numPr>
+          <w:ilvl w:val="0"/>
+          <w:numId w:val="1007"/>
+        </w:numPr>
+      </w:pPr>
+      <w:r>
+        <w:t xml:space="preserve">Evolució tecnològica travessa frontera.</w:t>
+      </w:r>
+    </w:p>
+    <w:p>
+      <w:pPr>
+        <w:pStyle w:val="Compact"/>
+        <w:numPr>
+          <w:ilvl w:val="0"/>
+          <w:numId w:val="1007"/>
+        </w:numPr>
+      </w:pPr>
+      <w:r>
+        <w:t xml:space="preserve">Tres riscos: acoblament, manteniment fràgil, continuïtat operativa.</w:t>
+      </w:r>
+    </w:p>
+    <w:p>
+      <w:pPr>
+        <w:pStyle w:val="Compact"/>
+        <w:numPr>
+          <w:ilvl w:val="0"/>
+          <w:numId w:val="1007"/>
+        </w:numPr>
+      </w:pPr>
+      <w:r>
+        <w:t xml:space="preserve">Transició: resposta arquitectònica, port de sortida.</w:t>
+      </w:r>
+    </w:p>
+    <w:bookmarkEnd w:id="28"/>
+    <w:bookmarkStart w:id="29" w:name="port-i-adaptador---220"/>
     <w:p>
       <w:pPr>
         <w:pStyle w:val="Ttulo3"/>
       </w:pPr>
       <w:r>
-        <w:t xml:space="preserve">6. Dependència directa - 2:10</w:t>
-      </w:r>
-    </w:p>
-    <w:p>
-      <w:pPr>
-        <w:pStyle w:val="Compact"/>
-        <w:numPr>
-          <w:ilvl w:val="0"/>
-          <w:numId w:val="1007"/>
-        </w:numPr>
-      </w:pPr>
-      <w:r>
-        <w:t xml:space="preserve">El problema no és PICA; és l’acoblament directe.</w:t>
-      </w:r>
-    </w:p>
-    <w:p>
-      <w:pPr>
-        <w:pStyle w:val="Compact"/>
-        <w:numPr>
-          <w:ilvl w:val="0"/>
-          <w:numId w:val="1007"/>
-        </w:numPr>
-      </w:pPr>
-      <w:r>
-        <w:t xml:space="preserve">Cas d’ús coneix SOAP/XML, DTOs, clients, errors tècnics.</w:t>
-      </w:r>
-    </w:p>
-    <w:p>
-      <w:pPr>
-        <w:pStyle w:val="Compact"/>
-        <w:numPr>
-          <w:ilvl w:val="0"/>
-          <w:numId w:val="1007"/>
-        </w:numPr>
-      </w:pPr>
-      <w:r>
-        <w:t xml:space="preserve">Evolució tecnològica travessa frontera.</w:t>
-      </w:r>
-    </w:p>
-    <w:p>
-      <w:pPr>
-        <w:pStyle w:val="Compact"/>
-        <w:numPr>
-          <w:ilvl w:val="0"/>
-          <w:numId w:val="1007"/>
-        </w:numPr>
-      </w:pPr>
-      <w:r>
-        <w:t xml:space="preserve">Tres riscos: acoblament, manteniment fràgil, continuïtat operativa.</w:t>
-      </w:r>
-    </w:p>
-    <w:p>
-      <w:pPr>
-        <w:pStyle w:val="Compact"/>
-        <w:numPr>
-          <w:ilvl w:val="0"/>
-          <w:numId w:val="1007"/>
-        </w:numPr>
-      </w:pPr>
-      <w:r>
-        <w:t xml:space="preserve">Transició: resposta arquitectònica, port de sortida.</w:t>
-      </w:r>
-    </w:p>
-    <w:bookmarkEnd w:id="27"/>
-    <w:bookmarkStart w:id="28" w:name="port-i-adaptador---055"/>
+        <w:t xml:space="preserve">7. Port i adaptador - 2:20</w:t>
+      </w:r>
+    </w:p>
+    <w:p>
+      <w:pPr>
+        <w:pStyle w:val="Compact"/>
+        <w:numPr>
+          <w:ilvl w:val="0"/>
+          <w:numId w:val="1008"/>
+        </w:numPr>
+      </w:pPr>
+      <w:r>
+        <w:t xml:space="preserve">Fer-la servir com a frontissa conceptual forta, no com a tràmit ràpid.</w:t>
+      </w:r>
+    </w:p>
+    <w:p>
+      <w:pPr>
+        <w:pStyle w:val="Compact"/>
+        <w:numPr>
+          <w:ilvl w:val="0"/>
+          <w:numId w:val="1008"/>
+        </w:numPr>
+      </w:pPr>
+      <w:r>
+        <w:t xml:space="preserve">Flux d’execució: el cas d’ús demana informació cap enfora.</w:t>
+      </w:r>
+    </w:p>
+    <w:p>
+      <w:pPr>
+        <w:pStyle w:val="Compact"/>
+        <w:numPr>
+          <w:ilvl w:val="0"/>
+          <w:numId w:val="1008"/>
+        </w:numPr>
+      </w:pPr>
+      <w:r>
+        <w:t xml:space="preserve">Dependència de codi: el cas d’ús depèn del port; l’adaptador implementa el port.</w:t>
+      </w:r>
+    </w:p>
+    <w:p>
+      <w:pPr>
+        <w:pStyle w:val="Compact"/>
+        <w:numPr>
+          <w:ilvl w:val="0"/>
+          <w:numId w:val="1008"/>
+        </w:numPr>
+      </w:pPr>
+      <w:r>
+        <w:t xml:space="preserve">En Java, el port s’expressa com una interfície.</w:t>
+      </w:r>
+    </w:p>
+    <w:p>
+      <w:pPr>
+        <w:pStyle w:val="Compact"/>
+        <w:numPr>
+          <w:ilvl w:val="0"/>
+          <w:numId w:val="1008"/>
+        </w:numPr>
+      </w:pPr>
+      <w:r>
+        <w:t xml:space="preserve">L’adaptador implementa aquesta interfície.</w:t>
+      </w:r>
+    </w:p>
+    <w:p>
+      <w:pPr>
+        <w:pStyle w:val="Compact"/>
+        <w:numPr>
+          <w:ilvl w:val="0"/>
+          <w:numId w:val="1008"/>
+        </w:numPr>
+      </w:pPr>
+      <w:r>
+        <w:t xml:space="preserve">La interfície funciona com a contracte desacoblador entre components.</w:t>
+      </w:r>
+    </w:p>
+    <w:p>
+      <w:pPr>
+        <w:pStyle w:val="Compact"/>
+        <w:numPr>
+          <w:ilvl w:val="0"/>
+          <w:numId w:val="1008"/>
+        </w:numPr>
+      </w:pPr>
+      <w:r>
+        <w:t xml:space="preserve">Inversió: la infraestructura depèn del port definit per l’aplicació.</w:t>
+      </w:r>
+    </w:p>
+    <w:p>
+      <w:pPr>
+        <w:pStyle w:val="Compact"/>
+        <w:numPr>
+          <w:ilvl w:val="0"/>
+          <w:numId w:val="1008"/>
+        </w:numPr>
+      </w:pPr>
+      <w:r>
+        <w:t xml:space="preserve">Transició: aplicar-ho al cas patrimonial.</w:t>
+      </w:r>
+    </w:p>
+    <w:bookmarkEnd w:id="29"/>
+    <w:bookmarkStart w:id="30" w:name="port-patrimonial---155"/>
     <w:p>
       <w:pPr>
         <w:pStyle w:val="Ttulo3"/>
       </w:pPr>
       <w:r>
-        <w:t xml:space="preserve">7. Port i adaptador - 0:55</w:t>
-      </w:r>
-    </w:p>
-    <w:p>
-      <w:pPr>
-        <w:pStyle w:val="Compact"/>
-        <w:numPr>
-          <w:ilvl w:val="0"/>
-          <w:numId w:val="1008"/>
-        </w:numPr>
-      </w:pPr>
-      <w:r>
-        <w:t xml:space="preserve">Fer-la servir com a frontissa conceptual, no com a explicació llarga.</w:t>
-      </w:r>
-    </w:p>
-    <w:p>
-      <w:pPr>
-        <w:pStyle w:val="Compact"/>
-        <w:numPr>
-          <w:ilvl w:val="0"/>
-          <w:numId w:val="1008"/>
-        </w:numPr>
-      </w:pPr>
-      <w:r>
-        <w:t xml:space="preserve">Flux d’execució: el cas d’ús demana informació cap enfora.</w:t>
-      </w:r>
-    </w:p>
-    <w:p>
-      <w:pPr>
-        <w:pStyle w:val="Compact"/>
-        <w:numPr>
-          <w:ilvl w:val="0"/>
-          <w:numId w:val="1008"/>
-        </w:numPr>
-      </w:pPr>
-      <w:r>
-        <w:t xml:space="preserve">Dependència de codi: el cas d’ús depèn del port; l’adaptador implementa el port.</w:t>
-      </w:r>
-    </w:p>
-    <w:p>
-      <w:pPr>
-        <w:pStyle w:val="Compact"/>
-        <w:numPr>
-          <w:ilvl w:val="0"/>
-          <w:numId w:val="1008"/>
-        </w:numPr>
-      </w:pPr>
-      <w:r>
-        <w:t xml:space="preserve">Inversió: la infraestructura depèn del port definit per l’aplicació.</w:t>
-      </w:r>
-    </w:p>
-    <w:p>
-      <w:pPr>
-        <w:pStyle w:val="Compact"/>
-        <w:numPr>
-          <w:ilvl w:val="0"/>
-          <w:numId w:val="1008"/>
-        </w:numPr>
-      </w:pPr>
-      <w:r>
-        <w:t xml:space="preserve">Transició: aplicar-ho al cas patrimonial.</w:t>
-      </w:r>
-    </w:p>
-    <w:bookmarkEnd w:id="28"/>
-    <w:bookmarkStart w:id="29" w:name="port-patrimonial---205"/>
+        <w:t xml:space="preserve">8. Port patrimonial - 1:55</w:t>
+      </w:r>
+    </w:p>
+    <w:p>
+      <w:pPr>
+        <w:pStyle w:val="Compact"/>
+        <w:numPr>
+          <w:ilvl w:val="0"/>
+          <w:numId w:val="1009"/>
+        </w:numPr>
+      </w:pPr>
+      <w:r>
+        <w:t xml:space="preserve">Servei d’aplicació depèn de contractes propis.</w:t>
+      </w:r>
+    </w:p>
+    <w:p>
+      <w:pPr>
+        <w:pStyle w:val="Compact"/>
+        <w:numPr>
+          <w:ilvl w:val="0"/>
+          <w:numId w:val="1009"/>
+        </w:numPr>
+      </w:pPr>
+      <w:r>
+        <w:t xml:space="preserve">Adaptadors fora del nucli.</w:t>
+      </w:r>
+    </w:p>
+    <w:p>
+      <w:pPr>
+        <w:pStyle w:val="Compact"/>
+        <w:numPr>
+          <w:ilvl w:val="0"/>
+          <w:numId w:val="1009"/>
+        </w:numPr>
+      </w:pPr>
+      <w:r>
+        <w:t xml:space="preserve">PICA/JDBC/SOAP/REST són detalls substituïbles.</w:t>
+      </w:r>
+    </w:p>
+    <w:p>
+      <w:pPr>
+        <w:pStyle w:val="Compact"/>
+        <w:numPr>
+          <w:ilvl w:val="0"/>
+          <w:numId w:val="1009"/>
+        </w:numPr>
+      </w:pPr>
+      <w:r>
+        <w:t xml:space="preserve">Fletxa correcta d’implementació: adaptador -&gt; port.</w:t>
+      </w:r>
+    </w:p>
+    <w:p>
+      <w:pPr>
+        <w:pStyle w:val="Compact"/>
+        <w:numPr>
+          <w:ilvl w:val="0"/>
+          <w:numId w:val="1009"/>
+        </w:numPr>
+      </w:pPr>
+      <w:r>
+        <w:t xml:space="preserve">Transició: mateix patró en un domini financer.</w:t>
+      </w:r>
+    </w:p>
+    <w:bookmarkEnd w:id="30"/>
+    <w:bookmarkStart w:id="31" w:name="domini-financer---135"/>
     <w:p>
       <w:pPr>
         <w:pStyle w:val="Ttulo3"/>
       </w:pPr>
       <w:r>
-        <w:t xml:space="preserve">8. Port patrimonial - 2:05</w:t>
-      </w:r>
-    </w:p>
-    <w:p>
-      <w:pPr>
-        <w:pStyle w:val="Compact"/>
-        <w:numPr>
-          <w:ilvl w:val="0"/>
-          <w:numId w:val="1009"/>
-        </w:numPr>
-      </w:pPr>
-      <w:r>
-        <w:t xml:space="preserve">Servei d’aplicació depèn de contractes propis.</w:t>
-      </w:r>
-    </w:p>
-    <w:p>
-      <w:pPr>
-        <w:pStyle w:val="Compact"/>
-        <w:numPr>
-          <w:ilvl w:val="0"/>
-          <w:numId w:val="1009"/>
-        </w:numPr>
-      </w:pPr>
-      <w:r>
-        <w:t xml:space="preserve">Adaptadors fora del nucli.</w:t>
-      </w:r>
-    </w:p>
-    <w:p>
-      <w:pPr>
-        <w:pStyle w:val="Compact"/>
-        <w:numPr>
-          <w:ilvl w:val="0"/>
-          <w:numId w:val="1009"/>
-        </w:numPr>
-      </w:pPr>
-      <w:r>
-        <w:t xml:space="preserve">PICA/JDBC/SOAP/REST són detalls substituïbles.</w:t>
-      </w:r>
-    </w:p>
-    <w:p>
-      <w:pPr>
-        <w:pStyle w:val="Compact"/>
-        <w:numPr>
-          <w:ilvl w:val="0"/>
-          <w:numId w:val="1009"/>
-        </w:numPr>
-      </w:pPr>
-      <w:r>
-        <w:t xml:space="preserve">Fletxa correcta d’implementació: adaptador -&gt; port.</w:t>
-      </w:r>
-    </w:p>
-    <w:p>
-      <w:pPr>
-        <w:pStyle w:val="Compact"/>
-        <w:numPr>
-          <w:ilvl w:val="0"/>
-          <w:numId w:val="1009"/>
-        </w:numPr>
-      </w:pPr>
-      <w:r>
-        <w:t xml:space="preserve">Transició: mateix patró en un domini financer.</w:t>
-      </w:r>
-    </w:p>
-    <w:bookmarkEnd w:id="29"/>
-    <w:bookmarkStart w:id="30" w:name="domini-financer---145"/>
+        <w:t xml:space="preserve">9. Domini financer - 1:35</w:t>
+      </w:r>
+    </w:p>
+    <w:p>
+      <w:pPr>
+        <w:pStyle w:val="Compact"/>
+        <w:numPr>
+          <w:ilvl w:val="0"/>
+          <w:numId w:val="1010"/>
+        </w:numPr>
+      </w:pPr>
+      <w:r>
+        <w:t xml:space="preserve">Canvi explícit de domini: beca -&gt; cartera d’inversió personal.</w:t>
+      </w:r>
+    </w:p>
+    <w:p>
+      <w:pPr>
+        <w:pStyle w:val="Compact"/>
+        <w:numPr>
+          <w:ilvl w:val="0"/>
+          <w:numId w:val="1010"/>
+        </w:numPr>
+      </w:pPr>
+      <w:r>
+        <w:t xml:space="preserve">El diagrama correspon a HexaStock, però s’ha de llegir com a patró.</w:t>
+      </w:r>
+    </w:p>
+    <w:p>
+      <w:pPr>
+        <w:pStyle w:val="Compact"/>
+        <w:numPr>
+          <w:ilvl w:val="0"/>
+          <w:numId w:val="1010"/>
+        </w:numPr>
+      </w:pPr>
+      <w:r>
+        <w:t xml:space="preserve">Cas d’ús: vendre accions.</w:t>
+      </w:r>
+    </w:p>
+    <w:p>
+      <w:pPr>
+        <w:pStyle w:val="Compact"/>
+        <w:numPr>
+          <w:ilvl w:val="0"/>
+          <w:numId w:val="1010"/>
+        </w:numPr>
+      </w:pPr>
+      <w:r>
+        <w:t xml:space="preserve">Necessitat: preu actual de l’acció que l’usuari vol vendre.</w:t>
+      </w:r>
+    </w:p>
+    <w:p>
+      <w:pPr>
+        <w:pStyle w:val="Compact"/>
+        <w:numPr>
+          <w:ilvl w:val="0"/>
+          <w:numId w:val="1010"/>
+        </w:numPr>
+      </w:pPr>
+      <w:r>
+        <w:t xml:space="preserve">Port de sortida: defineix aquesta capacitat.</w:t>
+      </w:r>
+    </w:p>
+    <w:p>
+      <w:pPr>
+        <w:pStyle w:val="Compact"/>
+        <w:numPr>
+          <w:ilvl w:val="0"/>
+          <w:numId w:val="1010"/>
+        </w:numPr>
+      </w:pPr>
+      <w:r>
+        <w:t xml:space="preserve">Transició: concretar-ho en el flux de HexaStock.</w:t>
+      </w:r>
+    </w:p>
+    <w:bookmarkEnd w:id="31"/>
+    <w:bookmarkStart w:id="32" w:name="flux-i-codi---135"/>
     <w:p>
       <w:pPr>
         <w:pStyle w:val="Ttulo3"/>
       </w:pPr>
       <w:r>
-        <w:t xml:space="preserve">9. Domini financer - 1:45</w:t>
-      </w:r>
-    </w:p>
-    <w:p>
-      <w:pPr>
-        <w:pStyle w:val="Compact"/>
-        <w:numPr>
-          <w:ilvl w:val="0"/>
-          <w:numId w:val="1010"/>
-        </w:numPr>
-      </w:pPr>
-      <w:r>
-        <w:t xml:space="preserve">Canvi explícit de domini: beca -&gt; cartera d’inversió personal.</w:t>
-      </w:r>
-    </w:p>
-    <w:p>
-      <w:pPr>
-        <w:pStyle w:val="Compact"/>
-        <w:numPr>
-          <w:ilvl w:val="0"/>
-          <w:numId w:val="1010"/>
-        </w:numPr>
-      </w:pPr>
-      <w:r>
-        <w:t xml:space="preserve">El diagrama ja correspon a HexaStock, però s’ha de llegir com a patró.</w:t>
-      </w:r>
-    </w:p>
-    <w:p>
-      <w:pPr>
-        <w:pStyle w:val="Compact"/>
-        <w:numPr>
-          <w:ilvl w:val="0"/>
-          <w:numId w:val="1010"/>
-        </w:numPr>
-      </w:pPr>
-      <w:r>
-        <w:t xml:space="preserve">Cas d’ús: vendre accions.</w:t>
-      </w:r>
-    </w:p>
-    <w:p>
-      <w:pPr>
-        <w:pStyle w:val="Compact"/>
-        <w:numPr>
-          <w:ilvl w:val="0"/>
-          <w:numId w:val="1010"/>
-        </w:numPr>
-      </w:pPr>
-      <w:r>
-        <w:t xml:space="preserve">Necessitat: preu actual de l’acció que l’usuari vol vendre.</w:t>
-      </w:r>
-    </w:p>
-    <w:p>
-      <w:pPr>
-        <w:pStyle w:val="Compact"/>
-        <w:numPr>
-          <w:ilvl w:val="0"/>
-          <w:numId w:val="1010"/>
-        </w:numPr>
-      </w:pPr>
-      <w:r>
-        <w:t xml:space="preserve">Port de sortida: defineix aquesta capacitat.</w:t>
-      </w:r>
-    </w:p>
-    <w:p>
-      <w:pPr>
-        <w:pStyle w:val="Compact"/>
-        <w:numPr>
-          <w:ilvl w:val="0"/>
-          <w:numId w:val="1010"/>
-        </w:numPr>
-      </w:pPr>
-      <w:r>
-        <w:t xml:space="preserve">Transició: ara sí, concretar-ho en HexaStock.</w:t>
-      </w:r>
-    </w:p>
-    <w:bookmarkEnd w:id="30"/>
-    <w:bookmarkStart w:id="31" w:name="flux-i-codi---145"/>
+        <w:t xml:space="preserve">10. Flux i codi - 1:35</w:t>
+      </w:r>
+    </w:p>
+    <w:p>
+      <w:pPr>
+        <w:pStyle w:val="Compact"/>
+        <w:numPr>
+          <w:ilvl w:val="0"/>
+          <w:numId w:val="1011"/>
+        </w:numPr>
+      </w:pPr>
+      <w:r>
+        <w:t xml:space="preserve">Diagrama de seqüència = flux temporal, no dependència de codi.</w:t>
+      </w:r>
+    </w:p>
+    <w:p>
+      <w:pPr>
+        <w:pStyle w:val="Compact"/>
+        <w:numPr>
+          <w:ilvl w:val="0"/>
+          <w:numId w:val="1011"/>
+        </w:numPr>
+      </w:pPr>
+      <w:r>
+        <w:t xml:space="preserve">Controller -&gt; port d’entrada -&gt; servei.</w:t>
+      </w:r>
+    </w:p>
+    <w:p>
+      <w:pPr>
+        <w:pStyle w:val="Compact"/>
+        <w:numPr>
+          <w:ilvl w:val="0"/>
+          <w:numId w:val="1011"/>
+        </w:numPr>
+      </w:pPr>
+      <w:r>
+        <w:t xml:space="preserve">Servei consulta ports i delega venda al domini.</w:t>
+      </w:r>
+    </w:p>
+    <w:p>
+      <w:pPr>
+        <w:pStyle w:val="Compact"/>
+        <w:numPr>
+          <w:ilvl w:val="0"/>
+          <w:numId w:val="1011"/>
+        </w:numPr>
+      </w:pPr>
+      <w:r>
+        <w:t xml:space="preserve">Domini decideix; adaptador integra.</w:t>
+      </w:r>
+    </w:p>
+    <w:p>
+      <w:pPr>
+        <w:pStyle w:val="Compact"/>
+        <w:numPr>
+          <w:ilvl w:val="0"/>
+          <w:numId w:val="1011"/>
+        </w:numPr>
+      </w:pPr>
+      <w:r>
+        <w:t xml:space="preserve">Frase clau: el servei coordina, el domini decideix, l’adaptador integra.</w:t>
+      </w:r>
+    </w:p>
+    <w:p>
+      <w:pPr>
+        <w:pStyle w:val="Compact"/>
+        <w:numPr>
+          <w:ilvl w:val="0"/>
+          <w:numId w:val="1011"/>
+        </w:numPr>
+      </w:pPr>
+      <w:r>
+        <w:t xml:space="preserve">Transició: conclusió i agraïment.</w:t>
+      </w:r>
+    </w:p>
+    <w:bookmarkEnd w:id="32"/>
+    <w:bookmarkStart w:id="33" w:name="agraïment---140"/>
     <w:p>
       <w:pPr>
         <w:pStyle w:val="Ttulo3"/>
       </w:pPr>
       <w:r>
-        <w:t xml:space="preserve">10. Flux i codi - 1:45</w:t>
-      </w:r>
-    </w:p>
-    <w:p>
-      <w:pPr>
-        <w:pStyle w:val="Compact"/>
-        <w:numPr>
-          <w:ilvl w:val="0"/>
-          <w:numId w:val="1011"/>
-        </w:numPr>
-      </w:pPr>
-      <w:r>
-        <w:t xml:space="preserve">Diagrama de seqüència = flux temporal, no dependència de codi.</w:t>
-      </w:r>
-    </w:p>
-    <w:p>
-      <w:pPr>
-        <w:pStyle w:val="Compact"/>
-        <w:numPr>
-          <w:ilvl w:val="0"/>
-          <w:numId w:val="1011"/>
-        </w:numPr>
-      </w:pPr>
-      <w:r>
-        <w:t xml:space="preserve">Controller -&gt; port d’entrada -&gt; servei.</w:t>
-      </w:r>
-    </w:p>
-    <w:p>
-      <w:pPr>
-        <w:pStyle w:val="Compact"/>
-        <w:numPr>
-          <w:ilvl w:val="0"/>
-          <w:numId w:val="1011"/>
-        </w:numPr>
-      </w:pPr>
-      <w:r>
-        <w:t xml:space="preserve">Servei consulta ports i delega venda al domini.</w:t>
-      </w:r>
-    </w:p>
-    <w:p>
-      <w:pPr>
-        <w:pStyle w:val="Compact"/>
-        <w:numPr>
-          <w:ilvl w:val="0"/>
-          <w:numId w:val="1011"/>
-        </w:numPr>
-      </w:pPr>
-      <w:r>
-        <w:t xml:space="preserve">Domini decideix; adaptador integra.</w:t>
-      </w:r>
-    </w:p>
-    <w:p>
-      <w:pPr>
-        <w:pStyle w:val="Compact"/>
-        <w:numPr>
-          <w:ilvl w:val="0"/>
-          <w:numId w:val="1011"/>
-        </w:numPr>
-      </w:pPr>
-      <w:r>
-        <w:t xml:space="preserve">Transició: demo controlada amb adaptador substituïble.</w:t>
-      </w:r>
-    </w:p>
-    <w:bookmarkEnd w:id="31"/>
-    <w:bookmarkStart w:id="32" w:name="demo---145"/>
-    <w:p>
-      <w:pPr>
-        <w:pStyle w:val="Ttulo3"/>
-      </w:pPr>
-      <w:r>
-        <w:t xml:space="preserve">11. Demo - 1:45</w:t>
+        <w:t xml:space="preserve">11. Agraïment - 1:40</w:t>
       </w:r>
     </w:p>
     <w:p>
@@ -1664,7 +1833,7 @@
         </w:numPr>
       </w:pPr>
       <w:r>
-        <w:t xml:space="preserve">Mateix cas d’ús, servei i domini.</w:t>
+        <w:t xml:space="preserve">Arquitectura no elimina canvi; el localitza.</w:t>
       </w:r>
     </w:p>
     <w:p>
@@ -1676,7 +1845,7 @@
         </w:numPr>
       </w:pPr>
       <w:r>
-        <w:t xml:space="preserve">Canvia l’adaptador.</w:t>
+        <w:t xml:space="preserve">Canviar adaptador, no cas d’ús ni domini.</w:t>
       </w:r>
     </w:p>
     <w:p>
@@ -1688,7 +1857,7 @@
         </w:numPr>
       </w:pPr>
       <w:r>
-        <w:t xml:space="preserve">Perfils: Finnhub, Alpha Vantage, mock.</w:t>
+        <w:t xml:space="preserve">Agraïment TecnoCampus.</w:t>
       </w:r>
     </w:p>
     <w:p>
@@ -1700,7 +1869,7 @@
         </w:numPr>
       </w:pPr>
       <w:r>
-        <w:t xml:space="preserve">Finnhub i Alpha Vantage són implementacions concretes; el contracte no canvia.</w:t>
+        <w:t xml:space="preserve">Agraïment Dr. Josep Roure.</w:t>
       </w:r>
     </w:p>
     <w:p>
@@ -1709,88 +1878,6 @@
         <w:numPr>
           <w:ilvl w:val="0"/>
           <w:numId w:val="1012"/>
-        </w:numPr>
-      </w:pPr>
-      <w:r>
-        <w:t xml:space="preserve">Utilitat docent: proves amb adaptador mock i sense claus reals.</w:t>
-      </w:r>
-    </w:p>
-    <w:p>
-      <w:pPr>
-        <w:pStyle w:val="Compact"/>
-        <w:numPr>
-          <w:ilvl w:val="0"/>
-          <w:numId w:val="1012"/>
-        </w:numPr>
-      </w:pPr>
-      <w:r>
-        <w:t xml:space="preserve">Transició: conclusió final.</w:t>
-      </w:r>
-    </w:p>
-    <w:bookmarkEnd w:id="32"/>
-    <w:bookmarkStart w:id="33" w:name="agraïment---120"/>
-    <w:p>
-      <w:pPr>
-        <w:pStyle w:val="Ttulo3"/>
-      </w:pPr>
-      <w:r>
-        <w:t xml:space="preserve">12. Agraïment - 1:20</w:t>
-      </w:r>
-    </w:p>
-    <w:p>
-      <w:pPr>
-        <w:pStyle w:val="Compact"/>
-        <w:numPr>
-          <w:ilvl w:val="0"/>
-          <w:numId w:val="1013"/>
-        </w:numPr>
-      </w:pPr>
-      <w:r>
-        <w:t xml:space="preserve">Arquitectura no elimina canvi; el localitza.</w:t>
-      </w:r>
-    </w:p>
-    <w:p>
-      <w:pPr>
-        <w:pStyle w:val="Compact"/>
-        <w:numPr>
-          <w:ilvl w:val="0"/>
-          <w:numId w:val="1013"/>
-        </w:numPr>
-      </w:pPr>
-      <w:r>
-        <w:t xml:space="preserve">Canviar adaptador, no cas d’ús ni domini.</w:t>
-      </w:r>
-    </w:p>
-    <w:p>
-      <w:pPr>
-        <w:pStyle w:val="Compact"/>
-        <w:numPr>
-          <w:ilvl w:val="0"/>
-          <w:numId w:val="1013"/>
-        </w:numPr>
-      </w:pPr>
-      <w:r>
-        <w:t xml:space="preserve">Agraïment TecnoCampus.</w:t>
-      </w:r>
-    </w:p>
-    <w:p>
-      <w:pPr>
-        <w:pStyle w:val="Compact"/>
-        <w:numPr>
-          <w:ilvl w:val="0"/>
-          <w:numId w:val="1013"/>
-        </w:numPr>
-      </w:pPr>
-      <w:r>
-        <w:t xml:space="preserve">Agraïment Dr. Josep Roure.</w:t>
-      </w:r>
-    </w:p>
-    <w:p>
-      <w:pPr>
-        <w:pStyle w:val="Compact"/>
-        <w:numPr>
-          <w:ilvl w:val="0"/>
-          <w:numId w:val="1013"/>
         </w:numPr>
       </w:pPr>
       <w:r>
@@ -1809,9 +1896,146 @@
         <w:t xml:space="preserve">.</w:t>
       </w:r>
     </w:p>
+    <w:p>
+      <w:pPr>
+        <w:pStyle w:val="Compact"/>
+        <w:numPr>
+          <w:ilvl w:val="0"/>
+          <w:numId w:val="1012"/>
+        </w:numPr>
+      </w:pPr>
+      <w:r>
+        <w:t xml:space="preserve">No obrir la demo després del tancament si el tribunal no la demana o si no hi ha temps clar.</w:t>
+      </w:r>
+    </w:p>
     <w:bookmarkEnd w:id="33"/>
+    <w:bookmarkStart w:id="34" w:name="annex-a.-demo-opcional---130-a-230-1"/>
+    <w:p>
+      <w:pPr>
+        <w:pStyle w:val="Ttulo3"/>
+      </w:pPr>
+      <w:r>
+        <w:t xml:space="preserve">Annex A. Demo opcional - 1:30 a 2:30</w:t>
+      </w:r>
+    </w:p>
+    <w:p>
+      <w:pPr>
+        <w:pStyle w:val="Compact"/>
+        <w:numPr>
+          <w:ilvl w:val="0"/>
+          <w:numId w:val="1013"/>
+        </w:numPr>
+      </w:pPr>
+      <w:r>
+        <w:t xml:space="preserve">Annex posterior al tancament, no part del cos principal.</w:t>
+      </w:r>
+    </w:p>
+    <w:p>
+      <w:pPr>
+        <w:pStyle w:val="Compact"/>
+        <w:numPr>
+          <w:ilvl w:val="0"/>
+          <w:numId w:val="1013"/>
+        </w:numPr>
+      </w:pPr>
+      <w:r>
+        <w:t xml:space="preserve">Només mostrar si el tribunal ho demana o si hi ha temps explícit després de la classe.</w:t>
+      </w:r>
+    </w:p>
+    <w:p>
+      <w:pPr>
+        <w:pStyle w:val="Compact"/>
+        <w:numPr>
+          <w:ilvl w:val="0"/>
+          <w:numId w:val="1013"/>
+        </w:numPr>
+      </w:pPr>
+      <w:r>
+        <w:t xml:space="preserve">Mateix cas d’ús, servei i domini.</w:t>
+      </w:r>
+    </w:p>
+    <w:p>
+      <w:pPr>
+        <w:pStyle w:val="Compact"/>
+        <w:numPr>
+          <w:ilvl w:val="0"/>
+          <w:numId w:val="1013"/>
+        </w:numPr>
+      </w:pPr>
+      <w:r>
+        <w:t xml:space="preserve">Canvia l’adaptador.</w:t>
+      </w:r>
+    </w:p>
+    <w:p>
+      <w:pPr>
+        <w:pStyle w:val="Compact"/>
+        <w:numPr>
+          <w:ilvl w:val="0"/>
+          <w:numId w:val="1013"/>
+        </w:numPr>
+      </w:pPr>
+      <w:r>
+        <w:t xml:space="preserve">Perfils: Finnhub, Alpha Vantage, mock.</w:t>
+      </w:r>
+    </w:p>
+    <w:p>
+      <w:pPr>
+        <w:pStyle w:val="Compact"/>
+        <w:numPr>
+          <w:ilvl w:val="0"/>
+          <w:numId w:val="1013"/>
+        </w:numPr>
+      </w:pPr>
+      <w:r>
+        <w:t xml:space="preserve">Finnhub i Alpha Vantage són implementacions concretes; el contracte no canvia.</w:t>
+      </w:r>
+    </w:p>
+    <w:p>
+      <w:pPr>
+        <w:pStyle w:val="Compact"/>
+        <w:numPr>
+          <w:ilvl w:val="0"/>
+          <w:numId w:val="1013"/>
+        </w:numPr>
+      </w:pPr>
+      <w:r>
+        <w:t xml:space="preserve">Utilitat docent: proves amb adaptador mock i sense claus reals.</w:t>
+      </w:r>
+    </w:p>
+    <w:p>
+      <w:pPr>
+        <w:pStyle w:val="Compact"/>
+        <w:numPr>
+          <w:ilvl w:val="0"/>
+          <w:numId w:val="1013"/>
+        </w:numPr>
+      </w:pPr>
+      <w:r>
+        <w:t xml:space="preserve">Missatge: canvia la infraestructura; el cas d’ús i el domini romanen estables.</w:t>
+      </w:r>
+    </w:p>
+    <w:p>
+      <w:pPr>
+        <w:pStyle w:val="Compact"/>
+        <w:numPr>
+          <w:ilvl w:val="0"/>
+          <w:numId w:val="1013"/>
+        </w:numPr>
+      </w:pPr>
+      <w:r>
+        <w:t xml:space="preserve">No convertir l’annex en una segona explicació llarga.</w:t>
+      </w:r>
+    </w:p>
+    <w:p>
+      <w:r>
+        <w:pict>
+          <v:rect style="width:0;height:1.5pt" o:hralign="center" o:hrstd="t" o:hr="t"/>
+        </w:pict>
+      </w:r>
+    </w:p>
     <w:bookmarkEnd w:id="34"/>
-    <w:bookmarkStart w:id="35" w:name="esquema-de-memorització"/>
+    <w:bookmarkEnd w:id="35"/>
+    <w:bookmarkStart w:id="36" w:name="esquema-de-memorització"/>
     <w:p>
       <w:pPr>
         <w:pStyle w:val="Ttulo2"/>
@@ -2266,7 +2490,7 @@
               <w:pStyle w:val="Compact"/>
             </w:pPr>
             <w:r>
-              <w:t xml:space="preserve">Inversió de dependències</w:t>
+              <w:t xml:space="preserve">Interfície, contracte, inversió</w:t>
             </w:r>
           </w:p>
         </w:tc>
@@ -2459,7 +2683,7 @@
               <w:pStyle w:val="Compact"/>
             </w:pPr>
             <w:r>
-              <w:t xml:space="preserve">Demo</w:t>
+              <w:t xml:space="preserve">Conclusió</w:t>
             </w:r>
           </w:p>
         </w:tc>
@@ -2483,40 +2707,40 @@
               <w:pStyle w:val="Compact"/>
             </w:pPr>
             <w:r>
-              <w:t xml:space="preserve">Canvia infraestructura, no cas d’ús</w:t>
-            </w:r>
-          </w:p>
-        </w:tc>
-        <w:tc>
-          <w:tcPr/>
-          <w:p>
-            <w:pPr>
-              <w:pStyle w:val="Compact"/>
-            </w:pPr>
-            <w:r>
-              <w:t xml:space="preserve">Adaptador substituïble</w:t>
-            </w:r>
-          </w:p>
-        </w:tc>
-        <w:tc>
-          <w:tcPr/>
-          <w:p>
-            <w:pPr>
-              <w:pStyle w:val="Compact"/>
-            </w:pPr>
-            <w:r>
-              <w:t xml:space="preserve">Flux</w:t>
-            </w:r>
-          </w:p>
-        </w:tc>
-        <w:tc>
-          <w:tcPr/>
-          <w:p>
-            <w:pPr>
-              <w:pStyle w:val="Compact"/>
-            </w:pPr>
-            <w:r>
-              <w:t xml:space="preserve">Conclusió</w:t>
+              <w:t xml:space="preserve">L’arquitectura localitza el canvi</w:t>
+            </w:r>
+          </w:p>
+        </w:tc>
+        <w:tc>
+          <w:tcPr/>
+          <w:p>
+            <w:pPr>
+              <w:pStyle w:val="Compact"/>
+            </w:pPr>
+            <w:r>
+              <w:t xml:space="preserve">Frontera explícita</w:t>
+            </w:r>
+          </w:p>
+        </w:tc>
+        <w:tc>
+          <w:tcPr/>
+          <w:p>
+            <w:pPr>
+              <w:pStyle w:val="Compact"/>
+            </w:pPr>
+            <w:r>
+              <w:t xml:space="preserve">Flux i codi</w:t>
+            </w:r>
+          </w:p>
+        </w:tc>
+        <w:tc>
+          <w:tcPr/>
+          <w:p>
+            <w:pPr>
+              <w:pStyle w:val="Compact"/>
+            </w:pPr>
+            <w:r>
+              <w:t xml:space="preserve">Tancament</w:t>
             </w:r>
           </w:p>
         </w:tc>
@@ -2529,51 +2753,51 @@
               <w:pStyle w:val="Compact"/>
             </w:pPr>
             <w:r>
-              <w:t xml:space="preserve">12</w:t>
-            </w:r>
-          </w:p>
-        </w:tc>
-        <w:tc>
-          <w:tcPr/>
-          <w:p>
-            <w:pPr>
-              <w:pStyle w:val="Compact"/>
-            </w:pPr>
-            <w:r>
-              <w:t xml:space="preserve">L’arquitectura localitza el canvi</w:t>
-            </w:r>
-          </w:p>
-        </w:tc>
-        <w:tc>
-          <w:tcPr/>
-          <w:p>
-            <w:pPr>
-              <w:pStyle w:val="Compact"/>
-            </w:pPr>
-            <w:r>
-              <w:t xml:space="preserve">Frontera explícita</w:t>
-            </w:r>
-          </w:p>
-        </w:tc>
-        <w:tc>
-          <w:tcPr/>
-          <w:p>
-            <w:pPr>
-              <w:pStyle w:val="Compact"/>
-            </w:pPr>
-            <w:r>
-              <w:t xml:space="preserve">Demo</w:t>
-            </w:r>
-          </w:p>
-        </w:tc>
-        <w:tc>
-          <w:tcPr/>
-          <w:p>
-            <w:pPr>
-              <w:pStyle w:val="Compact"/>
-            </w:pPr>
-            <w:r>
-              <w:t xml:space="preserve">Tancament</w:t>
+              <w:t xml:space="preserve">Annex A</w:t>
+            </w:r>
+          </w:p>
+        </w:tc>
+        <w:tc>
+          <w:tcPr/>
+          <w:p>
+            <w:pPr>
+              <w:pStyle w:val="Compact"/>
+            </w:pPr>
+            <w:r>
+              <w:t xml:space="preserve">Demostració opcional del canvi d’adaptador</w:t>
+            </w:r>
+          </w:p>
+        </w:tc>
+        <w:tc>
+          <w:tcPr/>
+          <w:p>
+            <w:pPr>
+              <w:pStyle w:val="Compact"/>
+            </w:pPr>
+            <w:r>
+              <w:t xml:space="preserve">Adaptador substituïble</w:t>
+            </w:r>
+          </w:p>
+        </w:tc>
+        <w:tc>
+          <w:tcPr/>
+          <w:p>
+            <w:pPr>
+              <w:pStyle w:val="Compact"/>
+            </w:pPr>
+            <w:r>
+              <w:t xml:space="preserve">Només si escau</w:t>
+            </w:r>
+          </w:p>
+        </w:tc>
+        <w:tc>
+          <w:tcPr/>
+          <w:p>
+            <w:pPr>
+              <w:pStyle w:val="Compact"/>
+            </w:pPr>
+            <w:r>
+              <w:t xml:space="preserve">Preguntes / discussió</w:t>
             </w:r>
           </w:p>
         </w:tc>
@@ -2584,7 +2808,7 @@
         <w:pStyle w:val="Textoindependiente"/>
       </w:pPr>
       <w:r>
-        <w:t xml:space="preserve">Mantra de memòria:</w:t>
+        <w:t xml:space="preserve">Mantra de memòria del cos principal:</w:t>
       </w:r>
       <w:r>
         <w:t xml:space="preserve"> </w:t>
@@ -2593,14 +2817,41 @@
         <w:rPr>
           <w:rStyle w:val="VerbatimChar"/>
         </w:rPr>
-        <w:t xml:space="preserve">context -&gt; assignatura -&gt; objectiu breu -&gt; procediment -&gt; dada externa -&gt; acoblament -&gt; port -&gt; AGAUR -&gt; domini financer -&gt; HexaStock -&gt; demo -&gt; conclusió</w:t>
+        <w:t xml:space="preserve">context -&gt; assignatura -&gt; objectiu breu -&gt; procediment -&gt; dada externa -&gt; acoblament -&gt; port -&gt; AGAUR -&gt; domini financer -&gt; HexaStock -&gt; conclusió</w:t>
       </w:r>
       <w:r>
         <w:t xml:space="preserve">.</w:t>
       </w:r>
     </w:p>
-    <w:bookmarkEnd w:id="35"/>
-    <w:bookmarkStart w:id="36" w:name="pla-dentrenament-comunicatiu"/>
+    <w:p>
+      <w:pPr>
+        <w:pStyle w:val="Textoindependiente"/>
+      </w:pPr>
+      <w:r>
+        <w:t xml:space="preserve">Mantra de l’annex opcional:</w:t>
+      </w:r>
+      <w:r>
+        <w:t xml:space="preserve"> </w:t>
+      </w:r>
+      <w:r>
+        <w:rPr>
+          <w:rStyle w:val="VerbatimChar"/>
+        </w:rPr>
+        <w:t xml:space="preserve">mateix cas d'ús -&gt; mateix servei -&gt; mateix domini -&gt; canvia l'adaptador</w:t>
+      </w:r>
+      <w:r>
+        <w:t xml:space="preserve">.</w:t>
+      </w:r>
+    </w:p>
+    <w:p>
+      <w:r>
+        <w:pict>
+          <v:rect style="width:0;height:1.5pt" o:hralign="center" o:hrstd="t" o:hr="t"/>
+        </w:pict>
+      </w:r>
+    </w:p>
+    <w:bookmarkEnd w:id="36"/>
+    <w:bookmarkStart w:id="41" w:name="pla-dentrenament-comunicatiu"/>
     <w:p>
       <w:pPr>
         <w:pStyle w:val="Ttulo2"/>
@@ -2609,49 +2860,52 @@
         <w:t xml:space="preserve">4. Pla d’entrenament comunicatiu</w:t>
       </w:r>
     </w:p>
+    <w:bookmarkStart w:id="37" w:name="entrenament-inicial"/>
+    <w:p>
+      <w:pPr>
+        <w:pStyle w:val="Ttulo3"/>
+      </w:pPr>
+      <w:r>
+        <w:t xml:space="preserve">Entrenament inicial</w:t>
+      </w:r>
+    </w:p>
     <w:p>
       <w:pPr>
         <w:pStyle w:val="FirstParagraph"/>
       </w:pPr>
       <w:r>
-        <w:rPr>
-          <w:b/>
-          <w:bCs/>
-        </w:rPr>
-        <w:t xml:space="preserve">Entrenament inicial</w:t>
-      </w:r>
-    </w:p>
-    <w:p>
-      <w:pPr>
-        <w:pStyle w:val="Textoindependiente"/>
-      </w:pPr>
-      <w:r>
-        <w:t xml:space="preserve">Llegeix el guió complet en veu alta dues vegades sense cronòmetre. L’objectiu no és memoritzar, sinó detectar frases que no sonen naturals. Marca amb llapis les frases que vols dir exactament igual: la definició inicial, la distinció entre flux i dependència, i la conclusió final. La resta pot ser més flexible.</w:t>
-      </w:r>
-    </w:p>
-    <w:p>
-      <w:pPr>
-        <w:pStyle w:val="Textoindependiente"/>
-      </w:pPr>
-      <w:r>
-        <w:t xml:space="preserve">Després fes una lectura cronometrada. Ritme orientatiu: 125-135 paraules per minut, amb pauses reals. Si surt per sobre de 22 minuts, retalla exemples; si surt per sota de 18:30, no afegeixis contingut tècnic, amplia pauses i transicions.</w:t>
-      </w:r>
-    </w:p>
-    <w:p>
-      <w:pPr>
-        <w:pStyle w:val="Textoindependiente"/>
-      </w:pPr>
-      <w:r>
-        <w:rPr>
-          <w:b/>
-          <w:bCs/>
-        </w:rPr>
+        <w:t xml:space="preserve">Llegeix el guió complet del cos principal en veu alta dues vegades sense cronòmetre. L’objectiu no és memoritzar, sinó detectar frases que no sonen naturals. Marca amb llapis les frases que vols dir exactament igual: la definició inicial, la distinció entre flux i dependència, la idea del port com a interfície, i la conclusió final. La resta pot ser més flexible.</w:t>
+      </w:r>
+    </w:p>
+    <w:p>
+      <w:pPr>
+        <w:pStyle w:val="Textoindependiente"/>
+      </w:pPr>
+      <w:r>
+        <w:t xml:space="preserve">Després fes una lectura cronometrada només del cos principal, sense annex. Ritme orientatiu: 125-135 paraules per minut, amb pauses reals. Si surt per sobre de 21 minuts, retalla detall de les diapositives 5, 6, 8 o 9. Si surt per sota de 18:30, no afegeixis contingut tècnic nou; amplia pauses, mirada i transicions.</w:t>
+      </w:r>
+    </w:p>
+    <w:p>
+      <w:pPr>
+        <w:pStyle w:val="Textoindependiente"/>
+      </w:pPr>
+      <w:r>
+        <w:t xml:space="preserve">La demo opcional s’ha d’assajar per separat. No s’ha d’incloure en el cronòmetre principal.</w:t>
+      </w:r>
+    </w:p>
+    <w:bookmarkEnd w:id="37"/>
+    <w:bookmarkStart w:id="38" w:name="entrenament-intermedi"/>
+    <w:p>
+      <w:pPr>
+        <w:pStyle w:val="Ttulo3"/>
+      </w:pPr>
+      <w:r>
         <w:t xml:space="preserve">Entrenament intermedi</w:t>
       </w:r>
     </w:p>
     <w:p>
       <w:pPr>
-        <w:pStyle w:val="Textoindependiente"/>
+        <w:pStyle w:val="FirstParagraph"/>
       </w:pPr>
       <w:r>
         <w:t xml:space="preserve">Practica per blocs, no tota la presentació sempre sencera:</w:t>
@@ -2690,7 +2944,19 @@
         </w:numPr>
       </w:pPr>
       <w:r>
-        <w:t xml:space="preserve">Bloc 3: diapositives 9-12, domini financer, HexaStock, demo i tancament.</w:t>
+        <w:t xml:space="preserve">Bloc 3: diapositives 9-11, domini financer, HexaStock, conclusió i agraïment.</w:t>
+      </w:r>
+    </w:p>
+    <w:p>
+      <w:pPr>
+        <w:pStyle w:val="Compact"/>
+        <w:numPr>
+          <w:ilvl w:val="0"/>
+          <w:numId w:val="1014"/>
+        </w:numPr>
+      </w:pPr>
+      <w:r>
+        <w:t xml:space="preserve">Annex: demo opcional, en una versió de màxim 2 minuts.</w:t>
       </w:r>
     </w:p>
     <w:p>
@@ -2725,24 +2991,22 @@
         <w:t xml:space="preserve">. Evita caminar mentre expliques una distinció fina; atura’t, formula-la i continua.</w:t>
       </w:r>
     </w:p>
-    <w:p>
-      <w:pPr>
-        <w:pStyle w:val="Textoindependiente"/>
-      </w:pPr>
-      <w:r>
-        <w:rPr>
-          <w:b/>
-          <w:bCs/>
-        </w:rPr>
+    <w:bookmarkEnd w:id="38"/>
+    <w:bookmarkStart w:id="39" w:name="assaig-final"/>
+    <w:p>
+      <w:pPr>
+        <w:pStyle w:val="Ttulo3"/>
+      </w:pPr>
+      <w:r>
         <w:t xml:space="preserve">Assaig final</w:t>
       </w:r>
     </w:p>
     <w:p>
       <w:pPr>
-        <w:pStyle w:val="Textoindependiente"/>
-      </w:pPr>
-      <w:r>
-        <w:t xml:space="preserve">Fes com a mínim tres passades completes:</w:t>
+        <w:pStyle w:val="FirstParagraph"/>
+      </w:pPr>
+      <w:r>
+        <w:t xml:space="preserve">Fes com a mínim tres passades completes del cos principal:</w:t>
       </w:r>
     </w:p>
     <w:p>
@@ -2809,16 +3073,22 @@
         <w:pStyle w:val="Textoindependiente"/>
       </w:pPr>
       <w:r>
-        <w:rPr>
-          <w:b/>
-          <w:bCs/>
-        </w:rPr>
+        <w:t xml:space="preserve">Després grava una passada independent de l’annex opcional. La demo ha de poder explicar-se sense reobrir tota la classe. Ha de sonar com una verificació pràctica del que ja s’ha explicat, no com una secció nova.</w:t>
+      </w:r>
+    </w:p>
+    <w:bookmarkEnd w:id="39"/>
+    <w:bookmarkStart w:id="40" w:name="ritme-veu-i-cos"/>
+    <w:p>
+      <w:pPr>
+        <w:pStyle w:val="Ttulo3"/>
+      </w:pPr>
+      <w:r>
         <w:t xml:space="preserve">Ritme, veu i cos</w:t>
       </w:r>
     </w:p>
     <w:p>
       <w:pPr>
-        <w:pStyle w:val="Textoindependiente"/>
+        <w:pStyle w:val="FirstParagraph"/>
       </w:pPr>
       <w:r>
         <w:t xml:space="preserve">Mantingues un to més lent a les diapositives 3, 6, 7 i 8, perquè són les conceptualment més importants. Fes pauses llargues després de:</w:t>
@@ -2854,6 +3124,18 @@
         <w:rPr>
           <w:rStyle w:val="VerbatimChar"/>
         </w:rPr>
+        <w:t xml:space="preserve">en Java, el port s'expressa com una interfície</w:t>
+      </w:r>
+      <w:r>
+        <w:t xml:space="preserve">;</w:t>
+      </w:r>
+      <w:r>
+        <w:t xml:space="preserve"> </w:t>
+      </w:r>
+      <w:r>
+        <w:rPr>
+          <w:rStyle w:val="VerbatimChar"/>
+        </w:rPr>
         <w:t xml:space="preserve">l'adaptador implementa el port</w:t>
       </w:r>
       <w:r>
@@ -2880,8 +3162,16 @@
         <w:t xml:space="preserve">La postura ha de ser estable, amb els peus oberts a amplada d’espatlles. Usa les mans per marcar fronteres: dins/fora, port/adaptador, flux/dependència. Si et perds, torna al mantra: necessitat, port, adaptador. Aquesta triada recupera tota la presentació.</w:t>
       </w:r>
     </w:p>
-    <w:bookmarkEnd w:id="36"/>
-    <w:bookmarkStart w:id="37" w:name="advertiments-finals"/>
+    <w:p>
+      <w:r>
+        <w:pict>
+          <v:rect style="width:0;height:1.5pt" o:hralign="center" o:hrstd="t" o:hr="t"/>
+        </w:pict>
+      </w:r>
+    </w:p>
+    <w:bookmarkEnd w:id="40"/>
+    <w:bookmarkEnd w:id="41"/>
+    <w:bookmarkStart w:id="42" w:name="advertiments-finals"/>
     <w:p>
       <w:pPr>
         <w:pStyle w:val="Ttulo2"/>
@@ -2895,7 +3185,27 @@
         <w:pStyle w:val="FirstParagraph"/>
       </w:pPr>
       <w:r>
-        <w:t xml:space="preserve">Risc de temps: les diapositives 4-10 poden allargar-se fàcilment. Si vas tard, no retallis la conclusió; retalla detall del cas AGAUR i de la demo.</w:t>
+        <w:t xml:space="preserve">Risc de temps: les diapositives 4-10 poden allargar-se fàcilment. Si vas tard, no retallis la conclusió; retalla detall del cas AGAUR, de la transferència al domini financer o de la lectura del diagrama de seqüència.</w:t>
+      </w:r>
+    </w:p>
+    <w:p>
+      <w:pPr>
+        <w:pStyle w:val="Textoindependiente"/>
+      </w:pPr>
+      <w:r>
+        <w:t xml:space="preserve">Risc de demo: la demo no forma part del cos principal. No s’ha d’obrir abans del tancament. Després de</w:t>
+      </w:r>
+      <w:r>
+        <w:t xml:space="preserve"> </w:t>
+      </w:r>
+      <w:r>
+        <w:rPr>
+          <w:rStyle w:val="VerbatimChar"/>
+        </w:rPr>
+        <w:t xml:space="preserve">Moltes gràcies</w:t>
+      </w:r>
+      <w:r>
+        <w:t xml:space="preserve">, només s’ha d’activar si el tribunal ho demana o si explícitament hi ha marge per fer-ho. Si no, la classe ja està tancada correctament.</w:t>
       </w:r>
     </w:p>
     <w:p>
@@ -2912,6 +3222,14 @@
       </w:pPr>
       <w:r>
         <w:t xml:space="preserve">Risc de lectura de fletxes: no presentar totes les fletxes com si signifiquessin el mateix. Quan representen ús o flux d’execució, poden sortir del servei cap als ports. Quan representen implementació o dependència de codi, la lectura correcta és de l’adaptador cap al port.</w:t>
+      </w:r>
+    </w:p>
+    <w:p>
+      <w:pPr>
+        <w:pStyle w:val="Textoindependiente"/>
+      </w:pPr>
+      <w:r>
+        <w:t xml:space="preserve">Risc de port massa abstracte: concretar-lo sempre amb Java. En aquesta explicació, el port s’expressa com una interfície i l’adaptador implementa aquesta interfície. Aquesta concreció evita que el concepte soni massa metafòric o purament teòric.</w:t>
       </w:r>
     </w:p>
     <w:p>
@@ -2962,8 +3280,8 @@
         <w:t xml:space="preserve">Risc de confidencialitat: no mencionar endpoints, credencials, captures internes ni detalls operatius d’AGAUR. L’informe acredita l’activitat; la classe només usa el cas com a abstracció docent.</w:t>
       </w:r>
     </w:p>
-    <w:bookmarkEnd w:id="37"/>
-    <w:bookmarkEnd w:id="38"/>
+    <w:bookmarkEnd w:id="42"/>
+    <w:bookmarkEnd w:id="43"/>
     <w:sectPr>
       <w:footnotePr>
         <w:numRestart w:val="eachSect"/>

</xml_diff>

<commit_message>
docs: clarify output port explanation
</commit_message>
<xml_diff>
--- a/doc/presentations/defensa-placa-permanent-dsi-ports-sortida-hexagonal/output/REMARKABLE_materials-orals-canonics-20-minuts.docx
+++ b/doc/presentations/defensa-placa-permanent-dsi-ports-sortida-hexagonal/output/REMARKABLE_materials-orals-canonics-20-minuts.docx
@@ -237,7 +237,7 @@
         <w:pStyle w:val="Textoindependiente"/>
       </w:pPr>
       <w:r>
-        <w:t xml:space="preserve">Ho explico perquè em semblava molt enriquidor plantejar aquesta sessió com una trobada entre dues dimensions.</w:t>
+        <w:t xml:space="preserve">Ho explico perquè em sembla molt enriquidor plantejar aquesta sessió com una trobada entre dues dimensions.</w:t>
       </w:r>
     </w:p>
     <w:p>
@@ -321,15 +321,15 @@
         <w:pStyle w:val="Textoindependiente"/>
       </w:pPr>
       <w:r>
-        <w:t xml:space="preserve">El principi de treball és aquest: el cas d’ús necessita una capacitat, no una tecnologia. [mirar el tribunal]</w:t>
-      </w:r>
-    </w:p>
-    <w:p>
-      <w:pPr>
-        <w:pStyle w:val="Textoindependiente"/>
-      </w:pPr>
-      <w:r>
-        <w:t xml:space="preserve">Per tant, el que aprendrem és a fer tres operacions: identificar una necessitat externa del cas d’ús, expressar-la com a port de sortida i implementar-la mitjançant adaptadors substituïbles. [assenyalar les tres caixes]</w:t>
+        <w:t xml:space="preserve">El principi de treball és aquest: el cas d’ús necessita una capacitat, no una tecnologia específica. [mirar el tribunal]</w:t>
+      </w:r>
+    </w:p>
+    <w:p>
+      <w:pPr>
+        <w:pStyle w:val="Textoindependiente"/>
+      </w:pPr>
+      <w:r>
+        <w:t xml:space="preserve">La sessió d’avui s’organitza al voltant de tres decisions de disseny: identificar una necessitat externa del cas d’ús, expressar-la com a port de sortida i implementar-la mitjançant adaptadors substituïbles. [assenyalar les tres caixes]</w:t>
       </w:r>
     </w:p>
     <w:p>

</xml_diff>

<commit_message>
docs: just updating the derived artifacts.
</commit_message>
<xml_diff>
--- a/doc/presentations/defensa-placa-permanent-dsi-ports-sortida-hexagonal/output/REMARKABLE_materials-orals-canonics-20-minuts.docx
+++ b/doc/presentations/defensa-placa-permanent-dsi-ports-sortida-hexagonal/output/REMARKABLE_materials-orals-canonics-20-minuts.docx
@@ -290,14 +290,6 @@
         <w:t xml:space="preserve">El pla docent de l’assignatura explica que s’hi treballa una visió global d’arquitectures de sistemes d’informació: arquitectures per capes, arquitectures hexagonals i arquitectures basades en microserveis. Dins el bloc d’arquitectures hexagonals hi apareixen explícitament ports i adaptadors. [to calmat, explicatiu]</w:t>
       </w:r>
     </w:p>
-    <w:p>
-      <w:pPr>
-        <w:pStyle w:val="Textoindependiente"/>
-      </w:pPr>
-      <w:r>
-        <w:t xml:space="preserve">Per tant, aquesta no és una sessió afegida artificialment al temari. És una classe versemblant dins l’assignatura. [pausa breu]</w:t>
-      </w:r>
-    </w:p>
     <w:bookmarkEnd w:id="10"/>
     <w:bookmarkStart w:id="11" w:name="X3696606fd6d9b6d83d02a9073392ba28f4d25a2"/>
     <w:p>
@@ -379,7 +371,7 @@
         <w:pStyle w:val="Textoindependiente"/>
       </w:pPr>
       <w:r>
-        <w:t xml:space="preserve">La idea docent important és que aquí encara no hem parlat de SOAP, ni de REST, ni de PICA, ni de cap base de dades. Estem parlant de la necessitat funcional del procediment: per poder aplicar uns criteris econòmics, el sistema necessita dades fiables sobre renda i patrimoni.</w:t>
+        <w:t xml:space="preserve">La idea docent important és que aquí encara no hem parlat de SOAP, ni de REST, ni de cap base de dades. Estem parlant de la necessitat funcional del procediment: per poder aplicar uns criteris econòmics, el sistema necessita dades fiables sobre renda i patrimoni.</w:t>
       </w:r>
     </w:p>
     <w:p>
@@ -454,7 +446,7 @@
         <w:rPr>
           <w:rStyle w:val="VerbatimChar"/>
         </w:rPr>
-        <w:t xml:space="preserve">necessito informació patrimonial avaluable</w:t>
+        <w:t xml:space="preserve">necessito informació patrimonial d'un ciutadà</w:t>
       </w:r>
       <w:r>
         <w:t xml:space="preserve">. Encara no estem decidint si aquesta informació arribarà a través de PICA, d’un servei SOAP, d’una API REST, d’una base de dades corporativa o d’un altre mecanisme futur.</w:t>
@@ -585,7 +577,7 @@
         <w:pStyle w:val="Textoindependiente"/>
       </w:pPr>
       <w:r>
-        <w:t xml:space="preserve">És a dir, el cas d’ús no depèn directament d’una base de dades, d’una API externa o d’un client concret. El cas d’ús depèn d’una interfície que defineix què necessita: per exemple, obtenir una determinada informació, consultar un expedient o recuperar unes dades administratives.</w:t>
+        <w:t xml:space="preserve">És a dir, el cas d’ús no depèn directament d’una base de dades, d’una API externa o d’un client concret. El cas d’ús depèn d’una interfície que defineix què necessita: per exemple, obtenir una determinada informació econòmica, consultar un expedient o recuperar unes dades administratives.</w:t>
       </w:r>
     </w:p>
     <w:p>
@@ -720,14 +712,6 @@
       </w:pPr>
       <w:r>
         <w:t xml:space="preserve">Ara fem un canvi de domini. Ja no parlem d’una sol·licitud de beca, sinó d’una aplicació de gestió d’una cartera d’inversió personal. [assenyalar el títol]</w:t>
-      </w:r>
-    </w:p>
-    <w:p>
-      <w:pPr>
-        <w:pStyle w:val="Textoindependiente"/>
-      </w:pPr>
-      <w:r>
-        <w:t xml:space="preserve">El diagrama que veiem correspon a HexaStock. Ara, però, no em centraré en els noms concrets; el que m’interessa és reconèixer el mateix patró: cas d’ús, port de sortida i adaptadors substituïbles.</w:t>
       </w:r>
     </w:p>
     <w:p>

</xml_diff>

<commit_message>
Update TecnoCampus defense oral script and add Claude config
Rework timing and wording for slides 8-10 (output ports, domain
transfer, closing) and regenerate derived exports. Add CLAUDE.md
mirroring the directory's AGENTS.md so Claude follows the same rules
as Codex.
</commit_message>
<xml_diff>
--- a/doc/presentations/defensa-placa-permanent-dsi-ports-sortida-hexagonal/output/REMARKABLE_materials-orals-canonics-20-minuts.docx
+++ b/doc/presentations/defensa-placa-permanent-dsi-ports-sortida-hexagonal/output/REMARKABLE_materials-orals-canonics-20-minuts.docx
@@ -2,7 +2,7 @@
 <file path=word/document.xml><?xml version="1.0" encoding="utf-8"?>
 <w:document xmlns:w="http://schemas.openxmlformats.org/wordprocessingml/2006/main" xmlns:m="http://schemas.openxmlformats.org/officeDocument/2006/math" xmlns:r="http://schemas.openxmlformats.org/officeDocument/2006/relationships" xmlns:o="urn:schemas-microsoft-com:office:office" xmlns:v="urn:schemas-microsoft-com:vml" xmlns:w10="urn:schemas-microsoft-com:office:word" xmlns:a="http://schemas.openxmlformats.org/drawingml/2006/main" xmlns:pic="http://schemas.openxmlformats.org/drawingml/2006/picture" xmlns:wp="http://schemas.openxmlformats.org/drawingml/2006/wordprocessingDrawing">
   <w:body>
-    <w:bookmarkStart w:id="43" w:name="X79cee1dd7752e91aad864bc270c2d5ac95f00d7"/>
+    <w:bookmarkStart w:id="42" w:name="X79cee1dd7752e91aad864bc270c2d5ac95f00d7"/>
     <w:p>
       <w:pPr>
         <w:pStyle w:val="Ttulo1"/>
@@ -152,7 +152,19 @@
         <w:pStyle w:val="Textoindependiente"/>
       </w:pPr>
       <w:r>
-        <w:t xml:space="preserve">Nota de versió: la demo queda fora del cos principal de la classe. El tancament formal és la diapositiva d’agraïment. La demo es conserva com a annex opcional, només per activar-la si el tribunal la demana o si hi ha temps explícitament disponible després del tancament.</w:t>
+        <w:t xml:space="preserve">Nota de versió: la demo queda fora del cos principal de la classe. El tancament formal és la diapositiva</w:t>
+      </w:r>
+      <w:r>
+        <w:t xml:space="preserve"> </w:t>
+      </w:r>
+      <w:r>
+        <w:rPr>
+          <w:rStyle w:val="VerbatimChar"/>
+        </w:rPr>
+        <w:t xml:space="preserve">Idea clau i tancament</w:t>
+      </w:r>
+      <w:r>
+        <w:t xml:space="preserve">. La demo es conserva com a annex opcional, només per activar-la si el tribunal la demana o si hi ha temps explícitament disponible després del tancament.</w:t>
       </w:r>
     </w:p>
     <w:p>
@@ -162,7 +174,7 @@
         </w:pict>
       </w:r>
     </w:p>
-    <w:bookmarkStart w:id="20" w:name="guió-oral-complet-imprimible"/>
+    <w:bookmarkStart w:id="19" w:name="guió-oral-complet-imprimible"/>
     <w:p>
       <w:pPr>
         <w:pStyle w:val="Ttulo2"/>
@@ -176,7 +188,7 @@
         <w:pStyle w:val="FirstParagraph"/>
       </w:pPr>
       <w:r>
-        <w:t xml:space="preserve">Temps total previst d’assaig del cos principal: 18:15-19:00 aproximadament, sense demo en viu.</w:t>
+        <w:t xml:space="preserve">Temps total previst d’assaig del cos principal: aproximadament 16:00-17:15, sense demo en viu. La lectura neta del text queda al voltant de 12:00-13:00 segons el ritme; la validació definitiva s’ha de fer amb assaig oral real.</w:t>
       </w:r>
     </w:p>
     <w:p>
@@ -657,7 +669,7 @@
         <w:pStyle w:val="Textoindependiente"/>
       </w:pPr>
       <w:r>
-        <w:t xml:space="preserve">En el diagrama, el nucli de l’aplicació conté el servei d’aplicació i el model de domini. Al voltant hi ha ports: un port d’entrada per invocar el cas d’ús i ports de sortida per obtenir o persistir informació. Fora del nucli hi ha els adaptadors: el controlador REST, l’adaptador JDBC, l’adaptador d’interoperabilitat amb PICA o qualsevol altre mecanisme concret.</w:t>
+        <w:t xml:space="preserve">En el diagrama, el nucli de l’aplicació conté el servei d’aplicació i el model de domini. Al voltant hi ha ports de sortida que representen necessitats de l’aplicació. Fora del nucli hi ha adaptadors que resolen persistència, interoperabilitat amb PICA o altres mecanismes concrets.</w:t>
       </w:r>
     </w:p>
     <w:p>
@@ -711,262 +723,15 @@
         <w:pStyle w:val="FirstParagraph"/>
       </w:pPr>
       <w:r>
-        <w:t xml:space="preserve">Ara fem un canvi de domini. Ja no parlem d’una sol·licitud de beca, sinó d’una aplicació de gestió d’una cartera d’inversió personal. [assenyalar el títol]</w:t>
-      </w:r>
-    </w:p>
-    <w:p>
-      <w:pPr>
-        <w:pStyle w:val="Textoindependiente"/>
-      </w:pPr>
-      <w:r>
-        <w:t xml:space="preserve">Imaginem un cas d’ús molt concret: vendre accions d’una cartera. Per executar aquesta operació correctament, l’aplicació pot necessitar consultar el preu actual de l’acció que l’usuari vol vendre.</w:t>
-      </w:r>
-    </w:p>
-    <w:p>
-      <w:pPr>
-        <w:pStyle w:val="Textoindependiente"/>
-      </w:pPr>
-      <w:r>
-        <w:t xml:space="preserve">Ara bé, el cas d’ús no hauria de dependre directament d’un proveïdor concret de dades financeres, ni d’una API específica, ni del contracte tècnic o el format de la resposta. El cas d’ús només hauria d’expressar la seva necessitat:</w:t>
-      </w:r>
-      <w:r>
-        <w:t xml:space="preserve"> </w:t>
-      </w:r>
-      <w:r>
-        <w:rPr>
-          <w:rStyle w:val="VerbatimChar"/>
-        </w:rPr>
-        <w:t xml:space="preserve">necessito obtenir el preu actual d'una acció concreta</w:t>
-      </w:r>
-      <w:r>
-        <w:t xml:space="preserve">.</w:t>
-      </w:r>
-    </w:p>
-    <w:p>
-      <w:pPr>
-        <w:pStyle w:val="Textoindependiente"/>
-      </w:pPr>
-      <w:r>
-        <w:t xml:space="preserve">Aquesta necessitat es pot representar amb un port de sortida. Aquest port no diu quin proveïdor s’ha de consultar, ni quin endpoint s’ha d’utilitzar, ni si la resposta vindrà en JSON, XML o qualsevol altre format. Només defineix una capacitat que l’aplicació necessita.</w:t>
-      </w:r>
-    </w:p>
-    <w:p>
-      <w:pPr>
-        <w:pStyle w:val="Textoindependiente"/>
-      </w:pPr>
-      <w:r>
-        <w:t xml:space="preserve">L’adaptador serà la peça que implementarà aquest port i coneixerà el detall tècnic concret: quin servei extern es consulta, com es fa la petició, quin format retorna la resposta i com es transforma aquesta informació perquè el cas d’ús la pugui utilitzar.</w:t>
-      </w:r>
-    </w:p>
-    <w:p>
-      <w:pPr>
-        <w:pStyle w:val="Textoindependiente"/>
-      </w:pPr>
-      <w:r>
-        <w:t xml:space="preserve">El patró és el mateix que en el cas administratiu. Allà, el procediment necessita informació patrimonial, no una tecnologia concreta. Aquí, el cas d’ús necessita un preu actual, no un proveïdor de dades ni una API concreta. [mirada al tribunal]</w:t>
-      </w:r>
-    </w:p>
-    <w:p>
-      <w:pPr>
-        <w:pStyle w:val="Textoindependiente"/>
-      </w:pPr>
-      <w:r>
-        <w:t xml:space="preserve">Per tant, el missatge docent és transferible: primer identifiquem la necessitat funcional; després definim el port; finalment implementem adaptadors.</w:t>
-      </w:r>
-    </w:p>
-    <w:bookmarkEnd w:id="17"/>
-    <w:bookmarkStart w:id="18" w:name="Xfe34694493a278887e7fb2931a3633f2064d60d"/>
-    <w:p>
-      <w:pPr>
-        <w:pStyle w:val="Ttulo3"/>
-      </w:pPr>
-      <w:r>
-        <w:t xml:space="preserve">Diapositiva 10. Flux i codi essencial - 1:25</w:t>
-      </w:r>
-    </w:p>
-    <w:p>
-      <w:pPr>
-        <w:pStyle w:val="FirstParagraph"/>
-      </w:pPr>
-      <w:r>
-        <w:t xml:space="preserve">A partir d’aquí ja podem baixar al projecte concret HexaStock. Aquesta diapositiva mostra el flux temporal del cas d’ús de venda. [assenyalar el diagrama de seqüència]</w:t>
-      </w:r>
-    </w:p>
-    <w:p>
-      <w:pPr>
-        <w:pStyle w:val="Textoindependiente"/>
-      </w:pPr>
-      <w:r>
-        <w:t xml:space="preserve">El client o controlador invoca el port d’entrada,</w:t>
-      </w:r>
-      <w:r>
-        <w:t xml:space="preserve"> </w:t>
-      </w:r>
-      <w:r>
-        <w:rPr>
-          <w:rStyle w:val="VerbatimChar"/>
-        </w:rPr>
-        <w:t xml:space="preserve">PortfolioStockOperationsUseCase</w:t>
-      </w:r>
-      <w:r>
-        <w:t xml:space="preserve">. La implementació és el servei d’aplicació,</w:t>
-      </w:r>
-      <w:r>
-        <w:t xml:space="preserve"> </w:t>
-      </w:r>
-      <w:r>
-        <w:rPr>
-          <w:rStyle w:val="VerbatimChar"/>
-        </w:rPr>
-        <w:t xml:space="preserve">PortfolioStockOperationsService</w:t>
-      </w:r>
-      <w:r>
-        <w:t xml:space="preserve">. Aquest servei recupera la cartera mitjançant un port de persistència, consulta el preu mitjançant el port de preus, i després crida el domini amb l’acció, la quantitat i el preu. [pausa breu]</w:t>
-      </w:r>
-    </w:p>
-    <w:p>
-      <w:pPr>
-        <w:pStyle w:val="Textoindependiente"/>
-      </w:pPr>
-      <w:r>
-        <w:t xml:space="preserve">La separació de responsabilitats és molt important. En aquesta implementació, el servei coordina, el port expressa una necessitat, l’adaptador integra amb la infraestructura i la decisió de domini es manté dins l’agregat</w:t>
-      </w:r>
-      <w:r>
-        <w:t xml:space="preserve"> </w:t>
-      </w:r>
-      <w:r>
-        <w:rPr>
-          <w:rStyle w:val="VerbatimChar"/>
-        </w:rPr>
-        <w:t xml:space="preserve">Portfolio</w:t>
-      </w:r>
-      <w:r>
-        <w:t xml:space="preserve">.</w:t>
-      </w:r>
-    </w:p>
-    <w:p>
-      <w:pPr>
-        <w:pStyle w:val="Textoindependiente"/>
-      </w:pPr>
-      <w:r>
-        <w:t xml:space="preserve">Dit de manera sintètica: l’adaptador pot saber com obtenir un preu; no hauria de decidir com es ven una acció dins la cartera. [pausa]</w:t>
-      </w:r>
-    </w:p>
-    <w:p>
-      <w:pPr>
-        <w:pStyle w:val="Textoindependiente"/>
-      </w:pPr>
-      <w:r>
-        <w:t xml:space="preserve">Aquesta idea ens porta al tancament: l’arquitectura no elimina la dependència respecte del món exterior, però sí que ens ajuda a ubicar-la en una frontera explícita.</w:t>
-      </w:r>
-    </w:p>
-    <w:bookmarkEnd w:id="18"/>
-    <w:bookmarkStart w:id="19" w:name="diapositiva-11.-agraïment---050"/>
-    <w:p>
-      <w:pPr>
-        <w:pStyle w:val="Ttulo3"/>
-      </w:pPr>
-      <w:r>
-        <w:t xml:space="preserve">Diapositiva 11. Agraïment - 0:50</w:t>
-      </w:r>
-    </w:p>
-    <w:p>
-      <w:pPr>
-        <w:pStyle w:val="FirstParagraph"/>
-      </w:pPr>
-      <w:r>
-        <w:t xml:space="preserve">Per tancar, voldria recuperar aquesta idea final. [pausa breu]</w:t>
-      </w:r>
-    </w:p>
-    <w:p>
-      <w:pPr>
-        <w:pStyle w:val="Textoindependiente"/>
-      </w:pPr>
-      <w:r>
-        <w:t xml:space="preserve">L’arquitectura no elimina la dependència del món exterior. Les aplicacions reals necessiten bases de dades, API, plataformes corporatives, proveïdors externs i mecanismes d’integració. El que fa l’arquitectura hexagonal és situar aquesta dependència en una frontera explícita i controlable.</w:t>
-      </w:r>
-    </w:p>
-    <w:p>
-      <w:pPr>
-        <w:pStyle w:val="Textoindependiente"/>
-      </w:pPr>
-      <w:r>
-        <w:t xml:space="preserve">Quan canvia un proveïdor, una API o una tecnologia, volem localitzar l’impacte a l’adaptador. No volem reescriure el cas d’ús ni deformar el model de domini. [pausa]</w:t>
-      </w:r>
-    </w:p>
-    <w:p>
-      <w:pPr>
-        <w:pStyle w:val="Textoindependiente"/>
-      </w:pPr>
-      <w:r>
-        <w:t xml:space="preserve">Vull expressar el meu agraïment al TecnoCampus per aquest entorn docent i acadèmic, i al Dr. Josep Roure pel treball compartit en arquitectura de software i metodologies actives. [mirada al tribunal]</w:t>
-      </w:r>
-    </w:p>
-    <w:p>
-      <w:pPr>
-        <w:pStyle w:val="Textoindependiente"/>
-      </w:pPr>
-      <w:r>
-        <w:t xml:space="preserve">Moltes gràcies.</w:t>
-      </w:r>
-    </w:p>
-    <w:p>
-      <w:r>
-        <w:pict>
-          <v:rect style="width:0;height:1.5pt" o:hralign="center" o:hrstd="t" o:hr="t"/>
-        </w:pict>
-      </w:r>
-    </w:p>
-    <w:bookmarkEnd w:id="19"/>
-    <w:bookmarkEnd w:id="20"/>
-    <w:bookmarkStart w:id="22" w:name="annex-a.-demo-opcional"/>
-    <w:p>
-      <w:pPr>
-        <w:pStyle w:val="Ttulo2"/>
-      </w:pPr>
-      <w:r>
-        <w:t xml:space="preserve">Annex A. Demo opcional</w:t>
-      </w:r>
-    </w:p>
-    <w:p>
-      <w:pPr>
-        <w:pStyle w:val="FirstParagraph"/>
-      </w:pPr>
-      <w:r>
-        <w:t xml:space="preserve">Aquest annex no forma part del cos principal de la classe magistral de 20 minuts. Només s’ha d’utilitzar si el tribunal ho demana o si, després del tancament formal, es considera oportú mostrar breument la demostració.</w:t>
-      </w:r>
-    </w:p>
-    <w:bookmarkStart w:id="21" w:name="annex-a.-demo-opcional---130-a-230"/>
-    <w:p>
-      <w:pPr>
-        <w:pStyle w:val="Ttulo3"/>
-      </w:pPr>
-      <w:r>
-        <w:t xml:space="preserve">Annex A. Demo opcional - 1:30 a 2:30</w:t>
-      </w:r>
-    </w:p>
-    <w:p>
-      <w:pPr>
-        <w:pStyle w:val="FirstParagraph"/>
-      </w:pPr>
-      <w:r>
-        <w:t xml:space="preserve">Si es vol veure la translació pràctica d’aquesta idea, tinc preparada una demo molt breu amb HexaStock.</w:t>
-      </w:r>
-    </w:p>
-    <w:p>
-      <w:pPr>
-        <w:pStyle w:val="Textoindependiente"/>
-      </w:pPr>
-      <w:r>
-        <w:t xml:space="preserve">La demo no pretén impressionar per complexitat tècnica. Té una funció docent molt concreta: mostrar que podem mantenir el mateix cas d’ús, el mateix servei d’aplicació i el mateix domini, canviant només l’adaptador. [assenyalar les tres caixes]</w:t>
-      </w:r>
-    </w:p>
-    <w:p>
-      <w:pPr>
-        <w:pStyle w:val="Textoindependiente"/>
-      </w:pPr>
-      <w:r>
-        <w:t xml:space="preserve">En HexaStock, això es pot veure amb perfils diferents: un adaptador Finnhub, un adaptador Alpha Vantage o un adaptador mock. El port que veu el servei és el mateix:</w:t>
+        <w:t xml:space="preserve">Ara transferim la mateixa decisió arquitectònica a un domini diferent: una aplicació de gestió d’una cartera d’inversió.</w:t>
+      </w:r>
+    </w:p>
+    <w:p>
+      <w:pPr>
+        <w:pStyle w:val="Textoindependiente"/>
+      </w:pPr>
+      <w:r>
+        <w:t xml:space="preserve">El cas d’ús de venda d’accions necessita conèixer el preu actual, però no necessita saber quin proveïdor de dades utilitzem, quina API concreta consultem ni quin format retorna. Aquesta necessitat s’expressa mitjançant</w:t>
       </w:r>
       <w:r>
         <w:t xml:space="preserve"> </w:t>
@@ -978,39 +743,97 @@
         <w:t xml:space="preserve">StockPriceProviderPort</w:t>
       </w:r>
       <w:r>
-        <w:t xml:space="preserve">. La implementació concreta canvia segons la configuració.</w:t>
-      </w:r>
-    </w:p>
-    <w:p>
-      <w:pPr>
-        <w:pStyle w:val="Textoindependiente"/>
-      </w:pPr>
-      <w:r>
-        <w:t xml:space="preserve">Aquests noms són implementacions concretes. El que vull que observeu és que el contracte que veu el cas d’ús no canvia.</w:t>
-      </w:r>
-    </w:p>
-    <w:p>
-      <w:pPr>
-        <w:pStyle w:val="Textoindependiente"/>
-      </w:pPr>
-      <w:r>
-        <w:t xml:space="preserve">Aquest punt és especialment rellevant en docència. Permet fer proves amb un adaptador mock, sense claus reals, sense disponibilitat d’un proveïdor extern i sense contaminar el domini amb detalls tècnics. [mirada al tribunal]</w:t>
-      </w:r>
-    </w:p>
-    <w:p>
-      <w:pPr>
-        <w:pStyle w:val="Textoindependiente"/>
-      </w:pPr>
-      <w:r>
-        <w:t xml:space="preserve">El missatge de la demo és el mateix que hem treballat des del principi: canvia la infraestructura; el cas d’ús i el domini romanen estables.</w:t>
-      </w:r>
-    </w:p>
-    <w:p>
-      <w:pPr>
-        <w:pStyle w:val="Textoindependiente"/>
-      </w:pPr>
-      <w:r>
-        <w:t xml:space="preserve">Això no vol dir que l’arquitectura elimini el canvi. El canvi continua existint. El que fa una bona arquitectura és localitzar-lo.</w:t>
+        <w:t xml:space="preserve">.</w:t>
+      </w:r>
+    </w:p>
+    <w:p>
+      <w:pPr>
+        <w:pStyle w:val="Textoindependiente"/>
+      </w:pPr>
+      <w:r>
+        <w:t xml:space="preserve">Els adaptadors de Finnhub, Alpha Vantage o un adaptador mock implementen aquest mateix contracte i encapsulen els detalls de cada integració.</w:t>
+      </w:r>
+    </w:p>
+    <w:p>
+      <w:pPr>
+        <w:pStyle w:val="Textoindependiente"/>
+      </w:pPr>
+      <w:r>
+        <w:t xml:space="preserve">En aquesta implementació, el servei d’aplicació coordina la consulta del preu i la recuperació de la cartera, mentre que la decisió de venda es manté dins del domini. El servei coordina, el domini decideix i l’adaptador integra.</w:t>
+      </w:r>
+    </w:p>
+    <w:p>
+      <w:pPr>
+        <w:pStyle w:val="Textoindependiente"/>
+      </w:pPr>
+      <w:r>
+        <w:t xml:space="preserve">Canvia el domini, però es manté la decisió arquitectònica: primer identifiquem la necessitat funcional, després definim el port i finalment resolem la integració. [pausa breu]</w:t>
+      </w:r>
+    </w:p>
+    <w:p>
+      <w:pPr>
+        <w:pStyle w:val="Textoindependiente"/>
+      </w:pPr>
+      <w:r>
+        <w:t xml:space="preserve">La substitució és viable mentre es mantinguin el contracte funcional i la semàntica que necessita l’aplicació.</w:t>
+      </w:r>
+    </w:p>
+    <w:p>
+      <w:pPr>
+        <w:pStyle w:val="Textoindependiente"/>
+      </w:pPr>
+      <w:r>
+        <w:t xml:space="preserve">Amb això podem tancar la classe recuperant les tres decisions essencials.</w:t>
+      </w:r>
+    </w:p>
+    <w:bookmarkEnd w:id="17"/>
+    <w:bookmarkStart w:id="18" w:name="Xd7a871bbbb87ae38038ffeeabaa31c977e7d330"/>
+    <w:p>
+      <w:pPr>
+        <w:pStyle w:val="Ttulo3"/>
+      </w:pPr>
+      <w:r>
+        <w:t xml:space="preserve">Diapositiva 10. Idea clau i tancament - 0:55</w:t>
+      </w:r>
+    </w:p>
+    <w:p>
+      <w:pPr>
+        <w:pStyle w:val="FirstParagraph"/>
+      </w:pPr>
+      <w:r>
+        <w:t xml:space="preserve">Per tancar, voldria recuperar les tres decisions que hem treballat.</w:t>
+      </w:r>
+    </w:p>
+    <w:p>
+      <w:pPr>
+        <w:pStyle w:val="Textoindependiente"/>
+      </w:pPr>
+      <w:r>
+        <w:t xml:space="preserve">Primer, el cas d’ús expressa una necessitat funcional, no una tecnologia concreta. Segon, el port defineix el contracte que necessita l’aplicació. I tercer, l’adaptador encapsula la integració amb el sistema extern.</w:t>
+      </w:r>
+    </w:p>
+    <w:p>
+      <w:pPr>
+        <w:pStyle w:val="Textoindependiente"/>
+      </w:pPr>
+      <w:r>
+        <w:t xml:space="preserve">L’arquitectura hexagonal no elimina la dependència del món exterior ni evita tots els canvis. El que ens permet és situar aquesta dependència en una frontera explícita i localitzar millor l’impacte de l’evolució tecnològica.</w:t>
+      </w:r>
+    </w:p>
+    <w:p>
+      <w:pPr>
+        <w:pStyle w:val="Textoindependiente"/>
+      </w:pPr>
+      <w:r>
+        <w:t xml:space="preserve">Vull expressar el meu agraïment al TecnoCampus per aquest entorn docent i acadèmic, i al Dr. Josep Roure pel treball compartit en arquitectura de software i metodologies actives.</w:t>
+      </w:r>
+    </w:p>
+    <w:p>
+      <w:pPr>
+        <w:pStyle w:val="Textoindependiente"/>
+      </w:pPr>
+      <w:r>
+        <w:t xml:space="preserve">Moltes gràcies.</w:t>
       </w:r>
     </w:p>
     <w:p>
@@ -1020,738 +843,865 @@
         </w:pict>
       </w:r>
     </w:p>
+    <w:bookmarkEnd w:id="18"/>
+    <w:bookmarkEnd w:id="19"/>
+    <w:bookmarkStart w:id="21" w:name="annex-a.-demo-opcional"/>
+    <w:p>
+      <w:pPr>
+        <w:pStyle w:val="Ttulo2"/>
+      </w:pPr>
+      <w:r>
+        <w:t xml:space="preserve">Annex A. Demo opcional</w:t>
+      </w:r>
+    </w:p>
+    <w:p>
+      <w:pPr>
+        <w:pStyle w:val="FirstParagraph"/>
+      </w:pPr>
+      <w:r>
+        <w:t xml:space="preserve">Aquest annex no forma part del cos principal de la classe magistral de 20 minuts. Només s’ha d’utilitzar si el tribunal ho demana o si, després del tancament formal, es considera oportú mostrar breument la demostració.</w:t>
+      </w:r>
+    </w:p>
+    <w:bookmarkStart w:id="20" w:name="annex-a.-demo-opcional---130-a-230"/>
+    <w:p>
+      <w:pPr>
+        <w:pStyle w:val="Ttulo3"/>
+      </w:pPr>
+      <w:r>
+        <w:t xml:space="preserve">Annex A. Demo opcional - 1:30 a 2:30</w:t>
+      </w:r>
+    </w:p>
+    <w:p>
+      <w:pPr>
+        <w:pStyle w:val="FirstParagraph"/>
+      </w:pPr>
+      <w:r>
+        <w:t xml:space="preserve">Si es vol veure la translació pràctica d’aquesta idea, tinc preparada una demo molt breu amb HexaStock.</w:t>
+      </w:r>
+    </w:p>
+    <w:p>
+      <w:pPr>
+        <w:pStyle w:val="Textoindependiente"/>
+      </w:pPr>
+      <w:r>
+        <w:t xml:space="preserve">La demo no pretén impressionar per complexitat tècnica. Té una funció docent molt concreta: mostrar que podem mantenir el mateix cas d’ús, el mateix servei d’aplicació i el mateix domini, canviant només l’adaptador. [assenyalar les tres caixes]</w:t>
+      </w:r>
+    </w:p>
+    <w:p>
+      <w:pPr>
+        <w:pStyle w:val="Textoindependiente"/>
+      </w:pPr>
+      <w:r>
+        <w:t xml:space="preserve">En HexaStock, això es pot veure amb perfils diferents: un adaptador Finnhub, un adaptador Alpha Vantage o un adaptador mock. El port que veu el servei és el mateix:</w:t>
+      </w:r>
+      <w:r>
+        <w:t xml:space="preserve"> </w:t>
+      </w:r>
+      <w:r>
+        <w:rPr>
+          <w:rStyle w:val="VerbatimChar"/>
+        </w:rPr>
+        <w:t xml:space="preserve">StockPriceProviderPort</w:t>
+      </w:r>
+      <w:r>
+        <w:t xml:space="preserve">. La implementació concreta canvia segons la configuració.</w:t>
+      </w:r>
+    </w:p>
+    <w:p>
+      <w:pPr>
+        <w:pStyle w:val="Textoindependiente"/>
+      </w:pPr>
+      <w:r>
+        <w:t xml:space="preserve">Aquests noms són implementacions concretes. El que vull que observeu és que el contracte que veu el cas d’ús no canvia.</w:t>
+      </w:r>
+    </w:p>
+    <w:p>
+      <w:pPr>
+        <w:pStyle w:val="Textoindependiente"/>
+      </w:pPr>
+      <w:r>
+        <w:t xml:space="preserve">Aquest punt és especialment rellevant en docència. Permet fer proves amb un adaptador mock, sense claus reals, sense disponibilitat d’un proveïdor extern i sense contaminar el domini amb detalls tècnics. [mirada al tribunal]</w:t>
+      </w:r>
+    </w:p>
+    <w:p>
+      <w:pPr>
+        <w:pStyle w:val="Textoindependiente"/>
+      </w:pPr>
+      <w:r>
+        <w:t xml:space="preserve">El missatge de la demo és el mateix que hem treballat des del principi: canvia la infraestructura; el cas d’ús i el domini romanen estables.</w:t>
+      </w:r>
+    </w:p>
+    <w:p>
+      <w:pPr>
+        <w:pStyle w:val="Textoindependiente"/>
+      </w:pPr>
+      <w:r>
+        <w:t xml:space="preserve">Això no vol dir que l’arquitectura elimini el canvi. El canvi continua existint. El que fa una bona arquitectura és localitzar-lo.</w:t>
+      </w:r>
+    </w:p>
+    <w:p>
+      <w:r>
+        <w:pict>
+          <v:rect style="width:0;height:1.5pt" o:hralign="center" o:hrstd="t" o:hr="t"/>
+        </w:pict>
+      </w:r>
+    </w:p>
+    <w:bookmarkEnd w:id="20"/>
     <w:bookmarkEnd w:id="21"/>
+    <w:bookmarkStart w:id="33" w:name="notes-del-presentador-per-diapositiva"/>
+    <w:p>
+      <w:pPr>
+        <w:pStyle w:val="Ttulo2"/>
+      </w:pPr>
+      <w:r>
+        <w:t xml:space="preserve">2. Notes del presentador per diapositiva</w:t>
+      </w:r>
+    </w:p>
+    <w:bookmarkStart w:id="22" w:name="portada---135"/>
+    <w:p>
+      <w:pPr>
+        <w:pStyle w:val="Ttulo3"/>
+      </w:pPr>
+      <w:r>
+        <w:t xml:space="preserve">1. Portada - 1:35</w:t>
+      </w:r>
+    </w:p>
+    <w:p>
+      <w:pPr>
+        <w:pStyle w:val="Compact"/>
+        <w:numPr>
+          <w:ilvl w:val="0"/>
+          <w:numId w:val="1002"/>
+        </w:numPr>
+      </w:pPr>
+      <w:r>
+        <w:t xml:space="preserve">Classe de DSI, no explicació completa d’arquitectura hexagonal.</w:t>
+      </w:r>
+    </w:p>
+    <w:p>
+      <w:pPr>
+        <w:pStyle w:val="Compact"/>
+        <w:numPr>
+          <w:ilvl w:val="0"/>
+          <w:numId w:val="1002"/>
+        </w:numPr>
+      </w:pPr>
+      <w:r>
+        <w:t xml:space="preserve">Informe incorporat a la documentació de la convocatòria: consultoria especialitzada per a la Generalitat/AGAUR.</w:t>
+      </w:r>
+    </w:p>
+    <w:p>
+      <w:pPr>
+        <w:pStyle w:val="Compact"/>
+        <w:numPr>
+          <w:ilvl w:val="0"/>
+          <w:numId w:val="1002"/>
+        </w:numPr>
+      </w:pPr>
+      <w:r>
+        <w:t xml:space="preserve">Trobada entre dimensió acadèmica i dimensió professional.</w:t>
+      </w:r>
+    </w:p>
+    <w:p>
+      <w:pPr>
+        <w:pStyle w:val="Compact"/>
+        <w:numPr>
+          <w:ilvl w:val="0"/>
+          <w:numId w:val="1002"/>
+        </w:numPr>
+      </w:pPr>
+      <w:r>
+        <w:t xml:space="preserve">Cas real com a base docent, sense entrar en detalls interns.</w:t>
+      </w:r>
+    </w:p>
+    <w:p>
+      <w:pPr>
+        <w:pStyle w:val="Compact"/>
+        <w:numPr>
+          <w:ilvl w:val="0"/>
+          <w:numId w:val="1002"/>
+        </w:numPr>
+      </w:pPr>
+      <w:r>
+        <w:t xml:space="preserve">Transició: ens centrarem en una decisió concreta, el port de sortida.</w:t>
+      </w:r>
+    </w:p>
     <w:bookmarkEnd w:id="22"/>
-    <w:bookmarkStart w:id="35" w:name="notes-del-presentador-per-diapositiva"/>
-    <w:p>
-      <w:pPr>
-        <w:pStyle w:val="Ttulo2"/>
-      </w:pPr>
-      <w:r>
-        <w:t xml:space="preserve">2. Notes del presentador per diapositiva</w:t>
-      </w:r>
-    </w:p>
-    <w:bookmarkStart w:id="23" w:name="portada---135"/>
+    <w:bookmarkStart w:id="23" w:name="on-som-dins-lassignatura---105"/>
     <w:p>
       <w:pPr>
         <w:pStyle w:val="Ttulo3"/>
       </w:pPr>
       <w:r>
-        <w:t xml:space="preserve">1. Portada - 1:35</w:t>
-      </w:r>
-    </w:p>
-    <w:p>
-      <w:pPr>
-        <w:pStyle w:val="Compact"/>
-        <w:numPr>
-          <w:ilvl w:val="0"/>
-          <w:numId w:val="1002"/>
-        </w:numPr>
-      </w:pPr>
-      <w:r>
-        <w:t xml:space="preserve">Classe de DSI, no explicació completa d’arquitectura hexagonal.</w:t>
-      </w:r>
-    </w:p>
-    <w:p>
-      <w:pPr>
-        <w:pStyle w:val="Compact"/>
-        <w:numPr>
-          <w:ilvl w:val="0"/>
-          <w:numId w:val="1002"/>
-        </w:numPr>
-      </w:pPr>
-      <w:r>
-        <w:t xml:space="preserve">Informe incorporat a la documentació de la convocatòria: consultoria especialitzada per a la Generalitat/AGAUR.</w:t>
-      </w:r>
-    </w:p>
-    <w:p>
-      <w:pPr>
-        <w:pStyle w:val="Compact"/>
-        <w:numPr>
-          <w:ilvl w:val="0"/>
-          <w:numId w:val="1002"/>
-        </w:numPr>
-      </w:pPr>
-      <w:r>
-        <w:t xml:space="preserve">Trobada entre dimensió acadèmica i dimensió professional.</w:t>
-      </w:r>
-    </w:p>
-    <w:p>
-      <w:pPr>
-        <w:pStyle w:val="Compact"/>
-        <w:numPr>
-          <w:ilvl w:val="0"/>
-          <w:numId w:val="1002"/>
-        </w:numPr>
-      </w:pPr>
-      <w:r>
-        <w:t xml:space="preserve">Cas real com a base docent, sense entrar en detalls interns.</w:t>
-      </w:r>
-    </w:p>
-    <w:p>
-      <w:pPr>
-        <w:pStyle w:val="Compact"/>
-        <w:numPr>
-          <w:ilvl w:val="0"/>
-          <w:numId w:val="1002"/>
-        </w:numPr>
-      </w:pPr>
-      <w:r>
-        <w:t xml:space="preserve">Transició: ens centrarem en una decisió concreta, el port de sortida.</w:t>
+        <w:t xml:space="preserve">2. On som dins l’assignatura - 1:05</w:t>
+      </w:r>
+    </w:p>
+    <w:p>
+      <w:pPr>
+        <w:pStyle w:val="Compact"/>
+        <w:numPr>
+          <w:ilvl w:val="0"/>
+          <w:numId w:val="1003"/>
+        </w:numPr>
+      </w:pPr>
+      <w:r>
+        <w:t xml:space="preserve">Pla docent: 3r curs, 6 ECTS, assignatura obligatòria.</w:t>
+      </w:r>
+    </w:p>
+    <w:p>
+      <w:pPr>
+        <w:pStyle w:val="Compact"/>
+        <w:numPr>
+          <w:ilvl w:val="0"/>
+          <w:numId w:val="1003"/>
+        </w:numPr>
+      </w:pPr>
+      <w:r>
+        <w:t xml:space="preserve">Bloc: Clean Architecture i arquitectura hexagonal, ports i adaptadors, mapping, modularització i Domain-Driven Design.</w:t>
+      </w:r>
+    </w:p>
+    <w:p>
+      <w:pPr>
+        <w:pStyle w:val="Compact"/>
+        <w:numPr>
+          <w:ilvl w:val="0"/>
+          <w:numId w:val="1003"/>
+        </w:numPr>
+      </w:pPr>
+      <w:r>
+        <w:t xml:space="preserve">Justificar que la sessió encaixa en el temari.</w:t>
+      </w:r>
+    </w:p>
+    <w:p>
+      <w:pPr>
+        <w:pStyle w:val="Compact"/>
+        <w:numPr>
+          <w:ilvl w:val="0"/>
+          <w:numId w:val="1003"/>
+        </w:numPr>
+      </w:pPr>
+      <w:r>
+        <w:t xml:space="preserve">No panoràmica completa; focus en ports de sortida.</w:t>
+      </w:r>
+    </w:p>
+    <w:p>
+      <w:pPr>
+        <w:pStyle w:val="Compact"/>
+        <w:numPr>
+          <w:ilvl w:val="0"/>
+          <w:numId w:val="1003"/>
+        </w:numPr>
+      </w:pPr>
+      <w:r>
+        <w:t xml:space="preserve">Transició: objectiu mínim i entrada ràpida al cas real.</w:t>
       </w:r>
     </w:p>
     <w:bookmarkEnd w:id="23"/>
-    <w:bookmarkStart w:id="24" w:name="on-som-dins-lassignatura---105"/>
+    <w:bookmarkStart w:id="24" w:name="objectiu-de-la-sessió---055"/>
     <w:p>
       <w:pPr>
         <w:pStyle w:val="Ttulo3"/>
       </w:pPr>
       <w:r>
-        <w:t xml:space="preserve">2. On som dins l’assignatura - 1:05</w:t>
-      </w:r>
-    </w:p>
-    <w:p>
-      <w:pPr>
-        <w:pStyle w:val="Compact"/>
-        <w:numPr>
-          <w:ilvl w:val="0"/>
-          <w:numId w:val="1003"/>
-        </w:numPr>
-      </w:pPr>
-      <w:r>
-        <w:t xml:space="preserve">Pla docent: 3r curs, 6 ECTS, assignatura obligatòria.</w:t>
-      </w:r>
-    </w:p>
-    <w:p>
-      <w:pPr>
-        <w:pStyle w:val="Compact"/>
-        <w:numPr>
-          <w:ilvl w:val="0"/>
-          <w:numId w:val="1003"/>
-        </w:numPr>
-      </w:pPr>
-      <w:r>
-        <w:t xml:space="preserve">Bloc: Clean Architecture i arquitectura hexagonal, ports i adaptadors, mapping, modularització i Domain-Driven Design.</w:t>
-      </w:r>
-    </w:p>
-    <w:p>
-      <w:pPr>
-        <w:pStyle w:val="Compact"/>
-        <w:numPr>
-          <w:ilvl w:val="0"/>
-          <w:numId w:val="1003"/>
-        </w:numPr>
-      </w:pPr>
-      <w:r>
-        <w:t xml:space="preserve">Justificar que la sessió encaixa en el temari.</w:t>
-      </w:r>
-    </w:p>
-    <w:p>
-      <w:pPr>
-        <w:pStyle w:val="Compact"/>
-        <w:numPr>
-          <w:ilvl w:val="0"/>
-          <w:numId w:val="1003"/>
-        </w:numPr>
-      </w:pPr>
-      <w:r>
-        <w:t xml:space="preserve">No panoràmica completa; focus en ports de sortida.</w:t>
-      </w:r>
-    </w:p>
-    <w:p>
-      <w:pPr>
-        <w:pStyle w:val="Compact"/>
-        <w:numPr>
-          <w:ilvl w:val="0"/>
-          <w:numId w:val="1003"/>
-        </w:numPr>
-      </w:pPr>
-      <w:r>
-        <w:t xml:space="preserve">Transició: objectiu mínim i entrada ràpida al cas real.</w:t>
+        <w:t xml:space="preserve">3. Objectiu de la sessió - 0:55</w:t>
+      </w:r>
+    </w:p>
+    <w:p>
+      <w:pPr>
+        <w:pStyle w:val="Compact"/>
+        <w:numPr>
+          <w:ilvl w:val="0"/>
+          <w:numId w:val="1004"/>
+        </w:numPr>
+      </w:pPr>
+      <w:r>
+        <w:t xml:space="preserve">Passar-hi ràpid: és una diapositiva pont, no una explicació teòrica llarga.</w:t>
+      </w:r>
+    </w:p>
+    <w:p>
+      <w:pPr>
+        <w:pStyle w:val="Compact"/>
+        <w:numPr>
+          <w:ilvl w:val="0"/>
+          <w:numId w:val="1004"/>
+        </w:numPr>
+      </w:pPr>
+      <w:r>
+        <w:t xml:space="preserve">Frase clau: el cas d’ús necessita una capacitat, no una tecnologia.</w:t>
+      </w:r>
+    </w:p>
+    <w:p>
+      <w:pPr>
+        <w:pStyle w:val="Compact"/>
+        <w:numPr>
+          <w:ilvl w:val="0"/>
+          <w:numId w:val="1004"/>
+        </w:numPr>
+      </w:pPr>
+      <w:r>
+        <w:t xml:space="preserve">Tres accions: identificar necessitat, definir port, implementar adaptadors.</w:t>
+      </w:r>
+    </w:p>
+    <w:p>
+      <w:pPr>
+        <w:pStyle w:val="Compact"/>
+        <w:numPr>
+          <w:ilvl w:val="0"/>
+          <w:numId w:val="1004"/>
+        </w:numPr>
+      </w:pPr>
+      <w:r>
+        <w:t xml:space="preserve">Anunciar metodologia: primer cas real, després abstracció arquitectònica.</w:t>
+      </w:r>
+    </w:p>
+    <w:p>
+      <w:pPr>
+        <w:pStyle w:val="Compact"/>
+        <w:numPr>
+          <w:ilvl w:val="0"/>
+          <w:numId w:val="1004"/>
+        </w:numPr>
+      </w:pPr>
+      <w:r>
+        <w:t xml:space="preserve">Transició: començar pel procediment de beca.</w:t>
       </w:r>
     </w:p>
     <w:bookmarkEnd w:id="24"/>
-    <w:bookmarkStart w:id="25" w:name="objectiu-de-la-sessió---055"/>
+    <w:bookmarkStart w:id="25" w:name="avaluació-econòmica---145"/>
     <w:p>
       <w:pPr>
         <w:pStyle w:val="Ttulo3"/>
       </w:pPr>
       <w:r>
-        <w:t xml:space="preserve">3. Objectiu de la sessió - 0:55</w:t>
-      </w:r>
-    </w:p>
-    <w:p>
-      <w:pPr>
-        <w:pStyle w:val="Compact"/>
-        <w:numPr>
-          <w:ilvl w:val="0"/>
-          <w:numId w:val="1004"/>
-        </w:numPr>
-      </w:pPr>
-      <w:r>
-        <w:t xml:space="preserve">Passar-hi ràpid: és una diapositiva pont, no una explicació teòrica llarga.</w:t>
-      </w:r>
-    </w:p>
-    <w:p>
-      <w:pPr>
-        <w:pStyle w:val="Compact"/>
-        <w:numPr>
-          <w:ilvl w:val="0"/>
-          <w:numId w:val="1004"/>
-        </w:numPr>
-      </w:pPr>
-      <w:r>
-        <w:t xml:space="preserve">Frase clau: el cas d’ús necessita una capacitat, no una tecnologia.</w:t>
-      </w:r>
-    </w:p>
-    <w:p>
-      <w:pPr>
-        <w:pStyle w:val="Compact"/>
-        <w:numPr>
-          <w:ilvl w:val="0"/>
-          <w:numId w:val="1004"/>
-        </w:numPr>
-      </w:pPr>
-      <w:r>
-        <w:t xml:space="preserve">Tres accions: identificar necessitat, definir port, implementar adaptadors.</w:t>
-      </w:r>
-    </w:p>
-    <w:p>
-      <w:pPr>
-        <w:pStyle w:val="Compact"/>
-        <w:numPr>
-          <w:ilvl w:val="0"/>
-          <w:numId w:val="1004"/>
-        </w:numPr>
-      </w:pPr>
-      <w:r>
-        <w:t xml:space="preserve">Anunciar metodologia: primer cas real, després abstracció arquitectònica.</w:t>
-      </w:r>
-    </w:p>
-    <w:p>
-      <w:pPr>
-        <w:pStyle w:val="Compact"/>
-        <w:numPr>
-          <w:ilvl w:val="0"/>
-          <w:numId w:val="1004"/>
-        </w:numPr>
-      </w:pPr>
-      <w:r>
-        <w:t xml:space="preserve">Transició: començar pel procediment de beca.</w:t>
+        <w:t xml:space="preserve">4. Avaluació econòmica - 1:45</w:t>
+      </w:r>
+    </w:p>
+    <w:p>
+      <w:pPr>
+        <w:pStyle w:val="Compact"/>
+        <w:numPr>
+          <w:ilvl w:val="0"/>
+          <w:numId w:val="1005"/>
+        </w:numPr>
+      </w:pPr>
+      <w:r>
+        <w:t xml:space="preserve">Primer entendre procediment, després tecnologia.</w:t>
+      </w:r>
+    </w:p>
+    <w:p>
+      <w:pPr>
+        <w:pStyle w:val="Compact"/>
+        <w:numPr>
+          <w:ilvl w:val="0"/>
+          <w:numId w:val="1005"/>
+        </w:numPr>
+      </w:pPr>
+      <w:r>
+        <w:t xml:space="preserve">Sol·licitud, expedient, requisits generals, econòmics, revisió, resolució.</w:t>
+      </w:r>
+    </w:p>
+    <w:p>
+      <w:pPr>
+        <w:pStyle w:val="Compact"/>
+        <w:numPr>
+          <w:ilvl w:val="0"/>
+          <w:numId w:val="1005"/>
+        </w:numPr>
+      </w:pPr>
+      <w:r>
+        <w:t xml:space="preserve">Renda i patrimoni com a decisió funcional.</w:t>
+      </w:r>
+    </w:p>
+    <w:p>
+      <w:pPr>
+        <w:pStyle w:val="Compact"/>
+        <w:numPr>
+          <w:ilvl w:val="0"/>
+          <w:numId w:val="1005"/>
+        </w:numPr>
+      </w:pPr>
+      <w:r>
+        <w:t xml:space="preserve">Evitar començar per SOAP/REST/PICA.</w:t>
+      </w:r>
+    </w:p>
+    <w:p>
+      <w:pPr>
+        <w:pStyle w:val="Compact"/>
+        <w:numPr>
+          <w:ilvl w:val="0"/>
+          <w:numId w:val="1005"/>
+        </w:numPr>
+      </w:pPr>
+      <w:r>
+        <w:t xml:space="preserve">Transició: quines dades externes fan falta?</w:t>
       </w:r>
     </w:p>
     <w:bookmarkEnd w:id="25"/>
-    <w:bookmarkStart w:id="26" w:name="avaluació-econòmica---145"/>
+    <w:bookmarkStart w:id="26" w:name="informació-externa---145"/>
     <w:p>
       <w:pPr>
         <w:pStyle w:val="Ttulo3"/>
       </w:pPr>
       <w:r>
-        <w:t xml:space="preserve">4. Avaluació econòmica - 1:45</w:t>
-      </w:r>
-    </w:p>
-    <w:p>
-      <w:pPr>
-        <w:pStyle w:val="Compact"/>
-        <w:numPr>
-          <w:ilvl w:val="0"/>
-          <w:numId w:val="1005"/>
-        </w:numPr>
-      </w:pPr>
-      <w:r>
-        <w:t xml:space="preserve">Primer entendre procediment, després tecnologia.</w:t>
-      </w:r>
-    </w:p>
-    <w:p>
-      <w:pPr>
-        <w:pStyle w:val="Compact"/>
-        <w:numPr>
-          <w:ilvl w:val="0"/>
-          <w:numId w:val="1005"/>
-        </w:numPr>
-      </w:pPr>
-      <w:r>
-        <w:t xml:space="preserve">Sol·licitud, expedient, requisits generals, econòmics, revisió, resolució.</w:t>
-      </w:r>
-    </w:p>
-    <w:p>
-      <w:pPr>
-        <w:pStyle w:val="Compact"/>
-        <w:numPr>
-          <w:ilvl w:val="0"/>
-          <w:numId w:val="1005"/>
-        </w:numPr>
-      </w:pPr>
-      <w:r>
-        <w:t xml:space="preserve">Renda i patrimoni com a decisió funcional.</w:t>
-      </w:r>
-    </w:p>
-    <w:p>
-      <w:pPr>
-        <w:pStyle w:val="Compact"/>
-        <w:numPr>
-          <w:ilvl w:val="0"/>
-          <w:numId w:val="1005"/>
-        </w:numPr>
-      </w:pPr>
-      <w:r>
-        <w:t xml:space="preserve">Evitar començar per SOAP/REST/PICA.</w:t>
-      </w:r>
-    </w:p>
-    <w:p>
-      <w:pPr>
-        <w:pStyle w:val="Compact"/>
-        <w:numPr>
-          <w:ilvl w:val="0"/>
-          <w:numId w:val="1005"/>
-        </w:numPr>
-      </w:pPr>
-      <w:r>
-        <w:t xml:space="preserve">Transició: quines dades externes fan falta?</w:t>
+        <w:t xml:space="preserve">5. Informació externa - 1:45</w:t>
+      </w:r>
+    </w:p>
+    <w:p>
+      <w:pPr>
+        <w:pStyle w:val="Compact"/>
+        <w:numPr>
+          <w:ilvl w:val="0"/>
+          <w:numId w:val="1006"/>
+        </w:numPr>
+      </w:pPr>
+      <w:r>
+        <w:t xml:space="preserve">Necessitats: renda, patrimoni, béns immobles.</w:t>
+      </w:r>
+    </w:p>
+    <w:p>
+      <w:pPr>
+        <w:pStyle w:val="Compact"/>
+        <w:numPr>
+          <w:ilvl w:val="0"/>
+          <w:numId w:val="1006"/>
+        </w:numPr>
+      </w:pPr>
+      <w:r>
+        <w:t xml:space="preserve">Fonts administratives: AEAT i Cadastre.</w:t>
+      </w:r>
+    </w:p>
+    <w:p>
+      <w:pPr>
+        <w:pStyle w:val="Compact"/>
+        <w:numPr>
+          <w:ilvl w:val="0"/>
+          <w:numId w:val="1006"/>
+        </w:numPr>
+      </w:pPr>
+      <w:r>
+        <w:t xml:space="preserve">Canal o plataforma d’interoperabilitat: PICA.</w:t>
+      </w:r>
+    </w:p>
+    <w:p>
+      <w:pPr>
+        <w:pStyle w:val="Compact"/>
+        <w:numPr>
+          <w:ilvl w:val="0"/>
+          <w:numId w:val="1006"/>
+        </w:numPr>
+      </w:pPr>
+      <w:r>
+        <w:t xml:space="preserve">No presentar PICA com a font original del mateix tipus.</w:t>
+      </w:r>
+    </w:p>
+    <w:p>
+      <w:pPr>
+        <w:pStyle w:val="Compact"/>
+        <w:numPr>
+          <w:ilvl w:val="0"/>
+          <w:numId w:val="1006"/>
+        </w:numPr>
+      </w:pPr>
+      <w:r>
+        <w:t xml:space="preserve">Frase clau: informació administrativa, no API concreta.</w:t>
+      </w:r>
+    </w:p>
+    <w:p>
+      <w:pPr>
+        <w:pStyle w:val="Compact"/>
+        <w:numPr>
+          <w:ilvl w:val="0"/>
+          <w:numId w:val="1006"/>
+        </w:numPr>
+      </w:pPr>
+      <w:r>
+        <w:t xml:space="preserve">Transició: si no separem, apareix dependència directa.</w:t>
       </w:r>
     </w:p>
     <w:bookmarkEnd w:id="26"/>
-    <w:bookmarkStart w:id="27" w:name="informació-externa---145"/>
+    <w:bookmarkStart w:id="27" w:name="dependència-directa---155"/>
     <w:p>
       <w:pPr>
         <w:pStyle w:val="Ttulo3"/>
       </w:pPr>
       <w:r>
-        <w:t xml:space="preserve">5. Informació externa - 1:45</w:t>
-      </w:r>
-    </w:p>
-    <w:p>
-      <w:pPr>
-        <w:pStyle w:val="Compact"/>
-        <w:numPr>
-          <w:ilvl w:val="0"/>
-          <w:numId w:val="1006"/>
-        </w:numPr>
-      </w:pPr>
-      <w:r>
-        <w:t xml:space="preserve">Necessitats: renda, patrimoni, béns immobles.</w:t>
-      </w:r>
-    </w:p>
-    <w:p>
-      <w:pPr>
-        <w:pStyle w:val="Compact"/>
-        <w:numPr>
-          <w:ilvl w:val="0"/>
-          <w:numId w:val="1006"/>
-        </w:numPr>
-      </w:pPr>
-      <w:r>
-        <w:t xml:space="preserve">Fonts administratives: AEAT i Cadastre.</w:t>
-      </w:r>
-    </w:p>
-    <w:p>
-      <w:pPr>
-        <w:pStyle w:val="Compact"/>
-        <w:numPr>
-          <w:ilvl w:val="0"/>
-          <w:numId w:val="1006"/>
-        </w:numPr>
-      </w:pPr>
-      <w:r>
-        <w:t xml:space="preserve">Canal o plataforma d’interoperabilitat: PICA.</w:t>
-      </w:r>
-    </w:p>
-    <w:p>
-      <w:pPr>
-        <w:pStyle w:val="Compact"/>
-        <w:numPr>
-          <w:ilvl w:val="0"/>
-          <w:numId w:val="1006"/>
-        </w:numPr>
-      </w:pPr>
-      <w:r>
-        <w:t xml:space="preserve">No presentar PICA com a font original del mateix tipus.</w:t>
-      </w:r>
-    </w:p>
-    <w:p>
-      <w:pPr>
-        <w:pStyle w:val="Compact"/>
-        <w:numPr>
-          <w:ilvl w:val="0"/>
-          <w:numId w:val="1006"/>
-        </w:numPr>
-      </w:pPr>
-      <w:r>
-        <w:t xml:space="preserve">Frase clau: informació administrativa, no API concreta.</w:t>
-      </w:r>
-    </w:p>
-    <w:p>
-      <w:pPr>
-        <w:pStyle w:val="Compact"/>
-        <w:numPr>
-          <w:ilvl w:val="0"/>
-          <w:numId w:val="1006"/>
-        </w:numPr>
-      </w:pPr>
-      <w:r>
-        <w:t xml:space="preserve">Transició: si no separem, apareix dependència directa.</w:t>
+        <w:t xml:space="preserve">6. Dependència directa - 1:55</w:t>
+      </w:r>
+    </w:p>
+    <w:p>
+      <w:pPr>
+        <w:pStyle w:val="Compact"/>
+        <w:numPr>
+          <w:ilvl w:val="0"/>
+          <w:numId w:val="1007"/>
+        </w:numPr>
+      </w:pPr>
+      <w:r>
+        <w:t xml:space="preserve">El problema no és PICA; és l’acoblament directe.</w:t>
+      </w:r>
+    </w:p>
+    <w:p>
+      <w:pPr>
+        <w:pStyle w:val="Compact"/>
+        <w:numPr>
+          <w:ilvl w:val="0"/>
+          <w:numId w:val="1007"/>
+        </w:numPr>
+      </w:pPr>
+      <w:r>
+        <w:t xml:space="preserve">La cadena SOAP/XML -&gt; PICA -&gt; AEAT i/o Cadastre és el problema, no la solució.</w:t>
+      </w:r>
+    </w:p>
+    <w:p>
+      <w:pPr>
+        <w:pStyle w:val="Compact"/>
+        <w:numPr>
+          <w:ilvl w:val="0"/>
+          <w:numId w:val="1007"/>
+        </w:numPr>
+      </w:pPr>
+      <w:r>
+        <w:t xml:space="preserve">Cas d’ús coneix SOAP/XML, DTO, clients, errors tècnics.</w:t>
+      </w:r>
+    </w:p>
+    <w:p>
+      <w:pPr>
+        <w:pStyle w:val="Compact"/>
+        <w:numPr>
+          <w:ilvl w:val="0"/>
+          <w:numId w:val="1007"/>
+        </w:numPr>
+      </w:pPr>
+      <w:r>
+        <w:t xml:space="preserve">Evolució tecnològica travessa frontera.</w:t>
+      </w:r>
+    </w:p>
+    <w:p>
+      <w:pPr>
+        <w:pStyle w:val="Compact"/>
+        <w:numPr>
+          <w:ilvl w:val="0"/>
+          <w:numId w:val="1007"/>
+        </w:numPr>
+      </w:pPr>
+      <w:r>
+        <w:t xml:space="preserve">Tres riscos: acoblament, manteniment fràgil i més superfície d’impacte davant canvis externs.</w:t>
+      </w:r>
+    </w:p>
+    <w:p>
+      <w:pPr>
+        <w:pStyle w:val="Compact"/>
+        <w:numPr>
+          <w:ilvl w:val="0"/>
+          <w:numId w:val="1007"/>
+        </w:numPr>
+      </w:pPr>
+      <w:r>
+        <w:t xml:space="preserve">Transició: resposta arquitectònica, port de sortida.</w:t>
       </w:r>
     </w:p>
     <w:bookmarkEnd w:id="27"/>
-    <w:bookmarkStart w:id="28" w:name="dependència-directa---155"/>
+    <w:bookmarkStart w:id="28" w:name="port-i-adaptador---220"/>
     <w:p>
       <w:pPr>
         <w:pStyle w:val="Ttulo3"/>
       </w:pPr>
       <w:r>
-        <w:t xml:space="preserve">6. Dependència directa - 1:55</w:t>
-      </w:r>
-    </w:p>
-    <w:p>
-      <w:pPr>
-        <w:pStyle w:val="Compact"/>
-        <w:numPr>
-          <w:ilvl w:val="0"/>
-          <w:numId w:val="1007"/>
-        </w:numPr>
-      </w:pPr>
-      <w:r>
-        <w:t xml:space="preserve">El problema no és PICA; és l’acoblament directe.</w:t>
-      </w:r>
-    </w:p>
-    <w:p>
-      <w:pPr>
-        <w:pStyle w:val="Compact"/>
-        <w:numPr>
-          <w:ilvl w:val="0"/>
-          <w:numId w:val="1007"/>
-        </w:numPr>
-      </w:pPr>
-      <w:r>
-        <w:t xml:space="preserve">La cadena SOAP/XML -&gt; PICA -&gt; AEAT i/o Cadastre és el problema, no la solució.</w:t>
-      </w:r>
-    </w:p>
-    <w:p>
-      <w:pPr>
-        <w:pStyle w:val="Compact"/>
-        <w:numPr>
-          <w:ilvl w:val="0"/>
-          <w:numId w:val="1007"/>
-        </w:numPr>
-      </w:pPr>
-      <w:r>
-        <w:t xml:space="preserve">Cas d’ús coneix SOAP/XML, DTO, clients, errors tècnics.</w:t>
-      </w:r>
-    </w:p>
-    <w:p>
-      <w:pPr>
-        <w:pStyle w:val="Compact"/>
-        <w:numPr>
-          <w:ilvl w:val="0"/>
-          <w:numId w:val="1007"/>
-        </w:numPr>
-      </w:pPr>
-      <w:r>
-        <w:t xml:space="preserve">Evolució tecnològica travessa frontera.</w:t>
-      </w:r>
-    </w:p>
-    <w:p>
-      <w:pPr>
-        <w:pStyle w:val="Compact"/>
-        <w:numPr>
-          <w:ilvl w:val="0"/>
-          <w:numId w:val="1007"/>
-        </w:numPr>
-      </w:pPr>
-      <w:r>
-        <w:t xml:space="preserve">Tres riscos: acoblament, manteniment fràgil i més superfície d’impacte davant canvis externs.</w:t>
-      </w:r>
-    </w:p>
-    <w:p>
-      <w:pPr>
-        <w:pStyle w:val="Compact"/>
-        <w:numPr>
-          <w:ilvl w:val="0"/>
-          <w:numId w:val="1007"/>
-        </w:numPr>
-      </w:pPr>
-      <w:r>
-        <w:t xml:space="preserve">Transició: resposta arquitectònica, port de sortida.</w:t>
+        <w:t xml:space="preserve">7. Port i adaptador - 2:20</w:t>
+      </w:r>
+    </w:p>
+    <w:p>
+      <w:pPr>
+        <w:pStyle w:val="Compact"/>
+        <w:numPr>
+          <w:ilvl w:val="0"/>
+          <w:numId w:val="1008"/>
+        </w:numPr>
+      </w:pPr>
+      <w:r>
+        <w:t xml:space="preserve">Fer-la servir com a frontissa conceptual forta, no com a tràmit ràpid.</w:t>
+      </w:r>
+    </w:p>
+    <w:p>
+      <w:pPr>
+        <w:pStyle w:val="Compact"/>
+        <w:numPr>
+          <w:ilvl w:val="0"/>
+          <w:numId w:val="1008"/>
+        </w:numPr>
+      </w:pPr>
+      <w:r>
+        <w:t xml:space="preserve">Flux d’execució: el cas d’ús demana informació cap enfora.</w:t>
+      </w:r>
+    </w:p>
+    <w:p>
+      <w:pPr>
+        <w:pStyle w:val="Compact"/>
+        <w:numPr>
+          <w:ilvl w:val="0"/>
+          <w:numId w:val="1008"/>
+        </w:numPr>
+      </w:pPr>
+      <w:r>
+        <w:t xml:space="preserve">Dependència de codi: el cas d’ús depèn del port; l’adaptador implementa el port.</w:t>
+      </w:r>
+    </w:p>
+    <w:p>
+      <w:pPr>
+        <w:pStyle w:val="Compact"/>
+        <w:numPr>
+          <w:ilvl w:val="0"/>
+          <w:numId w:val="1008"/>
+        </w:numPr>
+      </w:pPr>
+      <w:r>
+        <w:t xml:space="preserve">Conceptualment, el port és un contracte; en Java, aquí s’expressa com una interfície.</w:t>
+      </w:r>
+    </w:p>
+    <w:p>
+      <w:pPr>
+        <w:pStyle w:val="Compact"/>
+        <w:numPr>
+          <w:ilvl w:val="0"/>
+          <w:numId w:val="1008"/>
+        </w:numPr>
+      </w:pPr>
+      <w:r>
+        <w:t xml:space="preserve">L’adaptador implementa aquesta interfície.</w:t>
+      </w:r>
+    </w:p>
+    <w:p>
+      <w:pPr>
+        <w:pStyle w:val="Compact"/>
+        <w:numPr>
+          <w:ilvl w:val="0"/>
+          <w:numId w:val="1008"/>
+        </w:numPr>
+      </w:pPr>
+      <w:r>
+        <w:t xml:space="preserve">La interfície funciona com a contracte desacoblador entre components.</w:t>
+      </w:r>
+    </w:p>
+    <w:p>
+      <w:pPr>
+        <w:pStyle w:val="Compact"/>
+        <w:numPr>
+          <w:ilvl w:val="0"/>
+          <w:numId w:val="1008"/>
+        </w:numPr>
+      </w:pPr>
+      <w:r>
+        <w:t xml:space="preserve">Inversió: la infraestructura depèn del port definit per l’aplicació.</w:t>
+      </w:r>
+    </w:p>
+    <w:p>
+      <w:pPr>
+        <w:pStyle w:val="Compact"/>
+        <w:numPr>
+          <w:ilvl w:val="0"/>
+          <w:numId w:val="1008"/>
+        </w:numPr>
+      </w:pPr>
+      <w:r>
+        <w:t xml:space="preserve">Transició: aplicar-ho al cas patrimonial.</w:t>
       </w:r>
     </w:p>
     <w:bookmarkEnd w:id="28"/>
-    <w:bookmarkStart w:id="29" w:name="port-i-adaptador---220"/>
+    <w:bookmarkStart w:id="29" w:name="port-patrimonial---145"/>
     <w:p>
       <w:pPr>
         <w:pStyle w:val="Ttulo3"/>
       </w:pPr>
       <w:r>
-        <w:t xml:space="preserve">7. Port i adaptador - 2:20</w:t>
-      </w:r>
-    </w:p>
-    <w:p>
-      <w:pPr>
-        <w:pStyle w:val="Compact"/>
-        <w:numPr>
-          <w:ilvl w:val="0"/>
-          <w:numId w:val="1008"/>
-        </w:numPr>
-      </w:pPr>
-      <w:r>
-        <w:t xml:space="preserve">Fer-la servir com a frontissa conceptual forta, no com a tràmit ràpid.</w:t>
-      </w:r>
-    </w:p>
-    <w:p>
-      <w:pPr>
-        <w:pStyle w:val="Compact"/>
-        <w:numPr>
-          <w:ilvl w:val="0"/>
-          <w:numId w:val="1008"/>
-        </w:numPr>
-      </w:pPr>
-      <w:r>
-        <w:t xml:space="preserve">Flux d’execució: el cas d’ús demana informació cap enfora.</w:t>
-      </w:r>
-    </w:p>
-    <w:p>
-      <w:pPr>
-        <w:pStyle w:val="Compact"/>
-        <w:numPr>
-          <w:ilvl w:val="0"/>
-          <w:numId w:val="1008"/>
-        </w:numPr>
-      </w:pPr>
-      <w:r>
-        <w:t xml:space="preserve">Dependència de codi: el cas d’ús depèn del port; l’adaptador implementa el port.</w:t>
-      </w:r>
-    </w:p>
-    <w:p>
-      <w:pPr>
-        <w:pStyle w:val="Compact"/>
-        <w:numPr>
-          <w:ilvl w:val="0"/>
-          <w:numId w:val="1008"/>
-        </w:numPr>
-      </w:pPr>
-      <w:r>
-        <w:t xml:space="preserve">Conceptualment, el port és un contracte; en Java, aquí s’expressa com una interfície.</w:t>
-      </w:r>
-    </w:p>
-    <w:p>
-      <w:pPr>
-        <w:pStyle w:val="Compact"/>
-        <w:numPr>
-          <w:ilvl w:val="0"/>
-          <w:numId w:val="1008"/>
-        </w:numPr>
-      </w:pPr>
-      <w:r>
-        <w:t xml:space="preserve">L’adaptador implementa aquesta interfície.</w:t>
-      </w:r>
-    </w:p>
-    <w:p>
-      <w:pPr>
-        <w:pStyle w:val="Compact"/>
-        <w:numPr>
-          <w:ilvl w:val="0"/>
-          <w:numId w:val="1008"/>
-        </w:numPr>
-      </w:pPr>
-      <w:r>
-        <w:t xml:space="preserve">La interfície funciona com a contracte desacoblador entre components.</w:t>
-      </w:r>
-    </w:p>
-    <w:p>
-      <w:pPr>
-        <w:pStyle w:val="Compact"/>
-        <w:numPr>
-          <w:ilvl w:val="0"/>
-          <w:numId w:val="1008"/>
-        </w:numPr>
-      </w:pPr>
-      <w:r>
-        <w:t xml:space="preserve">Inversió: la infraestructura depèn del port definit per l’aplicació.</w:t>
-      </w:r>
-    </w:p>
-    <w:p>
-      <w:pPr>
-        <w:pStyle w:val="Compact"/>
-        <w:numPr>
-          <w:ilvl w:val="0"/>
-          <w:numId w:val="1008"/>
-        </w:numPr>
-      </w:pPr>
-      <w:r>
-        <w:t xml:space="preserve">Transició: aplicar-ho al cas patrimonial.</w:t>
+        <w:t xml:space="preserve">8. Port patrimonial - 1:45</w:t>
+      </w:r>
+    </w:p>
+    <w:p>
+      <w:pPr>
+        <w:pStyle w:val="Compact"/>
+        <w:numPr>
+          <w:ilvl w:val="0"/>
+          <w:numId w:val="1009"/>
+        </w:numPr>
+      </w:pPr>
+      <w:r>
+        <w:t xml:space="preserve">Servei d’aplicació depèn de contractes propis.</w:t>
+      </w:r>
+    </w:p>
+    <w:p>
+      <w:pPr>
+        <w:pStyle w:val="Compact"/>
+        <w:numPr>
+          <w:ilvl w:val="0"/>
+          <w:numId w:val="1009"/>
+        </w:numPr>
+      </w:pPr>
+      <w:r>
+        <w:t xml:space="preserve">Adaptadors fora del nucli.</w:t>
+      </w:r>
+    </w:p>
+    <w:p>
+      <w:pPr>
+        <w:pStyle w:val="Compact"/>
+        <w:numPr>
+          <w:ilvl w:val="0"/>
+          <w:numId w:val="1009"/>
+        </w:numPr>
+      </w:pPr>
+      <w:r>
+        <w:t xml:space="preserve">PICA/JDBC/SOAP/REST són detalls externs que poden evolucionar.</w:t>
+      </w:r>
+    </w:p>
+    <w:p>
+      <w:pPr>
+        <w:pStyle w:val="Compact"/>
+        <w:numPr>
+          <w:ilvl w:val="0"/>
+          <w:numId w:val="1009"/>
+        </w:numPr>
+      </w:pPr>
+      <w:r>
+        <w:t xml:space="preserve">Fletxa correcta d’implementació: adaptador -&gt; port.</w:t>
+      </w:r>
+    </w:p>
+    <w:p>
+      <w:pPr>
+        <w:pStyle w:val="Compact"/>
+        <w:numPr>
+          <w:ilvl w:val="0"/>
+          <w:numId w:val="1009"/>
+        </w:numPr>
+      </w:pPr>
+      <w:r>
+        <w:t xml:space="preserve">Transició: mateix patró en un domini financer.</w:t>
       </w:r>
     </w:p>
     <w:bookmarkEnd w:id="29"/>
-    <w:bookmarkStart w:id="30" w:name="port-patrimonial---145"/>
+    <w:bookmarkStart w:id="30" w:name="domini-financer---125"/>
     <w:p>
       <w:pPr>
         <w:pStyle w:val="Ttulo3"/>
       </w:pPr>
       <w:r>
-        <w:t xml:space="preserve">8. Port patrimonial - 1:45</w:t>
-      </w:r>
-    </w:p>
-    <w:p>
-      <w:pPr>
-        <w:pStyle w:val="Compact"/>
-        <w:numPr>
-          <w:ilvl w:val="0"/>
-          <w:numId w:val="1009"/>
-        </w:numPr>
-      </w:pPr>
-      <w:r>
-        <w:t xml:space="preserve">Servei d’aplicació depèn de contractes propis.</w:t>
-      </w:r>
-    </w:p>
-    <w:p>
-      <w:pPr>
-        <w:pStyle w:val="Compact"/>
-        <w:numPr>
-          <w:ilvl w:val="0"/>
-          <w:numId w:val="1009"/>
-        </w:numPr>
-      </w:pPr>
-      <w:r>
-        <w:t xml:space="preserve">Adaptadors fora del nucli.</w:t>
-      </w:r>
-    </w:p>
-    <w:p>
-      <w:pPr>
-        <w:pStyle w:val="Compact"/>
-        <w:numPr>
-          <w:ilvl w:val="0"/>
-          <w:numId w:val="1009"/>
-        </w:numPr>
-      </w:pPr>
-      <w:r>
-        <w:t xml:space="preserve">PICA/JDBC/SOAP/REST són detalls externs que poden evolucionar.</w:t>
-      </w:r>
-    </w:p>
-    <w:p>
-      <w:pPr>
-        <w:pStyle w:val="Compact"/>
-        <w:numPr>
-          <w:ilvl w:val="0"/>
-          <w:numId w:val="1009"/>
-        </w:numPr>
-      </w:pPr>
-      <w:r>
-        <w:t xml:space="preserve">Fletxa correcta d’implementació: adaptador -&gt; port.</w:t>
-      </w:r>
-    </w:p>
-    <w:p>
-      <w:pPr>
-        <w:pStyle w:val="Compact"/>
-        <w:numPr>
-          <w:ilvl w:val="0"/>
-          <w:numId w:val="1009"/>
-        </w:numPr>
-      </w:pPr>
-      <w:r>
-        <w:t xml:space="preserve">Transició: mateix patró en un domini financer.</w:t>
+        <w:t xml:space="preserve">9. Domini financer - 1:25</w:t>
+      </w:r>
+    </w:p>
+    <w:p>
+      <w:pPr>
+        <w:pStyle w:val="Compact"/>
+        <w:numPr>
+          <w:ilvl w:val="0"/>
+          <w:numId w:val="1010"/>
+        </w:numPr>
+      </w:pPr>
+      <w:r>
+        <w:t xml:space="preserve">Canvi explícit de domini: beca -&gt; cartera d’inversió personal.</w:t>
+      </w:r>
+    </w:p>
+    <w:p>
+      <w:pPr>
+        <w:pStyle w:val="Compact"/>
+        <w:numPr>
+          <w:ilvl w:val="0"/>
+          <w:numId w:val="1010"/>
+        </w:numPr>
+      </w:pPr>
+      <w:r>
+        <w:t xml:space="preserve">Cas d’ús: vendre accions.</w:t>
+      </w:r>
+    </w:p>
+    <w:p>
+      <w:pPr>
+        <w:pStyle w:val="Compact"/>
+        <w:numPr>
+          <w:ilvl w:val="0"/>
+          <w:numId w:val="1010"/>
+        </w:numPr>
+      </w:pPr>
+      <w:r>
+        <w:t xml:space="preserve">Necessitat: preu actual de l’acció.</w:t>
+      </w:r>
+    </w:p>
+    <w:p>
+      <w:pPr>
+        <w:pStyle w:val="Compact"/>
+        <w:numPr>
+          <w:ilvl w:val="0"/>
+          <w:numId w:val="1010"/>
+        </w:numPr>
+      </w:pPr>
+      <w:r>
+        <w:t xml:space="preserve">Port de sortida:</w:t>
+      </w:r>
+      <w:r>
+        <w:t xml:space="preserve"> </w:t>
+      </w:r>
+      <w:r>
+        <w:rPr>
+          <w:rStyle w:val="VerbatimChar"/>
+        </w:rPr>
+        <w:t xml:space="preserve">StockPriceProviderPort</w:t>
+      </w:r>
+      <w:r>
+        <w:t xml:space="preserve">.</w:t>
+      </w:r>
+    </w:p>
+    <w:p>
+      <w:pPr>
+        <w:pStyle w:val="Compact"/>
+        <w:numPr>
+          <w:ilvl w:val="0"/>
+          <w:numId w:val="1010"/>
+        </w:numPr>
+      </w:pPr>
+      <w:r>
+        <w:t xml:space="preserve">Separar proveïdor de dades, API concreta, contracte tècnic i adaptador.</w:t>
+      </w:r>
+    </w:p>
+    <w:p>
+      <w:pPr>
+        <w:pStyle w:val="Compact"/>
+        <w:numPr>
+          <w:ilvl w:val="0"/>
+          <w:numId w:val="1010"/>
+        </w:numPr>
+      </w:pPr>
+      <w:r>
+        <w:t xml:space="preserve">Servei d’aplicació coordina consulta del preu i recuperació de cartera.</w:t>
+      </w:r>
+    </w:p>
+    <w:p>
+      <w:pPr>
+        <w:pStyle w:val="Compact"/>
+        <w:numPr>
+          <w:ilvl w:val="0"/>
+          <w:numId w:val="1010"/>
+        </w:numPr>
+      </w:pPr>
+      <w:r>
+        <w:t xml:space="preserve">Domini decideix; adaptador integra.</w:t>
+      </w:r>
+    </w:p>
+    <w:p>
+      <w:pPr>
+        <w:pStyle w:val="Compact"/>
+        <w:numPr>
+          <w:ilvl w:val="0"/>
+          <w:numId w:val="1010"/>
+        </w:numPr>
+      </w:pPr>
+      <w:r>
+        <w:t xml:space="preserve">Transició: conclusió tècnica.</w:t>
       </w:r>
     </w:p>
     <w:bookmarkEnd w:id="30"/>
-    <w:bookmarkStart w:id="31" w:name="domini-financer---125"/>
+    <w:bookmarkStart w:id="31" w:name="idea-clau-i-tancament---055"/>
     <w:p>
       <w:pPr>
         <w:pStyle w:val="Ttulo3"/>
       </w:pPr>
       <w:r>
-        <w:t xml:space="preserve">9. Domini financer - 1:25</w:t>
-      </w:r>
-    </w:p>
-    <w:p>
-      <w:pPr>
-        <w:pStyle w:val="Compact"/>
-        <w:numPr>
-          <w:ilvl w:val="0"/>
-          <w:numId w:val="1010"/>
-        </w:numPr>
-      </w:pPr>
-      <w:r>
-        <w:t xml:space="preserve">Canvi explícit de domini: beca -&gt; cartera d’inversió personal.</w:t>
-      </w:r>
-    </w:p>
-    <w:p>
-      <w:pPr>
-        <w:pStyle w:val="Compact"/>
-        <w:numPr>
-          <w:ilvl w:val="0"/>
-          <w:numId w:val="1010"/>
-        </w:numPr>
-      </w:pPr>
-      <w:r>
-        <w:t xml:space="preserve">El diagrama correspon a HexaStock, però s’ha de llegir com a patró.</w:t>
-      </w:r>
-    </w:p>
-    <w:p>
-      <w:pPr>
-        <w:pStyle w:val="Compact"/>
-        <w:numPr>
-          <w:ilvl w:val="0"/>
-          <w:numId w:val="1010"/>
-        </w:numPr>
-      </w:pPr>
-      <w:r>
-        <w:t xml:space="preserve">Cas d’ús: vendre accions.</w:t>
-      </w:r>
-    </w:p>
-    <w:p>
-      <w:pPr>
-        <w:pStyle w:val="Compact"/>
-        <w:numPr>
-          <w:ilvl w:val="0"/>
-          <w:numId w:val="1010"/>
-        </w:numPr>
-      </w:pPr>
-      <w:r>
-        <w:t xml:space="preserve">Necessitat: preu actual de l’acció que l’usuari vol vendre.</w:t>
-      </w:r>
-    </w:p>
-    <w:p>
-      <w:pPr>
-        <w:pStyle w:val="Compact"/>
-        <w:numPr>
-          <w:ilvl w:val="0"/>
-          <w:numId w:val="1010"/>
-        </w:numPr>
-      </w:pPr>
-      <w:r>
-        <w:t xml:space="preserve">Port de sortida: defineix aquesta capacitat.</w:t>
-      </w:r>
-    </w:p>
-    <w:p>
-      <w:pPr>
-        <w:pStyle w:val="Compact"/>
-        <w:numPr>
-          <w:ilvl w:val="0"/>
-          <w:numId w:val="1010"/>
-        </w:numPr>
-      </w:pPr>
-      <w:r>
-        <w:t xml:space="preserve">Separar proveïdor de dades, API concreta, contracte tècnic i adaptador.</w:t>
-      </w:r>
-    </w:p>
-    <w:p>
-      <w:pPr>
-        <w:pStyle w:val="Compact"/>
-        <w:numPr>
-          <w:ilvl w:val="0"/>
-          <w:numId w:val="1010"/>
-        </w:numPr>
-      </w:pPr>
-      <w:r>
-        <w:t xml:space="preserve">Transició: concretar-ho en el flux de HexaStock.</w:t>
-      </w:r>
-    </w:p>
-    <w:bookmarkEnd w:id="31"/>
-    <w:bookmarkStart w:id="32" w:name="flux-i-codi---125"/>
-    <w:p>
-      <w:pPr>
-        <w:pStyle w:val="Ttulo3"/>
-      </w:pPr>
-      <w:r>
-        <w:t xml:space="preserve">10. Flux i codi - 1:25</w:t>
+        <w:t xml:space="preserve">10. Idea clau i tancament - 0:55</w:t>
       </w:r>
     </w:p>
     <w:p>
@@ -1763,7 +1713,7 @@
         </w:numPr>
       </w:pPr>
       <w:r>
-        <w:t xml:space="preserve">Diagrama de seqüència = flux temporal, no dependència de codi.</w:t>
+        <w:t xml:space="preserve">Tres decisions: necessitat funcional, port i adaptador.</w:t>
       </w:r>
     </w:p>
     <w:p>
@@ -1775,7 +1725,7 @@
         </w:numPr>
       </w:pPr>
       <w:r>
-        <w:t xml:space="preserve">Controller -&gt; port d’entrada -&gt; servei.</w:t>
+        <w:t xml:space="preserve">El cas d’ús expressa una necessitat funcional.</w:t>
       </w:r>
     </w:p>
     <w:p>
@@ -1787,7 +1737,7 @@
         </w:numPr>
       </w:pPr>
       <w:r>
-        <w:t xml:space="preserve">Servei consulta ports i delega venda al domini.</w:t>
+        <w:t xml:space="preserve">El port defineix el contracte de l’aplicació.</w:t>
       </w:r>
     </w:p>
     <w:p>
@@ -1799,7 +1749,7 @@
         </w:numPr>
       </w:pPr>
       <w:r>
-        <w:t xml:space="preserve">Domini decideix; adaptador integra.</w:t>
+        <w:t xml:space="preserve">L’adaptador encapsula la integració externa.</w:t>
       </w:r>
     </w:p>
     <w:p>
@@ -1811,7 +1761,7 @@
         </w:numPr>
       </w:pPr>
       <w:r>
-        <w:t xml:space="preserve">Frase clau: en aquesta implementació, el servei coordina, el domini decideix i l’adaptador integra.</w:t>
+        <w:t xml:space="preserve">Frase clau: l’arquitectura no elimina el canvi; el localitza.</w:t>
       </w:r>
     </w:p>
     <w:p>
@@ -1823,52 +1773,6 @@
         </w:numPr>
       </w:pPr>
       <w:r>
-        <w:t xml:space="preserve">Transició: conclusió i agraïment.</w:t>
-      </w:r>
-    </w:p>
-    <w:bookmarkEnd w:id="32"/>
-    <w:bookmarkStart w:id="33" w:name="agraïment---050"/>
-    <w:p>
-      <w:pPr>
-        <w:pStyle w:val="Ttulo3"/>
-      </w:pPr>
-      <w:r>
-        <w:t xml:space="preserve">11. Agraïment - 0:50</w:t>
-      </w:r>
-    </w:p>
-    <w:p>
-      <w:pPr>
-        <w:pStyle w:val="Compact"/>
-        <w:numPr>
-          <w:ilvl w:val="0"/>
-          <w:numId w:val="1012"/>
-        </w:numPr>
-      </w:pPr>
-      <w:r>
-        <w:t xml:space="preserve">Arquitectura no elimina la dependència externa; la situa en una frontera explícita i controlable.</w:t>
-      </w:r>
-    </w:p>
-    <w:p>
-      <w:pPr>
-        <w:pStyle w:val="Compact"/>
-        <w:numPr>
-          <w:ilvl w:val="0"/>
-          <w:numId w:val="1012"/>
-        </w:numPr>
-      </w:pPr>
-      <w:r>
-        <w:t xml:space="preserve">Canviar adaptador, no cas d’ús ni domini.</w:t>
-      </w:r>
-    </w:p>
-    <w:p>
-      <w:pPr>
-        <w:pStyle w:val="Compact"/>
-        <w:numPr>
-          <w:ilvl w:val="0"/>
-          <w:numId w:val="1012"/>
-        </w:numPr>
-      </w:pPr>
-      <w:r>
         <w:t xml:space="preserve">Agraïment breu al TecnoCampus i al Dr. Josep Roure.</w:t>
       </w:r>
     </w:p>
@@ -1877,7 +1781,7 @@
         <w:pStyle w:val="Compact"/>
         <w:numPr>
           <w:ilvl w:val="0"/>
-          <w:numId w:val="1012"/>
+          <w:numId w:val="1011"/>
         </w:numPr>
       </w:pPr>
       <w:r>
@@ -1901,32 +1805,32 @@
         <w:pStyle w:val="Compact"/>
         <w:numPr>
           <w:ilvl w:val="0"/>
+          <w:numId w:val="1011"/>
+        </w:numPr>
+      </w:pPr>
+      <w:r>
+        <w:t xml:space="preserve">No obrir la demo després del tancament si el tribunal no la demana o si no hi ha temps clar.</w:t>
+      </w:r>
+    </w:p>
+    <w:bookmarkEnd w:id="31"/>
+    <w:bookmarkStart w:id="32" w:name="annex-a.-demo-opcional---130-a-230-1"/>
+    <w:p>
+      <w:pPr>
+        <w:pStyle w:val="Ttulo3"/>
+      </w:pPr>
+      <w:r>
+        <w:t xml:space="preserve">Annex A. Demo opcional - 1:30 a 2:30</w:t>
+      </w:r>
+    </w:p>
+    <w:p>
+      <w:pPr>
+        <w:pStyle w:val="Compact"/>
+        <w:numPr>
+          <w:ilvl w:val="0"/>
           <w:numId w:val="1012"/>
         </w:numPr>
       </w:pPr>
       <w:r>
-        <w:t xml:space="preserve">No obrir la demo després del tancament si el tribunal no la demana o si no hi ha temps clar.</w:t>
-      </w:r>
-    </w:p>
-    <w:bookmarkEnd w:id="33"/>
-    <w:bookmarkStart w:id="34" w:name="annex-a.-demo-opcional---130-a-230-1"/>
-    <w:p>
-      <w:pPr>
-        <w:pStyle w:val="Ttulo3"/>
-      </w:pPr>
-      <w:r>
-        <w:t xml:space="preserve">Annex A. Demo opcional - 1:30 a 2:30</w:t>
-      </w:r>
-    </w:p>
-    <w:p>
-      <w:pPr>
-        <w:pStyle w:val="Compact"/>
-        <w:numPr>
-          <w:ilvl w:val="0"/>
-          <w:numId w:val="1013"/>
-        </w:numPr>
-      </w:pPr>
-      <w:r>
         <w:t xml:space="preserve">Annex posterior al tancament, no part del cos principal.</w:t>
       </w:r>
     </w:p>
@@ -1935,7 +1839,7 @@
         <w:pStyle w:val="Compact"/>
         <w:numPr>
           <w:ilvl w:val="0"/>
-          <w:numId w:val="1013"/>
+          <w:numId w:val="1012"/>
         </w:numPr>
       </w:pPr>
       <w:r>
@@ -1947,7 +1851,7 @@
         <w:pStyle w:val="Compact"/>
         <w:numPr>
           <w:ilvl w:val="0"/>
-          <w:numId w:val="1013"/>
+          <w:numId w:val="1012"/>
         </w:numPr>
       </w:pPr>
       <w:r>
@@ -1959,7 +1863,7 @@
         <w:pStyle w:val="Compact"/>
         <w:numPr>
           <w:ilvl w:val="0"/>
-          <w:numId w:val="1013"/>
+          <w:numId w:val="1012"/>
         </w:numPr>
       </w:pPr>
       <w:r>
@@ -1971,7 +1875,7 @@
         <w:pStyle w:val="Compact"/>
         <w:numPr>
           <w:ilvl w:val="0"/>
-          <w:numId w:val="1013"/>
+          <w:numId w:val="1012"/>
         </w:numPr>
       </w:pPr>
       <w:r>
@@ -1983,7 +1887,7 @@
         <w:pStyle w:val="Compact"/>
         <w:numPr>
           <w:ilvl w:val="0"/>
-          <w:numId w:val="1013"/>
+          <w:numId w:val="1012"/>
         </w:numPr>
       </w:pPr>
       <w:r>
@@ -1995,7 +1899,7 @@
         <w:pStyle w:val="Compact"/>
         <w:numPr>
           <w:ilvl w:val="0"/>
-          <w:numId w:val="1013"/>
+          <w:numId w:val="1012"/>
         </w:numPr>
       </w:pPr>
       <w:r>
@@ -2007,7 +1911,7 @@
         <w:pStyle w:val="Compact"/>
         <w:numPr>
           <w:ilvl w:val="0"/>
-          <w:numId w:val="1013"/>
+          <w:numId w:val="1012"/>
         </w:numPr>
       </w:pPr>
       <w:r>
@@ -2019,7 +1923,7 @@
         <w:pStyle w:val="Compact"/>
         <w:numPr>
           <w:ilvl w:val="0"/>
-          <w:numId w:val="1013"/>
+          <w:numId w:val="1012"/>
         </w:numPr>
       </w:pPr>
       <w:r>
@@ -2033,9 +1937,9 @@
         </w:pict>
       </w:r>
     </w:p>
-    <w:bookmarkEnd w:id="34"/>
-    <w:bookmarkEnd w:id="35"/>
-    <w:bookmarkStart w:id="36" w:name="esquema-de-memorització"/>
+    <w:bookmarkEnd w:id="32"/>
+    <w:bookmarkEnd w:id="33"/>
+    <w:bookmarkStart w:id="34" w:name="esquema-de-memorització"/>
     <w:p>
       <w:pPr>
         <w:pStyle w:val="Ttulo2"/>
@@ -2626,7 +2530,7 @@
               <w:pStyle w:val="Compact"/>
             </w:pPr>
             <w:r>
-              <w:t xml:space="preserve">Projecte concret</w:t>
+              <w:t xml:space="preserve">Conclusió</w:t>
             </w:r>
           </w:p>
         </w:tc>
@@ -2650,63 +2554,6 @@
               <w:pStyle w:val="Compact"/>
             </w:pPr>
             <w:r>
-              <w:t xml:space="preserve">Servei coordina, domini decideix</w:t>
-            </w:r>
-          </w:p>
-        </w:tc>
-        <w:tc>
-          <w:tcPr/>
-          <w:p>
-            <w:pPr>
-              <w:pStyle w:val="Compact"/>
-            </w:pPr>
-            <w:r>
-              <w:t xml:space="preserve">Seqüència vs dependència</w:t>
-            </w:r>
-          </w:p>
-        </w:tc>
-        <w:tc>
-          <w:tcPr/>
-          <w:p>
-            <w:pPr>
-              <w:pStyle w:val="Compact"/>
-            </w:pPr>
-            <w:r>
-              <w:t xml:space="preserve">Transferència genèrica</w:t>
-            </w:r>
-          </w:p>
-        </w:tc>
-        <w:tc>
-          <w:tcPr/>
-          <w:p>
-            <w:pPr>
-              <w:pStyle w:val="Compact"/>
-            </w:pPr>
-            <w:r>
-              <w:t xml:space="preserve">Conclusió</w:t>
-            </w:r>
-          </w:p>
-        </w:tc>
-      </w:tr>
-      <w:tr>
-        <w:tc>
-          <w:tcPr/>
-          <w:p>
-            <w:pPr>
-              <w:pStyle w:val="Compact"/>
-            </w:pPr>
-            <w:r>
-              <w:t xml:space="preserve">11</w:t>
-            </w:r>
-          </w:p>
-        </w:tc>
-        <w:tc>
-          <w:tcPr/>
-          <w:p>
-            <w:pPr>
-              <w:pStyle w:val="Compact"/>
-            </w:pPr>
-            <w:r>
               <w:t xml:space="preserve">L’arquitectura localitza el canvi</w:t>
             </w:r>
           </w:p>
@@ -2729,7 +2576,7 @@
               <w:pStyle w:val="Compact"/>
             </w:pPr>
             <w:r>
-              <w:t xml:space="preserve">Flux i codi</w:t>
+              <w:t xml:space="preserve">Domini financer</w:t>
             </w:r>
           </w:p>
         </w:tc>
@@ -2817,7 +2664,7 @@
         <w:rPr>
           <w:rStyle w:val="VerbatimChar"/>
         </w:rPr>
-        <w:t xml:space="preserve">context -&gt; assignatura -&gt; objectiu breu -&gt; procediment -&gt; dada externa -&gt; acoblament -&gt; port -&gt; AGAUR -&gt; domini financer -&gt; HexaStock -&gt; conclusió</w:t>
+        <w:t xml:space="preserve">context -&gt; assignatura -&gt; objectiu -&gt; procediment -&gt; informació externa -&gt; acoblament -&gt; port -&gt; cas patrimonial -&gt; domini financer -&gt; conclusió</w:t>
       </w:r>
       <w:r>
         <w:t xml:space="preserve">.</w:t>
@@ -2850,23 +2697,1086 @@
         </w:pict>
       </w:r>
     </w:p>
+    <w:bookmarkEnd w:id="34"/>
+    <w:bookmarkStart w:id="35" w:name="taula-temporal-actualitzada"/>
+    <w:p>
+      <w:pPr>
+        <w:pStyle w:val="Ttulo2"/>
+      </w:pPr>
+      <w:r>
+        <w:t xml:space="preserve">4. Taula temporal actualitzada</w:t>
+      </w:r>
+    </w:p>
+    <w:p>
+      <w:pPr>
+        <w:pStyle w:val="FirstParagraph"/>
+      </w:pPr>
+      <w:r>
+        <w:t xml:space="preserve">La taula següent calcula només el cos principal. No inclou la demo opcional. Les estimacions de 125, 130 i 135 paraules per minut corresponen a lectura neta del text; en assaig real cal afegir pauses, respiració, mirada al tribunal, canvi de diapositiva i assenyalament dels elements visuals.</w:t>
+      </w:r>
+    </w:p>
+    <w:tbl>
+      <w:tblPr>
+        <w:tblStyle w:val="Table"/>
+        <w:tblW w:type="pct" w:w="5000"/>
+        <w:tblLayout w:type="fixed"/>
+        <w:tblLook w:firstRow="1" w:lastRow="0" w:firstColumn="0" w:lastColumn="0" w:noHBand="0" w:noVBand="0" w:val="0020"/>
+      </w:tblPr>
+      <w:tblGrid>
+        <w:gridCol w:w="1405"/>
+        <w:gridCol w:w="510"/>
+        <w:gridCol w:w="1021"/>
+        <w:gridCol w:w="894"/>
+        <w:gridCol w:w="894"/>
+        <w:gridCol w:w="894"/>
+        <w:gridCol w:w="2299"/>
+      </w:tblGrid>
+      <w:tr>
+        <w:trPr>
+          <w:tblHeader w:val="on"/>
+        </w:trPr>
+        <w:tc>
+          <w:tcPr/>
+          <w:p>
+            <w:pPr>
+              <w:pStyle w:val="Compact"/>
+            </w:pPr>
+            <w:r>
+              <w:t xml:space="preserve">Diapositiva</w:t>
+            </w:r>
+          </w:p>
+        </w:tc>
+        <w:tc>
+          <w:tcPr/>
+          <w:p>
+            <w:pPr>
+              <w:pStyle w:val="Compact"/>
+            </w:pPr>
+            <w:r>
+              <w:t xml:space="preserve">Bloc</w:t>
+            </w:r>
+          </w:p>
+        </w:tc>
+        <w:tc>
+          <w:tcPr/>
+          <w:p>
+            <w:pPr>
+              <w:pStyle w:val="Compact"/>
+            </w:pPr>
+            <w:r>
+              <w:t xml:space="preserve">Paraules</w:t>
+            </w:r>
+          </w:p>
+        </w:tc>
+        <w:tc>
+          <w:tcPr/>
+          <w:p>
+            <w:pPr>
+              <w:pStyle w:val="Compact"/>
+            </w:pPr>
+            <w:r>
+              <w:t xml:space="preserve">125 ppm</w:t>
+            </w:r>
+          </w:p>
+        </w:tc>
+        <w:tc>
+          <w:tcPr/>
+          <w:p>
+            <w:pPr>
+              <w:pStyle w:val="Compact"/>
+            </w:pPr>
+            <w:r>
+              <w:t xml:space="preserve">130 ppm</w:t>
+            </w:r>
+          </w:p>
+        </w:tc>
+        <w:tc>
+          <w:tcPr/>
+          <w:p>
+            <w:pPr>
+              <w:pStyle w:val="Compact"/>
+            </w:pPr>
+            <w:r>
+              <w:t xml:space="preserve">135 ppm</w:t>
+            </w:r>
+          </w:p>
+        </w:tc>
+        <w:tc>
+          <w:tcPr/>
+          <w:p>
+            <w:pPr>
+              <w:pStyle w:val="Compact"/>
+            </w:pPr>
+            <w:r>
+              <w:t xml:space="preserve">Acumulat a 130 ppm</w:t>
+            </w:r>
+          </w:p>
+        </w:tc>
+      </w:tr>
+      <w:tr>
+        <w:tc>
+          <w:tcPr/>
+          <w:p>
+            <w:pPr>
+              <w:pStyle w:val="Compact"/>
+            </w:pPr>
+            <w:r>
+              <w:t xml:space="preserve">1</w:t>
+            </w:r>
+          </w:p>
+        </w:tc>
+        <w:tc>
+          <w:tcPr/>
+          <w:p>
+            <w:pPr>
+              <w:pStyle w:val="Compact"/>
+            </w:pPr>
+            <w:r>
+              <w:t xml:space="preserve">Portada</w:t>
+            </w:r>
+          </w:p>
+        </w:tc>
+        <w:tc>
+          <w:tcPr/>
+          <w:p>
+            <w:pPr>
+              <w:pStyle w:val="Compact"/>
+            </w:pPr>
+            <w:r>
+              <w:t xml:space="preserve">177</w:t>
+            </w:r>
+          </w:p>
+        </w:tc>
+        <w:tc>
+          <w:tcPr/>
+          <w:p>
+            <w:pPr>
+              <w:pStyle w:val="Compact"/>
+            </w:pPr>
+            <w:r>
+              <w:t xml:space="preserve">1:25</w:t>
+            </w:r>
+          </w:p>
+        </w:tc>
+        <w:tc>
+          <w:tcPr/>
+          <w:p>
+            <w:pPr>
+              <w:pStyle w:val="Compact"/>
+            </w:pPr>
+            <w:r>
+              <w:t xml:space="preserve">1:22</w:t>
+            </w:r>
+          </w:p>
+        </w:tc>
+        <w:tc>
+          <w:tcPr/>
+          <w:p>
+            <w:pPr>
+              <w:pStyle w:val="Compact"/>
+            </w:pPr>
+            <w:r>
+              <w:t xml:space="preserve">1:19</w:t>
+            </w:r>
+          </w:p>
+        </w:tc>
+        <w:tc>
+          <w:tcPr/>
+          <w:p>
+            <w:pPr>
+              <w:pStyle w:val="Compact"/>
+            </w:pPr>
+            <w:r>
+              <w:t xml:space="preserve">1:22</w:t>
+            </w:r>
+          </w:p>
+        </w:tc>
+      </w:tr>
+      <w:tr>
+        <w:tc>
+          <w:tcPr/>
+          <w:p>
+            <w:pPr>
+              <w:pStyle w:val="Compact"/>
+            </w:pPr>
+            <w:r>
+              <w:t xml:space="preserve">2</w:t>
+            </w:r>
+          </w:p>
+        </w:tc>
+        <w:tc>
+          <w:tcPr/>
+          <w:p>
+            <w:pPr>
+              <w:pStyle w:val="Compact"/>
+            </w:pPr>
+            <w:r>
+              <w:t xml:space="preserve">On som dins l’assignatura</w:t>
+            </w:r>
+          </w:p>
+        </w:tc>
+        <w:tc>
+          <w:tcPr/>
+          <w:p>
+            <w:pPr>
+              <w:pStyle w:val="Compact"/>
+            </w:pPr>
+            <w:r>
+              <w:t xml:space="preserve">45</w:t>
+            </w:r>
+          </w:p>
+        </w:tc>
+        <w:tc>
+          <w:tcPr/>
+          <w:p>
+            <w:pPr>
+              <w:pStyle w:val="Compact"/>
+            </w:pPr>
+            <w:r>
+              <w:t xml:space="preserve">0:22</w:t>
+            </w:r>
+          </w:p>
+        </w:tc>
+        <w:tc>
+          <w:tcPr/>
+          <w:p>
+            <w:pPr>
+              <w:pStyle w:val="Compact"/>
+            </w:pPr>
+            <w:r>
+              <w:t xml:space="preserve">0:21</w:t>
+            </w:r>
+          </w:p>
+        </w:tc>
+        <w:tc>
+          <w:tcPr/>
+          <w:p>
+            <w:pPr>
+              <w:pStyle w:val="Compact"/>
+            </w:pPr>
+            <w:r>
+              <w:t xml:space="preserve">0:20</w:t>
+            </w:r>
+          </w:p>
+        </w:tc>
+        <w:tc>
+          <w:tcPr/>
+          <w:p>
+            <w:pPr>
+              <w:pStyle w:val="Compact"/>
+            </w:pPr>
+            <w:r>
+              <w:t xml:space="preserve">1:43</w:t>
+            </w:r>
+          </w:p>
+        </w:tc>
+      </w:tr>
+      <w:tr>
+        <w:tc>
+          <w:tcPr/>
+          <w:p>
+            <w:pPr>
+              <w:pStyle w:val="Compact"/>
+            </w:pPr>
+            <w:r>
+              <w:t xml:space="preserve">3</w:t>
+            </w:r>
+          </w:p>
+        </w:tc>
+        <w:tc>
+          <w:tcPr/>
+          <w:p>
+            <w:pPr>
+              <w:pStyle w:val="Compact"/>
+            </w:pPr>
+            <w:r>
+              <w:t xml:space="preserve">Objectiu de la sessió</w:t>
+            </w:r>
+          </w:p>
+        </w:tc>
+        <w:tc>
+          <w:tcPr/>
+          <w:p>
+            <w:pPr>
+              <w:pStyle w:val="Compact"/>
+            </w:pPr>
+            <w:r>
+              <w:t xml:space="preserve">80</w:t>
+            </w:r>
+          </w:p>
+        </w:tc>
+        <w:tc>
+          <w:tcPr/>
+          <w:p>
+            <w:pPr>
+              <w:pStyle w:val="Compact"/>
+            </w:pPr>
+            <w:r>
+              <w:t xml:space="preserve">0:38</w:t>
+            </w:r>
+          </w:p>
+        </w:tc>
+        <w:tc>
+          <w:tcPr/>
+          <w:p>
+            <w:pPr>
+              <w:pStyle w:val="Compact"/>
+            </w:pPr>
+            <w:r>
+              <w:t xml:space="preserve">0:37</w:t>
+            </w:r>
+          </w:p>
+        </w:tc>
+        <w:tc>
+          <w:tcPr/>
+          <w:p>
+            <w:pPr>
+              <w:pStyle w:val="Compact"/>
+            </w:pPr>
+            <w:r>
+              <w:t xml:space="preserve">0:36</w:t>
+            </w:r>
+          </w:p>
+        </w:tc>
+        <w:tc>
+          <w:tcPr/>
+          <w:p>
+            <w:pPr>
+              <w:pStyle w:val="Compact"/>
+            </w:pPr>
+            <w:r>
+              <w:t xml:space="preserve">2:20</w:t>
+            </w:r>
+          </w:p>
+        </w:tc>
+      </w:tr>
+      <w:tr>
+        <w:tc>
+          <w:tcPr/>
+          <w:p>
+            <w:pPr>
+              <w:pStyle w:val="Compact"/>
+            </w:pPr>
+            <w:r>
+              <w:t xml:space="preserve">4</w:t>
+            </w:r>
+          </w:p>
+        </w:tc>
+        <w:tc>
+          <w:tcPr/>
+          <w:p>
+            <w:pPr>
+              <w:pStyle w:val="Compact"/>
+            </w:pPr>
+            <w:r>
+              <w:t xml:space="preserve">Avaluació econòmica d’una beca</w:t>
+            </w:r>
+          </w:p>
+        </w:tc>
+        <w:tc>
+          <w:tcPr/>
+          <w:p>
+            <w:pPr>
+              <w:pStyle w:val="Compact"/>
+            </w:pPr>
+            <w:r>
+              <w:t xml:space="preserve">168</w:t>
+            </w:r>
+          </w:p>
+        </w:tc>
+        <w:tc>
+          <w:tcPr/>
+          <w:p>
+            <w:pPr>
+              <w:pStyle w:val="Compact"/>
+            </w:pPr>
+            <w:r>
+              <w:t xml:space="preserve">1:21</w:t>
+            </w:r>
+          </w:p>
+        </w:tc>
+        <w:tc>
+          <w:tcPr/>
+          <w:p>
+            <w:pPr>
+              <w:pStyle w:val="Compact"/>
+            </w:pPr>
+            <w:r>
+              <w:t xml:space="preserve">1:18</w:t>
+            </w:r>
+          </w:p>
+        </w:tc>
+        <w:tc>
+          <w:tcPr/>
+          <w:p>
+            <w:pPr>
+              <w:pStyle w:val="Compact"/>
+            </w:pPr>
+            <w:r>
+              <w:t xml:space="preserve">1:15</w:t>
+            </w:r>
+          </w:p>
+        </w:tc>
+        <w:tc>
+          <w:tcPr/>
+          <w:p>
+            <w:pPr>
+              <w:pStyle w:val="Compact"/>
+            </w:pPr>
+            <w:r>
+              <w:t xml:space="preserve">3:38</w:t>
+            </w:r>
+          </w:p>
+        </w:tc>
+      </w:tr>
+      <w:tr>
+        <w:tc>
+          <w:tcPr/>
+          <w:p>
+            <w:pPr>
+              <w:pStyle w:val="Compact"/>
+            </w:pPr>
+            <w:r>
+              <w:t xml:space="preserve">5</w:t>
+            </w:r>
+          </w:p>
+        </w:tc>
+        <w:tc>
+          <w:tcPr/>
+          <w:p>
+            <w:pPr>
+              <w:pStyle w:val="Compact"/>
+            </w:pPr>
+            <w:r>
+              <w:t xml:space="preserve">Informació externa</w:t>
+            </w:r>
+          </w:p>
+        </w:tc>
+        <w:tc>
+          <w:tcPr/>
+          <w:p>
+            <w:pPr>
+              <w:pStyle w:val="Compact"/>
+            </w:pPr>
+            <w:r>
+              <w:t xml:space="preserve">211</w:t>
+            </w:r>
+          </w:p>
+        </w:tc>
+        <w:tc>
+          <w:tcPr/>
+          <w:p>
+            <w:pPr>
+              <w:pStyle w:val="Compact"/>
+            </w:pPr>
+            <w:r>
+              <w:t xml:space="preserve">1:41</w:t>
+            </w:r>
+          </w:p>
+        </w:tc>
+        <w:tc>
+          <w:tcPr/>
+          <w:p>
+            <w:pPr>
+              <w:pStyle w:val="Compact"/>
+            </w:pPr>
+            <w:r>
+              <w:t xml:space="preserve">1:37</w:t>
+            </w:r>
+          </w:p>
+        </w:tc>
+        <w:tc>
+          <w:tcPr/>
+          <w:p>
+            <w:pPr>
+              <w:pStyle w:val="Compact"/>
+            </w:pPr>
+            <w:r>
+              <w:t xml:space="preserve">1:34</w:t>
+            </w:r>
+          </w:p>
+        </w:tc>
+        <w:tc>
+          <w:tcPr/>
+          <w:p>
+            <w:pPr>
+              <w:pStyle w:val="Compact"/>
+            </w:pPr>
+            <w:r>
+              <w:t xml:space="preserve">5:15</w:t>
+            </w:r>
+          </w:p>
+        </w:tc>
+      </w:tr>
+      <w:tr>
+        <w:tc>
+          <w:tcPr/>
+          <w:p>
+            <w:pPr>
+              <w:pStyle w:val="Compact"/>
+            </w:pPr>
+            <w:r>
+              <w:t xml:space="preserve">6</w:t>
+            </w:r>
+          </w:p>
+        </w:tc>
+        <w:tc>
+          <w:tcPr/>
+          <w:p>
+            <w:pPr>
+              <w:pStyle w:val="Compact"/>
+            </w:pPr>
+            <w:r>
+              <w:t xml:space="preserve">Dependència directa</w:t>
+            </w:r>
+          </w:p>
+        </w:tc>
+        <w:tc>
+          <w:tcPr/>
+          <w:p>
+            <w:pPr>
+              <w:pStyle w:val="Compact"/>
+            </w:pPr>
+            <w:r>
+              <w:t xml:space="preserve">204</w:t>
+            </w:r>
+          </w:p>
+        </w:tc>
+        <w:tc>
+          <w:tcPr/>
+          <w:p>
+            <w:pPr>
+              <w:pStyle w:val="Compact"/>
+            </w:pPr>
+            <w:r>
+              <w:t xml:space="preserve">1:38</w:t>
+            </w:r>
+          </w:p>
+        </w:tc>
+        <w:tc>
+          <w:tcPr/>
+          <w:p>
+            <w:pPr>
+              <w:pStyle w:val="Compact"/>
+            </w:pPr>
+            <w:r>
+              <w:t xml:space="preserve">1:34</w:t>
+            </w:r>
+          </w:p>
+        </w:tc>
+        <w:tc>
+          <w:tcPr/>
+          <w:p>
+            <w:pPr>
+              <w:pStyle w:val="Compact"/>
+            </w:pPr>
+            <w:r>
+              <w:t xml:space="preserve">1:31</w:t>
+            </w:r>
+          </w:p>
+        </w:tc>
+        <w:tc>
+          <w:tcPr/>
+          <w:p>
+            <w:pPr>
+              <w:pStyle w:val="Compact"/>
+            </w:pPr>
+            <w:r>
+              <w:t xml:space="preserve">6:49</w:t>
+            </w:r>
+          </w:p>
+        </w:tc>
+      </w:tr>
+      <w:tr>
+        <w:tc>
+          <w:tcPr/>
+          <w:p>
+            <w:pPr>
+              <w:pStyle w:val="Compact"/>
+            </w:pPr>
+            <w:r>
+              <w:t xml:space="preserve">7</w:t>
+            </w:r>
+          </w:p>
+        </w:tc>
+        <w:tc>
+          <w:tcPr/>
+          <w:p>
+            <w:pPr>
+              <w:pStyle w:val="Compact"/>
+            </w:pPr>
+            <w:r>
+              <w:t xml:space="preserve">Port de sortida i adaptador</w:t>
+            </w:r>
+          </w:p>
+        </w:tc>
+        <w:tc>
+          <w:tcPr/>
+          <w:p>
+            <w:pPr>
+              <w:pStyle w:val="Compact"/>
+            </w:pPr>
+            <w:r>
+              <w:t xml:space="preserve">263</w:t>
+            </w:r>
+          </w:p>
+        </w:tc>
+        <w:tc>
+          <w:tcPr/>
+          <w:p>
+            <w:pPr>
+              <w:pStyle w:val="Compact"/>
+            </w:pPr>
+            <w:r>
+              <w:t xml:space="preserve">2:06</w:t>
+            </w:r>
+          </w:p>
+        </w:tc>
+        <w:tc>
+          <w:tcPr/>
+          <w:p>
+            <w:pPr>
+              <w:pStyle w:val="Compact"/>
+            </w:pPr>
+            <w:r>
+              <w:t xml:space="preserve">2:01</w:t>
+            </w:r>
+          </w:p>
+        </w:tc>
+        <w:tc>
+          <w:tcPr/>
+          <w:p>
+            <w:pPr>
+              <w:pStyle w:val="Compact"/>
+            </w:pPr>
+            <w:r>
+              <w:t xml:space="preserve">1:57</w:t>
+            </w:r>
+          </w:p>
+        </w:tc>
+        <w:tc>
+          <w:tcPr/>
+          <w:p>
+            <w:pPr>
+              <w:pStyle w:val="Compact"/>
+            </w:pPr>
+            <w:r>
+              <w:t xml:space="preserve">8:50</w:t>
+            </w:r>
+          </w:p>
+        </w:tc>
+      </w:tr>
+      <w:tr>
+        <w:tc>
+          <w:tcPr/>
+          <w:p>
+            <w:pPr>
+              <w:pStyle w:val="Compact"/>
+            </w:pPr>
+            <w:r>
+              <w:t xml:space="preserve">8</w:t>
+            </w:r>
+          </w:p>
+        </w:tc>
+        <w:tc>
+          <w:tcPr/>
+          <w:p>
+            <w:pPr>
+              <w:pStyle w:val="Compact"/>
+            </w:pPr>
+            <w:r>
+              <w:t xml:space="preserve">Port patrimonial</w:t>
+            </w:r>
+          </w:p>
+        </w:tc>
+        <w:tc>
+          <w:tcPr/>
+          <w:p>
+            <w:pPr>
+              <w:pStyle w:val="Compact"/>
+            </w:pPr>
+            <w:r>
+              <w:t xml:space="preserve">196</w:t>
+            </w:r>
+          </w:p>
+        </w:tc>
+        <w:tc>
+          <w:tcPr/>
+          <w:p>
+            <w:pPr>
+              <w:pStyle w:val="Compact"/>
+            </w:pPr>
+            <w:r>
+              <w:t xml:space="preserve">1:34</w:t>
+            </w:r>
+          </w:p>
+        </w:tc>
+        <w:tc>
+          <w:tcPr/>
+          <w:p>
+            <w:pPr>
+              <w:pStyle w:val="Compact"/>
+            </w:pPr>
+            <w:r>
+              <w:t xml:space="preserve">1:30</w:t>
+            </w:r>
+          </w:p>
+        </w:tc>
+        <w:tc>
+          <w:tcPr/>
+          <w:p>
+            <w:pPr>
+              <w:pStyle w:val="Compact"/>
+            </w:pPr>
+            <w:r>
+              <w:t xml:space="preserve">1:27</w:t>
+            </w:r>
+          </w:p>
+        </w:tc>
+        <w:tc>
+          <w:tcPr/>
+          <w:p>
+            <w:pPr>
+              <w:pStyle w:val="Compact"/>
+            </w:pPr>
+            <w:r>
+              <w:t xml:space="preserve">10:20</w:t>
+            </w:r>
+          </w:p>
+        </w:tc>
+      </w:tr>
+      <w:tr>
+        <w:tc>
+          <w:tcPr/>
+          <w:p>
+            <w:pPr>
+              <w:pStyle w:val="Compact"/>
+            </w:pPr>
+            <w:r>
+              <w:t xml:space="preserve">9</w:t>
+            </w:r>
+          </w:p>
+        </w:tc>
+        <w:tc>
+          <w:tcPr/>
+          <w:p>
+            <w:pPr>
+              <w:pStyle w:val="Compact"/>
+            </w:pPr>
+            <w:r>
+              <w:t xml:space="preserve">Domini financer</w:t>
+            </w:r>
+          </w:p>
+        </w:tc>
+        <w:tc>
+          <w:tcPr/>
+          <w:p>
+            <w:pPr>
+              <w:pStyle w:val="Compact"/>
+            </w:pPr>
+            <w:r>
+              <w:t xml:space="preserve">158</w:t>
+            </w:r>
+          </w:p>
+        </w:tc>
+        <w:tc>
+          <w:tcPr/>
+          <w:p>
+            <w:pPr>
+              <w:pStyle w:val="Compact"/>
+            </w:pPr>
+            <w:r>
+              <w:t xml:space="preserve">1:16</w:t>
+            </w:r>
+          </w:p>
+        </w:tc>
+        <w:tc>
+          <w:tcPr/>
+          <w:p>
+            <w:pPr>
+              <w:pStyle w:val="Compact"/>
+            </w:pPr>
+            <w:r>
+              <w:t xml:space="preserve">1:13</w:t>
+            </w:r>
+          </w:p>
+        </w:tc>
+        <w:tc>
+          <w:tcPr/>
+          <w:p>
+            <w:pPr>
+              <w:pStyle w:val="Compact"/>
+            </w:pPr>
+            <w:r>
+              <w:t xml:space="preserve">1:10</w:t>
+            </w:r>
+          </w:p>
+        </w:tc>
+        <w:tc>
+          <w:tcPr/>
+          <w:p>
+            <w:pPr>
+              <w:pStyle w:val="Compact"/>
+            </w:pPr>
+            <w:r>
+              <w:t xml:space="preserve">11:33</w:t>
+            </w:r>
+          </w:p>
+        </w:tc>
+      </w:tr>
+      <w:tr>
+        <w:tc>
+          <w:tcPr/>
+          <w:p>
+            <w:pPr>
+              <w:pStyle w:val="Compact"/>
+            </w:pPr>
+            <w:r>
+              <w:t xml:space="preserve">10</w:t>
+            </w:r>
+          </w:p>
+        </w:tc>
+        <w:tc>
+          <w:tcPr/>
+          <w:p>
+            <w:pPr>
+              <w:pStyle w:val="Compact"/>
+            </w:pPr>
+            <w:r>
+              <w:t xml:space="preserve">Idea clau i tancament</w:t>
+            </w:r>
+          </w:p>
+        </w:tc>
+        <w:tc>
+          <w:tcPr/>
+          <w:p>
+            <w:pPr>
+              <w:pStyle w:val="Compact"/>
+            </w:pPr>
+            <w:r>
+              <w:t xml:space="preserve">104</w:t>
+            </w:r>
+          </w:p>
+        </w:tc>
+        <w:tc>
+          <w:tcPr/>
+          <w:p>
+            <w:pPr>
+              <w:pStyle w:val="Compact"/>
+            </w:pPr>
+            <w:r>
+              <w:t xml:space="preserve">0:50</w:t>
+            </w:r>
+          </w:p>
+        </w:tc>
+        <w:tc>
+          <w:tcPr/>
+          <w:p>
+            <w:pPr>
+              <w:pStyle w:val="Compact"/>
+            </w:pPr>
+            <w:r>
+              <w:t xml:space="preserve">0:48</w:t>
+            </w:r>
+          </w:p>
+        </w:tc>
+        <w:tc>
+          <w:tcPr/>
+          <w:p>
+            <w:pPr>
+              <w:pStyle w:val="Compact"/>
+            </w:pPr>
+            <w:r>
+              <w:t xml:space="preserve">0:46</w:t>
+            </w:r>
+          </w:p>
+        </w:tc>
+        <w:tc>
+          <w:tcPr/>
+          <w:p>
+            <w:pPr>
+              <w:pStyle w:val="Compact"/>
+            </w:pPr>
+            <w:r>
+              <w:t xml:space="preserve">12:21</w:t>
+            </w:r>
+          </w:p>
+        </w:tc>
+      </w:tr>
+      <w:tr>
+        <w:tc>
+          <w:tcPr/>
+          <w:p>
+            <w:pPr>
+              <w:pStyle w:val="Compact"/>
+            </w:pPr>
+            <w:r>
+              <w:rPr>
+                <w:b/>
+                <w:bCs/>
+              </w:rPr>
+              <w:t xml:space="preserve">Total</w:t>
+            </w:r>
+          </w:p>
+        </w:tc>
+        <w:tc>
+          <w:tcPr/>
+          <w:p>
+            <w:pPr>
+              <w:pStyle w:val="Compact"/>
+            </w:pPr>
+            <w:r>
+              <w:rPr>
+                <w:b/>
+                <w:bCs/>
+              </w:rPr>
+              <w:t xml:space="preserve">Cos principal</w:t>
+            </w:r>
+          </w:p>
+        </w:tc>
+        <w:tc>
+          <w:tcPr/>
+          <w:p>
+            <w:pPr>
+              <w:pStyle w:val="Compact"/>
+            </w:pPr>
+            <w:r>
+              <w:rPr>
+                <w:b/>
+                <w:bCs/>
+              </w:rPr>
+              <w:t xml:space="preserve">1.606</w:t>
+            </w:r>
+          </w:p>
+        </w:tc>
+        <w:tc>
+          <w:tcPr/>
+          <w:p>
+            <w:pPr>
+              <w:pStyle w:val="Compact"/>
+            </w:pPr>
+            <w:r>
+              <w:rPr>
+                <w:b/>
+                <w:bCs/>
+              </w:rPr>
+              <w:t xml:space="preserve">12:51</w:t>
+            </w:r>
+          </w:p>
+        </w:tc>
+        <w:tc>
+          <w:tcPr/>
+          <w:p>
+            <w:pPr>
+              <w:pStyle w:val="Compact"/>
+            </w:pPr>
+            <w:r>
+              <w:rPr>
+                <w:b/>
+                <w:bCs/>
+              </w:rPr>
+              <w:t xml:space="preserve">12:21</w:t>
+            </w:r>
+          </w:p>
+        </w:tc>
+        <w:tc>
+          <w:tcPr/>
+          <w:p>
+            <w:pPr>
+              <w:pStyle w:val="Compact"/>
+            </w:pPr>
+            <w:r>
+              <w:rPr>
+                <w:b/>
+                <w:bCs/>
+              </w:rPr>
+              <w:t xml:space="preserve">11:54</w:t>
+            </w:r>
+          </w:p>
+        </w:tc>
+        <w:tc>
+          <w:tcPr/>
+          <w:p>
+            <w:pPr>
+              <w:pStyle w:val="Compact"/>
+            </w:pPr>
+            <w:r>
+              <w:rPr>
+                <w:b/>
+                <w:bCs/>
+              </w:rPr>
+              <w:t xml:space="preserve">12:21</w:t>
+            </w:r>
+          </w:p>
+        </w:tc>
+      </w:tr>
+    </w:tbl>
+    <w:p>
+      <w:pPr>
+        <w:pStyle w:val="Textoindependiente"/>
+      </w:pPr>
+      <w:r>
+        <w:t xml:space="preserve">Estimació anterior de treball: 18:15-19:00. Temps eliminat del cos principal: una diapositiva prevista d’1:25. Nova estimació prudent amb pauses reals: 16:00-17:15. Marge respecte dels 20 minuts: aproximadament 2:45-4:00, pendent de validació amb assaig oral real.</w:t>
+      </w:r>
+    </w:p>
+    <w:p>
+      <w:r>
+        <w:pict>
+          <v:rect style="width:0;height:1.5pt" o:hralign="center" o:hrstd="t" o:hr="t"/>
+        </w:pict>
+      </w:r>
+    </w:p>
+    <w:bookmarkEnd w:id="35"/>
+    <w:bookmarkStart w:id="40" w:name="pla-dentrenament-comunicatiu"/>
+    <w:p>
+      <w:pPr>
+        <w:pStyle w:val="Ttulo2"/>
+      </w:pPr>
+      <w:r>
+        <w:t xml:space="preserve">5. Pla d’entrenament comunicatiu</w:t>
+      </w:r>
+    </w:p>
+    <w:bookmarkStart w:id="36" w:name="entrenament-inicial"/>
+    <w:p>
+      <w:pPr>
+        <w:pStyle w:val="Ttulo3"/>
+      </w:pPr>
+      <w:r>
+        <w:t xml:space="preserve">Entrenament inicial</w:t>
+      </w:r>
+    </w:p>
+    <w:p>
+      <w:pPr>
+        <w:pStyle w:val="FirstParagraph"/>
+      </w:pPr>
+      <w:r>
+        <w:t xml:space="preserve">Llegeix el guió complet del cos principal en veu alta dues vegades sense cronòmetre. L’objectiu no és memoritzar, sinó detectar frases que no sonen naturals. Marca amb llapis les frases que vols dir exactament igual: la definició inicial, la distinció entre flux i dependència, la idea del port com a contracte representat amb una interfície, i la conclusió final. La resta pot ser més flexible.</w:t>
+      </w:r>
+    </w:p>
+    <w:p>
+      <w:pPr>
+        <w:pStyle w:val="Textoindependiente"/>
+      </w:pPr>
+      <w:r>
+        <w:t xml:space="preserve">Després fes una lectura cronometrada només del cos principal, sense annex. Ritme orientatiu: 125-135 paraules per minut, amb pauses reals. No intentis ocupar exactament vint minuts. Si el temps queda per sota del marge previst, no afegeixis contingut tècnic nou; amplia pauses, mirada, assenyalament de diagrames i transicions.</w:t>
+      </w:r>
+    </w:p>
+    <w:p>
+      <w:pPr>
+        <w:pStyle w:val="Textoindependiente"/>
+      </w:pPr>
+      <w:r>
+        <w:t xml:space="preserve">La demo opcional s’ha d’assajar per separat. No s’ha d’incloure en el cronòmetre principal.</w:t>
+      </w:r>
+    </w:p>
     <w:bookmarkEnd w:id="36"/>
-    <w:bookmarkStart w:id="41" w:name="pla-dentrenament-comunicatiu"/>
-    <w:p>
-      <w:pPr>
-        <w:pStyle w:val="Ttulo2"/>
-      </w:pPr>
-      <w:r>
-        <w:t xml:space="preserve">4. Pla d’entrenament comunicatiu</w:t>
-      </w:r>
-    </w:p>
-    <w:bookmarkStart w:id="37" w:name="entrenament-inicial"/>
+    <w:bookmarkStart w:id="37" w:name="entrenament-intermedi"/>
     <w:p>
       <w:pPr>
         <w:pStyle w:val="Ttulo3"/>
       </w:pPr>
       <w:r>
-        <w:t xml:space="preserve">Entrenament inicial</w:t>
+        <w:t xml:space="preserve">Entrenament intermedi</w:t>
       </w:r>
     </w:p>
     <w:p>
@@ -2874,40 +3784,6 @@
         <w:pStyle w:val="FirstParagraph"/>
       </w:pPr>
       <w:r>
-        <w:t xml:space="preserve">Llegeix el guió complet del cos principal en veu alta dues vegades sense cronòmetre. L’objectiu no és memoritzar, sinó detectar frases que no sonen naturals. Marca amb llapis les frases que vols dir exactament igual: la definició inicial, la distinció entre flux i dependència, la idea del port com a contracte representat amb una interfície, i la conclusió final. La resta pot ser més flexible.</w:t>
-      </w:r>
-    </w:p>
-    <w:p>
-      <w:pPr>
-        <w:pStyle w:val="Textoindependiente"/>
-      </w:pPr>
-      <w:r>
-        <w:t xml:space="preserve">Després fes una lectura cronometrada només del cos principal, sense annex. Ritme orientatiu: 125-135 paraules per minut, amb pauses reals. Si surt per sobre de 19 minuts, retalla detall de les diapositives 5, 8 o 9. Si surt per sota de 18:15, no afegeixis contingut tècnic nou; amplia pauses, mirada i transicions.</w:t>
-      </w:r>
-    </w:p>
-    <w:p>
-      <w:pPr>
-        <w:pStyle w:val="Textoindependiente"/>
-      </w:pPr>
-      <w:r>
-        <w:t xml:space="preserve">La demo opcional s’ha d’assajar per separat. No s’ha d’incloure en el cronòmetre principal.</w:t>
-      </w:r>
-    </w:p>
-    <w:bookmarkEnd w:id="37"/>
-    <w:bookmarkStart w:id="38" w:name="entrenament-intermedi"/>
-    <w:p>
-      <w:pPr>
-        <w:pStyle w:val="Ttulo3"/>
-      </w:pPr>
-      <w:r>
-        <w:t xml:space="preserve">Entrenament intermedi</w:t>
-      </w:r>
-    </w:p>
-    <w:p>
-      <w:pPr>
-        <w:pStyle w:val="FirstParagraph"/>
-      </w:pPr>
-      <w:r>
         <w:t xml:space="preserve">Practica per blocs, no tota la presentació sempre sencera:</w:t>
       </w:r>
     </w:p>
@@ -2916,7 +3792,7 @@
         <w:pStyle w:val="Compact"/>
         <w:numPr>
           <w:ilvl w:val="0"/>
-          <w:numId w:val="1014"/>
+          <w:numId w:val="1013"/>
         </w:numPr>
       </w:pPr>
       <w:r>
@@ -2928,7 +3804,7 @@
         <w:pStyle w:val="Compact"/>
         <w:numPr>
           <w:ilvl w:val="0"/>
-          <w:numId w:val="1014"/>
+          <w:numId w:val="1013"/>
         </w:numPr>
       </w:pPr>
       <w:r>
@@ -2940,19 +3816,19 @@
         <w:pStyle w:val="Compact"/>
         <w:numPr>
           <w:ilvl w:val="0"/>
-          <w:numId w:val="1014"/>
-        </w:numPr>
-      </w:pPr>
-      <w:r>
-        <w:t xml:space="preserve">Bloc 3: diapositives 9-11, domini financer, HexaStock, conclusió i agraïment.</w:t>
-      </w:r>
-    </w:p>
-    <w:p>
-      <w:pPr>
-        <w:pStyle w:val="Compact"/>
-        <w:numPr>
-          <w:ilvl w:val="0"/>
-          <w:numId w:val="1014"/>
+          <w:numId w:val="1013"/>
+        </w:numPr>
+      </w:pPr>
+      <w:r>
+        <w:t xml:space="preserve">Bloc 3: diapositives 9-10, domini financer, conclusió i agraïment.</w:t>
+      </w:r>
+    </w:p>
+    <w:p>
+      <w:pPr>
+        <w:pStyle w:val="Compact"/>
+        <w:numPr>
+          <w:ilvl w:val="0"/>
+          <w:numId w:val="1013"/>
         </w:numPr>
       </w:pPr>
       <w:r>
@@ -2991,8 +3867,8 @@
         <w:t xml:space="preserve">. Evita caminar mentre expliques una distinció fina; atura’t, formula-la i continua.</w:t>
       </w:r>
     </w:p>
-    <w:bookmarkEnd w:id="38"/>
-    <w:bookmarkStart w:id="39" w:name="assaig-final"/>
+    <w:bookmarkEnd w:id="37"/>
+    <w:bookmarkStart w:id="38" w:name="assaig-final"/>
     <w:p>
       <w:pPr>
         <w:pStyle w:val="Ttulo3"/>
@@ -3014,7 +3890,7 @@
         <w:pStyle w:val="Compact"/>
         <w:numPr>
           <w:ilvl w:val="0"/>
-          <w:numId w:val="1015"/>
+          <w:numId w:val="1014"/>
         </w:numPr>
       </w:pPr>
       <w:r>
@@ -3026,7 +3902,7 @@
         <w:pStyle w:val="Compact"/>
         <w:numPr>
           <w:ilvl w:val="0"/>
-          <w:numId w:val="1015"/>
+          <w:numId w:val="1014"/>
         </w:numPr>
       </w:pPr>
       <w:r>
@@ -3038,7 +3914,7 @@
         <w:pStyle w:val="Compact"/>
         <w:numPr>
           <w:ilvl w:val="0"/>
-          <w:numId w:val="1015"/>
+          <w:numId w:val="1014"/>
         </w:numPr>
       </w:pPr>
       <w:r>
@@ -3050,7 +3926,7 @@
         <w:pStyle w:val="FirstParagraph"/>
       </w:pPr>
       <w:r>
-        <w:t xml:space="preserve">Grava una passada en vídeo. Revisa només quatre indicadors: si mires massa la pantalla, si acceleres a les diapositives 6-10, si les pauses existeixen de veritat, i si la frase</w:t>
+        <w:t xml:space="preserve">Grava una passada en vídeo. Revisa només quatre indicadors: si mires massa la pantalla, si acceleres a les diapositives 6-9, si les pauses existeixen de veritat, i si la frase</w:t>
       </w:r>
       <w:r>
         <w:t xml:space="preserve"> </w:t>
@@ -3076,8 +3952,8 @@
         <w:t xml:space="preserve">Després grava una passada independent de l’annex opcional. La demo ha de poder explicar-se sense reobrir tota la classe. Ha de sonar com una verificació pràctica del que ja s’ha explicat, no com una secció nova.</w:t>
       </w:r>
     </w:p>
-    <w:bookmarkEnd w:id="39"/>
-    <w:bookmarkStart w:id="40" w:name="ritme-veu-i-cos"/>
+    <w:bookmarkEnd w:id="38"/>
+    <w:bookmarkStart w:id="39" w:name="ritme-veu-i-cos"/>
     <w:p>
       <w:pPr>
         <w:pStyle w:val="Ttulo3"/>
@@ -3181,15 +4057,15 @@
         </w:pict>
       </w:r>
     </w:p>
+    <w:bookmarkEnd w:id="39"/>
     <w:bookmarkEnd w:id="40"/>
-    <w:bookmarkEnd w:id="41"/>
-    <w:bookmarkStart w:id="42" w:name="advertiments-finals"/>
+    <w:bookmarkStart w:id="41" w:name="advertiments-finals"/>
     <w:p>
       <w:pPr>
         <w:pStyle w:val="Ttulo2"/>
       </w:pPr>
       <w:r>
-        <w:t xml:space="preserve">5. Advertiments finals</w:t>
+        <w:t xml:space="preserve">6. Advertiments finals</w:t>
       </w:r>
     </w:p>
     <w:p>
@@ -3197,7 +4073,7 @@
         <w:pStyle w:val="FirstParagraph"/>
       </w:pPr>
       <w:r>
-        <w:t xml:space="preserve">Risc de temps: les diapositives 4-10 poden allargar-se fàcilment. Si vas tard, no retallis la conclusió tècnica; retalla detall del cas AGAUR, de la transferència al domini financer o de la lectura del diagrama de seqüència.</w:t>
+        <w:t xml:space="preserve">Risc de temps: les diapositives 4-9 poden allargar-se fàcilment. Si vas tard, no retallis la conclusió tècnica; retalla detall del cas AGAUR o de la transferència al domini financer.</w:t>
       </w:r>
     </w:p>
     <w:p>
@@ -3292,8 +4168,8 @@
         <w:t xml:space="preserve">Risc de confidencialitat: no mencionar endpoints, credencials, captures internes ni detalls operatius d’AGAUR. L’informe acredita l’activitat; la classe només usa el cas com a abstracció docent.</w:t>
       </w:r>
     </w:p>
+    <w:bookmarkEnd w:id="41"/>
     <w:bookmarkEnd w:id="42"/>
-    <w:bookmarkEnd w:id="43"/>
     <w:sectPr>
       <w:footnotePr>
         <w:numRestart w:val="eachSect"/>
@@ -3836,9 +4712,6 @@
     <w:abstractNumId w:val="991"/>
   </w:num>
   <w:num w:numId="1014">
-    <w:abstractNumId w:val="991"/>
-  </w:num>
-  <w:num w:numId="1015">
     <w:abstractNumId w:val="991"/>
   </w:num>
 </w:numbering>

</xml_diff>

<commit_message>
Redissenya la concreció en Java de la diapositiva 7 com a diagrama UML
El requadre de la diapositiva 7 del deck de 20 minuts mostra ara la
interfície (contracte) i l'adaptador com a targetes UML unides per la
fletxa discontínua de realització «implements», de l'adaptador cap al
port. S'afegeixen dues acotacions al guió oral canònic per assenyalar
el nou visual i una nota de preservació al recordatori de millores.
Inclou els materials derivats regenerats.

Co-Authored-By: Claude Fable 5 <noreply@anthropic.com>
</commit_message>
<xml_diff>
--- a/doc/presentations/defensa-placa-permanent-dsi-ports-sortida-hexagonal/output/REMARKABLE_materials-orals-canonics-20-minuts.docx
+++ b/doc/presentations/defensa-placa-permanent-dsi-ports-sortida-hexagonal/output/REMARKABLE_materials-orals-canonics-20-minuts.docx
@@ -598,6 +598,12 @@
       <w:r>
         <w:t xml:space="preserve">Per situar bé el concepte, quan aquí parlem d’un port no estem parlant d’un element físic ni d’un detall d’infraestructura. Conceptualment, el port és un contracte; en aquesta implementació Java, el representem amb una interfície.</w:t>
       </w:r>
+      <w:r>
+        <w:t xml:space="preserve"> </w:t>
+      </w:r>
+      <w:r>
+        <w:t xml:space="preserve">[assenyalar el requadre «Concreció en Java»: la targeta superior és la interfície, el contracte]</w:t>
+      </w:r>
     </w:p>
     <w:p>
       <w:pPr>
@@ -613,6 +619,12 @@
       </w:pPr>
       <w:r>
         <w:t xml:space="preserve">Després, l’adaptador és la peça que implementa aquesta interfície i sap com anar realment a buscar aquella informació al sistema extern corresponent.</w:t>
+      </w:r>
+      <w:r>
+        <w:t xml:space="preserve"> </w:t>
+      </w:r>
+      <w:r>
+        <w:t xml:space="preserve">[assenyalar la fletxa discontínua «implements», de l’adaptador cap a la interfície]</w:t>
       </w:r>
     </w:p>
     <w:p>

</xml_diff>

<commit_message>
Actualitza els materials derivats de les presentacions
</commit_message>
<xml_diff>
--- a/doc/presentations/defensa-placa-permanent-dsi-ports-sortida-hexagonal/output/REMARKABLE_materials-orals-canonics-20-minuts.docx
+++ b/doc/presentations/defensa-placa-permanent-dsi-ports-sortida-hexagonal/output/REMARKABLE_materials-orals-canonics-20-minuts.docx
@@ -203,7 +203,7 @@
         <w:pStyle w:val="FirstParagraph"/>
       </w:pPr>
       <w:r>
-        <w:t xml:space="preserve">Temps total previst d’assaig del cos principal: aproximadament 16:20-17:45, sense demo en viu. La lectura neta del text queda al voltant de 12:00-13:00 segons el ritme; la validació definitiva s’ha de fer amb assaig oral real.</w:t>
+        <w:t xml:space="preserve">Temps total previst d’assaig del cos principal: aproximadament 17:05-18:30, sense demo en viu. La lectura neta del text queda al voltant de 12:45-13:45 segons el ritme; la validació definitiva s’ha de fer amb assaig oral real.</w:t>
       </w:r>
     </w:p>
     <w:p>
@@ -488,13 +488,13 @@
       </w:r>
     </w:p>
     <w:bookmarkEnd w:id="13"/>
-    <w:bookmarkStart w:id="14" w:name="Xef277339b9bbac09350e539c95ba9caf6c86f97"/>
+    <w:bookmarkStart w:id="14" w:name="X316054ed1b0af9ffc7ab9c0467862954676b646"/>
     <w:p>
       <w:pPr>
         <w:pStyle w:val="Ttulo3"/>
       </w:pPr>
       <w:r>
-        <w:t xml:space="preserve">Diapositiva 6. Dependència directa entre procediment i integració - 1:55</w:t>
+        <w:t xml:space="preserve">Diapositiva 6. Dependència directa entre procediment i integració - 2:20</w:t>
       </w:r>
     </w:p>
     <w:p>
@@ -526,7 +526,39 @@
         <w:pStyle w:val="Textoindependiente"/>
       </w:pPr>
       <w:r>
-        <w:t xml:space="preserve">Des del punt de vista de l’enginyeria del software, això incrementa tres riscos. Primer, acoblament tecnològic: el cas d’ús coneix massa detalls externs. Segon, manteniment més fràgil: canvis d’infraestructura obliguen a revisar lògica d’aplicació. I tercer, més superfície d’impacte davant de canvis externs. [assenyalar les tres caixes]</w:t>
+        <w:t xml:space="preserve">Les tres caixes no representen tres riscos independents. Són tres moments correlacionats d’una mateixa cadena causal. [assenyalar d’esquerra a dreta]</w:t>
+      </w:r>
+    </w:p>
+    <w:p>
+      <w:pPr>
+        <w:pStyle w:val="Textoindependiente"/>
+      </w:pPr>
+      <w:r>
+        <w:t xml:space="preserve">A l’esquerra hi ha la causa: l’acoblament tecnològic. El cas d’ús incorpora detalls que no pertanyen al llenguatge del procediment, com SOAP/XML, DTOs, clients o codis d’error de PICA.</w:t>
+      </w:r>
+    </w:p>
+    <w:p>
+      <w:pPr>
+        <w:pStyle w:val="Textoindependiente"/>
+      </w:pPr>
+      <w:r>
+        <w:t xml:space="preserve">Al centre hi ha la propagació: com que aquests detalls han entrat dins la frontera del cas d’ús, una evolució de la integració travessa aquesta frontera i obliga a revisar lògica d’aplicació.</w:t>
+      </w:r>
+    </w:p>
+    <w:p>
+      <w:pPr>
+        <w:pStyle w:val="Textoindependiente"/>
+      </w:pPr>
+      <w:r>
+        <w:t xml:space="preserve">A la dreta hi ha la conseqüència: augmenta la superfície de codi afectada. Cal modificar i revalidar més comportament i, per això, el manteniment esdevé més fràgil.</w:t>
+      </w:r>
+    </w:p>
+    <w:p>
+      <w:pPr>
+        <w:pStyle w:val="Textoindependiente"/>
+      </w:pPr>
+      <w:r>
+        <w:t xml:space="preserve">Per tant, no estem sumant tres riscos diferents. Estem mostrant com un únic acoblament fa que un canvi d’infraestructura es propagui fins al procediment administratiu.</w:t>
       </w:r>
     </w:p>
     <w:p>
@@ -1028,7 +1060,7 @@
         </w:numPr>
       </w:pPr>
       <w:r>
-        <w:t xml:space="preserve">Classe de DSI, no explicació completa d’arquitectura hexagonal.</w:t>
+        <w:t xml:space="preserve">Funció: obrir la microlliçó i delimitar-ne el focus.</w:t>
       </w:r>
     </w:p>
     <w:p>
@@ -1040,7 +1072,7 @@
         </w:numPr>
       </w:pPr>
       <w:r>
-        <w:t xml:space="preserve">Informe incorporat a la documentació de la convocatòria: consultoria especialitzada per a la Generalitat/AGAUR.</w:t>
+        <w:t xml:space="preserve">Context: classe de DSI i cas real acreditat de consultoria per a la Generalitat/AGAUR.</w:t>
       </w:r>
     </w:p>
     <w:p>
@@ -1052,7 +1084,7 @@
         </w:numPr>
       </w:pPr>
       <w:r>
-        <w:t xml:space="preserve">Trobada entre el món acadèmic i el professional.</w:t>
+        <w:t xml:space="preserve">Missatge: trobada entre dimensió acadèmica i professional, sense entrar en detalls interns.</w:t>
       </w:r>
     </w:p>
     <w:p>
@@ -1064,7 +1096,7 @@
         </w:numPr>
       </w:pPr>
       <w:r>
-        <w:t xml:space="preserve">Cas real com a base docent, sense entrar en detalls interns.</w:t>
+        <w:t xml:space="preserve">No oblidar: no és una panoràmica completa de l’arquitectura hexagonal.</w:t>
       </w:r>
     </w:p>
     <w:p>
@@ -1076,7 +1108,28 @@
         </w:numPr>
       </w:pPr>
       <w:r>
-        <w:t xml:space="preserve">Transició: ens centrarem en una decisió concreta, el port de sortida.</w:t>
+        <w:t xml:space="preserve">Frase de focus: dissenyar un port de sortida quan el cas d’ús necessita informació externa.</w:t>
+      </w:r>
+    </w:p>
+    <w:p>
+      <w:pPr>
+        <w:pStyle w:val="Compact"/>
+        <w:numPr>
+          <w:ilvl w:val="0"/>
+          <w:numId w:val="1002"/>
+        </w:numPr>
+      </w:pPr>
+      <w:r>
+        <w:t xml:space="preserve">Transició:</w:t>
+      </w:r>
+      <w:r>
+        <w:t xml:space="preserve"> </w:t>
+      </w:r>
+      <w:r>
+        <w:rPr>
+          <w:rStyle w:val="VerbatimChar"/>
+        </w:rPr>
+        <w:t xml:space="preserve">Situem primer la sessió dins l'assignatura.</w:t>
       </w:r>
     </w:p>
     <w:bookmarkEnd w:id="23"/>
@@ -1098,7 +1151,7 @@
         </w:numPr>
       </w:pPr>
       <w:r>
-        <w:t xml:space="preserve">Pla docent: 3r curs, 6 ECTS, assignatura obligatòria.</w:t>
+        <w:t xml:space="preserve">Funció: justificar l’encaix de la sessió en el pla docent.</w:t>
       </w:r>
     </w:p>
     <w:p>
@@ -1110,7 +1163,7 @@
         </w:numPr>
       </w:pPr>
       <w:r>
-        <w:t xml:space="preserve">Bloc: Clean Architecture i arquitectura hexagonal, ports i adaptadors, mapping, modularització i Domain-Driven Design.</w:t>
+        <w:t xml:space="preserve">Assenyalar: DSI, 3r curs i 6 ECTS.</w:t>
       </w:r>
     </w:p>
     <w:p>
@@ -1122,7 +1175,7 @@
         </w:numPr>
       </w:pPr>
       <w:r>
-        <w:t xml:space="preserve">Justificar que la sessió encaixa en el temari.</w:t>
+        <w:t xml:space="preserve">Bloc: Clean Architecture, arquitectura hexagonal, ports i adaptadors, mapping, modularització i DDD.</w:t>
       </w:r>
     </w:p>
     <w:p>
@@ -1134,7 +1187,7 @@
         </w:numPr>
       </w:pPr>
       <w:r>
-        <w:t xml:space="preserve">No panoràmica completa; focus en ports de sortida.</w:t>
+        <w:t xml:space="preserve">No convertir la diapositiva en una enumeració llarga del temari: el focus és una decisió concreta sobre ports de sortida.</w:t>
       </w:r>
     </w:p>
     <w:p>
@@ -1146,7 +1199,16 @@
         </w:numPr>
       </w:pPr>
       <w:r>
-        <w:t xml:space="preserve">Transició: objectiu mínim i entrada ràpida al cas real.</w:t>
+        <w:t xml:space="preserve">Transició:</w:t>
+      </w:r>
+      <w:r>
+        <w:t xml:space="preserve"> </w:t>
+      </w:r>
+      <w:r>
+        <w:rPr>
+          <w:rStyle w:val="VerbatimChar"/>
+        </w:rPr>
+        <w:t xml:space="preserve">Amb aquest context, formulem l'objectiu mínim de la sessió.</w:t>
       </w:r>
     </w:p>
     <w:bookmarkEnd w:id="24"/>
@@ -1168,7 +1230,7 @@
         </w:numPr>
       </w:pPr>
       <w:r>
-        <w:t xml:space="preserve">Passar-hi ràpid: és una diapositiva pont, no una explicació teòrica llarga.</w:t>
+        <w:t xml:space="preserve">Funció: diapositiva pont; passar-hi ràpid i no anticipar tota la teoria.</w:t>
       </w:r>
     </w:p>
     <w:p>
@@ -1180,7 +1242,16 @@
         </w:numPr>
       </w:pPr>
       <w:r>
-        <w:t xml:space="preserve">Frase clau: el cas d’ús necessita una capacitat, no una tecnologia.</w:t>
+        <w:t xml:space="preserve">Frase clau, mirant el tribunal:</w:t>
+      </w:r>
+      <w:r>
+        <w:t xml:space="preserve"> </w:t>
+      </w:r>
+      <w:r>
+        <w:rPr>
+          <w:rStyle w:val="VerbatimChar"/>
+        </w:rPr>
+        <w:t xml:space="preserve">El cas d'ús necessita una capacitat, no una tecnologia.</w:t>
       </w:r>
     </w:p>
     <w:p>
@@ -1192,7 +1263,7 @@
         </w:numPr>
       </w:pPr>
       <w:r>
-        <w:t xml:space="preserve">Tres accions: identificar necessitat, definir port, implementar adaptadors.</w:t>
+        <w:t xml:space="preserve">Assenyalar les tres decisions: identificar necessitat, definir port i implementar adaptador(s).</w:t>
       </w:r>
     </w:p>
     <w:p>
@@ -1204,7 +1275,7 @@
         </w:numPr>
       </w:pPr>
       <w:r>
-        <w:t xml:space="preserve">Anunciar metodologia: primer cas real, després abstracció arquitectònica.</w:t>
+        <w:t xml:space="preserve">Metodologia: primer el cas real; després, l’abstracció arquitectònica.</w:t>
       </w:r>
     </w:p>
     <w:p>
@@ -1216,7 +1287,16 @@
         </w:numPr>
       </w:pPr>
       <w:r>
-        <w:t xml:space="preserve">Transició: començar pel procediment de beca.</w:t>
+        <w:t xml:space="preserve">Transició:</w:t>
+      </w:r>
+      <w:r>
+        <w:t xml:space="preserve"> </w:t>
+      </w:r>
+      <w:r>
+        <w:rPr>
+          <w:rStyle w:val="VerbatimChar"/>
+        </w:rPr>
+        <w:t xml:space="preserve">Comencem, per tant, pel procediment de beca.</w:t>
       </w:r>
     </w:p>
     <w:bookmarkEnd w:id="25"/>
@@ -1238,7 +1318,7 @@
         </w:numPr>
       </w:pPr>
       <w:r>
-        <w:t xml:space="preserve">Primer entendre procediment, després tecnologia.</w:t>
+        <w:t xml:space="preserve">Funció: establir el problema funcional abans de parlar de tecnologia.</w:t>
       </w:r>
     </w:p>
     <w:p>
@@ -1250,7 +1330,7 @@
         </w:numPr>
       </w:pPr>
       <w:r>
-        <w:t xml:space="preserve">Sol·licitud, expedient, requisits generals, econòmics, revisió, resolució.</w:t>
+        <w:t xml:space="preserve">Assenyalar la seqüència: sol·licitud, expedient, requisits, revisió i resolució.</w:t>
       </w:r>
     </w:p>
     <w:p>
@@ -1262,7 +1342,7 @@
         </w:numPr>
       </w:pPr>
       <w:r>
-        <w:t xml:space="preserve">Renda i patrimoni com a decisió funcional.</w:t>
+        <w:t xml:space="preserve">Focus: l’avaluació econòmica necessita renda i patrimoni fiables.</w:t>
       </w:r>
     </w:p>
     <w:p>
@@ -1274,7 +1354,7 @@
         </w:numPr>
       </w:pPr>
       <w:r>
-        <w:t xml:space="preserve">Evitar començar per SOAP/REST/PICA.</w:t>
+        <w:t xml:space="preserve">No oblidar: la decisió administrativa i el mecanisme tècnic són nivells diferents.</w:t>
       </w:r>
     </w:p>
     <w:p>
@@ -1286,7 +1366,28 @@
         </w:numPr>
       </w:pPr>
       <w:r>
-        <w:t xml:space="preserve">Transició: quines dades externes fan falta?</w:t>
+        <w:t xml:space="preserve">Evitar encara SOAP, REST, PICA o bases de dades.</w:t>
+      </w:r>
+    </w:p>
+    <w:p>
+      <w:pPr>
+        <w:pStyle w:val="Compact"/>
+        <w:numPr>
+          <w:ilvl w:val="0"/>
+          <w:numId w:val="1005"/>
+        </w:numPr>
+      </w:pPr>
+      <w:r>
+        <w:t xml:space="preserve">Transició:</w:t>
+      </w:r>
+      <w:r>
+        <w:t xml:space="preserve"> </w:t>
+      </w:r>
+      <w:r>
+        <w:rPr>
+          <w:rStyle w:val="VerbatimChar"/>
+        </w:rPr>
+        <w:t xml:space="preserve">Quina informació externa necessita el procediment per prendre aquesta decisió?</w:t>
       </w:r>
     </w:p>
     <w:bookmarkEnd w:id="26"/>
@@ -1308,7 +1409,7 @@
         </w:numPr>
       </w:pPr>
       <w:r>
-        <w:t xml:space="preserve">Necessitats: renda, patrimoni, béns immobles.</w:t>
+        <w:t xml:space="preserve">Funció: separar necessitat funcional, font administrativa i canal d’interoperabilitat.</w:t>
       </w:r>
     </w:p>
     <w:p>
@@ -1320,7 +1421,7 @@
         </w:numPr>
       </w:pPr>
       <w:r>
-        <w:t xml:space="preserve">Fonts administratives: AEAT i Cadastre.</w:t>
+        <w:t xml:space="preserve">Necessitats: renda, patrimoni i béns immobles.</w:t>
       </w:r>
     </w:p>
     <w:p>
@@ -1332,7 +1433,7 @@
         </w:numPr>
       </w:pPr>
       <w:r>
-        <w:t xml:space="preserve">Canal o plataforma d’interoperabilitat: PICA.</w:t>
+        <w:t xml:space="preserve">Fonts: AEAT i Cadastre. Canal corporatiu: PICA.</w:t>
       </w:r>
     </w:p>
     <w:p>
@@ -1344,7 +1445,7 @@
         </w:numPr>
       </w:pPr>
       <w:r>
-        <w:t xml:space="preserve">No presentar PICA com a font original del mateix tipus.</w:t>
+        <w:t xml:space="preserve">No presentar PICA com una font original del mateix tipus que AEAT o Cadastre.</w:t>
       </w:r>
     </w:p>
     <w:p>
@@ -1356,7 +1457,16 @@
         </w:numPr>
       </w:pPr>
       <w:r>
-        <w:t xml:space="preserve">Frase clau: informació administrativa, no API concreta.</w:t>
+        <w:t xml:space="preserve">Frase clau, amb pausa:</w:t>
+      </w:r>
+      <w:r>
+        <w:t xml:space="preserve"> </w:t>
+      </w:r>
+      <w:r>
+        <w:rPr>
+          <w:rStyle w:val="VerbatimChar"/>
+        </w:rPr>
+        <w:t xml:space="preserve">El procediment necessita informació administrativa, no una API concreta.</w:t>
       </w:r>
     </w:p>
     <w:p>
@@ -1368,17 +1478,26 @@
         </w:numPr>
       </w:pPr>
       <w:r>
-        <w:t xml:space="preserve">Transició: si no separem, apareix dependència directa.</w:t>
+        <w:t xml:space="preserve">Transició:</w:t>
+      </w:r>
+      <w:r>
+        <w:t xml:space="preserve"> </w:t>
+      </w:r>
+      <w:r>
+        <w:rPr>
+          <w:rStyle w:val="VerbatimChar"/>
+        </w:rPr>
+        <w:t xml:space="preserve">Quan aquesta separació no es respecta, apareix el problema arquitectònic.</w:t>
       </w:r>
     </w:p>
     <w:bookmarkEnd w:id="27"/>
-    <w:bookmarkStart w:id="28" w:name="dependència-directa---155"/>
+    <w:bookmarkStart w:id="28" w:name="dependència-directa---220"/>
     <w:p>
       <w:pPr>
         <w:pStyle w:val="Ttulo3"/>
       </w:pPr>
       <w:r>
-        <w:t xml:space="preserve">6. Dependència directa - 1:55</w:t>
+        <w:t xml:space="preserve">6. Dependència directa - 2:20</w:t>
       </w:r>
     </w:p>
     <w:p>
@@ -1390,7 +1509,7 @@
         </w:numPr>
       </w:pPr>
       <w:r>
-        <w:t xml:space="preserve">El problema no és PICA; és l’acoblament directe.</w:t>
+        <w:t xml:space="preserve">Funció: diagnosticar una cadena causal, no enumerar tres riscos independents.</w:t>
       </w:r>
     </w:p>
     <w:p>
@@ -1402,7 +1521,7 @@
         </w:numPr>
       </w:pPr>
       <w:r>
-        <w:t xml:space="preserve">La cadena SOAP/XML -&gt; PICA -&gt; AEAT i/o Cadastre és el problema, no la solució.</w:t>
+        <w:t xml:space="preserve">Assenyalar d’esquerra a dreta: causa (acoblament) -&gt; propagació (el canvi travessa la frontera) -&gt; conseqüència (més codi afectat i manteniment més fràgil).</w:t>
       </w:r>
     </w:p>
     <w:p>
@@ -1414,7 +1533,7 @@
         </w:numPr>
       </w:pPr>
       <w:r>
-        <w:t xml:space="preserve">Cas d’ús coneix SOAP/XML, DTO, clients, errors tècnics.</w:t>
+        <w:t xml:space="preserve">Idea: un únic acoblament converteix el canvi d’infraestructura en un canvi que arriba al procediment.</w:t>
       </w:r>
     </w:p>
     <w:p>
@@ -1426,7 +1545,7 @@
         </w:numPr>
       </w:pPr>
       <w:r>
-        <w:t xml:space="preserve">Evolució tecnològica travessa frontera.</w:t>
+        <w:t xml:space="preserve">No oblidar: el problema no és PICA; és la dependència directa dels seus detalls tècnics.</w:t>
       </w:r>
     </w:p>
     <w:p>
@@ -1438,7 +1557,16 @@
         </w:numPr>
       </w:pPr>
       <w:r>
-        <w:t xml:space="preserve">Tres riscos: acoblament, manteniment fràgil i més superfície d’impacte davant canvis externs.</w:t>
+        <w:t xml:space="preserve">Pregunta docent, literal:</w:t>
+      </w:r>
+      <w:r>
+        <w:t xml:space="preserve"> </w:t>
+      </w:r>
+      <w:r>
+        <w:rPr>
+          <w:rStyle w:val="VerbatimChar"/>
+        </w:rPr>
+        <w:t xml:space="preserve">Com podem permetre que el cas d'ús necessiti dades externes, però sense dependre directament de la tecnologia que les proporciona?</w:t>
       </w:r>
     </w:p>
     <w:p>
@@ -1450,7 +1578,16 @@
         </w:numPr>
       </w:pPr>
       <w:r>
-        <w:t xml:space="preserve">Transició: resposta arquitectònica, port de sortida.</w:t>
+        <w:t xml:space="preserve">Fer una pausa. Transició:</w:t>
+      </w:r>
+      <w:r>
+        <w:t xml:space="preserve"> </w:t>
+      </w:r>
+      <w:r>
+        <w:rPr>
+          <w:rStyle w:val="VerbatimChar"/>
+        </w:rPr>
+        <w:t xml:space="preserve">La resposta és introduir un port de sortida.</w:t>
       </w:r>
     </w:p>
     <w:bookmarkEnd w:id="28"/>
@@ -1472,7 +1609,7 @@
         </w:numPr>
       </w:pPr>
       <w:r>
-        <w:t xml:space="preserve">Fer-la servir com a frontissa conceptual forta, no com a tràmit ràpid.</w:t>
+        <w:t xml:space="preserve">Funció: frontissa conceptual forta; baixar el ritme.</w:t>
       </w:r>
     </w:p>
     <w:p>
@@ -1484,7 +1621,7 @@
         </w:numPr>
       </w:pPr>
       <w:r>
-        <w:t xml:space="preserve">Flux d’execució: el cas d’ús demana informació cap enfora.</w:t>
+        <w:t xml:space="preserve">Primera línia: flux d’execució, del cas d’ús cap al sistema extern.</w:t>
       </w:r>
     </w:p>
     <w:p>
@@ -1496,7 +1633,7 @@
         </w:numPr>
       </w:pPr>
       <w:r>
-        <w:t xml:space="preserve">Dependència de codi: el cas d’ús depèn del port; l’adaptador implementa el port.</w:t>
+        <w:t xml:space="preserve">Segona línia: dependència de codi; el cas d’ús depèn del port i l’adaptador implementa el port.</w:t>
       </w:r>
     </w:p>
     <w:p>
@@ -1508,7 +1645,7 @@
         </w:numPr>
       </w:pPr>
       <w:r>
-        <w:t xml:space="preserve">Conceptualment, el port és un contracte; en Java, aquí s’expressa com una interfície.</w:t>
+        <w:t xml:space="preserve">Assenyalar el mini-UML: el port és un contracte; en Java el representem amb una interfície.</w:t>
       </w:r>
     </w:p>
     <w:p>
@@ -1520,7 +1657,16 @@
         </w:numPr>
       </w:pPr>
       <w:r>
-        <w:t xml:space="preserve">L’adaptador implementa aquesta interfície.</w:t>
+        <w:t xml:space="preserve">Frase clau:</w:t>
+      </w:r>
+      <w:r>
+        <w:t xml:space="preserve"> </w:t>
+      </w:r>
+      <w:r>
+        <w:rPr>
+          <w:rStyle w:val="VerbatimChar"/>
+        </w:rPr>
+        <w:t xml:space="preserve">El servei usa el port; l'adaptador implementa el port.</w:t>
       </w:r>
     </w:p>
     <w:p>
@@ -1532,7 +1678,7 @@
         </w:numPr>
       </w:pPr>
       <w:r>
-        <w:t xml:space="preserve">La interfície funciona com a contracte desacoblador entre components.</w:t>
+        <w:t xml:space="preserve">Inversió: la infraestructura depèn del port definit per l’aplicació.</w:t>
       </w:r>
     </w:p>
     <w:p>
@@ -1544,19 +1690,16 @@
         </w:numPr>
       </w:pPr>
       <w:r>
-        <w:t xml:space="preserve">Inversió: la infraestructura depèn del port definit per l’aplicació.</w:t>
-      </w:r>
-    </w:p>
-    <w:p>
-      <w:pPr>
-        <w:pStyle w:val="Compact"/>
-        <w:numPr>
-          <w:ilvl w:val="0"/>
-          <w:numId w:val="1008"/>
-        </w:numPr>
-      </w:pPr>
-      <w:r>
-        <w:t xml:space="preserve">Transició: aplicar-ho al cas patrimonial.</w:t>
+        <w:t xml:space="preserve">Transició:</w:t>
+      </w:r>
+      <w:r>
+        <w:t xml:space="preserve"> </w:t>
+      </w:r>
+      <w:r>
+        <w:rPr>
+          <w:rStyle w:val="VerbatimChar"/>
+        </w:rPr>
+        <w:t xml:space="preserve">Apliquem ara aquesta distinció a la informació patrimonial.</w:t>
       </w:r>
     </w:p>
     <w:bookmarkEnd w:id="29"/>
@@ -1578,7 +1721,7 @@
         </w:numPr>
       </w:pPr>
       <w:r>
-        <w:t xml:space="preserve">Servei d’aplicació depèn de contractes propis.</w:t>
+        <w:t xml:space="preserve">Funció: aplicar la distinció al cas administratiu.</w:t>
       </w:r>
     </w:p>
     <w:p>
@@ -1590,7 +1733,7 @@
         </w:numPr>
       </w:pPr>
       <w:r>
-        <w:t xml:space="preserve">Adaptadors fora del nucli.</w:t>
+        <w:t xml:space="preserve">Nucli: servei d’aplicació i domini; el servei depèn de contractes propis.</w:t>
       </w:r>
     </w:p>
     <w:p>
@@ -1602,7 +1745,7 @@
         </w:numPr>
       </w:pPr>
       <w:r>
-        <w:t xml:space="preserve">PICA/JDBC/SOAP/REST són detalls externs que poden evolucionar.</w:t>
+        <w:t xml:space="preserve">Exterior: adaptadors PICA/JDBC i mecanismes SOAP/XML o REST.</w:t>
       </w:r>
     </w:p>
     <w:p>
@@ -1614,7 +1757,7 @@
         </w:numPr>
       </w:pPr>
       <w:r>
-        <w:t xml:space="preserve">Fletxa correcta d’implementació: adaptador -&gt; port.</w:t>
+        <w:t xml:space="preserve">Llegir bé les fletxes: el servei usa el port; l’adaptador implementa el port.</w:t>
       </w:r>
     </w:p>
     <w:p>
@@ -1626,7 +1769,28 @@
         </w:numPr>
       </w:pPr>
       <w:r>
-        <w:t xml:space="preserve">Transició: mateix patró en un domini financer.</w:t>
+        <w:t xml:space="preserve">No oblidar: el domini no coneix ni PICA ni els adaptadors.</w:t>
+      </w:r>
+    </w:p>
+    <w:p>
+      <w:pPr>
+        <w:pStyle w:val="Compact"/>
+        <w:numPr>
+          <w:ilvl w:val="0"/>
+          <w:numId w:val="1009"/>
+        </w:numPr>
+      </w:pPr>
+      <w:r>
+        <w:t xml:space="preserve">Transició:</w:t>
+      </w:r>
+      <w:r>
+        <w:t xml:space="preserve"> </w:t>
+      </w:r>
+      <w:r>
+        <w:rPr>
+          <w:rStyle w:val="VerbatimChar"/>
+        </w:rPr>
+        <w:t xml:space="preserve">Transferim la mateixa decisió arquitectònica a un domini financer.</w:t>
       </w:r>
     </w:p>
     <w:bookmarkEnd w:id="30"/>
@@ -1648,7 +1812,7 @@
         </w:numPr>
       </w:pPr>
       <w:r>
-        <w:t xml:space="preserve">Canvi explícit de domini: beca -&gt; cartera d’inversió personal.</w:t>
+        <w:t xml:space="preserve">Funció: demostrar que la decisió es transfereix entre dominis.</w:t>
       </w:r>
     </w:p>
     <w:p>
@@ -1660,7 +1824,7 @@
         </w:numPr>
       </w:pPr>
       <w:r>
-        <w:t xml:space="preserve">Cas d’ús: vendre accions.</w:t>
+        <w:t xml:space="preserve">Canvi explícit: beca -&gt; cartera d’inversió personal.</w:t>
       </w:r>
     </w:p>
     <w:p>
@@ -1672,19 +1836,7 @@
         </w:numPr>
       </w:pPr>
       <w:r>
-        <w:t xml:space="preserve">Necessitat: preu actual de l’acció.</w:t>
-      </w:r>
-    </w:p>
-    <w:p>
-      <w:pPr>
-        <w:pStyle w:val="Compact"/>
-        <w:numPr>
-          <w:ilvl w:val="0"/>
-          <w:numId w:val="1010"/>
-        </w:numPr>
-      </w:pPr>
-      <w:r>
-        <w:t xml:space="preserve">Port de sortida:</w:t>
+        <w:t xml:space="preserve">Cas d’ús: vendre accions. Necessitat: preu actual. Port:</w:t>
       </w:r>
       <w:r>
         <w:t xml:space="preserve"> </w:t>
@@ -1708,7 +1860,7 @@
         </w:numPr>
       </w:pPr>
       <w:r>
-        <w:t xml:space="preserve">Separar proveïdor de dades, API concreta, contracte tècnic i adaptador.</w:t>
+        <w:t xml:space="preserve">Els adaptadors Finnhub, Alpha Vantage o mock encapsulen APIs concretes.</w:t>
       </w:r>
     </w:p>
     <w:p>
@@ -1720,7 +1872,16 @@
         </w:numPr>
       </w:pPr>
       <w:r>
-        <w:t xml:space="preserve">Servei d’aplicació coordina consulta del preu i recuperació de cartera.</w:t>
+        <w:t xml:space="preserve">Frase de repartiment:</w:t>
+      </w:r>
+      <w:r>
+        <w:t xml:space="preserve"> </w:t>
+      </w:r>
+      <w:r>
+        <w:rPr>
+          <w:rStyle w:val="VerbatimChar"/>
+        </w:rPr>
+        <w:t xml:space="preserve">El servei coordina; el domini decideix; l'adaptador integra.</w:t>
       </w:r>
     </w:p>
     <w:p>
@@ -1732,7 +1893,7 @@
         </w:numPr>
       </w:pPr>
       <w:r>
-        <w:t xml:space="preserve">Domini decideix; adaptador integra.</w:t>
+        <w:t xml:space="preserve">No afirmar substituïbilitat màgica: cal preservar el contracte funcional i la semàntica.</w:t>
       </w:r>
     </w:p>
     <w:p>
@@ -1744,7 +1905,16 @@
         </w:numPr>
       </w:pPr>
       <w:r>
-        <w:t xml:space="preserve">Transició: conclusió tècnica.</w:t>
+        <w:t xml:space="preserve">Transició:</w:t>
+      </w:r>
+      <w:r>
+        <w:t xml:space="preserve"> </w:t>
+      </w:r>
+      <w:r>
+        <w:rPr>
+          <w:rStyle w:val="VerbatimChar"/>
+        </w:rPr>
+        <w:t xml:space="preserve">Canvia el domini, però es manté la decisió arquitectònica.</w:t>
       </w:r>
     </w:p>
     <w:bookmarkEnd w:id="31"/>
@@ -1766,7 +1936,7 @@
         </w:numPr>
       </w:pPr>
       <w:r>
-        <w:t xml:space="preserve">Tres decisions: necessitat funcional, port i adaptador.</w:t>
+        <w:t xml:space="preserve">Funció: tancar el contingut tècnic, sense introduir res de nou.</w:t>
       </w:r>
     </w:p>
     <w:p>
@@ -1778,7 +1948,7 @@
         </w:numPr>
       </w:pPr>
       <w:r>
-        <w:t xml:space="preserve">El cas d’ús expressa una necessitat funcional.</w:t>
+        <w:t xml:space="preserve">Recuperar les tres decisions: necessitat funcional, port i adaptador.</w:t>
       </w:r>
     </w:p>
     <w:p>
@@ -1790,7 +1960,7 @@
         </w:numPr>
       </w:pPr>
       <w:r>
-        <w:t xml:space="preserve">El port defineix el contracte de l’aplicació.</w:t>
+        <w:t xml:space="preserve">Matís: l’arquitectura no elimina la dependència externa ni tots els canvis; en localitza l’impacte.</w:t>
       </w:r>
     </w:p>
     <w:p>
@@ -1802,7 +1972,16 @@
         </w:numPr>
       </w:pPr>
       <w:r>
-        <w:t xml:space="preserve">L’adaptador encapsula la integració externa.</w:t>
+        <w:t xml:space="preserve">Frase final, amb pausa i mirant el tribunal:</w:t>
+      </w:r>
+      <w:r>
+        <w:t xml:space="preserve"> </w:t>
+      </w:r>
+      <w:r>
+        <w:rPr>
+          <w:rStyle w:val="VerbatimChar"/>
+        </w:rPr>
+        <w:t xml:space="preserve">L'arquitectura no elimina el canvi; el localitza.</w:t>
       </w:r>
     </w:p>
     <w:p>
@@ -1814,19 +1993,7 @@
         </w:numPr>
       </w:pPr>
       <w:r>
-        <w:t xml:space="preserve">Frase clau amb màxima jerarquia visual: l’arquitectura no elimina el canvi; el localitza.</w:t>
-      </w:r>
-    </w:p>
-    <w:p>
-      <w:pPr>
-        <w:pStyle w:val="Compact"/>
-        <w:numPr>
-          <w:ilvl w:val="0"/>
-          <w:numId w:val="1011"/>
-        </w:numPr>
-      </w:pPr>
-      <w:r>
-        <w:t xml:space="preserve">Cap agraïment en aquesta diapositiva: donar pas a la diapositiva 11.</w:t>
+        <w:t xml:space="preserve">No fer encara l’agraïment: donar pas net a la diapositiva 11.</w:t>
       </w:r>
     </w:p>
     <w:bookmarkEnd w:id="32"/>
@@ -1848,7 +2015,7 @@
         </w:numPr>
       </w:pPr>
       <w:r>
-        <w:t xml:space="preserve">Frase d’agraïment literal: no resumir-la ni canviar cap paraula.</w:t>
+        <w:t xml:space="preserve">Funció: tancament institucional i protocol·lari.</w:t>
       </w:r>
     </w:p>
     <w:p>
@@ -1860,7 +2027,7 @@
         </w:numPr>
       </w:pPr>
       <w:r>
-        <w:t xml:space="preserve">Cap nom de persona i cap altre agraïment.</w:t>
+        <w:t xml:space="preserve">Llegir la frase d’agraïment literal; no resumir-la ni canviar-ne cap paraula.</w:t>
       </w:r>
     </w:p>
     <w:p>
@@ -1872,7 +2039,19 @@
         </w:numPr>
       </w:pPr>
       <w:r>
-        <w:t xml:space="preserve">Pausa natural abans de</w:t>
+        <w:t xml:space="preserve">No afegir noms de persones ni altres agraïments.</w:t>
+      </w:r>
+    </w:p>
+    <w:p>
+      <w:pPr>
+        <w:pStyle w:val="Compact"/>
+        <w:numPr>
+          <w:ilvl w:val="0"/>
+          <w:numId w:val="1012"/>
+        </w:numPr>
+      </w:pPr>
+      <w:r>
+        <w:t xml:space="preserve">Fer una pausa natural abans de</w:t>
       </w:r>
       <w:r>
         <w:t xml:space="preserve"> </w:t>
@@ -1884,7 +2063,10 @@
         <w:t xml:space="preserve">Moltes gràcies</w:t>
       </w:r>
       <w:r>
-        <w:t xml:space="preserve">.</w:t>
+        <w:t xml:space="preserve"> </w:t>
+      </w:r>
+      <w:r>
+        <w:t xml:space="preserve">i dir-ho mirant el tribunal.</w:t>
       </w:r>
     </w:p>
     <w:p>
@@ -1896,7 +2078,7 @@
         </w:numPr>
       </w:pPr>
       <w:r>
-        <w:t xml:space="preserve">Tancar mirant el tribunal:</w:t>
+        <w:t xml:space="preserve">Després de</w:t>
       </w:r>
       <w:r>
         <w:t xml:space="preserve"> </w:t>
@@ -1908,7 +2090,7 @@
         <w:t xml:space="preserve">Moltes gràcies</w:t>
       </w:r>
       <w:r>
-        <w:t xml:space="preserve">.</w:t>
+        <w:t xml:space="preserve">, la classe queda formalment tancada.</w:t>
       </w:r>
     </w:p>
     <w:p>
@@ -1920,7 +2102,89 @@
         </w:numPr>
       </w:pPr>
       <w:r>
-        <w:t xml:space="preserve">Després de</w:t>
+        <w:t xml:space="preserve">No obrir la demo si el tribunal no la demana o si no hi ha temps explícit.</w:t>
+      </w:r>
+    </w:p>
+    <w:bookmarkEnd w:id="33"/>
+    <w:bookmarkStart w:id="34" w:name="annex-a.-demo-opcional---130-a-230-1"/>
+    <w:p>
+      <w:pPr>
+        <w:pStyle w:val="Ttulo3"/>
+      </w:pPr>
+      <w:r>
+        <w:t xml:space="preserve">Annex A. Demo opcional - 1:30 a 2:30</w:t>
+      </w:r>
+    </w:p>
+    <w:p>
+      <w:pPr>
+        <w:pStyle w:val="Compact"/>
+        <w:numPr>
+          <w:ilvl w:val="0"/>
+          <w:numId w:val="1013"/>
+        </w:numPr>
+      </w:pPr>
+      <w:r>
+        <w:t xml:space="preserve">Funció: verificació pràctica opcional, posterior al tancament formal.</w:t>
+      </w:r>
+    </w:p>
+    <w:p>
+      <w:pPr>
+        <w:pStyle w:val="Compact"/>
+        <w:numPr>
+          <w:ilvl w:val="0"/>
+          <w:numId w:val="1013"/>
+        </w:numPr>
+      </w:pPr>
+      <w:r>
+        <w:t xml:space="preserve">Activar només si el tribunal ho demana o hi ha temps explícit.</w:t>
+      </w:r>
+    </w:p>
+    <w:p>
+      <w:pPr>
+        <w:pStyle w:val="Compact"/>
+        <w:numPr>
+          <w:ilvl w:val="0"/>
+          <w:numId w:val="1013"/>
+        </w:numPr>
+      </w:pPr>
+      <w:r>
+        <w:t xml:space="preserve">Assenyalar: mateix cas d’ús, mateix servei i mateix domini; canvia l’adaptador.</w:t>
+      </w:r>
+    </w:p>
+    <w:p>
+      <w:pPr>
+        <w:pStyle w:val="Compact"/>
+        <w:numPr>
+          <w:ilvl w:val="0"/>
+          <w:numId w:val="1013"/>
+        </w:numPr>
+      </w:pPr>
+      <w:r>
+        <w:t xml:space="preserve">Perfils: Finnhub, Alpha Vantage o mock; són implementacions, no el contracte.</w:t>
+      </w:r>
+    </w:p>
+    <w:p>
+      <w:pPr>
+        <w:pStyle w:val="Compact"/>
+        <w:numPr>
+          <w:ilvl w:val="0"/>
+          <w:numId w:val="1013"/>
+        </w:numPr>
+      </w:pPr>
+      <w:r>
+        <w:t xml:space="preserve">Utilitat docent: provar sense claus reals ni disponibilitat del proveïdor.</w:t>
+      </w:r>
+    </w:p>
+    <w:p>
+      <w:pPr>
+        <w:pStyle w:val="Compact"/>
+        <w:numPr>
+          <w:ilvl w:val="0"/>
+          <w:numId w:val="1013"/>
+        </w:numPr>
+      </w:pPr>
+      <w:r>
+        <w:t xml:space="preserve">Frase clau:</w:t>
       </w:r>
       <w:r>
         <w:t xml:space="preserve"> </w:t>
@@ -1929,128 +2193,7 @@
         <w:rPr>
           <w:rStyle w:val="VerbatimChar"/>
         </w:rPr>
-        <w:t xml:space="preserve">Moltes gràcies</w:t>
-      </w:r>
-      <w:r>
-        <w:t xml:space="preserve">, la classe queda formalment tancada.</w:t>
-      </w:r>
-    </w:p>
-    <w:p>
-      <w:pPr>
-        <w:pStyle w:val="Compact"/>
-        <w:numPr>
-          <w:ilvl w:val="0"/>
-          <w:numId w:val="1012"/>
-        </w:numPr>
-      </w:pPr>
-      <w:r>
-        <w:t xml:space="preserve">No obrir la demo després del tancament si el tribunal no la demana o si no hi ha temps clar.</w:t>
-      </w:r>
-    </w:p>
-    <w:bookmarkEnd w:id="33"/>
-    <w:bookmarkStart w:id="34" w:name="annex-a.-demo-opcional---130-a-230-1"/>
-    <w:p>
-      <w:pPr>
-        <w:pStyle w:val="Ttulo3"/>
-      </w:pPr>
-      <w:r>
-        <w:t xml:space="preserve">Annex A. Demo opcional - 1:30 a 2:30</w:t>
-      </w:r>
-    </w:p>
-    <w:p>
-      <w:pPr>
-        <w:pStyle w:val="Compact"/>
-        <w:numPr>
-          <w:ilvl w:val="0"/>
-          <w:numId w:val="1013"/>
-        </w:numPr>
-      </w:pPr>
-      <w:r>
-        <w:t xml:space="preserve">Annex posterior al tancament, no part del cos principal.</w:t>
-      </w:r>
-    </w:p>
-    <w:p>
-      <w:pPr>
-        <w:pStyle w:val="Compact"/>
-        <w:numPr>
-          <w:ilvl w:val="0"/>
-          <w:numId w:val="1013"/>
-        </w:numPr>
-      </w:pPr>
-      <w:r>
-        <w:t xml:space="preserve">Només mostrar si el tribunal ho demana o si hi ha temps explícit després de la classe.</w:t>
-      </w:r>
-    </w:p>
-    <w:p>
-      <w:pPr>
-        <w:pStyle w:val="Compact"/>
-        <w:numPr>
-          <w:ilvl w:val="0"/>
-          <w:numId w:val="1013"/>
-        </w:numPr>
-      </w:pPr>
-      <w:r>
-        <w:t xml:space="preserve">Mateix cas d’ús, servei i domini.</w:t>
-      </w:r>
-    </w:p>
-    <w:p>
-      <w:pPr>
-        <w:pStyle w:val="Compact"/>
-        <w:numPr>
-          <w:ilvl w:val="0"/>
-          <w:numId w:val="1013"/>
-        </w:numPr>
-      </w:pPr>
-      <w:r>
-        <w:t xml:space="preserve">Canvia l’adaptador.</w:t>
-      </w:r>
-    </w:p>
-    <w:p>
-      <w:pPr>
-        <w:pStyle w:val="Compact"/>
-        <w:numPr>
-          <w:ilvl w:val="0"/>
-          <w:numId w:val="1013"/>
-        </w:numPr>
-      </w:pPr>
-      <w:r>
-        <w:t xml:space="preserve">Perfils: Finnhub, Alpha Vantage, mock.</w:t>
-      </w:r>
-    </w:p>
-    <w:p>
-      <w:pPr>
-        <w:pStyle w:val="Compact"/>
-        <w:numPr>
-          <w:ilvl w:val="0"/>
-          <w:numId w:val="1013"/>
-        </w:numPr>
-      </w:pPr>
-      <w:r>
-        <w:t xml:space="preserve">Finnhub i Alpha Vantage són implementacions concretes; el contracte no canvia.</w:t>
-      </w:r>
-    </w:p>
-    <w:p>
-      <w:pPr>
-        <w:pStyle w:val="Compact"/>
-        <w:numPr>
-          <w:ilvl w:val="0"/>
-          <w:numId w:val="1013"/>
-        </w:numPr>
-      </w:pPr>
-      <w:r>
-        <w:t xml:space="preserve">Utilitat docent: proves amb adaptador mock i sense claus reals.</w:t>
-      </w:r>
-    </w:p>
-    <w:p>
-      <w:pPr>
-        <w:pStyle w:val="Compact"/>
-        <w:numPr>
-          <w:ilvl w:val="0"/>
-          <w:numId w:val="1013"/>
-        </w:numPr>
-      </w:pPr>
-      <w:r>
-        <w:t xml:space="preserve">Missatge: canvia la infraestructura; el cas d’ús i el domini romanen estables.</w:t>
+        <w:t xml:space="preserve">Canvia la infraestructura; el cas d'ús i el domini romanen estables.</w:t>
       </w:r>
     </w:p>
     <w:p>
@@ -2461,18 +2604,18 @@
               <w:pStyle w:val="Compact"/>
             </w:pPr>
             <w:r>
-              <w:t xml:space="preserve">La dependència directa fa fràgil el cas d’ús</w:t>
-            </w:r>
-          </w:p>
-        </w:tc>
-        <w:tc>
-          <w:tcPr/>
-          <w:p>
-            <w:pPr>
-              <w:pStyle w:val="Compact"/>
-            </w:pPr>
-            <w:r>
-              <w:t xml:space="preserve">Acoblament tecnològic</w:t>
+              <w:t xml:space="preserve">Un acoblament es propaga fins al procediment</w:t>
+            </w:r>
+          </w:p>
+        </w:tc>
+        <w:tc>
+          <w:tcPr/>
+          <w:p>
+            <w:pPr>
+              <w:pStyle w:val="Compact"/>
+            </w:pPr>
+            <w:r>
+              <w:t xml:space="preserve">Causa, propagació i conseqüència</w:t>
             </w:r>
           </w:p>
         </w:tc>
@@ -3430,51 +3573,51 @@
               <w:pStyle w:val="Compact"/>
             </w:pPr>
             <w:r>
-              <w:t xml:space="preserve">204</w:t>
-            </w:r>
-          </w:p>
-        </w:tc>
-        <w:tc>
-          <w:tcPr/>
-          <w:p>
-            <w:pPr>
-              <w:pStyle w:val="Compact"/>
-            </w:pPr>
-            <w:r>
-              <w:t xml:space="preserve">1:38</w:t>
-            </w:r>
-          </w:p>
-        </w:tc>
-        <w:tc>
-          <w:tcPr/>
-          <w:p>
-            <w:pPr>
-              <w:pStyle w:val="Compact"/>
-            </w:pPr>
-            <w:r>
-              <w:t xml:space="preserve">1:34</w:t>
-            </w:r>
-          </w:p>
-        </w:tc>
-        <w:tc>
-          <w:tcPr/>
-          <w:p>
-            <w:pPr>
-              <w:pStyle w:val="Compact"/>
-            </w:pPr>
-            <w:r>
-              <w:t xml:space="preserve">1:31</w:t>
-            </w:r>
-          </w:p>
-        </w:tc>
-        <w:tc>
-          <w:tcPr/>
-          <w:p>
-            <w:pPr>
-              <w:pStyle w:val="Compact"/>
-            </w:pPr>
-            <w:r>
-              <w:t xml:space="preserve">6:49</w:t>
+              <w:t xml:space="preserve">299</w:t>
+            </w:r>
+          </w:p>
+        </w:tc>
+        <w:tc>
+          <w:tcPr/>
+          <w:p>
+            <w:pPr>
+              <w:pStyle w:val="Compact"/>
+            </w:pPr>
+            <w:r>
+              <w:t xml:space="preserve">2:24</w:t>
+            </w:r>
+          </w:p>
+        </w:tc>
+        <w:tc>
+          <w:tcPr/>
+          <w:p>
+            <w:pPr>
+              <w:pStyle w:val="Compact"/>
+            </w:pPr>
+            <w:r>
+              <w:t xml:space="preserve">2:18</w:t>
+            </w:r>
+          </w:p>
+        </w:tc>
+        <w:tc>
+          <w:tcPr/>
+          <w:p>
+            <w:pPr>
+              <w:pStyle w:val="Compact"/>
+            </w:pPr>
+            <w:r>
+              <w:t xml:space="preserve">2:13</w:t>
+            </w:r>
+          </w:p>
+        </w:tc>
+        <w:tc>
+          <w:tcPr/>
+          <w:p>
+            <w:pPr>
+              <w:pStyle w:val="Compact"/>
+            </w:pPr>
+            <w:r>
+              <w:t xml:space="preserve">7:33</w:t>
             </w:r>
           </w:p>
         </w:tc>
@@ -3553,7 +3696,7 @@
               <w:pStyle w:val="Compact"/>
             </w:pPr>
             <w:r>
-              <w:t xml:space="preserve">8:50</w:t>
+              <w:t xml:space="preserve">9:34</w:t>
             </w:r>
           </w:p>
         </w:tc>
@@ -3632,7 +3775,7 @@
               <w:pStyle w:val="Compact"/>
             </w:pPr>
             <w:r>
-              <w:t xml:space="preserve">10:20</w:t>
+              <w:t xml:space="preserve">11:04</w:t>
             </w:r>
           </w:p>
         </w:tc>
@@ -3711,7 +3854,7 @@
               <w:pStyle w:val="Compact"/>
             </w:pPr>
             <w:r>
-              <w:t xml:space="preserve">11:33</w:t>
+              <w:t xml:space="preserve">12:17</w:t>
             </w:r>
           </w:p>
         </w:tc>
@@ -3790,7 +3933,7 @@
               <w:pStyle w:val="Compact"/>
             </w:pPr>
             <w:r>
-              <w:t xml:space="preserve">12:14</w:t>
+              <w:t xml:space="preserve">12:58</w:t>
             </w:r>
           </w:p>
         </w:tc>
@@ -3869,7 +4012,7 @@
               <w:pStyle w:val="Compact"/>
             </w:pPr>
             <w:r>
-              <w:t xml:space="preserve">12:30</w:t>
+              <w:t xml:space="preserve">13:14</w:t>
             </w:r>
           </w:p>
         </w:tc>
@@ -3916,7 +4059,7 @@
                 <w:b/>
                 <w:bCs/>
               </w:rPr>
-              <w:t xml:space="preserve">1.625</w:t>
+              <w:t xml:space="preserve">1.720</w:t>
             </w:r>
           </w:p>
         </w:tc>
@@ -3931,7 +4074,7 @@
                 <w:b/>
                 <w:bCs/>
               </w:rPr>
-              <w:t xml:space="preserve">13:00</w:t>
+              <w:t xml:space="preserve">13:46</w:t>
             </w:r>
           </w:p>
         </w:tc>
@@ -3946,7 +4089,7 @@
                 <w:b/>
                 <w:bCs/>
               </w:rPr>
-              <w:t xml:space="preserve">12:30</w:t>
+              <w:t xml:space="preserve">13:14</w:t>
             </w:r>
           </w:p>
         </w:tc>
@@ -3961,7 +4104,7 @@
                 <w:b/>
                 <w:bCs/>
               </w:rPr>
-              <w:t xml:space="preserve">12:02</w:t>
+              <w:t xml:space="preserve">12:44</w:t>
             </w:r>
           </w:p>
         </w:tc>
@@ -3976,7 +4119,7 @@
                 <w:b/>
                 <w:bCs/>
               </w:rPr>
-              <w:t xml:space="preserve">12:30</w:t>
+              <w:t xml:space="preserve">13:14</w:t>
             </w:r>
           </w:p>
         </w:tc>
@@ -3987,7 +4130,7 @@
         <w:pStyle w:val="Textoindependiente"/>
       </w:pPr>
       <w:r>
-        <w:t xml:space="preserve">Estimació anterior de treball: 18:15-19:00. Temps eliminat del cos principal: una diapositiva prevista d’1:25. La separació de la síntesi tècnica i l’agraïment en dues diapositives afegeix aproximadament 0:20-0:30 (canvi de diapositiva i pausa protocol·lària), sense contingut tècnic nou. Nova estimació prudent amb pauses reals: 16:20-17:45. Marge respecte dels 20 minuts: aproximadament 2:15-3:40, pendent de validació amb assaig oral real.</w:t>
+        <w:t xml:space="preserve">Estimació anterior de treball: 18:15-19:00. Temps eliminat del cos principal: una diapositiva prevista d’1:25. La separació de la síntesi tècnica i l’agraïment en dues diapositives afegeix aproximadament 0:20-0:30 (canvi de diapositiva i pausa protocol·lària), sense contingut tècnic nou. La nova explicació causal de la diapositiva 6 afegeix aproximadament 0:45 respecte de la versió anterior. Nova estimació prudent amb pauses reals: 17:05-18:30. Marge respecte dels 20 minuts: aproximadament 1:30-2:55, pendent de validació amb assaig oral real.</w:t>
       </w:r>
     </w:p>
     <w:p>

</xml_diff>

<commit_message>
Insereix la diapositiva de context al deck de 20 minuts i renumera el guió
La portada queda només com a salutació i títol (0:20) i la nova
diapositiva 2, «Una trobada entre dos mons», mostra el context AGAUR,
les dimensions acadèmica i professional i el focus de la sessió (1:15).
Renumera diapositives i referències del guió oral de 2-11 a 3-12,
actualitza AGENTS.md i regenera tots els materials derivats.
</commit_message>
<xml_diff>
--- a/doc/presentations/defensa-placa-permanent-dsi-ports-sortida-hexagonal/output/REMARKABLE_materials-orals-canonics-20-minuts.docx
+++ b/doc/presentations/defensa-placa-permanent-dsi-ports-sortida-hexagonal/output/REMARKABLE_materials-orals-canonics-20-minuts.docx
@@ -2,7 +2,7 @@
 <file path=word/document.xml><?xml version="1.0" encoding="utf-8"?>
 <w:document xmlns:w="http://schemas.openxmlformats.org/wordprocessingml/2006/main" xmlns:m="http://schemas.openxmlformats.org/officeDocument/2006/math" xmlns:r="http://schemas.openxmlformats.org/officeDocument/2006/relationships" xmlns:o="urn:schemas-microsoft-com:office:office" xmlns:v="urn:schemas-microsoft-com:vml" xmlns:w10="urn:schemas-microsoft-com:office:word" xmlns:a="http://schemas.openxmlformats.org/drawingml/2006/main" xmlns:pic="http://schemas.openxmlformats.org/drawingml/2006/picture" xmlns:wp="http://schemas.openxmlformats.org/drawingml/2006/wordprocessingDrawing">
   <w:body>
-    <w:bookmarkStart w:id="44" w:name="X79cee1dd7752e91aad864bc270c2d5ac95f00d7"/>
+    <w:bookmarkStart w:id="46" w:name="X79cee1dd7752e91aad864bc270c2d5ac95f00d7"/>
     <w:p>
       <w:pPr>
         <w:pStyle w:val="Ttulo1"/>
@@ -189,7 +189,7 @@
         </w:pict>
       </w:r>
     </w:p>
-    <w:bookmarkStart w:id="20" w:name="guió-oral-complet-imprimible"/>
+    <w:bookmarkStart w:id="21" w:name="guió-oral-complet-imprimible"/>
     <w:p>
       <w:pPr>
         <w:pStyle w:val="Ttulo2"/>
@@ -214,13 +214,13 @@
         <w:t xml:space="preserve">La demo no forma part del temps canònic de la classe. S’ha de considerar un annex opcional posterior al tancament.</w:t>
       </w:r>
     </w:p>
-    <w:bookmarkStart w:id="9" w:name="diapositiva-1.-portada---135"/>
+    <w:bookmarkStart w:id="9" w:name="diapositiva-1.-portada---020"/>
     <w:p>
       <w:pPr>
         <w:pStyle w:val="Ttulo3"/>
       </w:pPr>
       <w:r>
-        <w:t xml:space="preserve">Diapositiva 1. Portada - 1:35</w:t>
+        <w:t xml:space="preserve">Diapositiva 1. Portada - 0:20</w:t>
       </w:r>
     </w:p>
     <w:p>
@@ -256,6 +256,24 @@
         <w:pStyle w:val="Textoindependiente"/>
       </w:pPr>
       <w:r>
+        <w:t xml:space="preserve">[avançar a la diapositiva 2]</w:t>
+      </w:r>
+    </w:p>
+    <w:bookmarkEnd w:id="9"/>
+    <w:bookmarkStart w:id="10" w:name="Xbdbb5b4dd8dac51a8d3eb0ed39358744c7dacae"/>
+    <w:p>
+      <w:pPr>
+        <w:pStyle w:val="Ttulo3"/>
+      </w:pPr>
+      <w:r>
+        <w:t xml:space="preserve">Diapositiva 2. Una trobada entre dos mons - 1:15</w:t>
+      </w:r>
+    </w:p>
+    <w:p>
+      <w:pPr>
+        <w:pStyle w:val="FirstParagraph"/>
+      </w:pPr>
+      <w:r>
         <w:t xml:space="preserve">Abans d’entrar en el contingut tècnic, voldria fer una precisió de context. A la documentació de la convocatòria he incorporat un informe acreditatiu de la meva activitat de consultoria especialitzada per a la Generalitat de Catalunya, concretament l’Agència de Gestió d’Ajuts Universitaris i de Recerca. [pausa breu]</w:t>
       </w:r>
     </w:p>
@@ -272,33 +290,33 @@
         <w:pStyle w:val="Textoindependiente"/>
       </w:pPr>
       <w:r>
-        <w:t xml:space="preserve">D’una banda, l’acadèmic: l’assignatura de Disseny de Sistemes d’Informació, on treballem conceptes com arquitectura hexagonal, ports, adaptadors i inversió de dependències.</w:t>
-      </w:r>
-    </w:p>
-    <w:p>
-      <w:pPr>
-        <w:pStyle w:val="Textoindependiente"/>
-      </w:pPr>
-      <w:r>
-        <w:t xml:space="preserve">I de l’altra, el professional: un cas real que ens permet veure com aquests conceptes s’aterren en reptes concrets d’arquitectura de software. [mirada al tribunal]</w:t>
-      </w:r>
-    </w:p>
-    <w:p>
-      <w:pPr>
-        <w:pStyle w:val="Textoindependiente"/>
-      </w:pPr>
-      <w:r>
-        <w:t xml:space="preserve">En vint minuts no seria rigorós intentar explicar tota l’arquitectura hexagonal. Per això em centraré en una decisió concreta: com dissenyar un port de sortida quan un cas d’ús necessita informació que es troba fora de l’aplicació.</w:t>
-      </w:r>
-    </w:p>
-    <w:bookmarkEnd w:id="9"/>
-    <w:bookmarkStart w:id="10" w:name="Xb5679af0ea6231d1f2267dfe9100fc7751af926"/>
+        <w:t xml:space="preserve">D’una banda, l’acadèmic: l’assignatura de Disseny de Sistemes d’Informació, on treballem conceptes com arquitectura hexagonal, ports, adaptadors i inversió de dependències. [assenyalar la caixa esquerra]</w:t>
+      </w:r>
+    </w:p>
+    <w:p>
+      <w:pPr>
+        <w:pStyle w:val="Textoindependiente"/>
+      </w:pPr>
+      <w:r>
+        <w:t xml:space="preserve">I de l’altra, el professional: un cas real que ens permet veure com aquests conceptes s’aterren en reptes concrets d’arquitectura de software. [assenyalar la caixa dreta; mirada al tribunal]</w:t>
+      </w:r>
+    </w:p>
+    <w:p>
+      <w:pPr>
+        <w:pStyle w:val="Textoindependiente"/>
+      </w:pPr>
+      <w:r>
+        <w:t xml:space="preserve">En vint minuts no seria rigorós intentar explicar tota l’arquitectura hexagonal. Per això em centraré en una decisió concreta: com dissenyar un port de sortida quan un cas d’ús necessita informació que es troba fora de l’aplicació. [assenyalar la frase de focus]</w:t>
+      </w:r>
+    </w:p>
+    <w:bookmarkEnd w:id="10"/>
+    <w:bookmarkStart w:id="11" w:name="Xe28636d0affee42568e430faecfaa0d7cefc9d4"/>
     <w:p>
       <w:pPr>
         <w:pStyle w:val="Ttulo3"/>
       </w:pPr>
       <w:r>
-        <w:t xml:space="preserve">Diapositiva 2. On som dins l’assignatura - 1:05</w:t>
+        <w:t xml:space="preserve">Diapositiva 3. On som dins l’assignatura - 1:05</w:t>
       </w:r>
     </w:p>
     <w:p>
@@ -317,14 +335,14 @@
         <w:t xml:space="preserve">El pla docent de l’assignatura treballa una visió global d’arquitectures de sistemes d’informació: arquitectures per capes, Clean Architecture, arquitectura hexagonal, ports i adaptadors, mapping, modularització i Domain-Driven Design. [to calmat, explicatiu]</w:t>
       </w:r>
     </w:p>
-    <w:bookmarkEnd w:id="10"/>
-    <w:bookmarkStart w:id="11" w:name="X3696606fd6d9b6d83d02a9073392ba28f4d25a2"/>
+    <w:bookmarkEnd w:id="11"/>
+    <w:bookmarkStart w:id="12" w:name="Xb1bedf2081fb074329a6c0aa2bc4837fcd26096"/>
     <w:p>
       <w:pPr>
         <w:pStyle w:val="Ttulo3"/>
       </w:pPr>
       <w:r>
-        <w:t xml:space="preserve">Diapositiva 3. Objectiu de la sessió - 0:55</w:t>
+        <w:t xml:space="preserve">Diapositiva 4. Objectiu de la sessió - 0:55</w:t>
       </w:r>
     </w:p>
     <w:p>
@@ -359,14 +377,14 @@
         <w:t xml:space="preserve">No desenvoluparé encara tota l’abstracció. Primer veurem el problema en un cas real d’administració pública, i a partir d’aquí formularem la decisió arquitectònica. [pausa breu]</w:t>
       </w:r>
     </w:p>
-    <w:bookmarkEnd w:id="11"/>
-    <w:bookmarkStart w:id="12" w:name="X5e939adc6516d171120054c2dd2ce9d366e8390"/>
+    <w:bookmarkEnd w:id="12"/>
+    <w:bookmarkStart w:id="13" w:name="Xb1c176126e25cc487f84f2d677658c9e0434ef5"/>
     <w:p>
       <w:pPr>
         <w:pStyle w:val="Ttulo3"/>
       </w:pPr>
       <w:r>
-        <w:t xml:space="preserve">Diapositiva 4. Avaluació econòmica d’una beca - 1:45</w:t>
+        <w:t xml:space="preserve">Diapositiva 5. Avaluació econòmica d’una beca - 1:45</w:t>
       </w:r>
     </w:p>
     <w:p>
@@ -409,14 +427,14 @@
         <w:t xml:space="preserve">Aquest pas és essencial. Si comencem directament per la tecnologia, correm el risc de construir el cas d’ús al voltant de la integració. En canvi, si comencem pel procediment, podem distingir entre la decisió administrativa que volem modelar i el mecanisme tècnic que ens proporciona la informació.</w:t>
       </w:r>
     </w:p>
-    <w:bookmarkEnd w:id="12"/>
-    <w:bookmarkStart w:id="13" w:name="Xff6211f156de8e2b07dce7ebbf9d377121e521b"/>
+    <w:bookmarkEnd w:id="13"/>
+    <w:bookmarkStart w:id="14" w:name="X47823d5ee56492317bb78f6ff3ef0910b71caf5"/>
     <w:p>
       <w:pPr>
         <w:pStyle w:val="Ttulo3"/>
       </w:pPr>
       <w:r>
-        <w:t xml:space="preserve">Diapositiva 5. Quina informació externa necessita el procediment? - 1:45</w:t>
+        <w:t xml:space="preserve">Diapositiva 6. Quina informació externa necessita el procediment? - 1:45</w:t>
       </w:r>
     </w:p>
     <w:p>
@@ -487,14 +505,14 @@
         <w:t xml:space="preserve">Quan aquesta separació no es respecta, apareix el problema arquitectònic que veurem ara.</w:t>
       </w:r>
     </w:p>
-    <w:bookmarkEnd w:id="13"/>
-    <w:bookmarkStart w:id="14" w:name="X316054ed1b0af9ffc7ab9c0467862954676b646"/>
+    <w:bookmarkEnd w:id="14"/>
+    <w:bookmarkStart w:id="15" w:name="X532652117ed1f980c6580a458223caa4fac3a26"/>
     <w:p>
       <w:pPr>
         <w:pStyle w:val="Ttulo3"/>
       </w:pPr>
       <w:r>
-        <w:t xml:space="preserve">Diapositiva 6. Dependència directa entre procediment i integració - 2:20</w:t>
+        <w:t xml:space="preserve">Diapositiva 7. Dependència directa entre procediment i integració - 2:20</w:t>
       </w:r>
     </w:p>
     <w:p>
@@ -577,14 +595,14 @@
         <w:t xml:space="preserve">La resposta és introduir un port de sortida.</w:t>
       </w:r>
     </w:p>
-    <w:bookmarkEnd w:id="14"/>
-    <w:bookmarkStart w:id="15" w:name="Xa64d3085c9800517858e9bbb9c52cb4bb4814e5"/>
+    <w:bookmarkEnd w:id="15"/>
+    <w:bookmarkStart w:id="16" w:name="X4a8f5880c7b7ea95bbca297268df499668ea816"/>
     <w:p>
       <w:pPr>
         <w:pStyle w:val="Ttulo3"/>
       </w:pPr>
       <w:r>
-        <w:t xml:space="preserve">Diapositiva 7. Port de sortida i adaptador - 2:20</w:t>
+        <w:t xml:space="preserve">Diapositiva 8. Port de sortida i adaptador - 2:20</w:t>
       </w:r>
     </w:p>
     <w:p>
@@ -697,14 +715,14 @@
         <w:t xml:space="preserve">Amb aquesta idea clara, ara podem portar el patró al cas administratiu.</w:t>
       </w:r>
     </w:p>
-    <w:bookmarkEnd w:id="15"/>
-    <w:bookmarkStart w:id="16" w:name="X03bf5d2bd196b04e61c9020dfe27fee6ad69815"/>
+    <w:bookmarkEnd w:id="16"/>
+    <w:bookmarkStart w:id="17" w:name="X737dde0732fe365d60838ad25365514ba966f4c"/>
     <w:p>
       <w:pPr>
         <w:pStyle w:val="Ttulo3"/>
       </w:pPr>
       <w:r>
-        <w:t xml:space="preserve">Diapositiva 8. Port de sortida per a informació patrimonial - 1:45</w:t>
+        <w:t xml:space="preserve">Diapositiva 9. Port de sortida per a informació patrimonial - 1:45</w:t>
       </w:r>
     </w:p>
     <w:p>
@@ -767,14 +785,14 @@
         <w:t xml:space="preserve">Aquesta mateixa estructura la podem transferir ara al domini financer: una aplicació de gestió d’una cartera d’inversió personal.</w:t>
       </w:r>
     </w:p>
-    <w:bookmarkEnd w:id="16"/>
-    <w:bookmarkStart w:id="17" w:name="X622b1aabebf27347556ce6d9dffa831cb77da68"/>
+    <w:bookmarkEnd w:id="17"/>
+    <w:bookmarkStart w:id="18" w:name="X13e5e81559d612cc2069fccca85bb59fa82f5a1"/>
     <w:p>
       <w:pPr>
         <w:pStyle w:val="Ttulo3"/>
       </w:pPr>
       <w:r>
-        <w:t xml:space="preserve">Diapositiva 9. Transferència al domini financer - 1:25</w:t>
+        <w:t xml:space="preserve">Diapositiva 10. Transferència al domini financer - 1:25</w:t>
       </w:r>
     </w:p>
     <w:p>
@@ -845,14 +863,14 @@
         <w:t xml:space="preserve">Amb això podem tancar la classe recuperant les tres decisions essencials.</w:t>
       </w:r>
     </w:p>
-    <w:bookmarkEnd w:id="17"/>
-    <w:bookmarkStart w:id="18" w:name="X8617ba821f47f0e5854955ab559cd49c5832102"/>
+    <w:bookmarkEnd w:id="18"/>
+    <w:bookmarkStart w:id="19" w:name="X3d56e29a394b8f26f2e1c08e2877dce228513ea"/>
     <w:p>
       <w:pPr>
         <w:pStyle w:val="Ttulo3"/>
       </w:pPr>
       <w:r>
-        <w:t xml:space="preserve">Diapositiva 10. Idea clau i tancament - 0:45</w:t>
+        <w:t xml:space="preserve">Diapositiva 11. Idea clau i tancament - 0:45</w:t>
       </w:r>
     </w:p>
     <w:p>
@@ -887,14 +905,14 @@
         <w:t xml:space="preserve">Dit de manera sintètica: l’arquitectura no elimina el canvi; el localitza.</w:t>
       </w:r>
     </w:p>
-    <w:bookmarkEnd w:id="18"/>
-    <w:bookmarkStart w:id="19" w:name="diapositiva-11.-agraïment---025"/>
+    <w:bookmarkEnd w:id="19"/>
+    <w:bookmarkStart w:id="20" w:name="diapositiva-12.-agraïment---025"/>
     <w:p>
       <w:pPr>
         <w:pStyle w:val="Ttulo3"/>
       </w:pPr>
       <w:r>
-        <w:t xml:space="preserve">Diapositiva 11. Agraïment - 0:25</w:t>
+        <w:t xml:space="preserve">Diapositiva 12. Agraïment - 0:25</w:t>
       </w:r>
     </w:p>
     <w:p>
@@ -928,9 +946,9 @@
         </w:pict>
       </w:r>
     </w:p>
-    <w:bookmarkEnd w:id="19"/>
     <w:bookmarkEnd w:id="20"/>
-    <w:bookmarkStart w:id="22" w:name="annex-a.-demo-opcional"/>
+    <w:bookmarkEnd w:id="21"/>
+    <w:bookmarkStart w:id="23" w:name="annex-a.-demo-opcional"/>
     <w:p>
       <w:pPr>
         <w:pStyle w:val="Ttulo2"/>
@@ -947,7 +965,7 @@
         <w:t xml:space="preserve">Aquest annex no forma part del cos principal de la classe magistral de 20 minuts. Només s’ha d’utilitzar si el tribunal ho demana o si, després del tancament formal, es considera oportú mostrar breument la demostració.</w:t>
       </w:r>
     </w:p>
-    <w:bookmarkStart w:id="21" w:name="annex-a.-demo-opcional---130-a-230"/>
+    <w:bookmarkStart w:id="22" w:name="annex-a.-demo-opcional---130-a-230"/>
     <w:p>
       <w:pPr>
         <w:pStyle w:val="Ttulo3"/>
@@ -1031,9 +1049,9 @@
         </w:pict>
       </w:r>
     </w:p>
-    <w:bookmarkEnd w:id="21"/>
     <w:bookmarkEnd w:id="22"/>
-    <w:bookmarkStart w:id="35" w:name="notes-del-presentador-per-diapositiva"/>
+    <w:bookmarkEnd w:id="23"/>
+    <w:bookmarkStart w:id="37" w:name="notes-del-presentador-per-diapositiva"/>
     <w:p>
       <w:pPr>
         <w:pStyle w:val="Ttulo2"/>
@@ -1042,13 +1060,13 @@
         <w:t xml:space="preserve">2. Notes del presentador per diapositiva</w:t>
       </w:r>
     </w:p>
-    <w:bookmarkStart w:id="23" w:name="portada---135"/>
+    <w:bookmarkStart w:id="24" w:name="portada---020"/>
     <w:p>
       <w:pPr>
         <w:pStyle w:val="Ttulo3"/>
       </w:pPr>
       <w:r>
-        <w:t xml:space="preserve">1. Portada - 1:35</w:t>
+        <w:t xml:space="preserve">1. Portada - 0:20</w:t>
       </w:r>
     </w:p>
     <w:p>
@@ -1060,7 +1078,7 @@
         </w:numPr>
       </w:pPr>
       <w:r>
-        <w:t xml:space="preserve">Funció: obrir la microlliçó i delimitar-ne el focus.</w:t>
+        <w:t xml:space="preserve">Funció: obrir la microlliçó amb la salutació i el títol de la classe.</w:t>
       </w:r>
     </w:p>
     <w:p>
@@ -1072,6 +1090,64 @@
         </w:numPr>
       </w:pPr>
       <w:r>
+        <w:t xml:space="preserve">Assenyalar el títol; el context s’explica amb la diapositiva 2.</w:t>
+      </w:r>
+    </w:p>
+    <w:p>
+      <w:pPr>
+        <w:pStyle w:val="Compact"/>
+        <w:numPr>
+          <w:ilvl w:val="0"/>
+          <w:numId w:val="1002"/>
+        </w:numPr>
+      </w:pPr>
+      <w:r>
+        <w:t xml:space="preserve">Transició: avançar a la diapositiva</w:t>
+      </w:r>
+      <w:r>
+        <w:t xml:space="preserve"> </w:t>
+      </w:r>
+      <w:r>
+        <w:rPr>
+          <w:rStyle w:val="VerbatimChar"/>
+        </w:rPr>
+        <w:t xml:space="preserve">Una trobada entre dos mons</w:t>
+      </w:r>
+      <w:r>
+        <w:t xml:space="preserve">.</w:t>
+      </w:r>
+    </w:p>
+    <w:bookmarkEnd w:id="24"/>
+    <w:bookmarkStart w:id="25" w:name="una-trobada-entre-dos-mons---115"/>
+    <w:p>
+      <w:pPr>
+        <w:pStyle w:val="Ttulo3"/>
+      </w:pPr>
+      <w:r>
+        <w:t xml:space="preserve">2. Una trobada entre dos mons - 1:15</w:t>
+      </w:r>
+    </w:p>
+    <w:p>
+      <w:pPr>
+        <w:pStyle w:val="Compact"/>
+        <w:numPr>
+          <w:ilvl w:val="0"/>
+          <w:numId w:val="1003"/>
+        </w:numPr>
+      </w:pPr>
+      <w:r>
+        <w:t xml:space="preserve">Funció: contextualitzar la sessió i delimitar-ne el focus.</w:t>
+      </w:r>
+    </w:p>
+    <w:p>
+      <w:pPr>
+        <w:pStyle w:val="Compact"/>
+        <w:numPr>
+          <w:ilvl w:val="0"/>
+          <w:numId w:val="1003"/>
+        </w:numPr>
+      </w:pPr>
+      <w:r>
         <w:t xml:space="preserve">Context: classe de DSI i cas real acreditat de consultoria per a la Generalitat/AGAUR.</w:t>
       </w:r>
     </w:p>
@@ -1080,7 +1156,7 @@
         <w:pStyle w:val="Compact"/>
         <w:numPr>
           <w:ilvl w:val="0"/>
-          <w:numId w:val="1002"/>
+          <w:numId w:val="1003"/>
         </w:numPr>
       </w:pPr>
       <w:r>
@@ -1092,7 +1168,7 @@
         <w:pStyle w:val="Compact"/>
         <w:numPr>
           <w:ilvl w:val="0"/>
-          <w:numId w:val="1002"/>
+          <w:numId w:val="1003"/>
         </w:numPr>
       </w:pPr>
       <w:r>
@@ -1104,7 +1180,7 @@
         <w:pStyle w:val="Compact"/>
         <w:numPr>
           <w:ilvl w:val="0"/>
-          <w:numId w:val="1002"/>
+          <w:numId w:val="1003"/>
         </w:numPr>
       </w:pPr>
       <w:r>
@@ -1116,7 +1192,7 @@
         <w:pStyle w:val="Compact"/>
         <w:numPr>
           <w:ilvl w:val="0"/>
-          <w:numId w:val="1002"/>
+          <w:numId w:val="1003"/>
         </w:numPr>
       </w:pPr>
       <w:r>
@@ -1132,22 +1208,22 @@
         <w:t xml:space="preserve">Situem primer la sessió dins l'assignatura.</w:t>
       </w:r>
     </w:p>
-    <w:bookmarkEnd w:id="23"/>
-    <w:bookmarkStart w:id="24" w:name="on-som-dins-lassignatura---105"/>
+    <w:bookmarkEnd w:id="25"/>
+    <w:bookmarkStart w:id="26" w:name="on-som-dins-lassignatura---105"/>
     <w:p>
       <w:pPr>
         <w:pStyle w:val="Ttulo3"/>
       </w:pPr>
       <w:r>
-        <w:t xml:space="preserve">2. On som dins l’assignatura - 1:05</w:t>
-      </w:r>
-    </w:p>
-    <w:p>
-      <w:pPr>
-        <w:pStyle w:val="Compact"/>
-        <w:numPr>
-          <w:ilvl w:val="0"/>
-          <w:numId w:val="1003"/>
+        <w:t xml:space="preserve">3. On som dins l’assignatura - 1:05</w:t>
+      </w:r>
+    </w:p>
+    <w:p>
+      <w:pPr>
+        <w:pStyle w:val="Compact"/>
+        <w:numPr>
+          <w:ilvl w:val="0"/>
+          <w:numId w:val="1004"/>
         </w:numPr>
       </w:pPr>
       <w:r>
@@ -1159,7 +1235,7 @@
         <w:pStyle w:val="Compact"/>
         <w:numPr>
           <w:ilvl w:val="0"/>
-          <w:numId w:val="1003"/>
+          <w:numId w:val="1004"/>
         </w:numPr>
       </w:pPr>
       <w:r>
@@ -1171,7 +1247,7 @@
         <w:pStyle w:val="Compact"/>
         <w:numPr>
           <w:ilvl w:val="0"/>
-          <w:numId w:val="1003"/>
+          <w:numId w:val="1004"/>
         </w:numPr>
       </w:pPr>
       <w:r>
@@ -1183,7 +1259,7 @@
         <w:pStyle w:val="Compact"/>
         <w:numPr>
           <w:ilvl w:val="0"/>
-          <w:numId w:val="1003"/>
+          <w:numId w:val="1004"/>
         </w:numPr>
       </w:pPr>
       <w:r>
@@ -1195,7 +1271,7 @@
         <w:pStyle w:val="Compact"/>
         <w:numPr>
           <w:ilvl w:val="0"/>
-          <w:numId w:val="1003"/>
+          <w:numId w:val="1004"/>
         </w:numPr>
       </w:pPr>
       <w:r>
@@ -1211,22 +1287,22 @@
         <w:t xml:space="preserve">Amb aquest context, formulem l'objectiu mínim de la sessió.</w:t>
       </w:r>
     </w:p>
-    <w:bookmarkEnd w:id="24"/>
-    <w:bookmarkStart w:id="25" w:name="objectiu-de-la-sessió---055"/>
+    <w:bookmarkEnd w:id="26"/>
+    <w:bookmarkStart w:id="27" w:name="objectiu-de-la-sessió---055"/>
     <w:p>
       <w:pPr>
         <w:pStyle w:val="Ttulo3"/>
       </w:pPr>
       <w:r>
-        <w:t xml:space="preserve">3. Objectiu de la sessió - 0:55</w:t>
-      </w:r>
-    </w:p>
-    <w:p>
-      <w:pPr>
-        <w:pStyle w:val="Compact"/>
-        <w:numPr>
-          <w:ilvl w:val="0"/>
-          <w:numId w:val="1004"/>
+        <w:t xml:space="preserve">4. Objectiu de la sessió - 0:55</w:t>
+      </w:r>
+    </w:p>
+    <w:p>
+      <w:pPr>
+        <w:pStyle w:val="Compact"/>
+        <w:numPr>
+          <w:ilvl w:val="0"/>
+          <w:numId w:val="1005"/>
         </w:numPr>
       </w:pPr>
       <w:r>
@@ -1238,7 +1314,7 @@
         <w:pStyle w:val="Compact"/>
         <w:numPr>
           <w:ilvl w:val="0"/>
-          <w:numId w:val="1004"/>
+          <w:numId w:val="1005"/>
         </w:numPr>
       </w:pPr>
       <w:r>
@@ -1259,7 +1335,7 @@
         <w:pStyle w:val="Compact"/>
         <w:numPr>
           <w:ilvl w:val="0"/>
-          <w:numId w:val="1004"/>
+          <w:numId w:val="1005"/>
         </w:numPr>
       </w:pPr>
       <w:r>
@@ -1271,7 +1347,7 @@
         <w:pStyle w:val="Compact"/>
         <w:numPr>
           <w:ilvl w:val="0"/>
-          <w:numId w:val="1004"/>
+          <w:numId w:val="1005"/>
         </w:numPr>
       </w:pPr>
       <w:r>
@@ -1283,7 +1359,7 @@
         <w:pStyle w:val="Compact"/>
         <w:numPr>
           <w:ilvl w:val="0"/>
-          <w:numId w:val="1004"/>
+          <w:numId w:val="1005"/>
         </w:numPr>
       </w:pPr>
       <w:r>
@@ -1299,22 +1375,22 @@
         <w:t xml:space="preserve">Comencem, per tant, pel procediment de beca.</w:t>
       </w:r>
     </w:p>
-    <w:bookmarkEnd w:id="25"/>
-    <w:bookmarkStart w:id="26" w:name="avaluació-econòmica---145"/>
+    <w:bookmarkEnd w:id="27"/>
+    <w:bookmarkStart w:id="28" w:name="avaluació-econòmica---145"/>
     <w:p>
       <w:pPr>
         <w:pStyle w:val="Ttulo3"/>
       </w:pPr>
       <w:r>
-        <w:t xml:space="preserve">4. Avaluació econòmica - 1:45</w:t>
-      </w:r>
-    </w:p>
-    <w:p>
-      <w:pPr>
-        <w:pStyle w:val="Compact"/>
-        <w:numPr>
-          <w:ilvl w:val="0"/>
-          <w:numId w:val="1005"/>
+        <w:t xml:space="preserve">5. Avaluació econòmica - 1:45</w:t>
+      </w:r>
+    </w:p>
+    <w:p>
+      <w:pPr>
+        <w:pStyle w:val="Compact"/>
+        <w:numPr>
+          <w:ilvl w:val="0"/>
+          <w:numId w:val="1006"/>
         </w:numPr>
       </w:pPr>
       <w:r>
@@ -1326,7 +1402,7 @@
         <w:pStyle w:val="Compact"/>
         <w:numPr>
           <w:ilvl w:val="0"/>
-          <w:numId w:val="1005"/>
+          <w:numId w:val="1006"/>
         </w:numPr>
       </w:pPr>
       <w:r>
@@ -1338,7 +1414,7 @@
         <w:pStyle w:val="Compact"/>
         <w:numPr>
           <w:ilvl w:val="0"/>
-          <w:numId w:val="1005"/>
+          <w:numId w:val="1006"/>
         </w:numPr>
       </w:pPr>
       <w:r>
@@ -1350,7 +1426,7 @@
         <w:pStyle w:val="Compact"/>
         <w:numPr>
           <w:ilvl w:val="0"/>
-          <w:numId w:val="1005"/>
+          <w:numId w:val="1006"/>
         </w:numPr>
       </w:pPr>
       <w:r>
@@ -1362,7 +1438,7 @@
         <w:pStyle w:val="Compact"/>
         <w:numPr>
           <w:ilvl w:val="0"/>
-          <w:numId w:val="1005"/>
+          <w:numId w:val="1006"/>
         </w:numPr>
       </w:pPr>
       <w:r>
@@ -1374,7 +1450,7 @@
         <w:pStyle w:val="Compact"/>
         <w:numPr>
           <w:ilvl w:val="0"/>
-          <w:numId w:val="1005"/>
+          <w:numId w:val="1006"/>
         </w:numPr>
       </w:pPr>
       <w:r>
@@ -1390,22 +1466,22 @@
         <w:t xml:space="preserve">Quina informació externa necessita el procediment per prendre aquesta decisió?</w:t>
       </w:r>
     </w:p>
-    <w:bookmarkEnd w:id="26"/>
-    <w:bookmarkStart w:id="27" w:name="informació-externa---145"/>
+    <w:bookmarkEnd w:id="28"/>
+    <w:bookmarkStart w:id="29" w:name="informació-externa---145"/>
     <w:p>
       <w:pPr>
         <w:pStyle w:val="Ttulo3"/>
       </w:pPr>
       <w:r>
-        <w:t xml:space="preserve">5. Informació externa - 1:45</w:t>
-      </w:r>
-    </w:p>
-    <w:p>
-      <w:pPr>
-        <w:pStyle w:val="Compact"/>
-        <w:numPr>
-          <w:ilvl w:val="0"/>
-          <w:numId w:val="1006"/>
+        <w:t xml:space="preserve">6. Informació externa - 1:45</w:t>
+      </w:r>
+    </w:p>
+    <w:p>
+      <w:pPr>
+        <w:pStyle w:val="Compact"/>
+        <w:numPr>
+          <w:ilvl w:val="0"/>
+          <w:numId w:val="1007"/>
         </w:numPr>
       </w:pPr>
       <w:r>
@@ -1417,7 +1493,7 @@
         <w:pStyle w:val="Compact"/>
         <w:numPr>
           <w:ilvl w:val="0"/>
-          <w:numId w:val="1006"/>
+          <w:numId w:val="1007"/>
         </w:numPr>
       </w:pPr>
       <w:r>
@@ -1429,7 +1505,7 @@
         <w:pStyle w:val="Compact"/>
         <w:numPr>
           <w:ilvl w:val="0"/>
-          <w:numId w:val="1006"/>
+          <w:numId w:val="1007"/>
         </w:numPr>
       </w:pPr>
       <w:r>
@@ -1441,7 +1517,7 @@
         <w:pStyle w:val="Compact"/>
         <w:numPr>
           <w:ilvl w:val="0"/>
-          <w:numId w:val="1006"/>
+          <w:numId w:val="1007"/>
         </w:numPr>
       </w:pPr>
       <w:r>
@@ -1453,7 +1529,7 @@
         <w:pStyle w:val="Compact"/>
         <w:numPr>
           <w:ilvl w:val="0"/>
-          <w:numId w:val="1006"/>
+          <w:numId w:val="1007"/>
         </w:numPr>
       </w:pPr>
       <w:r>
@@ -1474,7 +1550,7 @@
         <w:pStyle w:val="Compact"/>
         <w:numPr>
           <w:ilvl w:val="0"/>
-          <w:numId w:val="1006"/>
+          <w:numId w:val="1007"/>
         </w:numPr>
       </w:pPr>
       <w:r>
@@ -1490,22 +1566,22 @@
         <w:t xml:space="preserve">Quan aquesta separació no es respecta, apareix el problema arquitectònic.</w:t>
       </w:r>
     </w:p>
-    <w:bookmarkEnd w:id="27"/>
-    <w:bookmarkStart w:id="28" w:name="dependència-directa---220"/>
+    <w:bookmarkEnd w:id="29"/>
+    <w:bookmarkStart w:id="30" w:name="dependència-directa---220"/>
     <w:p>
       <w:pPr>
         <w:pStyle w:val="Ttulo3"/>
       </w:pPr>
       <w:r>
-        <w:t xml:space="preserve">6. Dependència directa - 2:20</w:t>
-      </w:r>
-    </w:p>
-    <w:p>
-      <w:pPr>
-        <w:pStyle w:val="Compact"/>
-        <w:numPr>
-          <w:ilvl w:val="0"/>
-          <w:numId w:val="1007"/>
+        <w:t xml:space="preserve">7. Dependència directa - 2:20</w:t>
+      </w:r>
+    </w:p>
+    <w:p>
+      <w:pPr>
+        <w:pStyle w:val="Compact"/>
+        <w:numPr>
+          <w:ilvl w:val="0"/>
+          <w:numId w:val="1008"/>
         </w:numPr>
       </w:pPr>
       <w:r>
@@ -1517,7 +1593,7 @@
         <w:pStyle w:val="Compact"/>
         <w:numPr>
           <w:ilvl w:val="0"/>
-          <w:numId w:val="1007"/>
+          <w:numId w:val="1008"/>
         </w:numPr>
       </w:pPr>
       <w:r>
@@ -1529,7 +1605,7 @@
         <w:pStyle w:val="Compact"/>
         <w:numPr>
           <w:ilvl w:val="0"/>
-          <w:numId w:val="1007"/>
+          <w:numId w:val="1008"/>
         </w:numPr>
       </w:pPr>
       <w:r>
@@ -1541,7 +1617,7 @@
         <w:pStyle w:val="Compact"/>
         <w:numPr>
           <w:ilvl w:val="0"/>
-          <w:numId w:val="1007"/>
+          <w:numId w:val="1008"/>
         </w:numPr>
       </w:pPr>
       <w:r>
@@ -1553,7 +1629,7 @@
         <w:pStyle w:val="Compact"/>
         <w:numPr>
           <w:ilvl w:val="0"/>
-          <w:numId w:val="1007"/>
+          <w:numId w:val="1008"/>
         </w:numPr>
       </w:pPr>
       <w:r>
@@ -1574,7 +1650,7 @@
         <w:pStyle w:val="Compact"/>
         <w:numPr>
           <w:ilvl w:val="0"/>
-          <w:numId w:val="1007"/>
+          <w:numId w:val="1008"/>
         </w:numPr>
       </w:pPr>
       <w:r>
@@ -1590,22 +1666,22 @@
         <w:t xml:space="preserve">La resposta és introduir un port de sortida.</w:t>
       </w:r>
     </w:p>
-    <w:bookmarkEnd w:id="28"/>
-    <w:bookmarkStart w:id="29" w:name="port-i-adaptador---220"/>
+    <w:bookmarkEnd w:id="30"/>
+    <w:bookmarkStart w:id="31" w:name="port-i-adaptador---220"/>
     <w:p>
       <w:pPr>
         <w:pStyle w:val="Ttulo3"/>
       </w:pPr>
       <w:r>
-        <w:t xml:space="preserve">7. Port i adaptador - 2:20</w:t>
-      </w:r>
-    </w:p>
-    <w:p>
-      <w:pPr>
-        <w:pStyle w:val="Compact"/>
-        <w:numPr>
-          <w:ilvl w:val="0"/>
-          <w:numId w:val="1008"/>
+        <w:t xml:space="preserve">8. Port i adaptador - 2:20</w:t>
+      </w:r>
+    </w:p>
+    <w:p>
+      <w:pPr>
+        <w:pStyle w:val="Compact"/>
+        <w:numPr>
+          <w:ilvl w:val="0"/>
+          <w:numId w:val="1009"/>
         </w:numPr>
       </w:pPr>
       <w:r>
@@ -1617,7 +1693,7 @@
         <w:pStyle w:val="Compact"/>
         <w:numPr>
           <w:ilvl w:val="0"/>
-          <w:numId w:val="1008"/>
+          <w:numId w:val="1009"/>
         </w:numPr>
       </w:pPr>
       <w:r>
@@ -1629,7 +1705,7 @@
         <w:pStyle w:val="Compact"/>
         <w:numPr>
           <w:ilvl w:val="0"/>
-          <w:numId w:val="1008"/>
+          <w:numId w:val="1009"/>
         </w:numPr>
       </w:pPr>
       <w:r>
@@ -1641,7 +1717,7 @@
         <w:pStyle w:val="Compact"/>
         <w:numPr>
           <w:ilvl w:val="0"/>
-          <w:numId w:val="1008"/>
+          <w:numId w:val="1009"/>
         </w:numPr>
       </w:pPr>
       <w:r>
@@ -1653,7 +1729,7 @@
         <w:pStyle w:val="Compact"/>
         <w:numPr>
           <w:ilvl w:val="0"/>
-          <w:numId w:val="1008"/>
+          <w:numId w:val="1009"/>
         </w:numPr>
       </w:pPr>
       <w:r>
@@ -1674,7 +1750,7 @@
         <w:pStyle w:val="Compact"/>
         <w:numPr>
           <w:ilvl w:val="0"/>
-          <w:numId w:val="1008"/>
+          <w:numId w:val="1009"/>
         </w:numPr>
       </w:pPr>
       <w:r>
@@ -1686,7 +1762,7 @@
         <w:pStyle w:val="Compact"/>
         <w:numPr>
           <w:ilvl w:val="0"/>
-          <w:numId w:val="1008"/>
+          <w:numId w:val="1009"/>
         </w:numPr>
       </w:pPr>
       <w:r>
@@ -1702,22 +1778,22 @@
         <w:t xml:space="preserve">Apliquem ara aquesta distinció a la informació patrimonial.</w:t>
       </w:r>
     </w:p>
-    <w:bookmarkEnd w:id="29"/>
-    <w:bookmarkStart w:id="30" w:name="port-patrimonial---145"/>
+    <w:bookmarkEnd w:id="31"/>
+    <w:bookmarkStart w:id="32" w:name="port-patrimonial---145"/>
     <w:p>
       <w:pPr>
         <w:pStyle w:val="Ttulo3"/>
       </w:pPr>
       <w:r>
-        <w:t xml:space="preserve">8. Port patrimonial - 1:45</w:t>
-      </w:r>
-    </w:p>
-    <w:p>
-      <w:pPr>
-        <w:pStyle w:val="Compact"/>
-        <w:numPr>
-          <w:ilvl w:val="0"/>
-          <w:numId w:val="1009"/>
+        <w:t xml:space="preserve">9. Port patrimonial - 1:45</w:t>
+      </w:r>
+    </w:p>
+    <w:p>
+      <w:pPr>
+        <w:pStyle w:val="Compact"/>
+        <w:numPr>
+          <w:ilvl w:val="0"/>
+          <w:numId w:val="1010"/>
         </w:numPr>
       </w:pPr>
       <w:r>
@@ -1729,7 +1805,7 @@
         <w:pStyle w:val="Compact"/>
         <w:numPr>
           <w:ilvl w:val="0"/>
-          <w:numId w:val="1009"/>
+          <w:numId w:val="1010"/>
         </w:numPr>
       </w:pPr>
       <w:r>
@@ -1741,7 +1817,7 @@
         <w:pStyle w:val="Compact"/>
         <w:numPr>
           <w:ilvl w:val="0"/>
-          <w:numId w:val="1009"/>
+          <w:numId w:val="1010"/>
         </w:numPr>
       </w:pPr>
       <w:r>
@@ -1753,7 +1829,7 @@
         <w:pStyle w:val="Compact"/>
         <w:numPr>
           <w:ilvl w:val="0"/>
-          <w:numId w:val="1009"/>
+          <w:numId w:val="1010"/>
         </w:numPr>
       </w:pPr>
       <w:r>
@@ -1765,7 +1841,7 @@
         <w:pStyle w:val="Compact"/>
         <w:numPr>
           <w:ilvl w:val="0"/>
-          <w:numId w:val="1009"/>
+          <w:numId w:val="1010"/>
         </w:numPr>
       </w:pPr>
       <w:r>
@@ -1777,7 +1853,7 @@
         <w:pStyle w:val="Compact"/>
         <w:numPr>
           <w:ilvl w:val="0"/>
-          <w:numId w:val="1009"/>
+          <w:numId w:val="1010"/>
         </w:numPr>
       </w:pPr>
       <w:r>
@@ -1793,22 +1869,22 @@
         <w:t xml:space="preserve">Transferim la mateixa decisió arquitectònica a un domini financer.</w:t>
       </w:r>
     </w:p>
-    <w:bookmarkEnd w:id="30"/>
-    <w:bookmarkStart w:id="31" w:name="domini-financer---125"/>
+    <w:bookmarkEnd w:id="32"/>
+    <w:bookmarkStart w:id="33" w:name="domini-financer---125"/>
     <w:p>
       <w:pPr>
         <w:pStyle w:val="Ttulo3"/>
       </w:pPr>
       <w:r>
-        <w:t xml:space="preserve">9. Domini financer - 1:25</w:t>
-      </w:r>
-    </w:p>
-    <w:p>
-      <w:pPr>
-        <w:pStyle w:val="Compact"/>
-        <w:numPr>
-          <w:ilvl w:val="0"/>
-          <w:numId w:val="1010"/>
+        <w:t xml:space="preserve">10. Domini financer - 1:25</w:t>
+      </w:r>
+    </w:p>
+    <w:p>
+      <w:pPr>
+        <w:pStyle w:val="Compact"/>
+        <w:numPr>
+          <w:ilvl w:val="0"/>
+          <w:numId w:val="1011"/>
         </w:numPr>
       </w:pPr>
       <w:r>
@@ -1820,7 +1896,7 @@
         <w:pStyle w:val="Compact"/>
         <w:numPr>
           <w:ilvl w:val="0"/>
-          <w:numId w:val="1010"/>
+          <w:numId w:val="1011"/>
         </w:numPr>
       </w:pPr>
       <w:r>
@@ -1832,7 +1908,7 @@
         <w:pStyle w:val="Compact"/>
         <w:numPr>
           <w:ilvl w:val="0"/>
-          <w:numId w:val="1010"/>
+          <w:numId w:val="1011"/>
         </w:numPr>
       </w:pPr>
       <w:r>
@@ -1856,7 +1932,7 @@
         <w:pStyle w:val="Compact"/>
         <w:numPr>
           <w:ilvl w:val="0"/>
-          <w:numId w:val="1010"/>
+          <w:numId w:val="1011"/>
         </w:numPr>
       </w:pPr>
       <w:r>
@@ -1868,7 +1944,7 @@
         <w:pStyle w:val="Compact"/>
         <w:numPr>
           <w:ilvl w:val="0"/>
-          <w:numId w:val="1010"/>
+          <w:numId w:val="1011"/>
         </w:numPr>
       </w:pPr>
       <w:r>
@@ -1889,7 +1965,7 @@
         <w:pStyle w:val="Compact"/>
         <w:numPr>
           <w:ilvl w:val="0"/>
-          <w:numId w:val="1010"/>
+          <w:numId w:val="1011"/>
         </w:numPr>
       </w:pPr>
       <w:r>
@@ -1901,7 +1977,7 @@
         <w:pStyle w:val="Compact"/>
         <w:numPr>
           <w:ilvl w:val="0"/>
-          <w:numId w:val="1010"/>
+          <w:numId w:val="1011"/>
         </w:numPr>
       </w:pPr>
       <w:r>
@@ -1917,22 +1993,22 @@
         <w:t xml:space="preserve">Canvia el domini, però es manté la decisió arquitectònica.</w:t>
       </w:r>
     </w:p>
-    <w:bookmarkEnd w:id="31"/>
-    <w:bookmarkStart w:id="32" w:name="idea-clau-i-tancament---045"/>
+    <w:bookmarkEnd w:id="33"/>
+    <w:bookmarkStart w:id="34" w:name="idea-clau-i-tancament---045"/>
     <w:p>
       <w:pPr>
         <w:pStyle w:val="Ttulo3"/>
       </w:pPr>
       <w:r>
-        <w:t xml:space="preserve">10. Idea clau i tancament - 0:45</w:t>
-      </w:r>
-    </w:p>
-    <w:p>
-      <w:pPr>
-        <w:pStyle w:val="Compact"/>
-        <w:numPr>
-          <w:ilvl w:val="0"/>
-          <w:numId w:val="1011"/>
+        <w:t xml:space="preserve">11. Idea clau i tancament - 0:45</w:t>
+      </w:r>
+    </w:p>
+    <w:p>
+      <w:pPr>
+        <w:pStyle w:val="Compact"/>
+        <w:numPr>
+          <w:ilvl w:val="0"/>
+          <w:numId w:val="1012"/>
         </w:numPr>
       </w:pPr>
       <w:r>
@@ -1944,7 +2020,7 @@
         <w:pStyle w:val="Compact"/>
         <w:numPr>
           <w:ilvl w:val="0"/>
-          <w:numId w:val="1011"/>
+          <w:numId w:val="1012"/>
         </w:numPr>
       </w:pPr>
       <w:r>
@@ -1956,7 +2032,7 @@
         <w:pStyle w:val="Compact"/>
         <w:numPr>
           <w:ilvl w:val="0"/>
-          <w:numId w:val="1011"/>
+          <w:numId w:val="1012"/>
         </w:numPr>
       </w:pPr>
       <w:r>
@@ -1968,7 +2044,7 @@
         <w:pStyle w:val="Compact"/>
         <w:numPr>
           <w:ilvl w:val="0"/>
-          <w:numId w:val="1011"/>
+          <w:numId w:val="1012"/>
         </w:numPr>
       </w:pPr>
       <w:r>
@@ -1989,29 +2065,29 @@
         <w:pStyle w:val="Compact"/>
         <w:numPr>
           <w:ilvl w:val="0"/>
-          <w:numId w:val="1011"/>
-        </w:numPr>
-      </w:pPr>
-      <w:r>
-        <w:t xml:space="preserve">No fer encara l’agraïment: donar pas net a la diapositiva 11.</w:t>
-      </w:r>
-    </w:p>
-    <w:bookmarkEnd w:id="32"/>
-    <w:bookmarkStart w:id="33" w:name="agraïment---025"/>
+          <w:numId w:val="1012"/>
+        </w:numPr>
+      </w:pPr>
+      <w:r>
+        <w:t xml:space="preserve">No fer encara l’agraïment: donar pas net a la diapositiva 12.</w:t>
+      </w:r>
+    </w:p>
+    <w:bookmarkEnd w:id="34"/>
+    <w:bookmarkStart w:id="35" w:name="agraïment---025"/>
     <w:p>
       <w:pPr>
         <w:pStyle w:val="Ttulo3"/>
       </w:pPr>
       <w:r>
-        <w:t xml:space="preserve">11. Agraïment - 0:25</w:t>
-      </w:r>
-    </w:p>
-    <w:p>
-      <w:pPr>
-        <w:pStyle w:val="Compact"/>
-        <w:numPr>
-          <w:ilvl w:val="0"/>
-          <w:numId w:val="1012"/>
+        <w:t xml:space="preserve">12. Agraïment - 0:25</w:t>
+      </w:r>
+    </w:p>
+    <w:p>
+      <w:pPr>
+        <w:pStyle w:val="Compact"/>
+        <w:numPr>
+          <w:ilvl w:val="0"/>
+          <w:numId w:val="1013"/>
         </w:numPr>
       </w:pPr>
       <w:r>
@@ -2023,7 +2099,7 @@
         <w:pStyle w:val="Compact"/>
         <w:numPr>
           <w:ilvl w:val="0"/>
-          <w:numId w:val="1012"/>
+          <w:numId w:val="1013"/>
         </w:numPr>
       </w:pPr>
       <w:r>
@@ -2035,7 +2111,7 @@
         <w:pStyle w:val="Compact"/>
         <w:numPr>
           <w:ilvl w:val="0"/>
-          <w:numId w:val="1012"/>
+          <w:numId w:val="1013"/>
         </w:numPr>
       </w:pPr>
       <w:r>
@@ -2047,7 +2123,7 @@
         <w:pStyle w:val="Compact"/>
         <w:numPr>
           <w:ilvl w:val="0"/>
-          <w:numId w:val="1012"/>
+          <w:numId w:val="1013"/>
         </w:numPr>
       </w:pPr>
       <w:r>
@@ -2074,7 +2150,7 @@
         <w:pStyle w:val="Compact"/>
         <w:numPr>
           <w:ilvl w:val="0"/>
-          <w:numId w:val="1012"/>
+          <w:numId w:val="1013"/>
         </w:numPr>
       </w:pPr>
       <w:r>
@@ -2098,15 +2174,15 @@
         <w:pStyle w:val="Compact"/>
         <w:numPr>
           <w:ilvl w:val="0"/>
-          <w:numId w:val="1012"/>
+          <w:numId w:val="1013"/>
         </w:numPr>
       </w:pPr>
       <w:r>
         <w:t xml:space="preserve">No obrir la demo si el tribunal no la demana o si no hi ha temps explícit.</w:t>
       </w:r>
     </w:p>
-    <w:bookmarkEnd w:id="33"/>
-    <w:bookmarkStart w:id="34" w:name="annex-a.-demo-opcional---130-a-230-1"/>
+    <w:bookmarkEnd w:id="35"/>
+    <w:bookmarkStart w:id="36" w:name="annex-a.-demo-opcional---130-a-230-1"/>
     <w:p>
       <w:pPr>
         <w:pStyle w:val="Ttulo3"/>
@@ -2120,7 +2196,7 @@
         <w:pStyle w:val="Compact"/>
         <w:numPr>
           <w:ilvl w:val="0"/>
-          <w:numId w:val="1013"/>
+          <w:numId w:val="1014"/>
         </w:numPr>
       </w:pPr>
       <w:r>
@@ -2132,7 +2208,7 @@
         <w:pStyle w:val="Compact"/>
         <w:numPr>
           <w:ilvl w:val="0"/>
-          <w:numId w:val="1013"/>
+          <w:numId w:val="1014"/>
         </w:numPr>
       </w:pPr>
       <w:r>
@@ -2144,7 +2220,7 @@
         <w:pStyle w:val="Compact"/>
         <w:numPr>
           <w:ilvl w:val="0"/>
-          <w:numId w:val="1013"/>
+          <w:numId w:val="1014"/>
         </w:numPr>
       </w:pPr>
       <w:r>
@@ -2156,7 +2232,7 @@
         <w:pStyle w:val="Compact"/>
         <w:numPr>
           <w:ilvl w:val="0"/>
-          <w:numId w:val="1013"/>
+          <w:numId w:val="1014"/>
         </w:numPr>
       </w:pPr>
       <w:r>
@@ -2168,7 +2244,7 @@
         <w:pStyle w:val="Compact"/>
         <w:numPr>
           <w:ilvl w:val="0"/>
-          <w:numId w:val="1013"/>
+          <w:numId w:val="1014"/>
         </w:numPr>
       </w:pPr>
       <w:r>
@@ -2180,7 +2256,7 @@
         <w:pStyle w:val="Compact"/>
         <w:numPr>
           <w:ilvl w:val="0"/>
-          <w:numId w:val="1013"/>
+          <w:numId w:val="1014"/>
         </w:numPr>
       </w:pPr>
       <w:r>
@@ -2201,7 +2277,7 @@
         <w:pStyle w:val="Compact"/>
         <w:numPr>
           <w:ilvl w:val="0"/>
-          <w:numId w:val="1013"/>
+          <w:numId w:val="1014"/>
         </w:numPr>
       </w:pPr>
       <w:r>
@@ -2215,9 +2291,9 @@
         </w:pict>
       </w:r>
     </w:p>
-    <w:bookmarkEnd w:id="34"/>
-    <w:bookmarkEnd w:id="35"/>
-    <w:bookmarkStart w:id="36" w:name="esquema-de-memorització"/>
+    <w:bookmarkEnd w:id="36"/>
+    <w:bookmarkEnd w:id="37"/>
+    <w:bookmarkStart w:id="38" w:name="esquema-de-memorització"/>
     <w:p>
       <w:pPr>
         <w:pStyle w:val="Ttulo2"/>
@@ -2319,18 +2395,18 @@
               <w:pStyle w:val="Compact"/>
             </w:pPr>
             <w:r>
-              <w:t xml:space="preserve">Classe des d’un cas real acreditat</w:t>
-            </w:r>
-          </w:p>
-        </w:tc>
-        <w:tc>
-          <w:tcPr/>
-          <w:p>
-            <w:pPr>
-              <w:pStyle w:val="Compact"/>
-            </w:pPr>
-            <w:r>
-              <w:t xml:space="preserve">Ports de sortida com a focus</w:t>
+              <w:t xml:space="preserve">Portada: salutació i títol de la classe</w:t>
+            </w:r>
+          </w:p>
+        </w:tc>
+        <w:tc>
+          <w:tcPr/>
+          <w:p>
+            <w:pPr>
+              <w:pStyle w:val="Compact"/>
+            </w:pPr>
+            <w:r>
+              <w:t xml:space="preserve">Cap contingut tècnic nou</w:t>
             </w:r>
           </w:p>
         </w:tc>
@@ -2352,7 +2428,7 @@
               <w:pStyle w:val="Compact"/>
             </w:pPr>
             <w:r>
-              <w:t xml:space="preserve">Situar dins DSI</w:t>
+              <w:t xml:space="preserve">Context de la sessió</w:t>
             </w:r>
           </w:p>
         </w:tc>
@@ -2376,40 +2452,40 @@
               <w:pStyle w:val="Compact"/>
             </w:pPr>
             <w:r>
-              <w:t xml:space="preserve">La classe encaixa en el pla docent</w:t>
-            </w:r>
-          </w:p>
-        </w:tc>
-        <w:tc>
-          <w:tcPr/>
-          <w:p>
-            <w:pPr>
-              <w:pStyle w:val="Compact"/>
-            </w:pPr>
-            <w:r>
-              <w:t xml:space="preserve">Clean Architecture, ports, adaptadors</w:t>
-            </w:r>
-          </w:p>
-        </w:tc>
-        <w:tc>
-          <w:tcPr/>
-          <w:p>
-            <w:pPr>
-              <w:pStyle w:val="Compact"/>
-            </w:pPr>
-            <w:r>
-              <w:t xml:space="preserve">Cas real + docència</w:t>
-            </w:r>
-          </w:p>
-        </w:tc>
-        <w:tc>
-          <w:tcPr/>
-          <w:p>
-            <w:pPr>
-              <w:pStyle w:val="Compact"/>
-            </w:pPr>
-            <w:r>
-              <w:t xml:space="preserve">Objectiu breu</w:t>
+              <w:t xml:space="preserve">Classe des d’un cas real acreditat</w:t>
+            </w:r>
+          </w:p>
+        </w:tc>
+        <w:tc>
+          <w:tcPr/>
+          <w:p>
+            <w:pPr>
+              <w:pStyle w:val="Compact"/>
+            </w:pPr>
+            <w:r>
+              <w:t xml:space="preserve">Ports de sortida com a focus</w:t>
+            </w:r>
+          </w:p>
+        </w:tc>
+        <w:tc>
+          <w:tcPr/>
+          <w:p>
+            <w:pPr>
+              <w:pStyle w:val="Compact"/>
+            </w:pPr>
+            <w:r>
+              <w:t xml:space="preserve">Portada</w:t>
+            </w:r>
+          </w:p>
+        </w:tc>
+        <w:tc>
+          <w:tcPr/>
+          <w:p>
+            <w:pPr>
+              <w:pStyle w:val="Compact"/>
+            </w:pPr>
+            <w:r>
+              <w:t xml:space="preserve">Situar dins DSI</w:t>
             </w:r>
           </w:p>
         </w:tc>
@@ -2433,40 +2509,40 @@
               <w:pStyle w:val="Compact"/>
             </w:pPr>
             <w:r>
-              <w:t xml:space="preserve">Objectiu: necessitat, port, adaptador</w:t>
-            </w:r>
-          </w:p>
-        </w:tc>
-        <w:tc>
-          <w:tcPr/>
-          <w:p>
-            <w:pPr>
-              <w:pStyle w:val="Compact"/>
-            </w:pPr>
-            <w:r>
-              <w:t xml:space="preserve">Capacitat, no tecnologia</w:t>
-            </w:r>
-          </w:p>
-        </w:tc>
-        <w:tc>
-          <w:tcPr/>
-          <w:p>
-            <w:pPr>
-              <w:pStyle w:val="Compact"/>
-            </w:pPr>
-            <w:r>
-              <w:t xml:space="preserve">Assignatura</w:t>
-            </w:r>
-          </w:p>
-        </w:tc>
-        <w:tc>
-          <w:tcPr/>
-          <w:p>
-            <w:pPr>
-              <w:pStyle w:val="Compact"/>
-            </w:pPr>
-            <w:r>
-              <w:t xml:space="preserve">Cas funcional</w:t>
+              <w:t xml:space="preserve">La classe encaixa en el pla docent</w:t>
+            </w:r>
+          </w:p>
+        </w:tc>
+        <w:tc>
+          <w:tcPr/>
+          <w:p>
+            <w:pPr>
+              <w:pStyle w:val="Compact"/>
+            </w:pPr>
+            <w:r>
+              <w:t xml:space="preserve">Clean Architecture, ports, adaptadors</w:t>
+            </w:r>
+          </w:p>
+        </w:tc>
+        <w:tc>
+          <w:tcPr/>
+          <w:p>
+            <w:pPr>
+              <w:pStyle w:val="Compact"/>
+            </w:pPr>
+            <w:r>
+              <w:t xml:space="preserve">Cas real + docència</w:t>
+            </w:r>
+          </w:p>
+        </w:tc>
+        <w:tc>
+          <w:tcPr/>
+          <w:p>
+            <w:pPr>
+              <w:pStyle w:val="Compact"/>
+            </w:pPr>
+            <w:r>
+              <w:t xml:space="preserve">Objectiu breu</w:t>
             </w:r>
           </w:p>
         </w:tc>
@@ -2490,40 +2566,40 @@
               <w:pStyle w:val="Compact"/>
             </w:pPr>
             <w:r>
-              <w:t xml:space="preserve">Primer procediment, després tecnologia</w:t>
-            </w:r>
-          </w:p>
-        </w:tc>
-        <w:tc>
-          <w:tcPr/>
-          <w:p>
-            <w:pPr>
-              <w:pStyle w:val="Compact"/>
-            </w:pPr>
-            <w:r>
-              <w:t xml:space="preserve">Necessitat funcional</w:t>
-            </w:r>
-          </w:p>
-        </w:tc>
-        <w:tc>
-          <w:tcPr/>
-          <w:p>
-            <w:pPr>
-              <w:pStyle w:val="Compact"/>
-            </w:pPr>
-            <w:r>
-              <w:t xml:space="preserve">Objectiu</w:t>
-            </w:r>
-          </w:p>
-        </w:tc>
-        <w:tc>
-          <w:tcPr/>
-          <w:p>
-            <w:pPr>
-              <w:pStyle w:val="Compact"/>
-            </w:pPr>
-            <w:r>
-              <w:t xml:space="preserve">Fonts externes</w:t>
+              <w:t xml:space="preserve">Objectiu: necessitat, port, adaptador</w:t>
+            </w:r>
+          </w:p>
+        </w:tc>
+        <w:tc>
+          <w:tcPr/>
+          <w:p>
+            <w:pPr>
+              <w:pStyle w:val="Compact"/>
+            </w:pPr>
+            <w:r>
+              <w:t xml:space="preserve">Capacitat, no tecnologia</w:t>
+            </w:r>
+          </w:p>
+        </w:tc>
+        <w:tc>
+          <w:tcPr/>
+          <w:p>
+            <w:pPr>
+              <w:pStyle w:val="Compact"/>
+            </w:pPr>
+            <w:r>
+              <w:t xml:space="preserve">Assignatura</w:t>
+            </w:r>
+          </w:p>
+        </w:tc>
+        <w:tc>
+          <w:tcPr/>
+          <w:p>
+            <w:pPr>
+              <w:pStyle w:val="Compact"/>
+            </w:pPr>
+            <w:r>
+              <w:t xml:space="preserve">Cas funcional</w:t>
             </w:r>
           </w:p>
         </w:tc>
@@ -2547,40 +2623,40 @@
               <w:pStyle w:val="Compact"/>
             </w:pPr>
             <w:r>
-              <w:t xml:space="preserve">El procediment necessita dades, no API</w:t>
-            </w:r>
-          </w:p>
-        </w:tc>
-        <w:tc>
-          <w:tcPr/>
-          <w:p>
-            <w:pPr>
-              <w:pStyle w:val="Compact"/>
-            </w:pPr>
-            <w:r>
-              <w:t xml:space="preserve">Fonts administratives i interoperabilitat</w:t>
-            </w:r>
-          </w:p>
-        </w:tc>
-        <w:tc>
-          <w:tcPr/>
-          <w:p>
-            <w:pPr>
-              <w:pStyle w:val="Compact"/>
-            </w:pPr>
-            <w:r>
-              <w:t xml:space="preserve">Procediment</w:t>
-            </w:r>
-          </w:p>
-        </w:tc>
-        <w:tc>
-          <w:tcPr/>
-          <w:p>
-            <w:pPr>
-              <w:pStyle w:val="Compact"/>
-            </w:pPr>
-            <w:r>
-              <w:t xml:space="preserve">Risc d’acoblament</w:t>
+              <w:t xml:space="preserve">Primer procediment, després tecnologia</w:t>
+            </w:r>
+          </w:p>
+        </w:tc>
+        <w:tc>
+          <w:tcPr/>
+          <w:p>
+            <w:pPr>
+              <w:pStyle w:val="Compact"/>
+            </w:pPr>
+            <w:r>
+              <w:t xml:space="preserve">Necessitat funcional</w:t>
+            </w:r>
+          </w:p>
+        </w:tc>
+        <w:tc>
+          <w:tcPr/>
+          <w:p>
+            <w:pPr>
+              <w:pStyle w:val="Compact"/>
+            </w:pPr>
+            <w:r>
+              <w:t xml:space="preserve">Objectiu</w:t>
+            </w:r>
+          </w:p>
+        </w:tc>
+        <w:tc>
+          <w:tcPr/>
+          <w:p>
+            <w:pPr>
+              <w:pStyle w:val="Compact"/>
+            </w:pPr>
+            <w:r>
+              <w:t xml:space="preserve">Fonts externes</w:t>
             </w:r>
           </w:p>
         </w:tc>
@@ -2604,40 +2680,40 @@
               <w:pStyle w:val="Compact"/>
             </w:pPr>
             <w:r>
-              <w:t xml:space="preserve">Un acoblament es propaga fins al procediment</w:t>
-            </w:r>
-          </w:p>
-        </w:tc>
-        <w:tc>
-          <w:tcPr/>
-          <w:p>
-            <w:pPr>
-              <w:pStyle w:val="Compact"/>
-            </w:pPr>
-            <w:r>
-              <w:t xml:space="preserve">Causa, propagació i conseqüència</w:t>
-            </w:r>
-          </w:p>
-        </w:tc>
-        <w:tc>
-          <w:tcPr/>
-          <w:p>
-            <w:pPr>
-              <w:pStyle w:val="Compact"/>
-            </w:pPr>
-            <w:r>
-              <w:t xml:space="preserve">Dades externes</w:t>
-            </w:r>
-          </w:p>
-        </w:tc>
-        <w:tc>
-          <w:tcPr/>
-          <w:p>
-            <w:pPr>
-              <w:pStyle w:val="Compact"/>
-            </w:pPr>
-            <w:r>
-              <w:t xml:space="preserve">Port de sortida</w:t>
+              <w:t xml:space="preserve">El procediment necessita dades, no API</w:t>
+            </w:r>
+          </w:p>
+        </w:tc>
+        <w:tc>
+          <w:tcPr/>
+          <w:p>
+            <w:pPr>
+              <w:pStyle w:val="Compact"/>
+            </w:pPr>
+            <w:r>
+              <w:t xml:space="preserve">Fonts administratives i interoperabilitat</w:t>
+            </w:r>
+          </w:p>
+        </w:tc>
+        <w:tc>
+          <w:tcPr/>
+          <w:p>
+            <w:pPr>
+              <w:pStyle w:val="Compact"/>
+            </w:pPr>
+            <w:r>
+              <w:t xml:space="preserve">Procediment</w:t>
+            </w:r>
+          </w:p>
+        </w:tc>
+        <w:tc>
+          <w:tcPr/>
+          <w:p>
+            <w:pPr>
+              <w:pStyle w:val="Compact"/>
+            </w:pPr>
+            <w:r>
+              <w:t xml:space="preserve">Risc d’acoblament</w:t>
             </w:r>
           </w:p>
         </w:tc>
@@ -2661,40 +2737,40 @@
               <w:pStyle w:val="Compact"/>
             </w:pPr>
             <w:r>
-              <w:t xml:space="preserve">Port diu què; adaptador diu com</w:t>
-            </w:r>
-          </w:p>
-        </w:tc>
-        <w:tc>
-          <w:tcPr/>
-          <w:p>
-            <w:pPr>
-              <w:pStyle w:val="Compact"/>
-            </w:pPr>
-            <w:r>
-              <w:t xml:space="preserve">Contracte, interfície, inversió</w:t>
-            </w:r>
-          </w:p>
-        </w:tc>
-        <w:tc>
-          <w:tcPr/>
-          <w:p>
-            <w:pPr>
-              <w:pStyle w:val="Compact"/>
-            </w:pPr>
-            <w:r>
-              <w:t xml:space="preserve">Problema</w:t>
-            </w:r>
-          </w:p>
-        </w:tc>
-        <w:tc>
-          <w:tcPr/>
-          <w:p>
-            <w:pPr>
-              <w:pStyle w:val="Compact"/>
-            </w:pPr>
-            <w:r>
-              <w:t xml:space="preserve">Aplicació al cas patrimonial</w:t>
+              <w:t xml:space="preserve">Un acoblament es propaga fins al procediment</w:t>
+            </w:r>
+          </w:p>
+        </w:tc>
+        <w:tc>
+          <w:tcPr/>
+          <w:p>
+            <w:pPr>
+              <w:pStyle w:val="Compact"/>
+            </w:pPr>
+            <w:r>
+              <w:t xml:space="preserve">Causa, propagació i conseqüència</w:t>
+            </w:r>
+          </w:p>
+        </w:tc>
+        <w:tc>
+          <w:tcPr/>
+          <w:p>
+            <w:pPr>
+              <w:pStyle w:val="Compact"/>
+            </w:pPr>
+            <w:r>
+              <w:t xml:space="preserve">Dades externes</w:t>
+            </w:r>
+          </w:p>
+        </w:tc>
+        <w:tc>
+          <w:tcPr/>
+          <w:p>
+            <w:pPr>
+              <w:pStyle w:val="Compact"/>
+            </w:pPr>
+            <w:r>
+              <w:t xml:space="preserve">Port de sortida</w:t>
             </w:r>
           </w:p>
         </w:tc>
@@ -2718,40 +2794,40 @@
               <w:pStyle w:val="Compact"/>
             </w:pPr>
             <w:r>
-              <w:t xml:space="preserve">AGAUR: contracte d’aplicació, no detall tècnic</w:t>
-            </w:r>
-          </w:p>
-        </w:tc>
-        <w:tc>
-          <w:tcPr/>
-          <w:p>
-            <w:pPr>
-              <w:pStyle w:val="Compact"/>
-            </w:pPr>
-            <w:r>
-              <w:t xml:space="preserve">Adaptador implementa port</w:t>
-            </w:r>
-          </w:p>
-        </w:tc>
-        <w:tc>
-          <w:tcPr/>
-          <w:p>
-            <w:pPr>
-              <w:pStyle w:val="Compact"/>
-            </w:pPr>
-            <w:r>
-              <w:t xml:space="preserve">Port genèric</w:t>
-            </w:r>
-          </w:p>
-        </w:tc>
-        <w:tc>
-          <w:tcPr/>
-          <w:p>
-            <w:pPr>
-              <w:pStyle w:val="Compact"/>
-            </w:pPr>
-            <w:r>
-              <w:t xml:space="preserve">Transferència al domini financer</w:t>
+              <w:t xml:space="preserve">Port diu què; adaptador diu com</w:t>
+            </w:r>
+          </w:p>
+        </w:tc>
+        <w:tc>
+          <w:tcPr/>
+          <w:p>
+            <w:pPr>
+              <w:pStyle w:val="Compact"/>
+            </w:pPr>
+            <w:r>
+              <w:t xml:space="preserve">Contracte, interfície, inversió</w:t>
+            </w:r>
+          </w:p>
+        </w:tc>
+        <w:tc>
+          <w:tcPr/>
+          <w:p>
+            <w:pPr>
+              <w:pStyle w:val="Compact"/>
+            </w:pPr>
+            <w:r>
+              <w:t xml:space="preserve">Problema</w:t>
+            </w:r>
+          </w:p>
+        </w:tc>
+        <w:tc>
+          <w:tcPr/>
+          <w:p>
+            <w:pPr>
+              <w:pStyle w:val="Compact"/>
+            </w:pPr>
+            <w:r>
+              <w:t xml:space="preserve">Aplicació al cas patrimonial</w:t>
             </w:r>
           </w:p>
         </w:tc>
@@ -2775,40 +2851,40 @@
               <w:pStyle w:val="Compact"/>
             </w:pPr>
             <w:r>
-              <w:t xml:space="preserve">Mateix patró en domini financer</w:t>
-            </w:r>
-          </w:p>
-        </w:tc>
-        <w:tc>
-          <w:tcPr/>
-          <w:p>
-            <w:pPr>
-              <w:pStyle w:val="Compact"/>
-            </w:pPr>
-            <w:r>
-              <w:t xml:space="preserve">Necessitat, port i adaptador</w:t>
-            </w:r>
-          </w:p>
-        </w:tc>
-        <w:tc>
-          <w:tcPr/>
-          <w:p>
-            <w:pPr>
-              <w:pStyle w:val="Compact"/>
-            </w:pPr>
-            <w:r>
-              <w:t xml:space="preserve">Cas AGAUR</w:t>
-            </w:r>
-          </w:p>
-        </w:tc>
-        <w:tc>
-          <w:tcPr/>
-          <w:p>
-            <w:pPr>
-              <w:pStyle w:val="Compact"/>
-            </w:pPr>
-            <w:r>
-              <w:t xml:space="preserve">Conclusió</w:t>
+              <w:t xml:space="preserve">AGAUR: contracte d’aplicació, no detall tècnic</w:t>
+            </w:r>
+          </w:p>
+        </w:tc>
+        <w:tc>
+          <w:tcPr/>
+          <w:p>
+            <w:pPr>
+              <w:pStyle w:val="Compact"/>
+            </w:pPr>
+            <w:r>
+              <w:t xml:space="preserve">Adaptador implementa port</w:t>
+            </w:r>
+          </w:p>
+        </w:tc>
+        <w:tc>
+          <w:tcPr/>
+          <w:p>
+            <w:pPr>
+              <w:pStyle w:val="Compact"/>
+            </w:pPr>
+            <w:r>
+              <w:t xml:space="preserve">Port genèric</w:t>
+            </w:r>
+          </w:p>
+        </w:tc>
+        <w:tc>
+          <w:tcPr/>
+          <w:p>
+            <w:pPr>
+              <w:pStyle w:val="Compact"/>
+            </w:pPr>
+            <w:r>
+              <w:t xml:space="preserve">Transferència al domini financer</w:t>
             </w:r>
           </w:p>
         </w:tc>
@@ -2832,40 +2908,40 @@
               <w:pStyle w:val="Compact"/>
             </w:pPr>
             <w:r>
-              <w:t xml:space="preserve">L’arquitectura localitza el canvi</w:t>
-            </w:r>
-          </w:p>
-        </w:tc>
-        <w:tc>
-          <w:tcPr/>
-          <w:p>
-            <w:pPr>
-              <w:pStyle w:val="Compact"/>
-            </w:pPr>
-            <w:r>
-              <w:t xml:space="preserve">Frontera explícita</w:t>
-            </w:r>
-          </w:p>
-        </w:tc>
-        <w:tc>
-          <w:tcPr/>
-          <w:p>
-            <w:pPr>
-              <w:pStyle w:val="Compact"/>
-            </w:pPr>
-            <w:r>
-              <w:t xml:space="preserve">Domini financer</w:t>
-            </w:r>
-          </w:p>
-        </w:tc>
-        <w:tc>
-          <w:tcPr/>
-          <w:p>
-            <w:pPr>
-              <w:pStyle w:val="Compact"/>
-            </w:pPr>
-            <w:r>
-              <w:t xml:space="preserve">Agraïment</w:t>
+              <w:t xml:space="preserve">Mateix patró en domini financer</w:t>
+            </w:r>
+          </w:p>
+        </w:tc>
+        <w:tc>
+          <w:tcPr/>
+          <w:p>
+            <w:pPr>
+              <w:pStyle w:val="Compact"/>
+            </w:pPr>
+            <w:r>
+              <w:t xml:space="preserve">Necessitat, port i adaptador</w:t>
+            </w:r>
+          </w:p>
+        </w:tc>
+        <w:tc>
+          <w:tcPr/>
+          <w:p>
+            <w:pPr>
+              <w:pStyle w:val="Compact"/>
+            </w:pPr>
+            <w:r>
+              <w:t xml:space="preserve">Cas AGAUR</w:t>
+            </w:r>
+          </w:p>
+        </w:tc>
+        <w:tc>
+          <w:tcPr/>
+          <w:p>
+            <w:pPr>
+              <w:pStyle w:val="Compact"/>
+            </w:pPr>
+            <w:r>
+              <w:t xml:space="preserve">Conclusió</w:t>
             </w:r>
           </w:p>
         </w:tc>
@@ -2879,6 +2955,63 @@
             </w:pPr>
             <w:r>
               <w:t xml:space="preserve">11</w:t>
+            </w:r>
+          </w:p>
+        </w:tc>
+        <w:tc>
+          <w:tcPr/>
+          <w:p>
+            <w:pPr>
+              <w:pStyle w:val="Compact"/>
+            </w:pPr>
+            <w:r>
+              <w:t xml:space="preserve">L’arquitectura localitza el canvi</w:t>
+            </w:r>
+          </w:p>
+        </w:tc>
+        <w:tc>
+          <w:tcPr/>
+          <w:p>
+            <w:pPr>
+              <w:pStyle w:val="Compact"/>
+            </w:pPr>
+            <w:r>
+              <w:t xml:space="preserve">Frontera explícita</w:t>
+            </w:r>
+          </w:p>
+        </w:tc>
+        <w:tc>
+          <w:tcPr/>
+          <w:p>
+            <w:pPr>
+              <w:pStyle w:val="Compact"/>
+            </w:pPr>
+            <w:r>
+              <w:t xml:space="preserve">Domini financer</w:t>
+            </w:r>
+          </w:p>
+        </w:tc>
+        <w:tc>
+          <w:tcPr/>
+          <w:p>
+            <w:pPr>
+              <w:pStyle w:val="Compact"/>
+            </w:pPr>
+            <w:r>
+              <w:t xml:space="preserve">Agraïment</w:t>
+            </w:r>
+          </w:p>
+        </w:tc>
+      </w:tr>
+      <w:tr>
+        <w:tc>
+          <w:tcPr/>
+          <w:p>
+            <w:pPr>
+              <w:pStyle w:val="Compact"/>
+            </w:pPr>
+            <w:r>
+              <w:t xml:space="preserve">12</w:t>
             </w:r>
           </w:p>
         </w:tc>
@@ -3032,8 +3165,8 @@
         </w:pict>
       </w:r>
     </w:p>
-    <w:bookmarkEnd w:id="36"/>
-    <w:bookmarkStart w:id="37" w:name="taula-temporal-actualitzada"/>
+    <w:bookmarkEnd w:id="38"/>
+    <w:bookmarkStart w:id="39" w:name="taula-temporal-actualitzada"/>
     <w:p>
       <w:pPr>
         <w:pStyle w:val="Ttulo2"/>
@@ -3178,51 +3311,51 @@
               <w:pStyle w:val="Compact"/>
             </w:pPr>
             <w:r>
-              <w:t xml:space="preserve">177</w:t>
-            </w:r>
-          </w:p>
-        </w:tc>
-        <w:tc>
-          <w:tcPr/>
-          <w:p>
-            <w:pPr>
-              <w:pStyle w:val="Compact"/>
-            </w:pPr>
-            <w:r>
-              <w:t xml:space="preserve">1:25</w:t>
-            </w:r>
-          </w:p>
-        </w:tc>
-        <w:tc>
-          <w:tcPr/>
-          <w:p>
-            <w:pPr>
-              <w:pStyle w:val="Compact"/>
-            </w:pPr>
-            <w:r>
-              <w:t xml:space="preserve">1:22</w:t>
-            </w:r>
-          </w:p>
-        </w:tc>
-        <w:tc>
-          <w:tcPr/>
-          <w:p>
-            <w:pPr>
-              <w:pStyle w:val="Compact"/>
-            </w:pPr>
-            <w:r>
-              <w:t xml:space="preserve">1:19</w:t>
-            </w:r>
-          </w:p>
-        </w:tc>
-        <w:tc>
-          <w:tcPr/>
-          <w:p>
-            <w:pPr>
-              <w:pStyle w:val="Compact"/>
-            </w:pPr>
-            <w:r>
-              <w:t xml:space="preserve">1:22</w:t>
+              <w:t xml:space="preserve">34</w:t>
+            </w:r>
+          </w:p>
+        </w:tc>
+        <w:tc>
+          <w:tcPr/>
+          <w:p>
+            <w:pPr>
+              <w:pStyle w:val="Compact"/>
+            </w:pPr>
+            <w:r>
+              <w:t xml:space="preserve">0:16</w:t>
+            </w:r>
+          </w:p>
+        </w:tc>
+        <w:tc>
+          <w:tcPr/>
+          <w:p>
+            <w:pPr>
+              <w:pStyle w:val="Compact"/>
+            </w:pPr>
+            <w:r>
+              <w:t xml:space="preserve">0:16</w:t>
+            </w:r>
+          </w:p>
+        </w:tc>
+        <w:tc>
+          <w:tcPr/>
+          <w:p>
+            <w:pPr>
+              <w:pStyle w:val="Compact"/>
+            </w:pPr>
+            <w:r>
+              <w:t xml:space="preserve">0:15</w:t>
+            </w:r>
+          </w:p>
+        </w:tc>
+        <w:tc>
+          <w:tcPr/>
+          <w:p>
+            <w:pPr>
+              <w:pStyle w:val="Compact"/>
+            </w:pPr>
+            <w:r>
+              <w:t xml:space="preserve">0:16</w:t>
             </w:r>
           </w:p>
         </w:tc>
@@ -3246,62 +3379,62 @@
               <w:pStyle w:val="Compact"/>
             </w:pPr>
             <w:r>
-              <w:t xml:space="preserve">On som dins l’assignatura</w:t>
-            </w:r>
-          </w:p>
-        </w:tc>
-        <w:tc>
-          <w:tcPr/>
-          <w:p>
-            <w:pPr>
-              <w:pStyle w:val="Compact"/>
-            </w:pPr>
-            <w:r>
-              <w:t xml:space="preserve">45</w:t>
-            </w:r>
-          </w:p>
-        </w:tc>
-        <w:tc>
-          <w:tcPr/>
-          <w:p>
-            <w:pPr>
-              <w:pStyle w:val="Compact"/>
-            </w:pPr>
-            <w:r>
-              <w:t xml:space="preserve">0:22</w:t>
-            </w:r>
-          </w:p>
-        </w:tc>
-        <w:tc>
-          <w:tcPr/>
-          <w:p>
-            <w:pPr>
-              <w:pStyle w:val="Compact"/>
-            </w:pPr>
-            <w:r>
-              <w:t xml:space="preserve">0:21</w:t>
-            </w:r>
-          </w:p>
-        </w:tc>
-        <w:tc>
-          <w:tcPr/>
-          <w:p>
-            <w:pPr>
-              <w:pStyle w:val="Compact"/>
-            </w:pPr>
-            <w:r>
-              <w:t xml:space="preserve">0:20</w:t>
-            </w:r>
-          </w:p>
-        </w:tc>
-        <w:tc>
-          <w:tcPr/>
-          <w:p>
-            <w:pPr>
-              <w:pStyle w:val="Compact"/>
-            </w:pPr>
-            <w:r>
-              <w:t xml:space="preserve">1:43</w:t>
+              <w:t xml:space="preserve">Una trobada entre dos mons</w:t>
+            </w:r>
+          </w:p>
+        </w:tc>
+        <w:tc>
+          <w:tcPr/>
+          <w:p>
+            <w:pPr>
+              <w:pStyle w:val="Compact"/>
+            </w:pPr>
+            <w:r>
+              <w:t xml:space="preserve">143</w:t>
+            </w:r>
+          </w:p>
+        </w:tc>
+        <w:tc>
+          <w:tcPr/>
+          <w:p>
+            <w:pPr>
+              <w:pStyle w:val="Compact"/>
+            </w:pPr>
+            <w:r>
+              <w:t xml:space="preserve">1:09</w:t>
+            </w:r>
+          </w:p>
+        </w:tc>
+        <w:tc>
+          <w:tcPr/>
+          <w:p>
+            <w:pPr>
+              <w:pStyle w:val="Compact"/>
+            </w:pPr>
+            <w:r>
+              <w:t xml:space="preserve">1:06</w:t>
+            </w:r>
+          </w:p>
+        </w:tc>
+        <w:tc>
+          <w:tcPr/>
+          <w:p>
+            <w:pPr>
+              <w:pStyle w:val="Compact"/>
+            </w:pPr>
+            <w:r>
+              <w:t xml:space="preserve">1:04</w:t>
+            </w:r>
+          </w:p>
+        </w:tc>
+        <w:tc>
+          <w:tcPr/>
+          <w:p>
+            <w:pPr>
+              <w:pStyle w:val="Compact"/>
+            </w:pPr>
+            <w:r>
+              <w:t xml:space="preserve">1:22</w:t>
             </w:r>
           </w:p>
         </w:tc>
@@ -3325,62 +3458,62 @@
               <w:pStyle w:val="Compact"/>
             </w:pPr>
             <w:r>
-              <w:t xml:space="preserve">Objectiu de la sessió</w:t>
-            </w:r>
-          </w:p>
-        </w:tc>
-        <w:tc>
-          <w:tcPr/>
-          <w:p>
-            <w:pPr>
-              <w:pStyle w:val="Compact"/>
-            </w:pPr>
-            <w:r>
-              <w:t xml:space="preserve">80</w:t>
-            </w:r>
-          </w:p>
-        </w:tc>
-        <w:tc>
-          <w:tcPr/>
-          <w:p>
-            <w:pPr>
-              <w:pStyle w:val="Compact"/>
-            </w:pPr>
-            <w:r>
-              <w:t xml:space="preserve">0:38</w:t>
-            </w:r>
-          </w:p>
-        </w:tc>
-        <w:tc>
-          <w:tcPr/>
-          <w:p>
-            <w:pPr>
-              <w:pStyle w:val="Compact"/>
-            </w:pPr>
-            <w:r>
-              <w:t xml:space="preserve">0:37</w:t>
-            </w:r>
-          </w:p>
-        </w:tc>
-        <w:tc>
-          <w:tcPr/>
-          <w:p>
-            <w:pPr>
-              <w:pStyle w:val="Compact"/>
-            </w:pPr>
-            <w:r>
-              <w:t xml:space="preserve">0:36</w:t>
-            </w:r>
-          </w:p>
-        </w:tc>
-        <w:tc>
-          <w:tcPr/>
-          <w:p>
-            <w:pPr>
-              <w:pStyle w:val="Compact"/>
-            </w:pPr>
-            <w:r>
-              <w:t xml:space="preserve">2:20</w:t>
+              <w:t xml:space="preserve">On som dins l’assignatura</w:t>
+            </w:r>
+          </w:p>
+        </w:tc>
+        <w:tc>
+          <w:tcPr/>
+          <w:p>
+            <w:pPr>
+              <w:pStyle w:val="Compact"/>
+            </w:pPr>
+            <w:r>
+              <w:t xml:space="preserve">45</w:t>
+            </w:r>
+          </w:p>
+        </w:tc>
+        <w:tc>
+          <w:tcPr/>
+          <w:p>
+            <w:pPr>
+              <w:pStyle w:val="Compact"/>
+            </w:pPr>
+            <w:r>
+              <w:t xml:space="preserve">0:22</w:t>
+            </w:r>
+          </w:p>
+        </w:tc>
+        <w:tc>
+          <w:tcPr/>
+          <w:p>
+            <w:pPr>
+              <w:pStyle w:val="Compact"/>
+            </w:pPr>
+            <w:r>
+              <w:t xml:space="preserve">0:21</w:t>
+            </w:r>
+          </w:p>
+        </w:tc>
+        <w:tc>
+          <w:tcPr/>
+          <w:p>
+            <w:pPr>
+              <w:pStyle w:val="Compact"/>
+            </w:pPr>
+            <w:r>
+              <w:t xml:space="preserve">0:20</w:t>
+            </w:r>
+          </w:p>
+        </w:tc>
+        <w:tc>
+          <w:tcPr/>
+          <w:p>
+            <w:pPr>
+              <w:pStyle w:val="Compact"/>
+            </w:pPr>
+            <w:r>
+              <w:t xml:space="preserve">1:43</w:t>
             </w:r>
           </w:p>
         </w:tc>
@@ -3404,62 +3537,62 @@
               <w:pStyle w:val="Compact"/>
             </w:pPr>
             <w:r>
-              <w:t xml:space="preserve">Avaluació econòmica d’una beca</w:t>
-            </w:r>
-          </w:p>
-        </w:tc>
-        <w:tc>
-          <w:tcPr/>
-          <w:p>
-            <w:pPr>
-              <w:pStyle w:val="Compact"/>
-            </w:pPr>
-            <w:r>
-              <w:t xml:space="preserve">168</w:t>
-            </w:r>
-          </w:p>
-        </w:tc>
-        <w:tc>
-          <w:tcPr/>
-          <w:p>
-            <w:pPr>
-              <w:pStyle w:val="Compact"/>
-            </w:pPr>
-            <w:r>
-              <w:t xml:space="preserve">1:21</w:t>
-            </w:r>
-          </w:p>
-        </w:tc>
-        <w:tc>
-          <w:tcPr/>
-          <w:p>
-            <w:pPr>
-              <w:pStyle w:val="Compact"/>
-            </w:pPr>
-            <w:r>
-              <w:t xml:space="preserve">1:18</w:t>
-            </w:r>
-          </w:p>
-        </w:tc>
-        <w:tc>
-          <w:tcPr/>
-          <w:p>
-            <w:pPr>
-              <w:pStyle w:val="Compact"/>
-            </w:pPr>
-            <w:r>
-              <w:t xml:space="preserve">1:15</w:t>
-            </w:r>
-          </w:p>
-        </w:tc>
-        <w:tc>
-          <w:tcPr/>
-          <w:p>
-            <w:pPr>
-              <w:pStyle w:val="Compact"/>
-            </w:pPr>
-            <w:r>
-              <w:t xml:space="preserve">3:38</w:t>
+              <w:t xml:space="preserve">Objectiu de la sessió</w:t>
+            </w:r>
+          </w:p>
+        </w:tc>
+        <w:tc>
+          <w:tcPr/>
+          <w:p>
+            <w:pPr>
+              <w:pStyle w:val="Compact"/>
+            </w:pPr>
+            <w:r>
+              <w:t xml:space="preserve">80</w:t>
+            </w:r>
+          </w:p>
+        </w:tc>
+        <w:tc>
+          <w:tcPr/>
+          <w:p>
+            <w:pPr>
+              <w:pStyle w:val="Compact"/>
+            </w:pPr>
+            <w:r>
+              <w:t xml:space="preserve">0:38</w:t>
+            </w:r>
+          </w:p>
+        </w:tc>
+        <w:tc>
+          <w:tcPr/>
+          <w:p>
+            <w:pPr>
+              <w:pStyle w:val="Compact"/>
+            </w:pPr>
+            <w:r>
+              <w:t xml:space="preserve">0:37</w:t>
+            </w:r>
+          </w:p>
+        </w:tc>
+        <w:tc>
+          <w:tcPr/>
+          <w:p>
+            <w:pPr>
+              <w:pStyle w:val="Compact"/>
+            </w:pPr>
+            <w:r>
+              <w:t xml:space="preserve">0:36</w:t>
+            </w:r>
+          </w:p>
+        </w:tc>
+        <w:tc>
+          <w:tcPr/>
+          <w:p>
+            <w:pPr>
+              <w:pStyle w:val="Compact"/>
+            </w:pPr>
+            <w:r>
+              <w:t xml:space="preserve">2:20</w:t>
             </w:r>
           </w:p>
         </w:tc>
@@ -3483,62 +3616,62 @@
               <w:pStyle w:val="Compact"/>
             </w:pPr>
             <w:r>
-              <w:t xml:space="preserve">Informació externa</w:t>
-            </w:r>
-          </w:p>
-        </w:tc>
-        <w:tc>
-          <w:tcPr/>
-          <w:p>
-            <w:pPr>
-              <w:pStyle w:val="Compact"/>
-            </w:pPr>
-            <w:r>
-              <w:t xml:space="preserve">211</w:t>
-            </w:r>
-          </w:p>
-        </w:tc>
-        <w:tc>
-          <w:tcPr/>
-          <w:p>
-            <w:pPr>
-              <w:pStyle w:val="Compact"/>
-            </w:pPr>
-            <w:r>
-              <w:t xml:space="preserve">1:41</w:t>
-            </w:r>
-          </w:p>
-        </w:tc>
-        <w:tc>
-          <w:tcPr/>
-          <w:p>
-            <w:pPr>
-              <w:pStyle w:val="Compact"/>
-            </w:pPr>
-            <w:r>
-              <w:t xml:space="preserve">1:37</w:t>
-            </w:r>
-          </w:p>
-        </w:tc>
-        <w:tc>
-          <w:tcPr/>
-          <w:p>
-            <w:pPr>
-              <w:pStyle w:val="Compact"/>
-            </w:pPr>
-            <w:r>
-              <w:t xml:space="preserve">1:34</w:t>
-            </w:r>
-          </w:p>
-        </w:tc>
-        <w:tc>
-          <w:tcPr/>
-          <w:p>
-            <w:pPr>
-              <w:pStyle w:val="Compact"/>
-            </w:pPr>
-            <w:r>
-              <w:t xml:space="preserve">5:15</w:t>
+              <w:t xml:space="preserve">Avaluació econòmica d’una beca</w:t>
+            </w:r>
+          </w:p>
+        </w:tc>
+        <w:tc>
+          <w:tcPr/>
+          <w:p>
+            <w:pPr>
+              <w:pStyle w:val="Compact"/>
+            </w:pPr>
+            <w:r>
+              <w:t xml:space="preserve">168</w:t>
+            </w:r>
+          </w:p>
+        </w:tc>
+        <w:tc>
+          <w:tcPr/>
+          <w:p>
+            <w:pPr>
+              <w:pStyle w:val="Compact"/>
+            </w:pPr>
+            <w:r>
+              <w:t xml:space="preserve">1:21</w:t>
+            </w:r>
+          </w:p>
+        </w:tc>
+        <w:tc>
+          <w:tcPr/>
+          <w:p>
+            <w:pPr>
+              <w:pStyle w:val="Compact"/>
+            </w:pPr>
+            <w:r>
+              <w:t xml:space="preserve">1:18</w:t>
+            </w:r>
+          </w:p>
+        </w:tc>
+        <w:tc>
+          <w:tcPr/>
+          <w:p>
+            <w:pPr>
+              <w:pStyle w:val="Compact"/>
+            </w:pPr>
+            <w:r>
+              <w:t xml:space="preserve">1:15</w:t>
+            </w:r>
+          </w:p>
+        </w:tc>
+        <w:tc>
+          <w:tcPr/>
+          <w:p>
+            <w:pPr>
+              <w:pStyle w:val="Compact"/>
+            </w:pPr>
+            <w:r>
+              <w:t xml:space="preserve">3:38</w:t>
             </w:r>
           </w:p>
         </w:tc>
@@ -3562,62 +3695,62 @@
               <w:pStyle w:val="Compact"/>
             </w:pPr>
             <w:r>
-              <w:t xml:space="preserve">Dependència directa</w:t>
-            </w:r>
-          </w:p>
-        </w:tc>
-        <w:tc>
-          <w:tcPr/>
-          <w:p>
-            <w:pPr>
-              <w:pStyle w:val="Compact"/>
-            </w:pPr>
-            <w:r>
-              <w:t xml:space="preserve">299</w:t>
-            </w:r>
-          </w:p>
-        </w:tc>
-        <w:tc>
-          <w:tcPr/>
-          <w:p>
-            <w:pPr>
-              <w:pStyle w:val="Compact"/>
-            </w:pPr>
-            <w:r>
-              <w:t xml:space="preserve">2:24</w:t>
-            </w:r>
-          </w:p>
-        </w:tc>
-        <w:tc>
-          <w:tcPr/>
-          <w:p>
-            <w:pPr>
-              <w:pStyle w:val="Compact"/>
-            </w:pPr>
-            <w:r>
-              <w:t xml:space="preserve">2:18</w:t>
-            </w:r>
-          </w:p>
-        </w:tc>
-        <w:tc>
-          <w:tcPr/>
-          <w:p>
-            <w:pPr>
-              <w:pStyle w:val="Compact"/>
-            </w:pPr>
-            <w:r>
-              <w:t xml:space="preserve">2:13</w:t>
-            </w:r>
-          </w:p>
-        </w:tc>
-        <w:tc>
-          <w:tcPr/>
-          <w:p>
-            <w:pPr>
-              <w:pStyle w:val="Compact"/>
-            </w:pPr>
-            <w:r>
-              <w:t xml:space="preserve">7:33</w:t>
+              <w:t xml:space="preserve">Informació externa</w:t>
+            </w:r>
+          </w:p>
+        </w:tc>
+        <w:tc>
+          <w:tcPr/>
+          <w:p>
+            <w:pPr>
+              <w:pStyle w:val="Compact"/>
+            </w:pPr>
+            <w:r>
+              <w:t xml:space="preserve">211</w:t>
+            </w:r>
+          </w:p>
+        </w:tc>
+        <w:tc>
+          <w:tcPr/>
+          <w:p>
+            <w:pPr>
+              <w:pStyle w:val="Compact"/>
+            </w:pPr>
+            <w:r>
+              <w:t xml:space="preserve">1:41</w:t>
+            </w:r>
+          </w:p>
+        </w:tc>
+        <w:tc>
+          <w:tcPr/>
+          <w:p>
+            <w:pPr>
+              <w:pStyle w:val="Compact"/>
+            </w:pPr>
+            <w:r>
+              <w:t xml:space="preserve">1:37</w:t>
+            </w:r>
+          </w:p>
+        </w:tc>
+        <w:tc>
+          <w:tcPr/>
+          <w:p>
+            <w:pPr>
+              <w:pStyle w:val="Compact"/>
+            </w:pPr>
+            <w:r>
+              <w:t xml:space="preserve">1:34</w:t>
+            </w:r>
+          </w:p>
+        </w:tc>
+        <w:tc>
+          <w:tcPr/>
+          <w:p>
+            <w:pPr>
+              <w:pStyle w:val="Compact"/>
+            </w:pPr>
+            <w:r>
+              <w:t xml:space="preserve">5:15</w:t>
             </w:r>
           </w:p>
         </w:tc>
@@ -3641,62 +3774,62 @@
               <w:pStyle w:val="Compact"/>
             </w:pPr>
             <w:r>
-              <w:t xml:space="preserve">Port de sortida i adaptador</w:t>
-            </w:r>
-          </w:p>
-        </w:tc>
-        <w:tc>
-          <w:tcPr/>
-          <w:p>
-            <w:pPr>
-              <w:pStyle w:val="Compact"/>
-            </w:pPr>
-            <w:r>
-              <w:t xml:space="preserve">263</w:t>
-            </w:r>
-          </w:p>
-        </w:tc>
-        <w:tc>
-          <w:tcPr/>
-          <w:p>
-            <w:pPr>
-              <w:pStyle w:val="Compact"/>
-            </w:pPr>
-            <w:r>
-              <w:t xml:space="preserve">2:06</w:t>
-            </w:r>
-          </w:p>
-        </w:tc>
-        <w:tc>
-          <w:tcPr/>
-          <w:p>
-            <w:pPr>
-              <w:pStyle w:val="Compact"/>
-            </w:pPr>
-            <w:r>
-              <w:t xml:space="preserve">2:01</w:t>
-            </w:r>
-          </w:p>
-        </w:tc>
-        <w:tc>
-          <w:tcPr/>
-          <w:p>
-            <w:pPr>
-              <w:pStyle w:val="Compact"/>
-            </w:pPr>
-            <w:r>
-              <w:t xml:space="preserve">1:57</w:t>
-            </w:r>
-          </w:p>
-        </w:tc>
-        <w:tc>
-          <w:tcPr/>
-          <w:p>
-            <w:pPr>
-              <w:pStyle w:val="Compact"/>
-            </w:pPr>
-            <w:r>
-              <w:t xml:space="preserve">9:34</w:t>
+              <w:t xml:space="preserve">Dependència directa</w:t>
+            </w:r>
+          </w:p>
+        </w:tc>
+        <w:tc>
+          <w:tcPr/>
+          <w:p>
+            <w:pPr>
+              <w:pStyle w:val="Compact"/>
+            </w:pPr>
+            <w:r>
+              <w:t xml:space="preserve">299</w:t>
+            </w:r>
+          </w:p>
+        </w:tc>
+        <w:tc>
+          <w:tcPr/>
+          <w:p>
+            <w:pPr>
+              <w:pStyle w:val="Compact"/>
+            </w:pPr>
+            <w:r>
+              <w:t xml:space="preserve">2:24</w:t>
+            </w:r>
+          </w:p>
+        </w:tc>
+        <w:tc>
+          <w:tcPr/>
+          <w:p>
+            <w:pPr>
+              <w:pStyle w:val="Compact"/>
+            </w:pPr>
+            <w:r>
+              <w:t xml:space="preserve">2:18</w:t>
+            </w:r>
+          </w:p>
+        </w:tc>
+        <w:tc>
+          <w:tcPr/>
+          <w:p>
+            <w:pPr>
+              <w:pStyle w:val="Compact"/>
+            </w:pPr>
+            <w:r>
+              <w:t xml:space="preserve">2:13</w:t>
+            </w:r>
+          </w:p>
+        </w:tc>
+        <w:tc>
+          <w:tcPr/>
+          <w:p>
+            <w:pPr>
+              <w:pStyle w:val="Compact"/>
+            </w:pPr>
+            <w:r>
+              <w:t xml:space="preserve">7:33</w:t>
             </w:r>
           </w:p>
         </w:tc>
@@ -3720,62 +3853,62 @@
               <w:pStyle w:val="Compact"/>
             </w:pPr>
             <w:r>
-              <w:t xml:space="preserve">Port patrimonial</w:t>
-            </w:r>
-          </w:p>
-        </w:tc>
-        <w:tc>
-          <w:tcPr/>
-          <w:p>
-            <w:pPr>
-              <w:pStyle w:val="Compact"/>
-            </w:pPr>
-            <w:r>
-              <w:t xml:space="preserve">196</w:t>
-            </w:r>
-          </w:p>
-        </w:tc>
-        <w:tc>
-          <w:tcPr/>
-          <w:p>
-            <w:pPr>
-              <w:pStyle w:val="Compact"/>
-            </w:pPr>
-            <w:r>
-              <w:t xml:space="preserve">1:34</w:t>
-            </w:r>
-          </w:p>
-        </w:tc>
-        <w:tc>
-          <w:tcPr/>
-          <w:p>
-            <w:pPr>
-              <w:pStyle w:val="Compact"/>
-            </w:pPr>
-            <w:r>
-              <w:t xml:space="preserve">1:30</w:t>
-            </w:r>
-          </w:p>
-        </w:tc>
-        <w:tc>
-          <w:tcPr/>
-          <w:p>
-            <w:pPr>
-              <w:pStyle w:val="Compact"/>
-            </w:pPr>
-            <w:r>
-              <w:t xml:space="preserve">1:27</w:t>
-            </w:r>
-          </w:p>
-        </w:tc>
-        <w:tc>
-          <w:tcPr/>
-          <w:p>
-            <w:pPr>
-              <w:pStyle w:val="Compact"/>
-            </w:pPr>
-            <w:r>
-              <w:t xml:space="preserve">11:04</w:t>
+              <w:t xml:space="preserve">Port de sortida i adaptador</w:t>
+            </w:r>
+          </w:p>
+        </w:tc>
+        <w:tc>
+          <w:tcPr/>
+          <w:p>
+            <w:pPr>
+              <w:pStyle w:val="Compact"/>
+            </w:pPr>
+            <w:r>
+              <w:t xml:space="preserve">263</w:t>
+            </w:r>
+          </w:p>
+        </w:tc>
+        <w:tc>
+          <w:tcPr/>
+          <w:p>
+            <w:pPr>
+              <w:pStyle w:val="Compact"/>
+            </w:pPr>
+            <w:r>
+              <w:t xml:space="preserve">2:06</w:t>
+            </w:r>
+          </w:p>
+        </w:tc>
+        <w:tc>
+          <w:tcPr/>
+          <w:p>
+            <w:pPr>
+              <w:pStyle w:val="Compact"/>
+            </w:pPr>
+            <w:r>
+              <w:t xml:space="preserve">2:01</w:t>
+            </w:r>
+          </w:p>
+        </w:tc>
+        <w:tc>
+          <w:tcPr/>
+          <w:p>
+            <w:pPr>
+              <w:pStyle w:val="Compact"/>
+            </w:pPr>
+            <w:r>
+              <w:t xml:space="preserve">1:57</w:t>
+            </w:r>
+          </w:p>
+        </w:tc>
+        <w:tc>
+          <w:tcPr/>
+          <w:p>
+            <w:pPr>
+              <w:pStyle w:val="Compact"/>
+            </w:pPr>
+            <w:r>
+              <w:t xml:space="preserve">9:34</w:t>
             </w:r>
           </w:p>
         </w:tc>
@@ -3799,62 +3932,62 @@
               <w:pStyle w:val="Compact"/>
             </w:pPr>
             <w:r>
-              <w:t xml:space="preserve">Domini financer</w:t>
-            </w:r>
-          </w:p>
-        </w:tc>
-        <w:tc>
-          <w:tcPr/>
-          <w:p>
-            <w:pPr>
-              <w:pStyle w:val="Compact"/>
-            </w:pPr>
-            <w:r>
-              <w:t xml:space="preserve">158</w:t>
-            </w:r>
-          </w:p>
-        </w:tc>
-        <w:tc>
-          <w:tcPr/>
-          <w:p>
-            <w:pPr>
-              <w:pStyle w:val="Compact"/>
-            </w:pPr>
-            <w:r>
-              <w:t xml:space="preserve">1:16</w:t>
-            </w:r>
-          </w:p>
-        </w:tc>
-        <w:tc>
-          <w:tcPr/>
-          <w:p>
-            <w:pPr>
-              <w:pStyle w:val="Compact"/>
-            </w:pPr>
-            <w:r>
-              <w:t xml:space="preserve">1:13</w:t>
-            </w:r>
-          </w:p>
-        </w:tc>
-        <w:tc>
-          <w:tcPr/>
-          <w:p>
-            <w:pPr>
-              <w:pStyle w:val="Compact"/>
-            </w:pPr>
-            <w:r>
-              <w:t xml:space="preserve">1:10</w:t>
-            </w:r>
-          </w:p>
-        </w:tc>
-        <w:tc>
-          <w:tcPr/>
-          <w:p>
-            <w:pPr>
-              <w:pStyle w:val="Compact"/>
-            </w:pPr>
-            <w:r>
-              <w:t xml:space="preserve">12:17</w:t>
+              <w:t xml:space="preserve">Port patrimonial</w:t>
+            </w:r>
+          </w:p>
+        </w:tc>
+        <w:tc>
+          <w:tcPr/>
+          <w:p>
+            <w:pPr>
+              <w:pStyle w:val="Compact"/>
+            </w:pPr>
+            <w:r>
+              <w:t xml:space="preserve">196</w:t>
+            </w:r>
+          </w:p>
+        </w:tc>
+        <w:tc>
+          <w:tcPr/>
+          <w:p>
+            <w:pPr>
+              <w:pStyle w:val="Compact"/>
+            </w:pPr>
+            <w:r>
+              <w:t xml:space="preserve">1:34</w:t>
+            </w:r>
+          </w:p>
+        </w:tc>
+        <w:tc>
+          <w:tcPr/>
+          <w:p>
+            <w:pPr>
+              <w:pStyle w:val="Compact"/>
+            </w:pPr>
+            <w:r>
+              <w:t xml:space="preserve">1:30</w:t>
+            </w:r>
+          </w:p>
+        </w:tc>
+        <w:tc>
+          <w:tcPr/>
+          <w:p>
+            <w:pPr>
+              <w:pStyle w:val="Compact"/>
+            </w:pPr>
+            <w:r>
+              <w:t xml:space="preserve">1:27</w:t>
+            </w:r>
+          </w:p>
+        </w:tc>
+        <w:tc>
+          <w:tcPr/>
+          <w:p>
+            <w:pPr>
+              <w:pStyle w:val="Compact"/>
+            </w:pPr>
+            <w:r>
+              <w:t xml:space="preserve">11:04</w:t>
             </w:r>
           </w:p>
         </w:tc>
@@ -3878,62 +4011,62 @@
               <w:pStyle w:val="Compact"/>
             </w:pPr>
             <w:r>
-              <w:t xml:space="preserve">Idea clau i tancament</w:t>
-            </w:r>
-          </w:p>
-        </w:tc>
-        <w:tc>
-          <w:tcPr/>
-          <w:p>
-            <w:pPr>
-              <w:pStyle w:val="Compact"/>
-            </w:pPr>
-            <w:r>
-              <w:t xml:space="preserve">88</w:t>
-            </w:r>
-          </w:p>
-        </w:tc>
-        <w:tc>
-          <w:tcPr/>
-          <w:p>
-            <w:pPr>
-              <w:pStyle w:val="Compact"/>
-            </w:pPr>
-            <w:r>
-              <w:t xml:space="preserve">0:42</w:t>
-            </w:r>
-          </w:p>
-        </w:tc>
-        <w:tc>
-          <w:tcPr/>
-          <w:p>
-            <w:pPr>
-              <w:pStyle w:val="Compact"/>
-            </w:pPr>
-            <w:r>
-              <w:t xml:space="preserve">0:41</w:t>
-            </w:r>
-          </w:p>
-        </w:tc>
-        <w:tc>
-          <w:tcPr/>
-          <w:p>
-            <w:pPr>
-              <w:pStyle w:val="Compact"/>
-            </w:pPr>
-            <w:r>
-              <w:t xml:space="preserve">0:39</w:t>
-            </w:r>
-          </w:p>
-        </w:tc>
-        <w:tc>
-          <w:tcPr/>
-          <w:p>
-            <w:pPr>
-              <w:pStyle w:val="Compact"/>
-            </w:pPr>
-            <w:r>
-              <w:t xml:space="preserve">12:58</w:t>
+              <w:t xml:space="preserve">Domini financer</w:t>
+            </w:r>
+          </w:p>
+        </w:tc>
+        <w:tc>
+          <w:tcPr/>
+          <w:p>
+            <w:pPr>
+              <w:pStyle w:val="Compact"/>
+            </w:pPr>
+            <w:r>
+              <w:t xml:space="preserve">158</w:t>
+            </w:r>
+          </w:p>
+        </w:tc>
+        <w:tc>
+          <w:tcPr/>
+          <w:p>
+            <w:pPr>
+              <w:pStyle w:val="Compact"/>
+            </w:pPr>
+            <w:r>
+              <w:t xml:space="preserve">1:16</w:t>
+            </w:r>
+          </w:p>
+        </w:tc>
+        <w:tc>
+          <w:tcPr/>
+          <w:p>
+            <w:pPr>
+              <w:pStyle w:val="Compact"/>
+            </w:pPr>
+            <w:r>
+              <w:t xml:space="preserve">1:13</w:t>
+            </w:r>
+          </w:p>
+        </w:tc>
+        <w:tc>
+          <w:tcPr/>
+          <w:p>
+            <w:pPr>
+              <w:pStyle w:val="Compact"/>
+            </w:pPr>
+            <w:r>
+              <w:t xml:space="preserve">1:10</w:t>
+            </w:r>
+          </w:p>
+        </w:tc>
+        <w:tc>
+          <w:tcPr/>
+          <w:p>
+            <w:pPr>
+              <w:pStyle w:val="Compact"/>
+            </w:pPr>
+            <w:r>
+              <w:t xml:space="preserve">12:17</w:t>
             </w:r>
           </w:p>
         </w:tc>
@@ -3947,6 +4080,85 @@
             </w:pPr>
             <w:r>
               <w:t xml:space="preserve">11</w:t>
+            </w:r>
+          </w:p>
+        </w:tc>
+        <w:tc>
+          <w:tcPr/>
+          <w:p>
+            <w:pPr>
+              <w:pStyle w:val="Compact"/>
+            </w:pPr>
+            <w:r>
+              <w:t xml:space="preserve">Idea clau i tancament</w:t>
+            </w:r>
+          </w:p>
+        </w:tc>
+        <w:tc>
+          <w:tcPr/>
+          <w:p>
+            <w:pPr>
+              <w:pStyle w:val="Compact"/>
+            </w:pPr>
+            <w:r>
+              <w:t xml:space="preserve">88</w:t>
+            </w:r>
+          </w:p>
+        </w:tc>
+        <w:tc>
+          <w:tcPr/>
+          <w:p>
+            <w:pPr>
+              <w:pStyle w:val="Compact"/>
+            </w:pPr>
+            <w:r>
+              <w:t xml:space="preserve">0:42</w:t>
+            </w:r>
+          </w:p>
+        </w:tc>
+        <w:tc>
+          <w:tcPr/>
+          <w:p>
+            <w:pPr>
+              <w:pStyle w:val="Compact"/>
+            </w:pPr>
+            <w:r>
+              <w:t xml:space="preserve">0:41</w:t>
+            </w:r>
+          </w:p>
+        </w:tc>
+        <w:tc>
+          <w:tcPr/>
+          <w:p>
+            <w:pPr>
+              <w:pStyle w:val="Compact"/>
+            </w:pPr>
+            <w:r>
+              <w:t xml:space="preserve">0:39</w:t>
+            </w:r>
+          </w:p>
+        </w:tc>
+        <w:tc>
+          <w:tcPr/>
+          <w:p>
+            <w:pPr>
+              <w:pStyle w:val="Compact"/>
+            </w:pPr>
+            <w:r>
+              <w:t xml:space="preserve">12:58</w:t>
+            </w:r>
+          </w:p>
+        </w:tc>
+      </w:tr>
+      <w:tr>
+        <w:tc>
+          <w:tcPr/>
+          <w:p>
+            <w:pPr>
+              <w:pStyle w:val="Compact"/>
+            </w:pPr>
+            <w:r>
+              <w:t xml:space="preserve">12</w:t>
             </w:r>
           </w:p>
         </w:tc>
@@ -4130,7 +4342,7 @@
         <w:pStyle w:val="Textoindependiente"/>
       </w:pPr>
       <w:r>
-        <w:t xml:space="preserve">Estimació anterior de treball: 18:15-19:00. Temps eliminat del cos principal: una diapositiva prevista d’1:25. La separació de la síntesi tècnica i l’agraïment en dues diapositives afegeix aproximadament 0:20-0:30 (canvi de diapositiva i pausa protocol·lària), sense contingut tècnic nou. La nova explicació causal de la diapositiva 6 afegeix aproximadament 0:45 respecte de la versió anterior. Nova estimació prudent amb pauses reals: 17:05-18:30. Marge respecte dels 20 minuts: aproximadament 1:30-2:55, pendent de validació amb assaig oral real.</w:t>
+        <w:t xml:space="preserve">Estimació anterior de treball: 18:15-19:00. Temps eliminat del cos principal: una diapositiva prevista d’1:25. La separació de la síntesi tècnica i l’agraïment en dues diapositives afegeix aproximadament 0:20-0:30 (canvi de diapositiva i pausa protocol·lària), sense contingut tècnic nou. La nova explicació causal de la diapositiva 7 afegeix aproximadament 0:45 respecte de la versió anterior. La separació de la portada i el context en dues diapositives reparteix les mateixes 177 paraules i afegeix només un canvi de diapositiva, sense impacte apreciable en el temps total. Nova estimació prudent amb pauses reals: 17:05-18:30. Marge respecte dels 20 minuts: aproximadament 1:30-2:55, pendent de validació amb assaig oral real.</w:t>
       </w:r>
     </w:p>
     <w:p>
@@ -4140,8 +4352,8 @@
         </w:pict>
       </w:r>
     </w:p>
-    <w:bookmarkEnd w:id="37"/>
-    <w:bookmarkStart w:id="42" w:name="pla-dentrenament-comunicatiu"/>
+    <w:bookmarkEnd w:id="39"/>
+    <w:bookmarkStart w:id="44" w:name="pla-dentrenament-comunicatiu"/>
     <w:p>
       <w:pPr>
         <w:pStyle w:val="Ttulo2"/>
@@ -4150,7 +4362,7 @@
         <w:t xml:space="preserve">5. Pla d’entrenament comunicatiu</w:t>
       </w:r>
     </w:p>
-    <w:bookmarkStart w:id="38" w:name="entrenament-inicial"/>
+    <w:bookmarkStart w:id="40" w:name="entrenament-inicial"/>
     <w:p>
       <w:pPr>
         <w:pStyle w:val="Ttulo3"/>
@@ -4183,8 +4395,8 @@
         <w:t xml:space="preserve">La demo opcional s’ha d’assajar per separat. No s’ha d’incloure en el cronòmetre principal.</w:t>
       </w:r>
     </w:p>
-    <w:bookmarkEnd w:id="38"/>
-    <w:bookmarkStart w:id="39" w:name="entrenament-intermedi"/>
+    <w:bookmarkEnd w:id="40"/>
+    <w:bookmarkStart w:id="41" w:name="entrenament-intermedi"/>
     <w:p>
       <w:pPr>
         <w:pStyle w:val="Ttulo3"/>
@@ -4206,43 +4418,43 @@
         <w:pStyle w:val="Compact"/>
         <w:numPr>
           <w:ilvl w:val="0"/>
-          <w:numId w:val="1014"/>
-        </w:numPr>
-      </w:pPr>
-      <w:r>
-        <w:t xml:space="preserve">Bloc 1: diapositives 1-3, context, assignatura i objectiu breu.</w:t>
-      </w:r>
-    </w:p>
-    <w:p>
-      <w:pPr>
-        <w:pStyle w:val="Compact"/>
-        <w:numPr>
-          <w:ilvl w:val="0"/>
-          <w:numId w:val="1014"/>
-        </w:numPr>
-      </w:pPr>
-      <w:r>
-        <w:t xml:space="preserve">Bloc 2: diapositives 4-8, cas AGAUR, problema i port de sortida.</w:t>
-      </w:r>
-    </w:p>
-    <w:p>
-      <w:pPr>
-        <w:pStyle w:val="Compact"/>
-        <w:numPr>
-          <w:ilvl w:val="0"/>
-          <w:numId w:val="1014"/>
-        </w:numPr>
-      </w:pPr>
-      <w:r>
-        <w:t xml:space="preserve">Bloc 3: diapositives 9-11, domini financer, conclusió tècnica i agraïment.</w:t>
-      </w:r>
-    </w:p>
-    <w:p>
-      <w:pPr>
-        <w:pStyle w:val="Compact"/>
-        <w:numPr>
-          <w:ilvl w:val="0"/>
-          <w:numId w:val="1014"/>
+          <w:numId w:val="1015"/>
+        </w:numPr>
+      </w:pPr>
+      <w:r>
+        <w:t xml:space="preserve">Bloc 1: diapositives 1-4, portada, context, assignatura i objectiu breu.</w:t>
+      </w:r>
+    </w:p>
+    <w:p>
+      <w:pPr>
+        <w:pStyle w:val="Compact"/>
+        <w:numPr>
+          <w:ilvl w:val="0"/>
+          <w:numId w:val="1015"/>
+        </w:numPr>
+      </w:pPr>
+      <w:r>
+        <w:t xml:space="preserve">Bloc 2: diapositives 5-9, cas AGAUR, problema i port de sortida.</w:t>
+      </w:r>
+    </w:p>
+    <w:p>
+      <w:pPr>
+        <w:pStyle w:val="Compact"/>
+        <w:numPr>
+          <w:ilvl w:val="0"/>
+          <w:numId w:val="1015"/>
+        </w:numPr>
+      </w:pPr>
+      <w:r>
+        <w:t xml:space="preserve">Bloc 3: diapositives 10-12, domini financer, conclusió tècnica i agraïment.</w:t>
+      </w:r>
+    </w:p>
+    <w:p>
+      <w:pPr>
+        <w:pStyle w:val="Compact"/>
+        <w:numPr>
+          <w:ilvl w:val="0"/>
+          <w:numId w:val="1015"/>
         </w:numPr>
       </w:pPr>
       <w:r>
@@ -4281,8 +4493,8 @@
         <w:t xml:space="preserve">. Evita caminar mentre expliques una distinció fina; atura’t, formula-la i continua.</w:t>
       </w:r>
     </w:p>
-    <w:bookmarkEnd w:id="39"/>
-    <w:bookmarkStart w:id="40" w:name="assaig-final"/>
+    <w:bookmarkEnd w:id="41"/>
+    <w:bookmarkStart w:id="42" w:name="assaig-final"/>
     <w:p>
       <w:pPr>
         <w:pStyle w:val="Ttulo3"/>
@@ -4304,7 +4516,7 @@
         <w:pStyle w:val="Compact"/>
         <w:numPr>
           <w:ilvl w:val="0"/>
-          <w:numId w:val="1015"/>
+          <w:numId w:val="1016"/>
         </w:numPr>
       </w:pPr>
       <w:r>
@@ -4316,7 +4528,7 @@
         <w:pStyle w:val="Compact"/>
         <w:numPr>
           <w:ilvl w:val="0"/>
-          <w:numId w:val="1015"/>
+          <w:numId w:val="1016"/>
         </w:numPr>
       </w:pPr>
       <w:r>
@@ -4328,7 +4540,7 @@
         <w:pStyle w:val="Compact"/>
         <w:numPr>
           <w:ilvl w:val="0"/>
-          <w:numId w:val="1015"/>
+          <w:numId w:val="1016"/>
         </w:numPr>
       </w:pPr>
       <w:r>
@@ -4340,7 +4552,7 @@
         <w:pStyle w:val="FirstParagraph"/>
       </w:pPr>
       <w:r>
-        <w:t xml:space="preserve">Grava una passada en vídeo. Revisa només quatre indicadors: si mires massa la pantalla, si acceleres a les diapositives 6-9, si les pauses existeixen de veritat, i si la frase</w:t>
+        <w:t xml:space="preserve">Grava una passada en vídeo. Revisa només quatre indicadors: si mires massa la pantalla, si acceleres a les diapositives 7-10, si les pauses existeixen de veritat, i si la frase</w:t>
       </w:r>
       <w:r>
         <w:t xml:space="preserve"> </w:t>
@@ -4366,8 +4578,8 @@
         <w:t xml:space="preserve">Després grava una passada independent de l’annex opcional. La demo ha de poder explicar-se sense reobrir tota la classe. Ha de sonar com una verificació pràctica del que ja s’ha explicat, no com una secció nova.</w:t>
       </w:r>
     </w:p>
-    <w:bookmarkEnd w:id="40"/>
-    <w:bookmarkStart w:id="41" w:name="ritme-veu-i-cos"/>
+    <w:bookmarkEnd w:id="42"/>
+    <w:bookmarkStart w:id="43" w:name="ritme-veu-i-cos"/>
     <w:p>
       <w:pPr>
         <w:pStyle w:val="Ttulo3"/>
@@ -4381,7 +4593,7 @@
         <w:pStyle w:val="FirstParagraph"/>
       </w:pPr>
       <w:r>
-        <w:t xml:space="preserve">Mantingues un to més lent a les diapositives 3, 6, 7 i 8, perquè són les conceptualment més importants. Fes pauses llargues després de:</w:t>
+        <w:t xml:space="preserve">Mantingues un to més lent a les diapositives 4, 7, 8 i 9, perquè són les conceptualment més importants. Fes pauses llargues després de:</w:t>
       </w:r>
       <w:r>
         <w:t xml:space="preserve"> </w:t>
@@ -4471,9 +4683,9 @@
         </w:pict>
       </w:r>
     </w:p>
-    <w:bookmarkEnd w:id="41"/>
-    <w:bookmarkEnd w:id="42"/>
-    <w:bookmarkStart w:id="43" w:name="advertiments-finals"/>
+    <w:bookmarkEnd w:id="43"/>
+    <w:bookmarkEnd w:id="44"/>
+    <w:bookmarkStart w:id="45" w:name="advertiments-finals"/>
     <w:p>
       <w:pPr>
         <w:pStyle w:val="Ttulo2"/>
@@ -4487,7 +4699,7 @@
         <w:pStyle w:val="FirstParagraph"/>
       </w:pPr>
       <w:r>
-        <w:t xml:space="preserve">Risc de temps: les diapositives 4-9 poden allargar-se fàcilment. Si vas tard, no retallis la conclusió tècnica; retalla detall del cas AGAUR o de la transferència al domini financer.</w:t>
+        <w:t xml:space="preserve">Risc de temps: les diapositives 5-10 poden allargar-se fàcilment. Si vas tard, no retallis la conclusió tècnica; retalla detall del cas AGAUR o de la transferència al domini financer.</w:t>
       </w:r>
     </w:p>
     <w:p>
@@ -4582,8 +4794,8 @@
         <w:t xml:space="preserve">Risc de confidencialitat: no mencionar endpoints, credencials, captures internes ni detalls operatius d’AGAUR. L’informe acredita l’activitat; la classe només usa el cas com a abstracció docent.</w:t>
       </w:r>
     </w:p>
-    <w:bookmarkEnd w:id="43"/>
-    <w:bookmarkEnd w:id="44"/>
+    <w:bookmarkEnd w:id="45"/>
+    <w:bookmarkEnd w:id="46"/>
     <w:sectPr>
       <w:footnotePr>
         <w:numRestart w:val="eachSect"/>
@@ -5129,6 +5341,9 @@
     <w:abstractNumId w:val="991"/>
   </w:num>
   <w:num w:numId="1015">
+    <w:abstractNumId w:val="991"/>
+  </w:num>
+  <w:num w:numId="1016">
     <w:abstractNumId w:val="991"/>
   </w:num>
 </w:numbering>

</xml_diff>